<commit_message>
Ch3 Research constraints draft
</commit_message>
<xml_diff>
--- a/Draft/3 Methodology.docx
+++ b/Draft/3 Methodology.docx
@@ -1,12 +1,12 @@
 
 <file path=word/document.xml><?xml version="1.0" encoding="utf-8"?>
-<w:document xmlns:o="urn:schemas-microsoft-com:office:office" xmlns:r="http://schemas.openxmlformats.org/officeDocument/2006/relationships" xmlns:v="urn:schemas-microsoft-com:vml" xmlns:w="http://schemas.openxmlformats.org/wordprocessingml/2006/main" xmlns:w10="urn:schemas-microsoft-com:office:word" xmlns:wp="http://schemas.openxmlformats.org/drawingml/2006/wordprocessingDrawing" xmlns:pic="http://schemas.openxmlformats.org/drawingml/2006/picture" xmlns:wps="http://schemas.microsoft.com/office/word/2010/wordprocessingShape" xmlns:wpg="http://schemas.microsoft.com/office/word/2010/wordprocessingGroup" xmlns:mc="http://schemas.openxmlformats.org/markup-compatibility/2006" xmlns:wp14="http://schemas.microsoft.com/office/word/2010/wordprocessingDrawing" xmlns:w14="http://schemas.microsoft.com/office/word/2010/wordml" xmlns:w15="http://schemas.microsoft.com/office/word/2012/wordml" mc:Ignorable="w14 wp14 w15">
+<w:document xmlns:wpc="http://schemas.microsoft.com/office/word/2010/wordprocessingCanvas" xmlns:cx="http://schemas.microsoft.com/office/drawing/2014/chartex" xmlns:cx1="http://schemas.microsoft.com/office/drawing/2015/9/8/chartex" xmlns:cx2="http://schemas.microsoft.com/office/drawing/2015/10/21/chartex" xmlns:cx3="http://schemas.microsoft.com/office/drawing/2016/5/9/chartex" xmlns:cx4="http://schemas.microsoft.com/office/drawing/2016/5/10/chartex" xmlns:cx5="http://schemas.microsoft.com/office/drawing/2016/5/11/chartex" xmlns:cx6="http://schemas.microsoft.com/office/drawing/2016/5/12/chartex" xmlns:cx7="http://schemas.microsoft.com/office/drawing/2016/5/13/chartex" xmlns:cx8="http://schemas.microsoft.com/office/drawing/2016/5/14/chartex" xmlns:mc="http://schemas.openxmlformats.org/markup-compatibility/2006" xmlns:aink="http://schemas.microsoft.com/office/drawing/2016/ink" xmlns:am3d="http://schemas.microsoft.com/office/drawing/2017/model3d" xmlns:o="urn:schemas-microsoft-com:office:office" xmlns:oel="http://schemas.microsoft.com/office/2019/extlst" xmlns:r="http://schemas.openxmlformats.org/officeDocument/2006/relationships" xmlns:m="http://schemas.openxmlformats.org/officeDocument/2006/math" xmlns:v="urn:schemas-microsoft-com:vml" xmlns:wp14="http://schemas.microsoft.com/office/word/2010/wordprocessingDrawing" xmlns:wp="http://schemas.openxmlformats.org/drawingml/2006/wordprocessingDrawing" xmlns:w10="urn:schemas-microsoft-com:office:word" xmlns:w="http://schemas.openxmlformats.org/wordprocessingml/2006/main" xmlns:w14="http://schemas.microsoft.com/office/word/2010/wordml" xmlns:w15="http://schemas.microsoft.com/office/word/2012/wordml" xmlns:w16cex="http://schemas.microsoft.com/office/word/2018/wordml/cex" xmlns:w16cid="http://schemas.microsoft.com/office/word/2016/wordml/cid" xmlns:w16="http://schemas.microsoft.com/office/word/2018/wordml" xmlns:w16du="http://schemas.microsoft.com/office/word/2023/wordml/word16du" xmlns:w16sdtdh="http://schemas.microsoft.com/office/word/2020/wordml/sdtdatahash" xmlns:w16sdtfl="http://schemas.microsoft.com/office/word/2024/wordml/sdtformatlock" xmlns:w16se="http://schemas.microsoft.com/office/word/2015/wordml/symex" xmlns:wpg="http://schemas.microsoft.com/office/word/2010/wordprocessingGroup" xmlns:wpi="http://schemas.microsoft.com/office/word/2010/wordprocessingInk" xmlns:wne="http://schemas.microsoft.com/office/word/2006/wordml" xmlns:wps="http://schemas.microsoft.com/office/word/2010/wordprocessingShape" mc:Ignorable="w14 w15 w16se w16cid w16 w16cex w16sdtdh w16sdtfl w16du wp14">
   <w:body>
     <w:p>
       <w:pPr>
-        <w:pStyle w:val="Title"/>
-        <w:rPr>
-          <w:rFonts w:ascii="Calibri" w:hAnsi="Calibri" w:eastAsia="Times New Roman" w:cs="Calibri" w:asciiTheme="minorHAnsi" w:cstheme="minorHAnsi" w:hAnsiTheme="minorHAnsi"/>
+        <w:pStyle w:val="Ttulo"/>
+        <w:rPr>
+          <w:rFonts w:asciiTheme="minorHAnsi" w:eastAsia="Times New Roman" w:hAnsiTheme="minorHAnsi" w:cstheme="minorHAnsi"/>
           <w:sz w:val="22"/>
           <w:szCs w:val="22"/>
           <w:lang w:val="en-NZ" w:eastAsia="es-CO"/>
@@ -14,7 +14,7 @@
       </w:pPr>
       <w:r>
         <w:rPr>
-          <w:rFonts w:eastAsia="Times New Roman" w:cs="Calibri" w:ascii="Calibri" w:hAnsi="Calibri" w:asciiTheme="minorHAnsi" w:cstheme="minorHAnsi" w:hAnsiTheme="minorHAnsi"/>
+          <w:rFonts w:asciiTheme="minorHAnsi" w:eastAsia="Times New Roman" w:hAnsiTheme="minorHAnsi" w:cstheme="minorHAnsi"/>
           <w:sz w:val="22"/>
           <w:szCs w:val="22"/>
           <w:lang w:val="en-NZ" w:eastAsia="es-CO"/>
@@ -24,7 +24,6 @@
     </w:p>
     <w:p>
       <w:pPr>
-        <w:pStyle w:val="Normal"/>
         <w:rPr>
           <w:lang w:val="en-NZ" w:eastAsia="es-CO"/>
         </w:rPr>
@@ -38,7 +37,6 @@
     </w:p>
     <w:p>
       <w:pPr>
-        <w:pStyle w:val="Normal"/>
         <w:rPr>
           <w:lang w:val="en-NZ" w:eastAsia="es-CO"/>
         </w:rPr>
@@ -52,10 +50,10 @@
     </w:p>
     <w:p>
       <w:pPr>
-        <w:pStyle w:val="Heading1"/>
+        <w:pStyle w:val="Ttulo1"/>
         <w:spacing w:before="280" w:after="280"/>
         <w:rPr>
-          <w:rFonts w:ascii="Calibri" w:hAnsi="Calibri" w:cs="Calibri" w:asciiTheme="minorHAnsi" w:cstheme="minorHAnsi" w:hAnsiTheme="minorHAnsi"/>
+          <w:rFonts w:asciiTheme="minorHAnsi" w:hAnsiTheme="minorHAnsi" w:cstheme="minorHAnsi"/>
           <w:sz w:val="22"/>
           <w:szCs w:val="22"/>
           <w:lang w:val="en-NZ"/>
@@ -63,7 +61,7 @@
       </w:pPr>
       <w:r>
         <w:rPr>
-          <w:rFonts w:cs="Calibri" w:ascii="Calibri" w:hAnsi="Calibri" w:asciiTheme="minorHAnsi" w:cstheme="minorHAnsi" w:hAnsiTheme="minorHAnsi"/>
+          <w:rFonts w:asciiTheme="minorHAnsi" w:hAnsiTheme="minorHAnsi" w:cstheme="minorHAnsi"/>
           <w:sz w:val="22"/>
           <w:szCs w:val="22"/>
           <w:lang w:val="en-NZ"/>
@@ -73,15 +71,14 @@
     </w:p>
     <w:p>
       <w:pPr>
-        <w:pStyle w:val="Normal"/>
-        <w:rPr>
-          <w:rFonts w:cs="Calibri" w:cstheme="minorHAnsi"/>
-          <w:lang w:val="en-NZ"/>
-        </w:rPr>
-      </w:pPr>
-      <w:r>
-        <w:rPr>
-          <w:rFonts w:cs="Calibri" w:cstheme="minorHAnsi"/>
+        <w:rPr>
+          <w:rFonts w:cstheme="minorHAnsi"/>
+          <w:lang w:val="en-NZ"/>
+        </w:rPr>
+      </w:pPr>
+      <w:r>
+        <w:rPr>
+          <w:rFonts w:cstheme="minorHAnsi"/>
           <w:lang w:val="en-NZ"/>
         </w:rPr>
         <w:t>This is a project that is qualitative and exploratory in nature. Qualitative because at the core of the research questions there is the idea of description. The goal is to describe behaviours and characterize the technology selected as used in the classroom. It is exploratory because rather than trying to corroborate or to formulate a theory, the goal is to gather enough data to understand the characteristics of the scenario being studied and to start laying the road to deeper analysis of the issues and questions that stood out through the review of relevant literature and previous experiences.</w:t>
@@ -89,41 +86,94 @@
     </w:p>
     <w:p>
       <w:pPr>
-        <w:pStyle w:val="Normal"/>
-        <w:rPr>
-          <w:rFonts w:cs="Calibri" w:cstheme="minorHAnsi"/>
-          <w:lang w:val="en-NZ"/>
-        </w:rPr>
-      </w:pPr>
-      <w:r>
-        <w:rPr>
-          <w:rFonts w:cs="Calibri" w:cstheme="minorHAnsi"/>
-          <w:lang w:val="en-NZ"/>
-        </w:rPr>
-        <w:t>It is due to the nature of the project proposed that Critical Realism (CR) was identified as a good fit for the philosophical approach of the research. Observation will be at the core of the enquiry process and the data gathered will be subjective in nature, linked to very specific points of view: the observations of the researcher, the perceptions of the students and the teaching staff participating in the current cohort of the course. CR proposes an approach to research that takes into consideration the imperfections inherent to understanding reality through our own perception. Since this very specific point of view is going to be the main source of analysis, it is important to understand and accept that any data and observation will be flawed and in need of interpretation and contextualization in order to asses validity or applicability (Bryman, 2003).</w:t>
-      </w:r>
-    </w:p>
-    <w:p>
-      <w:pPr>
-        <w:pStyle w:val="Normal"/>
-        <w:rPr>
-          <w:rFonts w:cs="Calibri" w:cstheme="minorHAnsi"/>
-          <w:lang w:val="en-NZ"/>
-        </w:rPr>
-      </w:pPr>
-      <w:r>
-        <w:rPr>
-          <w:rFonts w:cs="Calibri" w:cstheme="minorHAnsi"/>
-          <w:lang w:val="en-NZ"/>
-        </w:rPr>
-        <w:t>Section 2.x explores the tendency found in literature on justifying any educational development through improvements in average grades or similar gains, in an attempt to give the research validity using a very positivistic framework of analysis, while neglecting or obscuring the human and social core of education. CR offers a midpoint between positivism and social constructivism, by acknowledging the social dynamics used to build knowledge and learning processes, the ontological framework used to model and interpret qualitative data as well as linking all of these ideas with a more empirical understanding of the mechanism working underneath (Parra et al., 2021).</w:t>
-      </w:r>
-    </w:p>
-    <w:p>
-      <w:pPr>
-        <w:pStyle w:val="Normal"/>
-        <w:rPr>
-          <w:rFonts w:cs="Calibri" w:cstheme="minorHAnsi"/>
+        <w:rPr>
+          <w:rFonts w:cstheme="minorHAnsi"/>
+          <w:lang w:val="en-NZ"/>
+        </w:rPr>
+      </w:pPr>
+      <w:r>
+        <w:rPr>
+          <w:rFonts w:cstheme="minorHAnsi"/>
+          <w:lang w:val="en-NZ"/>
+        </w:rPr>
+        <w:t xml:space="preserve">It is due to the nature of the project proposed that Critical Realism (CR) was identified as a good fit for the philosophical approach of the research. Observation will be at the core of the enquiry process and the data gathered will be subjective in nature, linked to very specific points of view: the observations of the researcher, the perceptions of the students and the teaching staff participating in the current cohort of the course. CR proposes an approach to research that takes into consideration the imperfections inherent to understanding reality through our own perception. Since this very specific point of view is going to be the main source of analysis, it is important to understand and accept that any data and observation will be flawed and in need of interpretation and contextualization </w:t>
+      </w:r>
+      <w:r>
+        <w:rPr>
+          <w:rFonts w:cstheme="minorHAnsi"/>
+          <w:lang w:val="en-NZ"/>
+        </w:rPr>
+        <w:t>to</w:t>
+      </w:r>
+      <w:r>
+        <w:rPr>
+          <w:rFonts w:cstheme="minorHAnsi"/>
+          <w:lang w:val="en-NZ"/>
+        </w:rPr>
+        <w:t xml:space="preserve"> </w:t>
+      </w:r>
+      <w:r>
+        <w:rPr>
+          <w:rFonts w:cstheme="minorHAnsi"/>
+          <w:lang w:val="en-NZ"/>
+        </w:rPr>
+        <w:t>assess</w:t>
+      </w:r>
+      <w:r>
+        <w:rPr>
+          <w:rFonts w:cstheme="minorHAnsi"/>
+          <w:lang w:val="en-NZ"/>
+        </w:rPr>
+        <w:t xml:space="preserve"> validity or applicability (Bryman, 2003).</w:t>
+      </w:r>
+    </w:p>
+    <w:p>
+      <w:pPr>
+        <w:rPr>
+          <w:rFonts w:cstheme="minorHAnsi"/>
+          <w:lang w:val="en-NZ"/>
+        </w:rPr>
+      </w:pPr>
+      <w:r>
+        <w:rPr>
+          <w:rFonts w:cstheme="minorHAnsi"/>
+          <w:lang w:val="en-NZ"/>
+        </w:rPr>
+        <w:t xml:space="preserve">Section 2.x explores the tendency found in literature on justifying any educational development through improvements in average grades or similar gains, </w:t>
+      </w:r>
+      <w:r>
+        <w:rPr>
+          <w:rFonts w:cstheme="minorHAnsi"/>
+          <w:lang w:val="en-NZ"/>
+        </w:rPr>
+        <w:t>to</w:t>
+      </w:r>
+      <w:r>
+        <w:rPr>
+          <w:rFonts w:cstheme="minorHAnsi"/>
+          <w:lang w:val="en-NZ"/>
+        </w:rPr>
+        <w:t xml:space="preserve"> give the research validity using a very positivistic framework of analysis, while neglecting or obscuring the human and social core of education. CR offers a midpoint between positivism and social constructivism, by acknowledging the social dynamics used to build knowledge and learning processes, the ontological framework used to model and interpret qualitative data as well as linking </w:t>
+      </w:r>
+      <w:r>
+        <w:rPr>
+          <w:rFonts w:cstheme="minorHAnsi"/>
+          <w:lang w:val="en-NZ"/>
+        </w:rPr>
+        <w:t>all</w:t>
+      </w:r>
+      <w:r>
+        <w:rPr>
+          <w:rFonts w:cstheme="minorHAnsi"/>
+          <w:lang w:val="en-NZ"/>
+        </w:rPr>
+        <w:t xml:space="preserve"> these ideas with a more empirical understanding of the mechanism working underneath (Parra et al., 2021).</w:t>
+      </w:r>
+    </w:p>
+    <w:p>
+      <w:pPr>
+        <w:rPr>
+          <w:rFonts w:cstheme="minorHAnsi"/>
           <w:lang w:val="en-NZ"/>
         </w:rPr>
       </w:pPr>
@@ -135,7 +185,7 @@
       </w:r>
       <w:r>
         <w:rPr>
-          <w:rFonts w:cs="Calibri" w:cstheme="minorHAnsi"/>
+          <w:rFonts w:cstheme="minorHAnsi"/>
           <w:lang w:val="en-NZ"/>
         </w:rPr>
         <w:t>Scott (2005) highlight that one of the most important tools in CR research is to identify agency and structure, that is, to understand the phenomenon being observed by identifying who is doing things, what are the social connections at play and the reasons behind the actions being observed. This approach requires the present of both empirical, hard data that can be analyses, as well as the necessity for a more interpretative, qualitative approach to does elements that cannot be described which just numbers.</w:t>
@@ -143,33 +193,34 @@
     </w:p>
     <w:p>
       <w:pPr>
-        <w:pStyle w:val="Normal"/>
-        <w:rPr>
-          <w:rFonts w:cs="Calibri" w:cstheme="minorHAnsi"/>
-          <w:lang w:val="en-NZ"/>
-        </w:rPr>
-      </w:pPr>
-      <w:r>
-        <w:rPr>
-          <w:rFonts w:cs="Calibri" w:cstheme="minorHAnsi"/>
-          <w:lang w:val="en-NZ"/>
-        </w:rPr>
+        <w:rPr>
+          <w:rFonts w:cstheme="minorHAnsi"/>
+          <w:lang w:val="en-NZ"/>
+        </w:rPr>
+      </w:pPr>
+      <w:r>
+        <w:rPr>
+          <w:rFonts w:cstheme="minorHAnsi"/>
+          <w:lang w:val="en-NZ"/>
+        </w:rPr>
+        <w:lastRenderedPageBreak/>
         <w:t>CR is also a framework well suited to answer “how” and “what” questions. Saxena (2021) explains that the Empirical-Actual-Real model used in CR (see Figure 1) can be used to explain ideas about causation, correlation and the underlying structures driving the empirical events we are experiencing. The research question proposed for this research both align to this view, or where tune to align with this selected approach. The main objective is to describes as well as possible what is happening in the classroom around the mechanisms of collaboration and the technological tools created as an engine of those mechanisms (the what, the empirical), and create an analytical and interpretative framework to explain those observations behaviours (the how, the actual) and hopefully link the observations with the ideas, designs and tools created.</w:t>
       </w:r>
     </w:p>
     <w:p>
       <w:pPr>
-        <w:pStyle w:val="Normal"/>
-        <w:keepNext w:val="true"/>
+        <w:keepNext/>
         <w:jc w:val="center"/>
         <w:rPr>
           <w:lang w:val="en-NZ"/>
         </w:rPr>
       </w:pPr>
       <w:r>
-        <w:rPr/>
+        <w:rPr>
+          <w:noProof/>
+        </w:rPr>
         <w:drawing>
-          <wp:inline distT="0" distB="0" distL="0" distR="0">
+          <wp:inline distT="0" distB="0" distL="0" distR="0" wp14:anchorId="4088167D" wp14:editId="3FD3A096">
             <wp:extent cx="2733675" cy="2733675"/>
             <wp:effectExtent l="0" t="0" r="0" b="0"/>
             <wp:docPr id="1" name="Picture 1"/>
@@ -186,7 +237,7 @@
                     </pic:cNvPicPr>
                   </pic:nvPicPr>
                   <pic:blipFill>
-                    <a:blip r:embed="rId2"/>
+                    <a:blip r:embed="rId5"/>
                     <a:stretch>
                       <a:fillRect/>
                     </a:stretch>
@@ -210,10 +261,10 @@
     </w:p>
     <w:p>
       <w:pPr>
-        <w:pStyle w:val="Caption"/>
+        <w:pStyle w:val="Descripcin"/>
         <w:jc w:val="center"/>
         <w:rPr>
-          <w:rFonts w:cs="Calibri" w:cstheme="minorHAnsi"/>
+          <w:rFonts w:cstheme="minorHAnsi"/>
           <w:lang w:val="en-NZ"/>
         </w:rPr>
       </w:pPr>
@@ -262,31 +313,57 @@
     </w:p>
     <w:p>
       <w:pPr>
-        <w:pStyle w:val="Normal"/>
-        <w:rPr>
-          <w:rFonts w:cs="Calibri" w:cstheme="minorHAnsi"/>
-          <w:lang w:val="en-NZ"/>
-        </w:rPr>
-      </w:pPr>
-      <w:r>
-        <w:rPr>
-          <w:rFonts w:cs="Calibri" w:cstheme="minorHAnsi"/>
-          <w:lang w:val="en-NZ"/>
-        </w:rPr>
-        <w:t>Given the emphasis explained to observational qualitative data of the scenario of interest, it is clear that the best research type that fits the methodology so far described is an inductive approach. Section 1.x described the research questions formulated to guide this research. The main question (MQ) is aimed at understanding how AR promotes observed behaviours, while question SQ1 to SQ6 help to identify elements of the what, describing the data in hope to link the empirical data with the actual mechanisms in play throughout the educational scenario. The assumption here is that those mechanisms in fact exists, and that they are being build or promoted by the use of the technology as part of the educational design of the activity.</w:t>
-      </w:r>
-    </w:p>
-    <w:p>
-      <w:pPr>
-        <w:pStyle w:val="Normal"/>
-        <w:rPr>
-          <w:rFonts w:cs="Calibri" w:cstheme="minorHAnsi"/>
-          <w:lang w:val="en-NZ"/>
-        </w:rPr>
-      </w:pPr>
-      <w:r>
-        <w:rPr>
-          <w:rFonts w:cs="Calibri" w:cstheme="minorHAnsi"/>
+        <w:rPr>
+          <w:rFonts w:cstheme="minorHAnsi"/>
+          <w:lang w:val="en-NZ"/>
+        </w:rPr>
+      </w:pPr>
+      <w:r>
+        <w:rPr>
+          <w:rFonts w:cstheme="minorHAnsi"/>
+          <w:lang w:val="en-NZ"/>
+        </w:rPr>
+        <w:t xml:space="preserve">Given the emphasis explained to observational qualitative data of the scenario of interest, </w:t>
+      </w:r>
+      <w:r>
+        <w:rPr>
+          <w:rFonts w:cstheme="minorHAnsi"/>
+          <w:lang w:val="en-NZ"/>
+        </w:rPr>
+        <w:t>the</w:t>
+      </w:r>
+      <w:r>
+        <w:rPr>
+          <w:rFonts w:cstheme="minorHAnsi"/>
+          <w:lang w:val="en-NZ"/>
+        </w:rPr>
+        <w:t xml:space="preserve"> best research type that fits the methodology so far described is an inductive approach. Section 1.x described the research questions formulated to guide this research. The main question (MQ) is aimed at understanding how AR promotes observed behaviours, while question SQ1 to SQ6 help to identify elements of the what, describing the data in hope to link the empirical data with the actual mechanisms in play throughout the educational scenario. The assumption here is that those mechanisms in fact exists, and that they are being build or promoted </w:t>
+      </w:r>
+      <w:r>
+        <w:rPr>
+          <w:rFonts w:cstheme="minorHAnsi"/>
+          <w:lang w:val="en-NZ"/>
+        </w:rPr>
+        <w:t>using</w:t>
+      </w:r>
+      <w:r>
+        <w:rPr>
+          <w:rFonts w:cstheme="minorHAnsi"/>
+          <w:lang w:val="en-NZ"/>
+        </w:rPr>
+        <w:t xml:space="preserve"> the technology as part of the educational design of the activity.</w:t>
+      </w:r>
+    </w:p>
+    <w:p>
+      <w:pPr>
+        <w:rPr>
+          <w:rFonts w:cstheme="minorHAnsi"/>
+          <w:lang w:val="en-NZ"/>
+        </w:rPr>
+      </w:pPr>
+      <w:r>
+        <w:rPr>
+          <w:rFonts w:cstheme="minorHAnsi"/>
           <w:lang w:val="en-NZ"/>
         </w:rPr>
         <w:t>It is important to clarify that the explorative nature of the data will not be totally blind, it will be informed by a series of expectations and hypothesis about how AR has been used in the past for educative scenarios and the theoretical background found in literature about collaborative learning, project-based educational design and TEL experiences, all which were explored in chapter 2. Base in this background, the biggest foundational ideas that will guide the analysis process of the data are that:</w:t>
@@ -294,19 +371,19 @@
     </w:p>
     <w:p>
       <w:pPr>
-        <w:pStyle w:val="ListParagraph"/>
+        <w:pStyle w:val="Prrafodelista"/>
         <w:numPr>
           <w:ilvl w:val="0"/>
           <w:numId w:val="1"/>
         </w:numPr>
         <w:rPr>
-          <w:rFonts w:cs="Calibri" w:cstheme="minorHAnsi"/>
-          <w:lang w:val="en-NZ"/>
-        </w:rPr>
-      </w:pPr>
-      <w:r>
-        <w:rPr>
-          <w:rFonts w:cs="Calibri" w:cstheme="minorHAnsi"/>
+          <w:rFonts w:cstheme="minorHAnsi"/>
+          <w:lang w:val="en-NZ"/>
+        </w:rPr>
+      </w:pPr>
+      <w:r>
+        <w:rPr>
+          <w:rFonts w:cstheme="minorHAnsi"/>
           <w:lang w:val="en-NZ"/>
         </w:rPr>
         <w:t>AR can be use in education as an effective tool for communication and work by exploring the advantages inherent to the technology in the form of visualization, interaction and connection with others.</w:t>
@@ -314,35 +391,49 @@
     </w:p>
     <w:p>
       <w:pPr>
-        <w:pStyle w:val="ListParagraph"/>
+        <w:pStyle w:val="Prrafodelista"/>
         <w:numPr>
           <w:ilvl w:val="0"/>
           <w:numId w:val="1"/>
         </w:numPr>
         <w:rPr>
-          <w:rFonts w:cs="Calibri" w:cstheme="minorHAnsi"/>
-          <w:lang w:val="en-NZ"/>
-        </w:rPr>
-      </w:pPr>
-      <w:r>
-        <w:rPr>
-          <w:rFonts w:cs="Calibri" w:cstheme="minorHAnsi"/>
-          <w:lang w:val="en-NZ"/>
-        </w:rPr>
-        <w:t>The core of collaborative learning lies in using social connections as the main driver of the educational design, and the main behavioural changes will be observed in those point where AR intervene in the creation and executions of those connections.</w:t>
-      </w:r>
-    </w:p>
-    <w:p>
-      <w:pPr>
-        <w:pStyle w:val="Normal"/>
-        <w:rPr>
-          <w:rFonts w:cs="Calibri" w:cstheme="minorHAnsi"/>
-          <w:lang w:val="en-NZ"/>
-        </w:rPr>
-      </w:pPr>
-      <w:r>
-        <w:rPr>
-          <w:rFonts w:cs="Calibri" w:cstheme="minorHAnsi"/>
+          <w:rFonts w:cstheme="minorHAnsi"/>
+          <w:lang w:val="en-NZ"/>
+        </w:rPr>
+      </w:pPr>
+      <w:r>
+        <w:rPr>
+          <w:rFonts w:cstheme="minorHAnsi"/>
+          <w:lang w:val="en-NZ"/>
+        </w:rPr>
+        <w:lastRenderedPageBreak/>
+        <w:t>The core of collaborative learning lies in using social connections as the main driver of the educational design, and the main behavioural changes will be observed in those point</w:t>
+      </w:r>
+      <w:r>
+        <w:rPr>
+          <w:rFonts w:cstheme="minorHAnsi"/>
+          <w:lang w:val="en-NZ"/>
+        </w:rPr>
+        <w:t>s</w:t>
+      </w:r>
+      <w:r>
+        <w:rPr>
+          <w:rFonts w:cstheme="minorHAnsi"/>
+          <w:lang w:val="en-NZ"/>
+        </w:rPr>
+        <w:t xml:space="preserve"> where AR intervene in the creation and executions of those connections.</w:t>
+      </w:r>
+    </w:p>
+    <w:p>
+      <w:pPr>
+        <w:rPr>
+          <w:rFonts w:cstheme="minorHAnsi"/>
+          <w:lang w:val="en-NZ"/>
+        </w:rPr>
+      </w:pPr>
+      <w:r>
+        <w:rPr>
+          <w:rFonts w:cstheme="minorHAnsi"/>
           <w:lang w:val="en-NZ"/>
         </w:rPr>
         <w:t>The analysis process will naturally try to find indications of those ideas in the data, mainly because it has been apparent in the results found in previous works, but it is also important to understand that the main research drive of this project is to identify all those elements that do not align with those ideas  (if any), try to link them to underlaying mechanisms and refine those initial ideas base on what have been observed and create a new or distinct starting point for future research.</w:t>
@@ -350,167 +441,519 @@
     </w:p>
     <w:p>
       <w:pPr>
-        <w:pStyle w:val="Normal"/>
-        <w:rPr>
-          <w:rFonts w:cs="Calibri" w:cstheme="minorHAnsi"/>
-          <w:lang w:val="en-NZ"/>
-        </w:rPr>
-      </w:pPr>
-      <w:r>
-        <w:rPr>
-          <w:rFonts w:cs="Calibri" w:cstheme="minorHAnsi"/>
-          <w:lang w:val="en-NZ"/>
-        </w:rPr>
-        <w:t xml:space="preserve">For the research strategy it was decided </w:t>
-      </w:r>
-      <w:r>
-        <w:rPr>
-          <w:rFonts w:cs="Calibri" w:cstheme="minorHAnsi"/>
-          <w:lang w:val="en-NZ"/>
-        </w:rPr>
-        <w:t>it was decided that the approach that would fit the best the desicion taken in matter s of research philosophy and type would be a case study.</w:t>
-      </w:r>
-    </w:p>
-    <w:p>
-      <w:pPr>
-        <w:pStyle w:val="Normal"/>
-        <w:rPr>
-          <w:rFonts w:cs="Calibri" w:cstheme="minorHAnsi"/>
-          <w:lang w:val="en-NZ"/>
-        </w:rPr>
-      </w:pPr>
-      <w:r>
-        <w:rPr>
-          <w:rFonts w:cs="Calibri" w:cstheme="minorHAnsi"/>
-          <w:lang w:val="en-NZ"/>
-        </w:rPr>
-        <w:t xml:space="preserve">Even before any considerations about the details of the case study, this strategy offers a good approach to manage the kind of observations proposed to answer the research questions. As the research is more interested in beheviours and personal perceptions and he way hey change thanks o the intervention designed. A detailed case study is </w:t>
-      </w:r>
-      <w:r>
-        <w:rPr>
-          <w:rFonts w:cs="Calibri" w:cstheme="minorHAnsi"/>
-          <w:lang w:val="en-NZ"/>
-        </w:rPr>
-        <w:t>well</w:t>
-      </w:r>
-      <w:r>
-        <w:rPr>
-          <w:rFonts w:cs="Calibri" w:cstheme="minorHAnsi"/>
-          <w:lang w:val="en-NZ"/>
-        </w:rPr>
-        <w:t xml:space="preserve"> suited to create the scenario where this c</w:t>
-      </w:r>
-      <w:r>
-        <w:rPr>
-          <w:rFonts w:cs="Calibri" w:cstheme="minorHAnsi"/>
-          <w:lang w:val="en-NZ"/>
-        </w:rPr>
-        <w:t>ha</w:t>
-      </w:r>
-      <w:r>
-        <w:rPr>
-          <w:rFonts w:cs="Calibri" w:cstheme="minorHAnsi"/>
-          <w:lang w:val="en-NZ"/>
-        </w:rPr>
-        <w:t>nges can be obsered, even if it is dificult to both identify and understand all the variables and mechanisms operating behind the observed scenario.</w:t>
-      </w:r>
-    </w:p>
-    <w:p>
-      <w:pPr>
-        <w:pStyle w:val="Normal"/>
-        <w:rPr>
-          <w:rFonts w:cs="Calibri" w:cstheme="minorHAnsi"/>
-          <w:lang w:val="en-NZ"/>
-        </w:rPr>
-      </w:pPr>
-      <w:r>
-        <w:rPr>
-          <w:rFonts w:cs="Calibri" w:cstheme="minorHAnsi"/>
-          <w:lang w:val="en-NZ"/>
-        </w:rPr>
-        <w:t xml:space="preserve">Case studies produce the type of context-related knowledge that is most valuable in learning scenarios. </w:t>
-      </w:r>
-      <w:r>
-        <w:rPr>
-          <w:rFonts w:cs="Calibri" w:cstheme="minorHAnsi"/>
-          <w:lang w:val="en-NZ"/>
-        </w:rPr>
-        <w:t>They are also a very useful tool for context in which human behaviour have o be observed and in which a community is an integral part of the context (Hamilton and Corbett-Whittier, 2013). Case studies are ideal tools to identify problems, outliers and out of the norm observations. Moreover, thematic and problem characterized as rich or complex are perfect subjects for case studies, which have a good set of tools to capture, organize and analyze extensive narratives, which value lays more on its density and richness rather than the factual data that can be summarized out of it (Seale, 2007, Grauer, 2012).</w:t>
-      </w:r>
-    </w:p>
-    <w:p>
-      <w:pPr>
-        <w:pStyle w:val="Normal"/>
-        <w:rPr>
-          <w:rFonts w:cs="Calibri" w:cstheme="minorHAnsi"/>
-          <w:lang w:val="en-NZ"/>
-        </w:rPr>
-      </w:pPr>
-      <w:r>
-        <w:rPr>
-          <w:rFonts w:cs="Calibri" w:cstheme="minorHAnsi"/>
-          <w:lang w:val="en-NZ"/>
-        </w:rPr>
-        <w:t xml:space="preserve">Cober et al. </w:t>
-      </w:r>
-      <w:r>
-        <w:rPr>
-          <w:rFonts w:cs="Calibri" w:cstheme="minorHAnsi"/>
-          <w:lang w:val="en-NZ"/>
-        </w:rPr>
-        <w:t>(</w:t>
-      </w:r>
-      <w:r>
-        <w:rPr>
-          <w:rFonts w:cs="Calibri" w:cstheme="minorHAnsi"/>
-          <w:lang w:val="en-NZ"/>
-        </w:rPr>
-        <w:t xml:space="preserve">2015) </w:t>
-      </w:r>
-      <w:r>
-        <w:rPr>
-          <w:rFonts w:cs="Calibri" w:cstheme="minorHAnsi"/>
-          <w:lang w:val="en-NZ"/>
-        </w:rPr>
-        <w:t xml:space="preserve">and Tay et al. </w:t>
-      </w:r>
-      <w:r>
-        <w:rPr>
-          <w:rFonts w:cs="Calibri" w:cstheme="minorHAnsi"/>
-          <w:lang w:val="en-NZ"/>
-        </w:rPr>
-        <w:t>(</w:t>
-      </w:r>
-      <w:r>
-        <w:rPr>
-          <w:rFonts w:cs="Calibri" w:cstheme="minorHAnsi"/>
-          <w:lang w:val="en-NZ"/>
-        </w:rPr>
-        <w:t>2017) represent exemplar projects of educational case studies centred around a TEL intervention demostrainting and setting a presendent of many of the foundation used in this research around technology in the classroom: a design process that involves the users and a feedback loopthat adapts to the particular circumstances of the classroom. These examples also high;ight some unique benefits of a case tudy aproach like involving the community as an active part in the design and development of the research, enriching the discussion of the ideas and proposals generated by using the different points of view present in the case study and facilitating a two-way avenue of the benefits of the research, often allowing the researcher to activitly and directly making an impact on the community well beyond the research scope.</w:t>
-      </w:r>
-    </w:p>
-    <w:p>
-      <w:pPr>
-        <w:pStyle w:val="Normal"/>
-        <w:rPr>
-          <w:rFonts w:cs="Calibri" w:cstheme="minorHAnsi"/>
-          <w:lang w:val="en-NZ"/>
-        </w:rPr>
-      </w:pPr>
-      <w:r>
-        <w:rPr>
-          <w:rFonts w:cs="Calibri" w:cstheme="minorHAnsi"/>
-          <w:lang w:val="en-NZ"/>
-        </w:rPr>
-        <w:t>Analysis technique (Content and thematic analysis, Framework analysis)</w:t>
-      </w:r>
-    </w:p>
-    <w:p>
-      <w:pPr>
-        <w:pStyle w:val="Heading1"/>
+        <w:rPr>
+          <w:rFonts w:cstheme="minorHAnsi"/>
+          <w:lang w:val="en-NZ"/>
+        </w:rPr>
+      </w:pPr>
+      <w:r>
+        <w:rPr>
+          <w:rFonts w:cstheme="minorHAnsi"/>
+          <w:lang w:val="en-NZ"/>
+        </w:rPr>
+        <w:t xml:space="preserve">For the research strategy it was decided it was decided that the approach that would fit the best the </w:t>
+      </w:r>
+      <w:r>
+        <w:rPr>
+          <w:rFonts w:cstheme="minorHAnsi"/>
+          <w:lang w:val="en-NZ"/>
+        </w:rPr>
+        <w:t>decision</w:t>
+      </w:r>
+      <w:r>
+        <w:rPr>
+          <w:rFonts w:cstheme="minorHAnsi"/>
+          <w:lang w:val="en-NZ"/>
+        </w:rPr>
+        <w:t xml:space="preserve"> taken in matter s of research philosophy and type would be a case study.</w:t>
+      </w:r>
+    </w:p>
+    <w:p>
+      <w:pPr>
+        <w:rPr>
+          <w:rFonts w:cstheme="minorHAnsi"/>
+          <w:lang w:val="en-NZ"/>
+        </w:rPr>
+      </w:pPr>
+      <w:r>
+        <w:rPr>
+          <w:rFonts w:cstheme="minorHAnsi"/>
+          <w:lang w:val="en-NZ"/>
+        </w:rPr>
+        <w:t xml:space="preserve">Even before any considerations about the details of the case study, this strategy offers a good approach to manage the kind of observations proposed to answer the research questions. As the research is more interested in </w:t>
+      </w:r>
+      <w:r>
+        <w:rPr>
+          <w:rFonts w:cstheme="minorHAnsi"/>
+          <w:lang w:val="en-NZ"/>
+        </w:rPr>
+        <w:t>behaviours</w:t>
+      </w:r>
+      <w:r>
+        <w:rPr>
+          <w:rFonts w:cstheme="minorHAnsi"/>
+          <w:lang w:val="en-NZ"/>
+        </w:rPr>
+        <w:t xml:space="preserve"> and personal perceptions and he way hey change thanks </w:t>
+      </w:r>
+      <w:r>
+        <w:rPr>
+          <w:rFonts w:cstheme="minorHAnsi"/>
+          <w:lang w:val="en-NZ"/>
+        </w:rPr>
+        <w:t>t</w:t>
+      </w:r>
+      <w:r>
+        <w:rPr>
+          <w:rFonts w:cstheme="minorHAnsi"/>
+          <w:lang w:val="en-NZ"/>
+        </w:rPr>
+        <w:t xml:space="preserve">o the intervention designed. A detailed case study is well suited to create the scenario where </w:t>
+      </w:r>
+      <w:r>
+        <w:rPr>
+          <w:rFonts w:cstheme="minorHAnsi"/>
+          <w:lang w:val="en-NZ"/>
+        </w:rPr>
+        <w:t>these changes</w:t>
+      </w:r>
+      <w:r>
+        <w:rPr>
+          <w:rFonts w:cstheme="minorHAnsi"/>
+          <w:lang w:val="en-NZ"/>
+        </w:rPr>
+        <w:t xml:space="preserve"> can be </w:t>
+      </w:r>
+      <w:r>
+        <w:rPr>
+          <w:rFonts w:cstheme="minorHAnsi"/>
+          <w:lang w:val="en-NZ"/>
+        </w:rPr>
+        <w:t>observed</w:t>
+      </w:r>
+      <w:r>
+        <w:rPr>
+          <w:rFonts w:cstheme="minorHAnsi"/>
+          <w:lang w:val="en-NZ"/>
+        </w:rPr>
+        <w:t xml:space="preserve">, even if it is </w:t>
+      </w:r>
+      <w:r>
+        <w:rPr>
+          <w:rFonts w:cstheme="minorHAnsi"/>
+          <w:lang w:val="en-NZ"/>
+        </w:rPr>
+        <w:t>difficult</w:t>
+      </w:r>
+      <w:r>
+        <w:rPr>
+          <w:rFonts w:cstheme="minorHAnsi"/>
+          <w:lang w:val="en-NZ"/>
+        </w:rPr>
+        <w:t xml:space="preserve"> to both identify and understand all the variables and mechanisms operating behind the observed scenario.</w:t>
+      </w:r>
+    </w:p>
+    <w:p>
+      <w:pPr>
+        <w:rPr>
+          <w:rFonts w:cstheme="minorHAnsi"/>
+          <w:lang w:val="en-NZ"/>
+        </w:rPr>
+      </w:pPr>
+      <w:r>
+        <w:rPr>
+          <w:rFonts w:cstheme="minorHAnsi"/>
+          <w:lang w:val="en-NZ"/>
+        </w:rPr>
+        <w:t xml:space="preserve">Case studies produce the type of context-related knowledge that is most valuable in learning scenarios. They are also a very useful tool for context in which human behaviour </w:t>
+      </w:r>
+      <w:r>
+        <w:rPr>
+          <w:rFonts w:cstheme="minorHAnsi"/>
+          <w:lang w:val="en-NZ"/>
+        </w:rPr>
+        <w:t>needs</w:t>
+      </w:r>
+      <w:r>
+        <w:rPr>
+          <w:rFonts w:cstheme="minorHAnsi"/>
+          <w:lang w:val="en-NZ"/>
+        </w:rPr>
+        <w:t xml:space="preserve"> </w:t>
+      </w:r>
+      <w:r>
+        <w:rPr>
+          <w:rFonts w:cstheme="minorHAnsi"/>
+          <w:lang w:val="en-NZ"/>
+        </w:rPr>
+        <w:t>t</w:t>
+      </w:r>
+      <w:r>
+        <w:rPr>
+          <w:rFonts w:cstheme="minorHAnsi"/>
+          <w:lang w:val="en-NZ"/>
+        </w:rPr>
+        <w:t xml:space="preserve">o be observed and in which a community is an integral part of the context (Hamilton and Corbett-Whittier, 2013). Case studies are ideal tools to identify problems, outliers and out of the norm observations. Moreover, thematic and problem characterized as rich or complex are perfect subjects for case studies, which have a good set of tools to capture, organize and </w:t>
+      </w:r>
+      <w:r>
+        <w:rPr>
+          <w:rFonts w:cstheme="minorHAnsi"/>
+          <w:lang w:val="en-NZ"/>
+        </w:rPr>
+        <w:t>analyse</w:t>
+      </w:r>
+      <w:r>
+        <w:rPr>
+          <w:rFonts w:cstheme="minorHAnsi"/>
+          <w:lang w:val="en-NZ"/>
+        </w:rPr>
+        <w:t xml:space="preserve"> extensive narratives, which value lays more on its density and richness rather than the factual data that can be summarized out of it (Seale, 2007, Grauer, 2012).</w:t>
+      </w:r>
+    </w:p>
+    <w:p>
+      <w:pPr>
+        <w:rPr>
+          <w:rFonts w:cstheme="minorHAnsi"/>
+          <w:lang w:val="en-NZ"/>
+        </w:rPr>
+      </w:pPr>
+      <w:r>
+        <w:rPr>
+          <w:rFonts w:cstheme="minorHAnsi"/>
+          <w:lang w:val="en-NZ"/>
+        </w:rPr>
+        <w:t xml:space="preserve">Cober et al. (2015) and Tay et al. (2017) represent exemplar projects of educational case studies centred around a TEL intervention </w:t>
+      </w:r>
+      <w:r>
+        <w:rPr>
+          <w:rFonts w:cstheme="minorHAnsi"/>
+          <w:lang w:val="en-NZ"/>
+        </w:rPr>
+        <w:t>demonstrating</w:t>
+      </w:r>
+      <w:r>
+        <w:rPr>
+          <w:rFonts w:cstheme="minorHAnsi"/>
+          <w:lang w:val="en-NZ"/>
+        </w:rPr>
+        <w:t xml:space="preserve"> and setting a </w:t>
+      </w:r>
+      <w:r>
+        <w:rPr>
+          <w:rFonts w:cstheme="minorHAnsi"/>
+          <w:lang w:val="en-NZ"/>
+        </w:rPr>
+        <w:t>precedent</w:t>
+      </w:r>
+      <w:r>
+        <w:rPr>
+          <w:rFonts w:cstheme="minorHAnsi"/>
+          <w:lang w:val="en-NZ"/>
+        </w:rPr>
+        <w:t xml:space="preserve"> of many of the foundation used in this research around technology in the classroom: a design process that involves the users and a feedback loop</w:t>
+      </w:r>
+      <w:r>
+        <w:rPr>
+          <w:rFonts w:cstheme="minorHAnsi"/>
+          <w:lang w:val="en-NZ"/>
+        </w:rPr>
+        <w:t xml:space="preserve"> </w:t>
+      </w:r>
+      <w:r>
+        <w:rPr>
+          <w:rFonts w:cstheme="minorHAnsi"/>
+          <w:lang w:val="en-NZ"/>
+        </w:rPr>
+        <w:t xml:space="preserve">that adapts to the </w:t>
+      </w:r>
+      <w:r>
+        <w:rPr>
+          <w:rFonts w:cstheme="minorHAnsi"/>
+          <w:lang w:val="en-NZ"/>
+        </w:rPr>
+        <w:t>circumstances</w:t>
+      </w:r>
+      <w:r>
+        <w:rPr>
+          <w:rFonts w:cstheme="minorHAnsi"/>
+          <w:lang w:val="en-NZ"/>
+        </w:rPr>
+        <w:t xml:space="preserve"> of the classroom. These examples also </w:t>
+      </w:r>
+      <w:r>
+        <w:rPr>
+          <w:rFonts w:cstheme="minorHAnsi"/>
+          <w:lang w:val="en-NZ"/>
+        </w:rPr>
+        <w:t>highlight</w:t>
+      </w:r>
+      <w:r>
+        <w:rPr>
+          <w:rFonts w:cstheme="minorHAnsi"/>
+          <w:lang w:val="en-NZ"/>
+        </w:rPr>
+        <w:t xml:space="preserve"> some unique benefits of a case </w:t>
+      </w:r>
+      <w:r>
+        <w:rPr>
+          <w:rFonts w:cstheme="minorHAnsi"/>
+          <w:lang w:val="en-NZ"/>
+        </w:rPr>
+        <w:t>s</w:t>
+      </w:r>
+      <w:r>
+        <w:rPr>
+          <w:rFonts w:cstheme="minorHAnsi"/>
+          <w:lang w:val="en-NZ"/>
+        </w:rPr>
+        <w:t xml:space="preserve">tudy </w:t>
+      </w:r>
+      <w:r>
+        <w:rPr>
+          <w:rFonts w:cstheme="minorHAnsi"/>
+          <w:lang w:val="en-NZ"/>
+        </w:rPr>
+        <w:t>approach</w:t>
+      </w:r>
+      <w:r>
+        <w:rPr>
+          <w:rFonts w:cstheme="minorHAnsi"/>
+          <w:lang w:val="en-NZ"/>
+        </w:rPr>
+        <w:t xml:space="preserve"> like involving the community as an active part in the design and development of the research, enriching the discussion of the ideas and proposals generated by using the different points of view present in the case study and facilitating a two-way avenue of the benefits of the research, often allowing the researcher to </w:t>
+      </w:r>
+      <w:r>
+        <w:rPr>
+          <w:rFonts w:cstheme="minorHAnsi"/>
+          <w:lang w:val="en-NZ"/>
+        </w:rPr>
+        <w:t>actively</w:t>
+      </w:r>
+      <w:r>
+        <w:rPr>
+          <w:rFonts w:cstheme="minorHAnsi"/>
+          <w:lang w:val="en-NZ"/>
+        </w:rPr>
+        <w:t xml:space="preserve"> and directly making an impact on the community well beyond the research scope.</w:t>
+      </w:r>
+    </w:p>
+    <w:p>
+      <w:pPr>
+        <w:rPr>
+          <w:rFonts w:cstheme="minorHAnsi"/>
+          <w:lang w:val="en-NZ"/>
+        </w:rPr>
+      </w:pPr>
+      <w:r>
+        <w:rPr>
+          <w:rFonts w:cstheme="minorHAnsi"/>
+          <w:lang w:val="en-NZ"/>
+        </w:rPr>
+        <w:t>Finally, and given the prevalence of qualitative data in the research strategy selected, the analysis technique chosen for the project will focus on content and thematic analysis. These approaches offer good flexibility to analyse the data obtained from different point of view</w:t>
+      </w:r>
+      <w:r>
+        <w:rPr>
+          <w:rFonts w:cstheme="minorHAnsi"/>
+          <w:lang w:val="en-NZ"/>
+        </w:rPr>
+        <w:t>. S</w:t>
+      </w:r>
+      <w:r>
+        <w:rPr>
+          <w:rFonts w:cstheme="minorHAnsi"/>
+          <w:lang w:val="en-NZ"/>
+        </w:rPr>
+        <w:t>pecifically,</w:t>
+      </w:r>
+      <w:r>
+        <w:rPr>
+          <w:rFonts w:cstheme="minorHAnsi"/>
+          <w:lang w:val="en-NZ"/>
+        </w:rPr>
+        <w:t xml:space="preserve"> the thematical analysis of the research will focus mostly on identifying themes related to:</w:t>
+      </w:r>
+    </w:p>
+    <w:p>
+      <w:pPr>
+        <w:pStyle w:val="Prrafodelista"/>
+        <w:numPr>
+          <w:ilvl w:val="0"/>
+          <w:numId w:val="3"/>
+        </w:numPr>
+        <w:rPr>
+          <w:rFonts w:cstheme="minorHAnsi"/>
+          <w:lang w:val="en-NZ"/>
+        </w:rPr>
+      </w:pPr>
+      <w:r>
+        <w:rPr>
+          <w:rFonts w:cstheme="minorHAnsi"/>
+          <w:lang w:val="en-NZ"/>
+        </w:rPr>
+        <w:t>The use of technology to manage team activities in the classroom.</w:t>
+      </w:r>
+    </w:p>
+    <w:p>
+      <w:pPr>
+        <w:pStyle w:val="Prrafodelista"/>
+        <w:numPr>
+          <w:ilvl w:val="0"/>
+          <w:numId w:val="3"/>
+        </w:numPr>
+        <w:rPr>
+          <w:rFonts w:cstheme="minorHAnsi"/>
+          <w:lang w:val="en-NZ"/>
+        </w:rPr>
+      </w:pPr>
+      <w:r>
+        <w:rPr>
+          <w:rFonts w:cstheme="minorHAnsi"/>
+          <w:lang w:val="en-NZ"/>
+        </w:rPr>
+        <w:lastRenderedPageBreak/>
+        <w:t>The prevalence and importance of technological tools while creating channels of communication among the groups.</w:t>
+      </w:r>
+    </w:p>
+    <w:p>
+      <w:pPr>
+        <w:pStyle w:val="Prrafodelista"/>
+        <w:numPr>
+          <w:ilvl w:val="0"/>
+          <w:numId w:val="3"/>
+        </w:numPr>
+        <w:rPr>
+          <w:rFonts w:cstheme="minorHAnsi"/>
+          <w:lang w:val="en-NZ"/>
+        </w:rPr>
+      </w:pPr>
+      <w:r>
+        <w:rPr>
+          <w:rFonts w:cstheme="minorHAnsi"/>
+          <w:lang w:val="en-NZ"/>
+        </w:rPr>
+        <w:t>The interaction between the different tools used by the students.</w:t>
+      </w:r>
+    </w:p>
+    <w:p>
+      <w:pPr>
+        <w:pStyle w:val="Prrafodelista"/>
+        <w:numPr>
+          <w:ilvl w:val="0"/>
+          <w:numId w:val="3"/>
+        </w:numPr>
+        <w:rPr>
+          <w:rFonts w:cstheme="minorHAnsi"/>
+          <w:lang w:val="en-NZ"/>
+        </w:rPr>
+      </w:pPr>
+      <w:r>
+        <w:rPr>
+          <w:rFonts w:cstheme="minorHAnsi"/>
+          <w:lang w:val="en-NZ"/>
+        </w:rPr>
+        <w:t>Instances of reflection and analysis of the activities in the classroom thanks to the use the tool proposed for the intervention.</w:t>
+      </w:r>
+    </w:p>
+    <w:p>
+      <w:pPr>
+        <w:rPr>
+          <w:rFonts w:cstheme="minorHAnsi"/>
+          <w:lang w:val="en-NZ"/>
+        </w:rPr>
+      </w:pPr>
+      <w:r>
+        <w:rPr>
+          <w:rFonts w:cstheme="minorHAnsi"/>
+          <w:lang w:val="en-NZ"/>
+        </w:rPr>
+        <w:t>Although these themes are the focus of analysis, it will be very important to track and identify any other relevant content that emerges during the observation phase, specially if it is related to the collaboration process of the use of technology in the classroom.</w:t>
+      </w:r>
+      <w:r>
+        <w:rPr>
+          <w:rFonts w:cstheme="minorHAnsi"/>
+          <w:lang w:val="en-NZ"/>
+        </w:rPr>
+        <w:t xml:space="preserve"> </w:t>
+      </w:r>
+      <w:r>
+        <w:rPr>
+          <w:rFonts w:cstheme="minorHAnsi"/>
+          <w:lang w:val="en-NZ"/>
+        </w:rPr>
+        <w:t>Additionally</w:t>
+      </w:r>
+      <w:r>
+        <w:rPr>
+          <w:rFonts w:cstheme="minorHAnsi"/>
+          <w:lang w:val="en-NZ"/>
+        </w:rPr>
+        <w:t xml:space="preserve">, these same analysis </w:t>
+      </w:r>
+      <w:r>
+        <w:rPr>
+          <w:rFonts w:cstheme="minorHAnsi"/>
+          <w:lang w:val="en-NZ"/>
+        </w:rPr>
+        <w:t>strategies</w:t>
+      </w:r>
+      <w:r>
+        <w:rPr>
+          <w:rFonts w:cstheme="minorHAnsi"/>
+          <w:lang w:val="en-NZ"/>
+        </w:rPr>
+        <w:t xml:space="preserve"> can be used in the evaluation process of the software development, offering </w:t>
+      </w:r>
+      <w:r>
+        <w:rPr>
+          <w:rFonts w:cstheme="minorHAnsi"/>
+          <w:lang w:val="en-NZ"/>
+        </w:rPr>
+        <w:t>a</w:t>
+      </w:r>
+      <w:r>
+        <w:rPr>
+          <w:rFonts w:cstheme="minorHAnsi"/>
+          <w:lang w:val="en-NZ"/>
+        </w:rPr>
+        <w:t xml:space="preserve"> structured method to gather and analyse the qualitative data gathered about the usage of the tool and the perceptions of the users while using the tool during the instances of controlled test and during the intervention in the classroom.</w:t>
+      </w:r>
+    </w:p>
+    <w:p>
+      <w:pPr>
+        <w:rPr>
+          <w:rFonts w:cstheme="minorHAnsi"/>
+          <w:lang w:val="en-NZ"/>
+        </w:rPr>
+      </w:pPr>
+      <w:r>
+        <w:rPr>
+          <w:rFonts w:cstheme="minorHAnsi"/>
+          <w:lang w:val="en-NZ"/>
+        </w:rPr>
+        <w:t>An important effort is also proposed to offer some triangulation to the data obtained from the case study. In one hand, the software development process in itself requires a substantial data analysis coming from the reported results of similar past projects and from the exercise in user-driven design that will be followed to serve as a framework for the interaction design of the tool, base on data obtained from the users and the analysis of the information obtained from them. The software development process is also iterative in nature, and the feedback collected and analysed during the testing stages of the development will not only inform the development of the tool, but also the observation process.</w:t>
+      </w:r>
+    </w:p>
+    <w:p>
+      <w:pPr>
+        <w:rPr>
+          <w:rFonts w:cstheme="minorHAnsi"/>
+          <w:lang w:val="en-NZ"/>
+        </w:rPr>
+      </w:pPr>
+      <w:r>
+        <w:rPr>
+          <w:rFonts w:cstheme="minorHAnsi"/>
+          <w:lang w:val="en-NZ"/>
+        </w:rPr>
+        <w:t xml:space="preserve">In second instance, two extra data instruments are proposed to complement the observation process of the case study. One is focused on unstructured interview with the students of the course with the objective of gathering data about their collaborative process, their approach to teamwork during the course and the tools they used to make work possible or easier. The second instrument is a similar set of unstructured interviews focused on the teaching staff to gather information about the influence of teamwork and collaboration in the educational design, the criteria hold by the staff to asses a successful teamwork and their personal views on how this project-oriented activities could be used to prepare the students for future projects and their professional work. </w:t>
+      </w:r>
+    </w:p>
+    <w:p>
+      <w:pPr>
+        <w:pStyle w:val="Ttulo1"/>
         <w:spacing w:before="280" w:after="280"/>
         <w:rPr>
-          <w:rFonts w:ascii="Calibri" w:hAnsi="Calibri" w:cs="Calibri" w:asciiTheme="minorHAnsi" w:cstheme="minorHAnsi" w:hAnsiTheme="minorHAnsi"/>
+          <w:rFonts w:asciiTheme="minorHAnsi" w:hAnsiTheme="minorHAnsi" w:cstheme="minorHAnsi"/>
           <w:sz w:val="22"/>
           <w:szCs w:val="22"/>
           <w:lang w:val="en-NZ"/>
@@ -518,7 +961,7 @@
       </w:pPr>
       <w:r>
         <w:rPr>
-          <w:rFonts w:cs="Calibri" w:ascii="Calibri" w:hAnsi="Calibri" w:asciiTheme="minorHAnsi" w:cstheme="minorHAnsi" w:hAnsiTheme="minorHAnsi"/>
+          <w:rFonts w:asciiTheme="minorHAnsi" w:hAnsiTheme="minorHAnsi" w:cstheme="minorHAnsi"/>
           <w:sz w:val="22"/>
           <w:szCs w:val="22"/>
           <w:lang w:val="en-NZ"/>
@@ -528,74 +971,385 @@
     </w:p>
     <w:p>
       <w:pPr>
-        <w:pStyle w:val="Normal"/>
-        <w:rPr>
-          <w:rFonts w:cs="Calibri" w:cstheme="minorHAnsi"/>
-          <w:lang w:val="en-NZ"/>
-        </w:rPr>
-      </w:pPr>
-      <w:r>
-        <w:rPr>
-          <w:rFonts w:cs="Calibri" w:cstheme="minorHAnsi"/>
-          <w:lang w:val="en-NZ"/>
-        </w:rPr>
-        <w:t>Time horizon (cross sectional and practical constraints)</w:t>
-      </w:r>
-    </w:p>
-    <w:p>
-      <w:pPr>
-        <w:pStyle w:val="Normal"/>
-        <w:rPr>
-          <w:rFonts w:cs="Calibri" w:cstheme="minorHAnsi"/>
-          <w:lang w:val="en-NZ"/>
-        </w:rPr>
-      </w:pPr>
-      <w:r>
-        <w:rPr>
-          <w:rFonts w:cs="Calibri" w:cstheme="minorHAnsi"/>
+        <w:rPr>
+          <w:rFonts w:cstheme="minorHAnsi"/>
+          <w:lang w:val="en-NZ"/>
+        </w:rPr>
+      </w:pPr>
+      <w:r>
+        <w:rPr>
+          <w:rFonts w:cstheme="minorHAnsi"/>
+          <w:lang w:val="en-NZ"/>
+        </w:rPr>
+        <w:t>The biggest constraints in the time horizon proposed for the development of this research are the access to the Industry Project course. Any cohort of the course runs trough two semesters, and it was important to follow the development of the project from the initial first contact the students have with their time to the final presentation, creating a window of one academical year for data gathering, which can be translated to 24 weeks in which observation of the development of the course is possible. Due to similar time constraints in the degree that this research project is related to, it was possible to gather data of one cohort of the course through 20 weeks and divided in two academical semesters of work.</w:t>
+      </w:r>
+    </w:p>
+    <w:p>
+      <w:pPr>
+        <w:rPr>
+          <w:rFonts w:cstheme="minorHAnsi"/>
+          <w:lang w:val="en-NZ"/>
+        </w:rPr>
+      </w:pPr>
+      <w:r>
+        <w:rPr>
+          <w:rFonts w:cstheme="minorHAnsi"/>
+          <w:lang w:val="en-NZ"/>
+        </w:rPr>
+        <w:t>This situation forces this project to adapt a cross-sectional approach</w:t>
+      </w:r>
+      <w:r>
+        <w:rPr>
+          <w:rFonts w:cstheme="minorHAnsi"/>
+          <w:lang w:val="en-NZ"/>
+        </w:rPr>
+        <w:t xml:space="preserve">, which will try to describe in as much detail as possible the effects observed of the technological intervention for this </w:t>
+      </w:r>
+      <w:r>
+        <w:rPr>
+          <w:rFonts w:cstheme="minorHAnsi"/>
+          <w:lang w:val="en-NZ"/>
+        </w:rPr>
+        <w:t>cohort</w:t>
+      </w:r>
+      <w:r>
+        <w:rPr>
+          <w:rFonts w:cstheme="minorHAnsi"/>
+          <w:lang w:val="en-NZ"/>
+        </w:rPr>
+        <w:t xml:space="preserve"> of </w:t>
+      </w:r>
+      <w:r>
+        <w:rPr>
+          <w:rFonts w:cstheme="minorHAnsi"/>
+          <w:lang w:val="en-NZ"/>
+        </w:rPr>
+        <w:lastRenderedPageBreak/>
+        <w:t xml:space="preserve">the Industry Project course, trying to create an internal comparison between those participating in the course as thy would normally do versus those using the AR tool. </w:t>
+      </w:r>
+      <w:r>
+        <w:rPr>
+          <w:rFonts w:cstheme="minorHAnsi"/>
+          <w:lang w:val="en-NZ"/>
+        </w:rPr>
+        <w:t xml:space="preserve">As with most cross sectional studies, this approach offers a quick way of gathering data and the observations will be able to cover multiple variables of interest that can be analysed later, at the cost of creating the situation that the data will be biased to the particularities of this sample, making hard to propose any generalization or causality </w:t>
+      </w:r>
+      <w:r>
+        <w:rPr>
+          <w:rFonts w:cstheme="minorHAnsi"/>
+          <w:lang w:val="en-NZ"/>
+        </w:rPr>
+        <w:t>(Wang &amp; Cheng, 2020)</w:t>
+      </w:r>
+      <w:r>
+        <w:rPr>
+          <w:rFonts w:cstheme="minorHAnsi"/>
+          <w:lang w:val="en-NZ"/>
+        </w:rPr>
+        <w:t>.</w:t>
+      </w:r>
+      <w:r>
+        <w:rPr>
+          <w:rFonts w:cstheme="minorHAnsi"/>
+          <w:lang w:val="en-NZ"/>
+        </w:rPr>
+        <w:t xml:space="preserve"> </w:t>
+      </w:r>
+    </w:p>
+    <w:p>
+      <w:pPr>
+        <w:rPr>
+          <w:rFonts w:cstheme="minorHAnsi"/>
+          <w:lang w:val="en-NZ"/>
+        </w:rPr>
+      </w:pPr>
+      <w:r>
+        <w:rPr>
+          <w:rFonts w:cstheme="minorHAnsi"/>
           <w:lang w:val="en-NZ"/>
         </w:rPr>
         <w:t>Sampling</w:t>
       </w:r>
-    </w:p>
-    <w:p>
-      <w:pPr>
-        <w:pStyle w:val="Normal"/>
-        <w:rPr>
-          <w:rFonts w:cs="Calibri" w:cstheme="minorHAnsi"/>
-          <w:lang w:val="en-NZ"/>
-        </w:rPr>
-      </w:pPr>
-      <w:r>
-        <w:rPr>
-          <w:rFonts w:cs="Calibri" w:cstheme="minorHAnsi"/>
-          <w:lang w:val="en-NZ"/>
-        </w:rPr>
-        <w:t>Data Collection method</w:t>
-      </w:r>
-    </w:p>
-    <w:p>
-      <w:pPr>
-        <w:pStyle w:val="Normal"/>
-        <w:rPr>
-          <w:rFonts w:cs="Calibri" w:cstheme="minorHAnsi"/>
-          <w:lang w:val="en-NZ"/>
-        </w:rPr>
-      </w:pPr>
-      <w:r>
-        <w:rPr>
-          <w:rFonts w:cs="Calibri" w:cstheme="minorHAnsi"/>
-          <w:lang w:val="en-NZ"/>
-        </w:rPr>
-        <w:t>Limits of the design</w:t>
-      </w:r>
-    </w:p>
-    <w:p>
-      <w:pPr>
-        <w:pStyle w:val="Heading1"/>
+      <w:r>
+        <w:rPr>
+          <w:rFonts w:cstheme="minorHAnsi"/>
+          <w:lang w:val="en-NZ"/>
+        </w:rPr>
+        <w:t xml:space="preserve"> inside the cohort of the course will be guided by convenience and the disposition of the students to participate in the research, since is important to prioritize their academical work and minimize the disruptions to the classroom. Observation will be organized in singular work session that the students will be asked to participate in. Each work session will be guided by the students themselves, setting the goals of the session by the any need the have during that instance of development of their project. The observation will try to focus different aspect of the course that had not be observed and show the students different aspect of the AR tool one functionality at a time, facilitating their involvement in the observation and helping with the iterative development of the software. If possible, the observation will try to </w:t>
+      </w:r>
+      <w:r>
+        <w:rPr>
+          <w:rFonts w:cstheme="minorHAnsi"/>
+          <w:lang w:val="en-NZ"/>
+        </w:rPr>
+        <w:t>gather</w:t>
+      </w:r>
+      <w:r>
+        <w:rPr>
+          <w:rFonts w:cstheme="minorHAnsi"/>
+          <w:lang w:val="en-NZ"/>
+        </w:rPr>
+        <w:t xml:space="preserve"> work session focused on:</w:t>
+      </w:r>
+    </w:p>
+    <w:p>
+      <w:pPr>
+        <w:pStyle w:val="Prrafodelista"/>
+        <w:numPr>
+          <w:ilvl w:val="0"/>
+          <w:numId w:val="4"/>
+        </w:numPr>
+        <w:rPr>
+          <w:rFonts w:cstheme="minorHAnsi"/>
+          <w:lang w:val="en-NZ"/>
+        </w:rPr>
+      </w:pPr>
+      <w:r>
+        <w:rPr>
+          <w:rFonts w:cstheme="minorHAnsi"/>
+          <w:lang w:val="en-NZ"/>
+        </w:rPr>
+        <w:t>The initial contact and formation of the group.</w:t>
+      </w:r>
+    </w:p>
+    <w:p>
+      <w:pPr>
+        <w:pStyle w:val="Prrafodelista"/>
+        <w:numPr>
+          <w:ilvl w:val="0"/>
+          <w:numId w:val="4"/>
+        </w:numPr>
+        <w:rPr>
+          <w:rFonts w:cstheme="minorHAnsi"/>
+          <w:lang w:val="en-NZ"/>
+        </w:rPr>
+      </w:pPr>
+      <w:r>
+        <w:rPr>
+          <w:rFonts w:cstheme="minorHAnsi"/>
+          <w:lang w:val="en-NZ"/>
+        </w:rPr>
+        <w:t>Understanding the project and gathering information about it.</w:t>
+      </w:r>
+    </w:p>
+    <w:p>
+      <w:pPr>
+        <w:pStyle w:val="Prrafodelista"/>
+        <w:numPr>
+          <w:ilvl w:val="0"/>
+          <w:numId w:val="4"/>
+        </w:numPr>
+        <w:rPr>
+          <w:rFonts w:cstheme="minorHAnsi"/>
+          <w:lang w:val="en-NZ"/>
+        </w:rPr>
+      </w:pPr>
+      <w:r>
+        <w:rPr>
+          <w:rFonts w:cstheme="minorHAnsi"/>
+          <w:lang w:val="en-NZ"/>
+        </w:rPr>
+        <w:t>The initial design proposal and the flow of information between the different roles in the group.</w:t>
+      </w:r>
+    </w:p>
+    <w:p>
+      <w:pPr>
+        <w:pStyle w:val="Prrafodelista"/>
+        <w:numPr>
+          <w:ilvl w:val="0"/>
+          <w:numId w:val="4"/>
+        </w:numPr>
+        <w:rPr>
+          <w:rFonts w:cstheme="minorHAnsi"/>
+          <w:lang w:val="en-NZ"/>
+        </w:rPr>
+      </w:pPr>
+      <w:r>
+        <w:rPr>
+          <w:rFonts w:cstheme="minorHAnsi"/>
+          <w:lang w:val="en-NZ"/>
+        </w:rPr>
+        <w:t>The creation of material for the project</w:t>
+      </w:r>
+    </w:p>
+    <w:p>
+      <w:pPr>
+        <w:pStyle w:val="Prrafodelista"/>
+        <w:numPr>
+          <w:ilvl w:val="0"/>
+          <w:numId w:val="4"/>
+        </w:numPr>
+        <w:rPr>
+          <w:rFonts w:cstheme="minorHAnsi"/>
+          <w:lang w:val="en-NZ"/>
+        </w:rPr>
+      </w:pPr>
+      <w:r>
+        <w:rPr>
+          <w:rFonts w:cstheme="minorHAnsi"/>
+          <w:lang w:val="en-NZ"/>
+        </w:rPr>
+        <w:t>Evaluation and correction of the material created based on the feedback of the teaching staff.</w:t>
+      </w:r>
+    </w:p>
+    <w:p>
+      <w:pPr>
+        <w:pStyle w:val="Prrafodelista"/>
+        <w:numPr>
+          <w:ilvl w:val="0"/>
+          <w:numId w:val="4"/>
+        </w:numPr>
+        <w:rPr>
+          <w:rFonts w:cstheme="minorHAnsi"/>
+          <w:lang w:val="en-NZ"/>
+        </w:rPr>
+      </w:pPr>
+      <w:r>
+        <w:rPr>
+          <w:rFonts w:cstheme="minorHAnsi"/>
+          <w:lang w:val="en-NZ"/>
+        </w:rPr>
+        <w:t>A final evaluation of the work done by the group at the end of the project.</w:t>
+      </w:r>
+    </w:p>
+    <w:p>
+      <w:pPr>
+        <w:rPr>
+          <w:rFonts w:cstheme="minorHAnsi"/>
+          <w:lang w:val="en-NZ"/>
+        </w:rPr>
+      </w:pPr>
+      <w:r>
+        <w:rPr>
+          <w:rFonts w:cstheme="minorHAnsi"/>
+          <w:lang w:val="en-NZ"/>
+        </w:rPr>
+        <w:t xml:space="preserve">Ideally, the observations can gather instances of these activities of the course for groups using the AR tool and other working as their normally would. The observations themselves will gather data of the students work using mainly audio and video recordings, as well as the personal notes of the researcher. Data will be initially organized based on the week it was taken (to determine the overall development stage of the course’s project), the composition of the group observed and the functionality of the AR tool that was </w:t>
+      </w:r>
+      <w:r>
+        <w:rPr>
+          <w:rFonts w:cstheme="minorHAnsi"/>
+          <w:lang w:val="en-NZ"/>
+        </w:rPr>
+        <w:t>prioritized</w:t>
+      </w:r>
+      <w:r>
+        <w:rPr>
+          <w:rFonts w:cstheme="minorHAnsi"/>
+          <w:lang w:val="en-NZ"/>
+        </w:rPr>
+        <w:t>.</w:t>
+      </w:r>
+    </w:p>
+    <w:p>
+      <w:pPr>
+        <w:rPr>
+          <w:rFonts w:cstheme="minorHAnsi"/>
+          <w:lang w:val="en-NZ"/>
+        </w:rPr>
+      </w:pPr>
+      <w:r>
+        <w:rPr>
+          <w:rFonts w:cstheme="minorHAnsi"/>
+          <w:lang w:val="en-NZ"/>
+        </w:rPr>
+        <w:t>There are clear limits and constraints inherent to the research methodology chosen that are important to acknowledge and that will affect the results obtained:</w:t>
+      </w:r>
+    </w:p>
+    <w:p>
+      <w:pPr>
+        <w:pStyle w:val="Prrafodelista"/>
+        <w:numPr>
+          <w:ilvl w:val="0"/>
+          <w:numId w:val="5"/>
+        </w:numPr>
+        <w:rPr>
+          <w:rFonts w:cstheme="minorHAnsi"/>
+          <w:lang w:val="en-NZ"/>
+        </w:rPr>
+      </w:pPr>
+      <w:r>
+        <w:rPr>
+          <w:rFonts w:cstheme="minorHAnsi"/>
+          <w:lang w:val="en-NZ"/>
+        </w:rPr>
+        <w:t>Case studies difficult process of generalization and extrapolation. The results obtained through this project will be linked mainly to the case study selected and its unique characteristics. An important effort was done to select a case study that uses all the elements of collaborative learning needed for this research, as well as presenting a unique an interesting scenario which provide interesting and valuable insights that can be used in future research.</w:t>
+      </w:r>
+    </w:p>
+    <w:p>
+      <w:pPr>
+        <w:pStyle w:val="Prrafodelista"/>
+        <w:numPr>
+          <w:ilvl w:val="0"/>
+          <w:numId w:val="5"/>
+        </w:numPr>
+        <w:rPr>
+          <w:rFonts w:cstheme="minorHAnsi"/>
+          <w:lang w:val="en-NZ"/>
+        </w:rPr>
+      </w:pPr>
+      <w:r>
+        <w:rPr>
+          <w:rFonts w:cstheme="minorHAnsi"/>
+          <w:lang w:val="en-NZ"/>
+        </w:rPr>
+        <w:t xml:space="preserve">The time constraints of the project cause the data point to reflect only one cohort of the course. Though it was possible to follow the whole development of the course, comparison among other cohorts would minimize the noise generated from difficulties </w:t>
+      </w:r>
+      <w:r>
+        <w:rPr>
+          <w:rFonts w:cstheme="minorHAnsi"/>
+          <w:lang w:val="en-NZ"/>
+        </w:rPr>
+        <w:lastRenderedPageBreak/>
+        <w:t>and circumstances present in this instance of the course that could have affected in a negative way the observations obtained.</w:t>
+      </w:r>
+    </w:p>
+    <w:p>
+      <w:pPr>
+        <w:pStyle w:val="Prrafodelista"/>
+        <w:numPr>
+          <w:ilvl w:val="0"/>
+          <w:numId w:val="5"/>
+        </w:numPr>
+        <w:rPr>
+          <w:rFonts w:cstheme="minorHAnsi"/>
+          <w:lang w:val="en-NZ"/>
+        </w:rPr>
+      </w:pPr>
+      <w:r>
+        <w:rPr>
+          <w:rFonts w:cstheme="minorHAnsi"/>
+          <w:lang w:val="en-NZ"/>
+        </w:rPr>
+        <w:t>The prototyping nature of the technological intervention also causes that a good deal of noise generated from the friction with learning and using the tool will affect in some way the observations, stealing the spotlight form certain aspect of the educational design that are very sensitive to that kind of disruptions.</w:t>
+      </w:r>
+    </w:p>
+    <w:p>
+      <w:pPr>
+        <w:pStyle w:val="Prrafodelista"/>
+        <w:numPr>
+          <w:ilvl w:val="0"/>
+          <w:numId w:val="5"/>
+        </w:numPr>
+        <w:rPr>
+          <w:rFonts w:cstheme="minorHAnsi"/>
+          <w:lang w:val="en-NZ"/>
+        </w:rPr>
+      </w:pPr>
+      <w:r>
+        <w:rPr>
+          <w:rFonts w:cstheme="minorHAnsi"/>
+          <w:lang w:val="en-NZ"/>
+        </w:rPr>
+        <w:t>The predominance of qualitative data generated from this study needs to be interpreted and contextualized. In the same way, the focus on behaviour and underlaying mechanism of social activities makes it impossible to create answers and observations that are not subjective in nature and marked by the own biases of the researcher. An important effort is done to separate the observations form the analysis. The interpretation of the researcher will be well documented, but hopefully this research will also offer the opportunity for future work to recontextualize and offer different views to the data obtained and documented here.</w:t>
+      </w:r>
+    </w:p>
+    <w:p>
+      <w:pPr>
+        <w:pStyle w:val="Ttulo1"/>
         <w:spacing w:before="280" w:after="280"/>
         <w:rPr>
-          <w:rFonts w:ascii="Calibri" w:hAnsi="Calibri" w:cs="Calibri" w:asciiTheme="minorHAnsi" w:cstheme="minorHAnsi" w:hAnsiTheme="minorHAnsi"/>
+          <w:rFonts w:asciiTheme="minorHAnsi" w:hAnsiTheme="minorHAnsi" w:cstheme="minorHAnsi"/>
           <w:sz w:val="22"/>
           <w:szCs w:val="22"/>
           <w:lang w:val="en-NZ"/>
@@ -603,7 +1357,7 @@
       </w:pPr>
       <w:r>
         <w:rPr>
-          <w:rFonts w:cs="Calibri" w:ascii="Calibri" w:hAnsi="Calibri" w:asciiTheme="minorHAnsi" w:cstheme="minorHAnsi" w:hAnsiTheme="minorHAnsi"/>
+          <w:rFonts w:asciiTheme="minorHAnsi" w:hAnsiTheme="minorHAnsi" w:cstheme="minorHAnsi"/>
           <w:sz w:val="22"/>
           <w:szCs w:val="22"/>
           <w:lang w:val="en-NZ"/>
@@ -613,10 +1367,10 @@
     </w:p>
     <w:p>
       <w:pPr>
-        <w:pStyle w:val="Heading2"/>
+        <w:pStyle w:val="Ttulo2"/>
         <w:spacing w:before="280" w:after="280"/>
         <w:rPr>
-          <w:rFonts w:ascii="Calibri" w:hAnsi="Calibri" w:cs="Calibri" w:asciiTheme="minorHAnsi" w:cstheme="minorHAnsi" w:hAnsiTheme="minorHAnsi"/>
+          <w:rFonts w:asciiTheme="minorHAnsi" w:hAnsiTheme="minorHAnsi" w:cstheme="minorHAnsi"/>
           <w:sz w:val="22"/>
           <w:szCs w:val="22"/>
           <w:lang w:val="en-NZ"/>
@@ -624,7 +1378,7 @@
       </w:pPr>
       <w:r>
         <w:rPr>
-          <w:rFonts w:cs="Calibri" w:ascii="Calibri" w:hAnsi="Calibri" w:asciiTheme="minorHAnsi" w:cstheme="minorHAnsi" w:hAnsiTheme="minorHAnsi"/>
+          <w:rFonts w:asciiTheme="minorHAnsi" w:hAnsiTheme="minorHAnsi" w:cstheme="minorHAnsi"/>
           <w:sz w:val="22"/>
           <w:szCs w:val="22"/>
           <w:lang w:val="en-NZ"/>
@@ -634,9 +1388,9 @@
     </w:p>
     <w:p>
       <w:pPr>
-        <w:pStyle w:val="Heading3"/>
-        <w:rPr>
-          <w:rFonts w:ascii="Calibri" w:hAnsi="Calibri" w:cs="Calibri" w:asciiTheme="minorHAnsi" w:cstheme="minorHAnsi" w:hAnsiTheme="minorHAnsi"/>
+        <w:pStyle w:val="Ttulo3"/>
+        <w:rPr>
+          <w:rFonts w:asciiTheme="minorHAnsi" w:hAnsiTheme="minorHAnsi" w:cstheme="minorHAnsi"/>
           <w:sz w:val="22"/>
           <w:szCs w:val="22"/>
           <w:lang w:val="en-NZ"/>
@@ -644,7 +1398,7 @@
       </w:pPr>
       <w:r>
         <w:rPr>
-          <w:rFonts w:cs="Calibri" w:ascii="Calibri" w:hAnsi="Calibri" w:asciiTheme="minorHAnsi" w:cstheme="minorHAnsi" w:hAnsiTheme="minorHAnsi"/>
+          <w:rFonts w:asciiTheme="minorHAnsi" w:hAnsiTheme="minorHAnsi" w:cstheme="minorHAnsi"/>
           <w:sz w:val="22"/>
           <w:szCs w:val="22"/>
           <w:lang w:val="en-NZ"/>
@@ -654,9 +1408,9 @@
     </w:p>
     <w:p>
       <w:pPr>
-        <w:pStyle w:val="Heading3"/>
-        <w:rPr>
-          <w:rFonts w:ascii="Calibri" w:hAnsi="Calibri" w:cs="Calibri" w:asciiTheme="minorHAnsi" w:cstheme="minorHAnsi" w:hAnsiTheme="minorHAnsi"/>
+        <w:pStyle w:val="Ttulo3"/>
+        <w:rPr>
+          <w:rFonts w:asciiTheme="minorHAnsi" w:hAnsiTheme="minorHAnsi" w:cstheme="minorHAnsi"/>
           <w:sz w:val="22"/>
           <w:szCs w:val="22"/>
           <w:lang w:val="en-NZ"/>
@@ -664,7 +1418,7 @@
       </w:pPr>
       <w:r>
         <w:rPr>
-          <w:rFonts w:cs="Calibri" w:ascii="Calibri" w:hAnsi="Calibri" w:asciiTheme="minorHAnsi" w:cstheme="minorHAnsi" w:hAnsiTheme="minorHAnsi"/>
+          <w:rFonts w:asciiTheme="minorHAnsi" w:hAnsiTheme="minorHAnsi" w:cstheme="minorHAnsi"/>
           <w:sz w:val="22"/>
           <w:szCs w:val="22"/>
           <w:lang w:val="en-NZ"/>
@@ -674,9 +1428,9 @@
     </w:p>
     <w:p>
       <w:pPr>
-        <w:pStyle w:val="Heading3"/>
-        <w:rPr>
-          <w:rFonts w:ascii="Calibri" w:hAnsi="Calibri" w:cs="Calibri" w:asciiTheme="minorHAnsi" w:cstheme="minorHAnsi" w:hAnsiTheme="minorHAnsi"/>
+        <w:pStyle w:val="Ttulo3"/>
+        <w:rPr>
+          <w:rFonts w:asciiTheme="minorHAnsi" w:hAnsiTheme="minorHAnsi" w:cstheme="minorHAnsi"/>
           <w:sz w:val="22"/>
           <w:szCs w:val="22"/>
           <w:lang w:val="en-NZ"/>
@@ -684,7 +1438,7 @@
       </w:pPr>
       <w:r>
         <w:rPr>
-          <w:rFonts w:cs="Calibri" w:ascii="Calibri" w:hAnsi="Calibri" w:asciiTheme="minorHAnsi" w:cstheme="minorHAnsi" w:hAnsiTheme="minorHAnsi"/>
+          <w:rFonts w:asciiTheme="minorHAnsi" w:hAnsiTheme="minorHAnsi" w:cstheme="minorHAnsi"/>
           <w:sz w:val="22"/>
           <w:szCs w:val="22"/>
           <w:lang w:val="en-NZ"/>
@@ -694,10 +1448,10 @@
     </w:p>
     <w:p>
       <w:pPr>
-        <w:pStyle w:val="Heading2"/>
+        <w:pStyle w:val="Ttulo2"/>
         <w:spacing w:before="280" w:after="280"/>
         <w:rPr>
-          <w:rFonts w:ascii="Calibri" w:hAnsi="Calibri" w:cs="Calibri" w:asciiTheme="minorHAnsi" w:cstheme="minorHAnsi" w:hAnsiTheme="minorHAnsi"/>
+          <w:rFonts w:asciiTheme="minorHAnsi" w:hAnsiTheme="minorHAnsi" w:cstheme="minorHAnsi"/>
           <w:sz w:val="22"/>
           <w:szCs w:val="22"/>
           <w:lang w:val="en-NZ"/>
@@ -705,7 +1459,7 @@
       </w:pPr>
       <w:r>
         <w:rPr>
-          <w:rFonts w:cs="Calibri" w:ascii="Calibri" w:hAnsi="Calibri" w:asciiTheme="minorHAnsi" w:cstheme="minorHAnsi" w:hAnsiTheme="minorHAnsi"/>
+          <w:rFonts w:asciiTheme="minorHAnsi" w:hAnsiTheme="minorHAnsi" w:cstheme="minorHAnsi"/>
           <w:sz w:val="22"/>
           <w:szCs w:val="22"/>
           <w:lang w:val="en-NZ"/>
@@ -715,9 +1469,9 @@
     </w:p>
     <w:p>
       <w:pPr>
-        <w:pStyle w:val="Heading3"/>
-        <w:rPr>
-          <w:rFonts w:ascii="Calibri" w:hAnsi="Calibri" w:cs="Calibri" w:asciiTheme="minorHAnsi" w:cstheme="minorHAnsi" w:hAnsiTheme="minorHAnsi"/>
+        <w:pStyle w:val="Ttulo3"/>
+        <w:rPr>
+          <w:rFonts w:asciiTheme="minorHAnsi" w:hAnsiTheme="minorHAnsi" w:cstheme="minorHAnsi"/>
           <w:sz w:val="22"/>
           <w:szCs w:val="22"/>
           <w:lang w:val="en-NZ"/>
@@ -725,40 +1479,39 @@
       </w:pPr>
       <w:r>
         <w:rPr>
-          <w:rFonts w:cs="Calibri" w:ascii="Calibri" w:hAnsi="Calibri" w:asciiTheme="minorHAnsi" w:cstheme="minorHAnsi" w:hAnsiTheme="minorHAnsi"/>
+          <w:rFonts w:asciiTheme="minorHAnsi" w:hAnsiTheme="minorHAnsi" w:cstheme="minorHAnsi"/>
           <w:sz w:val="22"/>
           <w:szCs w:val="22"/>
           <w:lang w:val="en-NZ"/>
         </w:rPr>
-        <w:t>3.3.2.1 User-centered design</w:t>
-      </w:r>
-    </w:p>
-    <w:p>
-      <w:pPr>
-        <w:pStyle w:val="Heading3"/>
-        <w:rPr>
-          <w:rFonts w:ascii="Calibri" w:hAnsi="Calibri" w:cs="Calibri" w:asciiTheme="minorHAnsi" w:cstheme="minorHAnsi" w:hAnsiTheme="minorHAnsi"/>
+        <w:t>3.3.2.1 User-</w:t>
+      </w:r>
+      <w:proofErr w:type="spellStart"/>
+      <w:r>
+        <w:rPr>
+          <w:rFonts w:asciiTheme="minorHAnsi" w:hAnsiTheme="minorHAnsi" w:cstheme="minorHAnsi"/>
           <w:sz w:val="22"/>
           <w:szCs w:val="22"/>
           <w:lang w:val="en-NZ"/>
         </w:rPr>
-      </w:pPr>
-      <w:r>
-        <w:rPr>
-          <w:rFonts w:cs="Calibri" w:ascii="Calibri" w:hAnsi="Calibri" w:asciiTheme="minorHAnsi" w:cstheme="minorHAnsi" w:hAnsiTheme="minorHAnsi"/>
+        <w:t>centered</w:t>
+      </w:r>
+      <w:proofErr w:type="spellEnd"/>
+      <w:r>
+        <w:rPr>
+          <w:rFonts w:asciiTheme="minorHAnsi" w:hAnsiTheme="minorHAnsi" w:cstheme="minorHAnsi"/>
           <w:sz w:val="22"/>
           <w:szCs w:val="22"/>
           <w:lang w:val="en-NZ"/>
         </w:rPr>
-        <w:t>3.3.2.2 Software engineering process</w:t>
-      </w:r>
-    </w:p>
-    <w:p>
-      <w:pPr>
-        <w:pStyle w:val="Heading1"/>
-        <w:spacing w:before="280" w:after="280"/>
-        <w:rPr>
-          <w:rFonts w:ascii="Calibri" w:hAnsi="Calibri" w:cs="Calibri" w:asciiTheme="minorHAnsi" w:cstheme="minorHAnsi" w:hAnsiTheme="minorHAnsi"/>
+        <w:t xml:space="preserve"> design</w:t>
+      </w:r>
+    </w:p>
+    <w:p>
+      <w:pPr>
+        <w:pStyle w:val="Ttulo3"/>
+        <w:rPr>
+          <w:rFonts w:asciiTheme="minorHAnsi" w:hAnsiTheme="minorHAnsi" w:cstheme="minorHAnsi"/>
           <w:sz w:val="22"/>
           <w:szCs w:val="22"/>
           <w:lang w:val="en-NZ"/>
@@ -766,40 +1519,401 @@
       </w:pPr>
       <w:r>
         <w:rPr>
-          <w:rFonts w:cs="Calibri" w:ascii="Calibri" w:hAnsi="Calibri" w:asciiTheme="minorHAnsi" w:cstheme="minorHAnsi" w:hAnsiTheme="minorHAnsi"/>
+          <w:rFonts w:asciiTheme="minorHAnsi" w:hAnsiTheme="minorHAnsi" w:cstheme="minorHAnsi"/>
           <w:sz w:val="22"/>
           <w:szCs w:val="22"/>
           <w:lang w:val="en-NZ"/>
         </w:rPr>
+        <w:t>3.3.2.2 Software engineering process</w:t>
+      </w:r>
+    </w:p>
+    <w:p>
+      <w:pPr>
+        <w:pStyle w:val="Ttulo1"/>
+        <w:spacing w:before="280" w:after="280"/>
+        <w:rPr>
+          <w:rFonts w:asciiTheme="minorHAnsi" w:hAnsiTheme="minorHAnsi" w:cstheme="minorHAnsi"/>
+          <w:sz w:val="22"/>
+          <w:szCs w:val="22"/>
+          <w:lang w:val="en-NZ"/>
+        </w:rPr>
+      </w:pPr>
+      <w:r>
+        <w:rPr>
+          <w:rFonts w:asciiTheme="minorHAnsi" w:hAnsiTheme="minorHAnsi" w:cstheme="minorHAnsi"/>
+          <w:sz w:val="22"/>
+          <w:szCs w:val="22"/>
+          <w:lang w:val="en-NZ"/>
+        </w:rPr>
         <w:t>3.4 Conclusions</w:t>
       </w:r>
     </w:p>
     <w:sectPr>
-      <w:type w:val="nextPage"/>
       <w:pgSz w:w="12240" w:h="15840"/>
-      <w:pgMar w:left="1701" w:right="1701" w:gutter="0" w:header="0" w:top="1417" w:footer="0" w:bottom="1417"/>
-      <w:pgNumType w:fmt="decimal"/>
-      <w:formProt w:val="false"/>
-      <w:textDirection w:val="lrTb"/>
-      <w:docGrid w:type="default" w:linePitch="360" w:charSpace="0"/>
+      <w:pgMar w:top="1417" w:right="1701" w:bottom="1417" w:left="1701" w:header="0" w:footer="0" w:gutter="0"/>
+      <w:cols w:space="720"/>
+      <w:formProt w:val="0"/>
+      <w:docGrid w:linePitch="360"/>
     </w:sectPr>
   </w:body>
 </w:document>
 </file>
 
 <file path=word/numbering.xml><?xml version="1.0" encoding="utf-8"?>
-<w:numbering xmlns:w="http://schemas.openxmlformats.org/wordprocessingml/2006/main" xmlns:o="urn:schemas-microsoft-com:office:office" xmlns:r="http://schemas.openxmlformats.org/officeDocument/2006/relationships" xmlns:v="urn:schemas-microsoft-com:vml" xmlns:mc="http://schemas.openxmlformats.org/markup-compatibility/2006" xmlns:w14="http://schemas.microsoft.com/office/word/2010/wordml" mc:Ignorable="w14">
-  <w:abstractNum w:abstractNumId="1">
+<w:numbering xmlns:wpc="http://schemas.microsoft.com/office/word/2010/wordprocessingCanvas" xmlns:cx="http://schemas.microsoft.com/office/drawing/2014/chartex" xmlns:cx1="http://schemas.microsoft.com/office/drawing/2015/9/8/chartex" xmlns:cx2="http://schemas.microsoft.com/office/drawing/2015/10/21/chartex" xmlns:cx3="http://schemas.microsoft.com/office/drawing/2016/5/9/chartex" xmlns:cx4="http://schemas.microsoft.com/office/drawing/2016/5/10/chartex" xmlns:cx5="http://schemas.microsoft.com/office/drawing/2016/5/11/chartex" xmlns:cx6="http://schemas.microsoft.com/office/drawing/2016/5/12/chartex" xmlns:cx7="http://schemas.microsoft.com/office/drawing/2016/5/13/chartex" xmlns:cx8="http://schemas.microsoft.com/office/drawing/2016/5/14/chartex" xmlns:mc="http://schemas.openxmlformats.org/markup-compatibility/2006" xmlns:aink="http://schemas.microsoft.com/office/drawing/2016/ink" xmlns:am3d="http://schemas.microsoft.com/office/drawing/2017/model3d" xmlns:o="urn:schemas-microsoft-com:office:office" xmlns:oel="http://schemas.microsoft.com/office/2019/extlst" xmlns:r="http://schemas.openxmlformats.org/officeDocument/2006/relationships" xmlns:m="http://schemas.openxmlformats.org/officeDocument/2006/math" xmlns:v="urn:schemas-microsoft-com:vml" xmlns:wp14="http://schemas.microsoft.com/office/word/2010/wordprocessingDrawing" xmlns:wp="http://schemas.openxmlformats.org/drawingml/2006/wordprocessingDrawing" xmlns:w10="urn:schemas-microsoft-com:office:word" xmlns:w="http://schemas.openxmlformats.org/wordprocessingml/2006/main" xmlns:w14="http://schemas.microsoft.com/office/word/2010/wordml" xmlns:w15="http://schemas.microsoft.com/office/word/2012/wordml" xmlns:w16cex="http://schemas.microsoft.com/office/word/2018/wordml/cex" xmlns:w16cid="http://schemas.microsoft.com/office/word/2016/wordml/cid" xmlns:w16="http://schemas.microsoft.com/office/word/2018/wordml" xmlns:w16du="http://schemas.microsoft.com/office/word/2023/wordml/word16du" xmlns:w16sdtdh="http://schemas.microsoft.com/office/word/2020/wordml/sdtdatahash" xmlns:w16sdtfl="http://schemas.microsoft.com/office/word/2024/wordml/sdtformatlock" xmlns:w16se="http://schemas.microsoft.com/office/word/2015/wordml/symex" xmlns:wpg="http://schemas.microsoft.com/office/word/2010/wordprocessingGroup" xmlns:wpi="http://schemas.microsoft.com/office/word/2010/wordprocessingInk" xmlns:wne="http://schemas.microsoft.com/office/word/2006/wordml" xmlns:wps="http://schemas.microsoft.com/office/word/2010/wordprocessingShape" mc:Ignorable="w14 w15 w16se w16cid w16 w16cex w16sdtdh w16sdtfl w16du wp14">
+  <w:abstractNum w:abstractNumId="0" w15:restartNumberingAfterBreak="0">
+    <w:nsid w:val="4A0275F9"/>
+    <w:multiLevelType w:val="hybridMultilevel"/>
+    <w:tmpl w:val="2D36C7EA"/>
+    <w:lvl w:ilvl="0" w:tplc="240A0001">
+      <w:start w:val="1"/>
+      <w:numFmt w:val="bullet"/>
+      <w:lvlText w:val=""/>
+      <w:lvlJc w:val="left"/>
+      <w:pPr>
+        <w:ind w:left="765" w:hanging="360"/>
+      </w:pPr>
+      <w:rPr>
+        <w:rFonts w:ascii="Symbol" w:hAnsi="Symbol" w:hint="default"/>
+      </w:rPr>
+    </w:lvl>
+    <w:lvl w:ilvl="1" w:tplc="240A0003" w:tentative="1">
+      <w:start w:val="1"/>
+      <w:numFmt w:val="bullet"/>
+      <w:lvlText w:val="o"/>
+      <w:lvlJc w:val="left"/>
+      <w:pPr>
+        <w:ind w:left="1485" w:hanging="360"/>
+      </w:pPr>
+      <w:rPr>
+        <w:rFonts w:ascii="Courier New" w:hAnsi="Courier New" w:cs="Courier New" w:hint="default"/>
+      </w:rPr>
+    </w:lvl>
+    <w:lvl w:ilvl="2" w:tplc="240A0005" w:tentative="1">
+      <w:start w:val="1"/>
+      <w:numFmt w:val="bullet"/>
+      <w:lvlText w:val=""/>
+      <w:lvlJc w:val="left"/>
+      <w:pPr>
+        <w:ind w:left="2205" w:hanging="360"/>
+      </w:pPr>
+      <w:rPr>
+        <w:rFonts w:ascii="Wingdings" w:hAnsi="Wingdings" w:hint="default"/>
+      </w:rPr>
+    </w:lvl>
+    <w:lvl w:ilvl="3" w:tplc="240A0001" w:tentative="1">
+      <w:start w:val="1"/>
+      <w:numFmt w:val="bullet"/>
+      <w:lvlText w:val=""/>
+      <w:lvlJc w:val="left"/>
+      <w:pPr>
+        <w:ind w:left="2925" w:hanging="360"/>
+      </w:pPr>
+      <w:rPr>
+        <w:rFonts w:ascii="Symbol" w:hAnsi="Symbol" w:hint="default"/>
+      </w:rPr>
+    </w:lvl>
+    <w:lvl w:ilvl="4" w:tplc="240A0003" w:tentative="1">
+      <w:start w:val="1"/>
+      <w:numFmt w:val="bullet"/>
+      <w:lvlText w:val="o"/>
+      <w:lvlJc w:val="left"/>
+      <w:pPr>
+        <w:ind w:left="3645" w:hanging="360"/>
+      </w:pPr>
+      <w:rPr>
+        <w:rFonts w:ascii="Courier New" w:hAnsi="Courier New" w:cs="Courier New" w:hint="default"/>
+      </w:rPr>
+    </w:lvl>
+    <w:lvl w:ilvl="5" w:tplc="240A0005" w:tentative="1">
+      <w:start w:val="1"/>
+      <w:numFmt w:val="bullet"/>
+      <w:lvlText w:val=""/>
+      <w:lvlJc w:val="left"/>
+      <w:pPr>
+        <w:ind w:left="4365" w:hanging="360"/>
+      </w:pPr>
+      <w:rPr>
+        <w:rFonts w:ascii="Wingdings" w:hAnsi="Wingdings" w:hint="default"/>
+      </w:rPr>
+    </w:lvl>
+    <w:lvl w:ilvl="6" w:tplc="240A0001" w:tentative="1">
+      <w:start w:val="1"/>
+      <w:numFmt w:val="bullet"/>
+      <w:lvlText w:val=""/>
+      <w:lvlJc w:val="left"/>
+      <w:pPr>
+        <w:ind w:left="5085" w:hanging="360"/>
+      </w:pPr>
+      <w:rPr>
+        <w:rFonts w:ascii="Symbol" w:hAnsi="Symbol" w:hint="default"/>
+      </w:rPr>
+    </w:lvl>
+    <w:lvl w:ilvl="7" w:tplc="240A0003" w:tentative="1">
+      <w:start w:val="1"/>
+      <w:numFmt w:val="bullet"/>
+      <w:lvlText w:val="o"/>
+      <w:lvlJc w:val="left"/>
+      <w:pPr>
+        <w:ind w:left="5805" w:hanging="360"/>
+      </w:pPr>
+      <w:rPr>
+        <w:rFonts w:ascii="Courier New" w:hAnsi="Courier New" w:cs="Courier New" w:hint="default"/>
+      </w:rPr>
+    </w:lvl>
+    <w:lvl w:ilvl="8" w:tplc="240A0005" w:tentative="1">
+      <w:start w:val="1"/>
+      <w:numFmt w:val="bullet"/>
+      <w:lvlText w:val=""/>
+      <w:lvlJc w:val="left"/>
+      <w:pPr>
+        <w:ind w:left="6525" w:hanging="360"/>
+      </w:pPr>
+      <w:rPr>
+        <w:rFonts w:ascii="Wingdings" w:hAnsi="Wingdings" w:hint="default"/>
+      </w:rPr>
+    </w:lvl>
+  </w:abstractNum>
+  <w:abstractNum w:abstractNumId="1" w15:restartNumberingAfterBreak="0">
+    <w:nsid w:val="50AE5D78"/>
+    <w:multiLevelType w:val="hybridMultilevel"/>
+    <w:tmpl w:val="2D1617CC"/>
+    <w:lvl w:ilvl="0" w:tplc="240A0001">
+      <w:start w:val="1"/>
+      <w:numFmt w:val="bullet"/>
+      <w:lvlText w:val=""/>
+      <w:lvlJc w:val="left"/>
+      <w:pPr>
+        <w:ind w:left="720" w:hanging="360"/>
+      </w:pPr>
+      <w:rPr>
+        <w:rFonts w:ascii="Symbol" w:hAnsi="Symbol" w:hint="default"/>
+      </w:rPr>
+    </w:lvl>
+    <w:lvl w:ilvl="1" w:tplc="240A0003" w:tentative="1">
+      <w:start w:val="1"/>
+      <w:numFmt w:val="bullet"/>
+      <w:lvlText w:val="o"/>
+      <w:lvlJc w:val="left"/>
+      <w:pPr>
+        <w:ind w:left="1440" w:hanging="360"/>
+      </w:pPr>
+      <w:rPr>
+        <w:rFonts w:ascii="Courier New" w:hAnsi="Courier New" w:cs="Courier New" w:hint="default"/>
+      </w:rPr>
+    </w:lvl>
+    <w:lvl w:ilvl="2" w:tplc="240A0005" w:tentative="1">
+      <w:start w:val="1"/>
+      <w:numFmt w:val="bullet"/>
+      <w:lvlText w:val=""/>
+      <w:lvlJc w:val="left"/>
+      <w:pPr>
+        <w:ind w:left="2160" w:hanging="360"/>
+      </w:pPr>
+      <w:rPr>
+        <w:rFonts w:ascii="Wingdings" w:hAnsi="Wingdings" w:hint="default"/>
+      </w:rPr>
+    </w:lvl>
+    <w:lvl w:ilvl="3" w:tplc="240A0001" w:tentative="1">
+      <w:start w:val="1"/>
+      <w:numFmt w:val="bullet"/>
+      <w:lvlText w:val=""/>
+      <w:lvlJc w:val="left"/>
+      <w:pPr>
+        <w:ind w:left="2880" w:hanging="360"/>
+      </w:pPr>
+      <w:rPr>
+        <w:rFonts w:ascii="Symbol" w:hAnsi="Symbol" w:hint="default"/>
+      </w:rPr>
+    </w:lvl>
+    <w:lvl w:ilvl="4" w:tplc="240A0003" w:tentative="1">
+      <w:start w:val="1"/>
+      <w:numFmt w:val="bullet"/>
+      <w:lvlText w:val="o"/>
+      <w:lvlJc w:val="left"/>
+      <w:pPr>
+        <w:ind w:left="3600" w:hanging="360"/>
+      </w:pPr>
+      <w:rPr>
+        <w:rFonts w:ascii="Courier New" w:hAnsi="Courier New" w:cs="Courier New" w:hint="default"/>
+      </w:rPr>
+    </w:lvl>
+    <w:lvl w:ilvl="5" w:tplc="240A0005" w:tentative="1">
+      <w:start w:val="1"/>
+      <w:numFmt w:val="bullet"/>
+      <w:lvlText w:val=""/>
+      <w:lvlJc w:val="left"/>
+      <w:pPr>
+        <w:ind w:left="4320" w:hanging="360"/>
+      </w:pPr>
+      <w:rPr>
+        <w:rFonts w:ascii="Wingdings" w:hAnsi="Wingdings" w:hint="default"/>
+      </w:rPr>
+    </w:lvl>
+    <w:lvl w:ilvl="6" w:tplc="240A0001" w:tentative="1">
+      <w:start w:val="1"/>
+      <w:numFmt w:val="bullet"/>
+      <w:lvlText w:val=""/>
+      <w:lvlJc w:val="left"/>
+      <w:pPr>
+        <w:ind w:left="5040" w:hanging="360"/>
+      </w:pPr>
+      <w:rPr>
+        <w:rFonts w:ascii="Symbol" w:hAnsi="Symbol" w:hint="default"/>
+      </w:rPr>
+    </w:lvl>
+    <w:lvl w:ilvl="7" w:tplc="240A0003" w:tentative="1">
+      <w:start w:val="1"/>
+      <w:numFmt w:val="bullet"/>
+      <w:lvlText w:val="o"/>
+      <w:lvlJc w:val="left"/>
+      <w:pPr>
+        <w:ind w:left="5760" w:hanging="360"/>
+      </w:pPr>
+      <w:rPr>
+        <w:rFonts w:ascii="Courier New" w:hAnsi="Courier New" w:cs="Courier New" w:hint="default"/>
+      </w:rPr>
+    </w:lvl>
+    <w:lvl w:ilvl="8" w:tplc="240A0005" w:tentative="1">
+      <w:start w:val="1"/>
+      <w:numFmt w:val="bullet"/>
+      <w:lvlText w:val=""/>
+      <w:lvlJc w:val="left"/>
+      <w:pPr>
+        <w:ind w:left="6480" w:hanging="360"/>
+      </w:pPr>
+      <w:rPr>
+        <w:rFonts w:ascii="Wingdings" w:hAnsi="Wingdings" w:hint="default"/>
+      </w:rPr>
+    </w:lvl>
+  </w:abstractNum>
+  <w:abstractNum w:abstractNumId="2" w15:restartNumberingAfterBreak="0">
+    <w:nsid w:val="60B2553B"/>
+    <w:multiLevelType w:val="hybridMultilevel"/>
+    <w:tmpl w:val="256E472A"/>
+    <w:lvl w:ilvl="0" w:tplc="240A0001">
+      <w:start w:val="1"/>
+      <w:numFmt w:val="bullet"/>
+      <w:lvlText w:val=""/>
+      <w:lvlJc w:val="left"/>
+      <w:pPr>
+        <w:ind w:left="765" w:hanging="360"/>
+      </w:pPr>
+      <w:rPr>
+        <w:rFonts w:ascii="Symbol" w:hAnsi="Symbol" w:hint="default"/>
+      </w:rPr>
+    </w:lvl>
+    <w:lvl w:ilvl="1" w:tplc="240A0003" w:tentative="1">
+      <w:start w:val="1"/>
+      <w:numFmt w:val="bullet"/>
+      <w:lvlText w:val="o"/>
+      <w:lvlJc w:val="left"/>
+      <w:pPr>
+        <w:ind w:left="1485" w:hanging="360"/>
+      </w:pPr>
+      <w:rPr>
+        <w:rFonts w:ascii="Courier New" w:hAnsi="Courier New" w:cs="Courier New" w:hint="default"/>
+      </w:rPr>
+    </w:lvl>
+    <w:lvl w:ilvl="2" w:tplc="240A0005" w:tentative="1">
+      <w:start w:val="1"/>
+      <w:numFmt w:val="bullet"/>
+      <w:lvlText w:val=""/>
+      <w:lvlJc w:val="left"/>
+      <w:pPr>
+        <w:ind w:left="2205" w:hanging="360"/>
+      </w:pPr>
+      <w:rPr>
+        <w:rFonts w:ascii="Wingdings" w:hAnsi="Wingdings" w:hint="default"/>
+      </w:rPr>
+    </w:lvl>
+    <w:lvl w:ilvl="3" w:tplc="240A0001" w:tentative="1">
+      <w:start w:val="1"/>
+      <w:numFmt w:val="bullet"/>
+      <w:lvlText w:val=""/>
+      <w:lvlJc w:val="left"/>
+      <w:pPr>
+        <w:ind w:left="2925" w:hanging="360"/>
+      </w:pPr>
+      <w:rPr>
+        <w:rFonts w:ascii="Symbol" w:hAnsi="Symbol" w:hint="default"/>
+      </w:rPr>
+    </w:lvl>
+    <w:lvl w:ilvl="4" w:tplc="240A0003" w:tentative="1">
+      <w:start w:val="1"/>
+      <w:numFmt w:val="bullet"/>
+      <w:lvlText w:val="o"/>
+      <w:lvlJc w:val="left"/>
+      <w:pPr>
+        <w:ind w:left="3645" w:hanging="360"/>
+      </w:pPr>
+      <w:rPr>
+        <w:rFonts w:ascii="Courier New" w:hAnsi="Courier New" w:cs="Courier New" w:hint="default"/>
+      </w:rPr>
+    </w:lvl>
+    <w:lvl w:ilvl="5" w:tplc="240A0005" w:tentative="1">
+      <w:start w:val="1"/>
+      <w:numFmt w:val="bullet"/>
+      <w:lvlText w:val=""/>
+      <w:lvlJc w:val="left"/>
+      <w:pPr>
+        <w:ind w:left="4365" w:hanging="360"/>
+      </w:pPr>
+      <w:rPr>
+        <w:rFonts w:ascii="Wingdings" w:hAnsi="Wingdings" w:hint="default"/>
+      </w:rPr>
+    </w:lvl>
+    <w:lvl w:ilvl="6" w:tplc="240A0001" w:tentative="1">
+      <w:start w:val="1"/>
+      <w:numFmt w:val="bullet"/>
+      <w:lvlText w:val=""/>
+      <w:lvlJc w:val="left"/>
+      <w:pPr>
+        <w:ind w:left="5085" w:hanging="360"/>
+      </w:pPr>
+      <w:rPr>
+        <w:rFonts w:ascii="Symbol" w:hAnsi="Symbol" w:hint="default"/>
+      </w:rPr>
+    </w:lvl>
+    <w:lvl w:ilvl="7" w:tplc="240A0003" w:tentative="1">
+      <w:start w:val="1"/>
+      <w:numFmt w:val="bullet"/>
+      <w:lvlText w:val="o"/>
+      <w:lvlJc w:val="left"/>
+      <w:pPr>
+        <w:ind w:left="5805" w:hanging="360"/>
+      </w:pPr>
+      <w:rPr>
+        <w:rFonts w:ascii="Courier New" w:hAnsi="Courier New" w:cs="Courier New" w:hint="default"/>
+      </w:rPr>
+    </w:lvl>
+    <w:lvl w:ilvl="8" w:tplc="240A0005" w:tentative="1">
+      <w:start w:val="1"/>
+      <w:numFmt w:val="bullet"/>
+      <w:lvlText w:val=""/>
+      <w:lvlJc w:val="left"/>
+      <w:pPr>
+        <w:ind w:left="6525" w:hanging="360"/>
+      </w:pPr>
+      <w:rPr>
+        <w:rFonts w:ascii="Wingdings" w:hAnsi="Wingdings" w:hint="default"/>
+      </w:rPr>
+    </w:lvl>
+  </w:abstractNum>
+  <w:abstractNum w:abstractNumId="3" w15:restartNumberingAfterBreak="0">
+    <w:nsid w:val="7AA678B3"/>
+    <w:multiLevelType w:val="multilevel"/>
+    <w:tmpl w:val="9F4A76D2"/>
     <w:lvl w:ilvl="0">
       <w:start w:val="1"/>
       <w:numFmt w:val="bullet"/>
       <w:lvlText w:val=""/>
-      <w:lvlJc w:val="start"/>
+      <w:lvlJc w:val="left"/>
       <w:pPr>
         <w:tabs>
           <w:tab w:val="num" w:pos="0"/>
         </w:tabs>
-        <w:ind w:start="720" w:hanging="360"/>
+        <w:ind w:left="720" w:hanging="360"/>
       </w:pPr>
       <w:rPr>
         <w:rFonts w:ascii="Symbol" w:hAnsi="Symbol" w:cs="Symbol" w:hint="default"/>
@@ -809,12 +1923,12 @@
       <w:start w:val="1"/>
       <w:numFmt w:val="bullet"/>
       <w:lvlText w:val="o"/>
-      <w:lvlJc w:val="start"/>
+      <w:lvlJc w:val="left"/>
       <w:pPr>
         <w:tabs>
           <w:tab w:val="num" w:pos="0"/>
         </w:tabs>
-        <w:ind w:start="1440" w:hanging="360"/>
+        <w:ind w:left="1440" w:hanging="360"/>
       </w:pPr>
       <w:rPr>
         <w:rFonts w:ascii="Courier New" w:hAnsi="Courier New" w:cs="Courier New" w:hint="default"/>
@@ -824,12 +1938,12 @@
       <w:start w:val="1"/>
       <w:numFmt w:val="bullet"/>
       <w:lvlText w:val=""/>
-      <w:lvlJc w:val="start"/>
+      <w:lvlJc w:val="left"/>
       <w:pPr>
         <w:tabs>
           <w:tab w:val="num" w:pos="0"/>
         </w:tabs>
-        <w:ind w:start="2160" w:hanging="360"/>
+        <w:ind w:left="2160" w:hanging="360"/>
       </w:pPr>
       <w:rPr>
         <w:rFonts w:ascii="Wingdings" w:hAnsi="Wingdings" w:cs="Wingdings" w:hint="default"/>
@@ -839,12 +1953,12 @@
       <w:start w:val="1"/>
       <w:numFmt w:val="bullet"/>
       <w:lvlText w:val=""/>
-      <w:lvlJc w:val="start"/>
+      <w:lvlJc w:val="left"/>
       <w:pPr>
         <w:tabs>
           <w:tab w:val="num" w:pos="0"/>
         </w:tabs>
-        <w:ind w:start="2880" w:hanging="360"/>
+        <w:ind w:left="2880" w:hanging="360"/>
       </w:pPr>
       <w:rPr>
         <w:rFonts w:ascii="Symbol" w:hAnsi="Symbol" w:cs="Symbol" w:hint="default"/>
@@ -854,12 +1968,12 @@
       <w:start w:val="1"/>
       <w:numFmt w:val="bullet"/>
       <w:lvlText w:val="o"/>
-      <w:lvlJc w:val="start"/>
+      <w:lvlJc w:val="left"/>
       <w:pPr>
         <w:tabs>
           <w:tab w:val="num" w:pos="0"/>
         </w:tabs>
-        <w:ind w:start="3600" w:hanging="360"/>
+        <w:ind w:left="3600" w:hanging="360"/>
       </w:pPr>
       <w:rPr>
         <w:rFonts w:ascii="Courier New" w:hAnsi="Courier New" w:cs="Courier New" w:hint="default"/>
@@ -869,12 +1983,12 @@
       <w:start w:val="1"/>
       <w:numFmt w:val="bullet"/>
       <w:lvlText w:val=""/>
-      <w:lvlJc w:val="start"/>
+      <w:lvlJc w:val="left"/>
       <w:pPr>
         <w:tabs>
           <w:tab w:val="num" w:pos="0"/>
         </w:tabs>
-        <w:ind w:start="4320" w:hanging="360"/>
+        <w:ind w:left="4320" w:hanging="360"/>
       </w:pPr>
       <w:rPr>
         <w:rFonts w:ascii="Wingdings" w:hAnsi="Wingdings" w:cs="Wingdings" w:hint="default"/>
@@ -884,12 +1998,12 @@
       <w:start w:val="1"/>
       <w:numFmt w:val="bullet"/>
       <w:lvlText w:val=""/>
-      <w:lvlJc w:val="start"/>
+      <w:lvlJc w:val="left"/>
       <w:pPr>
         <w:tabs>
           <w:tab w:val="num" w:pos="0"/>
         </w:tabs>
-        <w:ind w:start="5040" w:hanging="360"/>
+        <w:ind w:left="5040" w:hanging="360"/>
       </w:pPr>
       <w:rPr>
         <w:rFonts w:ascii="Symbol" w:hAnsi="Symbol" w:cs="Symbol" w:hint="default"/>
@@ -899,12 +2013,12 @@
       <w:start w:val="1"/>
       <w:numFmt w:val="bullet"/>
       <w:lvlText w:val="o"/>
-      <w:lvlJc w:val="start"/>
+      <w:lvlJc w:val="left"/>
       <w:pPr>
         <w:tabs>
           <w:tab w:val="num" w:pos="0"/>
         </w:tabs>
-        <w:ind w:start="5760" w:hanging="360"/>
+        <w:ind w:left="5760" w:hanging="360"/>
       </w:pPr>
       <w:rPr>
         <w:rFonts w:ascii="Courier New" w:hAnsi="Courier New" w:cs="Courier New" w:hint="default"/>
@@ -914,30 +2028,33 @@
       <w:start w:val="1"/>
       <w:numFmt w:val="bullet"/>
       <w:lvlText w:val=""/>
-      <w:lvlJc w:val="start"/>
+      <w:lvlJc w:val="left"/>
       <w:pPr>
         <w:tabs>
           <w:tab w:val="num" w:pos="0"/>
         </w:tabs>
-        <w:ind w:start="6480" w:hanging="360"/>
+        <w:ind w:left="6480" w:hanging="360"/>
       </w:pPr>
       <w:rPr>
         <w:rFonts w:ascii="Wingdings" w:hAnsi="Wingdings" w:cs="Wingdings" w:hint="default"/>
       </w:rPr>
     </w:lvl>
   </w:abstractNum>
-  <w:abstractNum w:abstractNumId="2">
+  <w:abstractNum w:abstractNumId="4" w15:restartNumberingAfterBreak="0">
+    <w:nsid w:val="7BAF304B"/>
+    <w:multiLevelType w:val="multilevel"/>
+    <w:tmpl w:val="C22A476C"/>
     <w:lvl w:ilvl="0">
       <w:start w:val="1"/>
       <w:numFmt w:val="none"/>
       <w:suff w:val="nothing"/>
       <w:lvlText w:val=""/>
-      <w:lvlJc w:val="start"/>
+      <w:lvlJc w:val="left"/>
       <w:pPr>
         <w:tabs>
           <w:tab w:val="num" w:pos="0"/>
         </w:tabs>
-        <w:ind w:start="0" w:hanging="0"/>
+        <w:ind w:left="0" w:firstLine="0"/>
       </w:pPr>
     </w:lvl>
     <w:lvl w:ilvl="1">
@@ -945,12 +2062,12 @@
       <w:numFmt w:val="none"/>
       <w:suff w:val="nothing"/>
       <w:lvlText w:val=""/>
-      <w:lvlJc w:val="start"/>
+      <w:lvlJc w:val="left"/>
       <w:pPr>
         <w:tabs>
           <w:tab w:val="num" w:pos="0"/>
         </w:tabs>
-        <w:ind w:start="0" w:hanging="0"/>
+        <w:ind w:left="0" w:firstLine="0"/>
       </w:pPr>
     </w:lvl>
     <w:lvl w:ilvl="2">
@@ -958,12 +2075,12 @@
       <w:numFmt w:val="none"/>
       <w:suff w:val="nothing"/>
       <w:lvlText w:val=""/>
-      <w:lvlJc w:val="start"/>
+      <w:lvlJc w:val="left"/>
       <w:pPr>
         <w:tabs>
           <w:tab w:val="num" w:pos="0"/>
         </w:tabs>
-        <w:ind w:start="0" w:hanging="0"/>
+        <w:ind w:left="0" w:firstLine="0"/>
       </w:pPr>
     </w:lvl>
     <w:lvl w:ilvl="3">
@@ -971,12 +2088,12 @@
       <w:numFmt w:val="none"/>
       <w:suff w:val="nothing"/>
       <w:lvlText w:val=""/>
-      <w:lvlJc w:val="start"/>
+      <w:lvlJc w:val="left"/>
       <w:pPr>
         <w:tabs>
           <w:tab w:val="num" w:pos="0"/>
         </w:tabs>
-        <w:ind w:start="0" w:hanging="0"/>
+        <w:ind w:left="0" w:firstLine="0"/>
       </w:pPr>
     </w:lvl>
     <w:lvl w:ilvl="4">
@@ -984,12 +2101,12 @@
       <w:numFmt w:val="none"/>
       <w:suff w:val="nothing"/>
       <w:lvlText w:val=""/>
-      <w:lvlJc w:val="start"/>
+      <w:lvlJc w:val="left"/>
       <w:pPr>
         <w:tabs>
           <w:tab w:val="num" w:pos="0"/>
         </w:tabs>
-        <w:ind w:start="0" w:hanging="0"/>
+        <w:ind w:left="0" w:firstLine="0"/>
       </w:pPr>
     </w:lvl>
     <w:lvl w:ilvl="5">
@@ -997,12 +2114,12 @@
       <w:numFmt w:val="none"/>
       <w:suff w:val="nothing"/>
       <w:lvlText w:val=""/>
-      <w:lvlJc w:val="start"/>
+      <w:lvlJc w:val="left"/>
       <w:pPr>
         <w:tabs>
           <w:tab w:val="num" w:pos="0"/>
         </w:tabs>
-        <w:ind w:start="0" w:hanging="0"/>
+        <w:ind w:left="0" w:firstLine="0"/>
       </w:pPr>
     </w:lvl>
     <w:lvl w:ilvl="6">
@@ -1010,12 +2127,12 @@
       <w:numFmt w:val="none"/>
       <w:suff w:val="nothing"/>
       <w:lvlText w:val=""/>
-      <w:lvlJc w:val="start"/>
+      <w:lvlJc w:val="left"/>
       <w:pPr>
         <w:tabs>
           <w:tab w:val="num" w:pos="0"/>
         </w:tabs>
-        <w:ind w:start="0" w:hanging="0"/>
+        <w:ind w:left="0" w:firstLine="0"/>
       </w:pPr>
     </w:lvl>
     <w:lvl w:ilvl="7">
@@ -1023,12 +2140,12 @@
       <w:numFmt w:val="none"/>
       <w:suff w:val="nothing"/>
       <w:lvlText w:val=""/>
-      <w:lvlJc w:val="start"/>
+      <w:lvlJc w:val="left"/>
       <w:pPr>
         <w:tabs>
           <w:tab w:val="num" w:pos="0"/>
         </w:tabs>
-        <w:ind w:start="0" w:hanging="0"/>
+        <w:ind w:left="0" w:firstLine="0"/>
       </w:pPr>
     </w:lvl>
     <w:lvl w:ilvl="8">
@@ -1036,30 +2153,39 @@
       <w:numFmt w:val="none"/>
       <w:suff w:val="nothing"/>
       <w:lvlText w:val=""/>
-      <w:lvlJc w:val="start"/>
+      <w:lvlJc w:val="left"/>
       <w:pPr>
         <w:tabs>
           <w:tab w:val="num" w:pos="0"/>
         </w:tabs>
-        <w:ind w:start="0" w:hanging="0"/>
+        <w:ind w:left="0" w:firstLine="0"/>
       </w:pPr>
     </w:lvl>
   </w:abstractNum>
-  <w:num w:numId="1">
+  <w:num w:numId="1" w16cid:durableId="439112252">
+    <w:abstractNumId w:val="3"/>
+  </w:num>
+  <w:num w:numId="2" w16cid:durableId="127675219">
+    <w:abstractNumId w:val="4"/>
+  </w:num>
+  <w:num w:numId="3" w16cid:durableId="1951622312">
+    <w:abstractNumId w:val="0"/>
+  </w:num>
+  <w:num w:numId="4" w16cid:durableId="1930582924">
     <w:abstractNumId w:val="1"/>
   </w:num>
-  <w:num w:numId="2">
+  <w:num w:numId="5" w16cid:durableId="1064987166">
     <w:abstractNumId w:val="2"/>
   </w:num>
 </w:numbering>
 </file>
 
 <file path=word/styles.xml><?xml version="1.0" encoding="utf-8"?>
-<w:styles xmlns:w="http://schemas.openxmlformats.org/wordprocessingml/2006/main" xmlns:w14="http://schemas.microsoft.com/office/word/2010/wordml" xmlns:mc="http://schemas.openxmlformats.org/markup-compatibility/2006" mc:Ignorable="w14">
+<w:styles xmlns:mc="http://schemas.openxmlformats.org/markup-compatibility/2006" xmlns:r="http://schemas.openxmlformats.org/officeDocument/2006/relationships" xmlns:w="http://schemas.openxmlformats.org/wordprocessingml/2006/main" xmlns:w14="http://schemas.microsoft.com/office/word/2010/wordml" xmlns:w15="http://schemas.microsoft.com/office/word/2012/wordml" xmlns:w16cex="http://schemas.microsoft.com/office/word/2018/wordml/cex" xmlns:w16cid="http://schemas.microsoft.com/office/word/2016/wordml/cid" xmlns:w16="http://schemas.microsoft.com/office/word/2018/wordml" xmlns:w16du="http://schemas.microsoft.com/office/word/2023/wordml/word16du" xmlns:w16sdtdh="http://schemas.microsoft.com/office/word/2020/wordml/sdtdatahash" xmlns:w16sdtfl="http://schemas.microsoft.com/office/word/2024/wordml/sdtformatlock" xmlns:w16se="http://schemas.microsoft.com/office/word/2015/wordml/symex" mc:Ignorable="w14 w15 w16se w16cid w16 w16cex w16sdtdh w16sdtfl w16du">
   <w:docDefaults>
     <w:rPrDefault>
       <w:rPr>
-        <w:rFonts w:ascii="Calibri" w:hAnsi="Calibri" w:eastAsia="Calibri" w:cs="" w:asciiTheme="minorHAnsi" w:cstheme="minorBidi" w:eastAsiaTheme="minorHAnsi" w:hAnsiTheme="minorHAnsi"/>
+        <w:rFonts w:asciiTheme="minorHAnsi" w:eastAsiaTheme="minorHAnsi" w:hAnsiTheme="minorHAnsi" w:cstheme="minorBidi"/>
         <w:kern w:val="2"/>
         <w:sz w:val="22"/>
         <w:szCs w:val="22"/>
@@ -1069,21 +2195,21 @@
     </w:rPrDefault>
     <w:pPrDefault>
       <w:pPr>
-        <w:suppressAutoHyphens w:val="true"/>
+        <w:suppressAutoHyphens/>
       </w:pPr>
     </w:pPrDefault>
   </w:docDefaults>
   <w:latentStyles w:defLockedState="0" w:defUIPriority="99" w:defSemiHidden="0" w:defUnhideWhenUsed="0" w:defQFormat="0" w:count="376">
     <w:lsdException w:name="Normal" w:uiPriority="0" w:qFormat="1"/>
     <w:lsdException w:name="heading 1" w:uiPriority="9" w:qFormat="1"/>
-    <w:lsdException w:name="heading 2" w:uiPriority="9" w:semiHidden="1" w:unhideWhenUsed="1" w:qFormat="1"/>
-    <w:lsdException w:name="heading 3" w:uiPriority="9" w:semiHidden="1" w:unhideWhenUsed="1" w:qFormat="1"/>
-    <w:lsdException w:name="heading 4" w:uiPriority="9" w:semiHidden="1" w:unhideWhenUsed="1" w:qFormat="1"/>
-    <w:lsdException w:name="heading 5" w:uiPriority="9" w:semiHidden="1" w:unhideWhenUsed="1" w:qFormat="1"/>
-    <w:lsdException w:name="heading 6" w:uiPriority="9" w:semiHidden="1" w:unhideWhenUsed="1" w:qFormat="1"/>
-    <w:lsdException w:name="heading 7" w:uiPriority="9" w:semiHidden="1" w:unhideWhenUsed="1" w:qFormat="1"/>
-    <w:lsdException w:name="heading 8" w:uiPriority="9" w:semiHidden="1" w:unhideWhenUsed="1" w:qFormat="1"/>
-    <w:lsdException w:name="heading 9" w:uiPriority="9" w:semiHidden="1" w:unhideWhenUsed="1" w:qFormat="1"/>
+    <w:lsdException w:name="heading 2" w:semiHidden="1" w:uiPriority="9" w:unhideWhenUsed="1" w:qFormat="1"/>
+    <w:lsdException w:name="heading 3" w:semiHidden="1" w:uiPriority="9" w:unhideWhenUsed="1" w:qFormat="1"/>
+    <w:lsdException w:name="heading 4" w:semiHidden="1" w:uiPriority="9" w:unhideWhenUsed="1" w:qFormat="1"/>
+    <w:lsdException w:name="heading 5" w:semiHidden="1" w:uiPriority="9" w:unhideWhenUsed="1" w:qFormat="1"/>
+    <w:lsdException w:name="heading 6" w:semiHidden="1" w:uiPriority="9" w:unhideWhenUsed="1" w:qFormat="1"/>
+    <w:lsdException w:name="heading 7" w:semiHidden="1" w:uiPriority="9" w:unhideWhenUsed="1" w:qFormat="1"/>
+    <w:lsdException w:name="heading 8" w:semiHidden="1" w:uiPriority="9" w:unhideWhenUsed="1" w:qFormat="1"/>
+    <w:lsdException w:name="heading 9" w:semiHidden="1" w:uiPriority="9" w:unhideWhenUsed="1" w:qFormat="1"/>
     <w:lsdException w:name="index 1" w:semiHidden="1" w:unhideWhenUsed="1"/>
     <w:lsdException w:name="index 2" w:semiHidden="1" w:unhideWhenUsed="1"/>
     <w:lsdException w:name="index 3" w:semiHidden="1" w:unhideWhenUsed="1"/>
@@ -1093,22 +2219,22 @@
     <w:lsdException w:name="index 7" w:semiHidden="1" w:unhideWhenUsed="1"/>
     <w:lsdException w:name="index 8" w:semiHidden="1" w:unhideWhenUsed="1"/>
     <w:lsdException w:name="index 9" w:semiHidden="1" w:unhideWhenUsed="1"/>
-    <w:lsdException w:name="toc 1" w:uiPriority="39" w:semiHidden="1" w:unhideWhenUsed="1"/>
-    <w:lsdException w:name="toc 2" w:uiPriority="39" w:semiHidden="1" w:unhideWhenUsed="1"/>
-    <w:lsdException w:name="toc 3" w:uiPriority="39" w:semiHidden="1" w:unhideWhenUsed="1"/>
-    <w:lsdException w:name="toc 4" w:uiPriority="39" w:semiHidden="1" w:unhideWhenUsed="1"/>
-    <w:lsdException w:name="toc 5" w:uiPriority="39" w:semiHidden="1" w:unhideWhenUsed="1"/>
-    <w:lsdException w:name="toc 6" w:uiPriority="39" w:semiHidden="1" w:unhideWhenUsed="1"/>
-    <w:lsdException w:name="toc 7" w:uiPriority="39" w:semiHidden="1" w:unhideWhenUsed="1"/>
-    <w:lsdException w:name="toc 8" w:uiPriority="39" w:semiHidden="1" w:unhideWhenUsed="1"/>
-    <w:lsdException w:name="toc 9" w:uiPriority="39" w:semiHidden="1" w:unhideWhenUsed="1"/>
+    <w:lsdException w:name="toc 1" w:semiHidden="1" w:uiPriority="39" w:unhideWhenUsed="1"/>
+    <w:lsdException w:name="toc 2" w:semiHidden="1" w:uiPriority="39" w:unhideWhenUsed="1"/>
+    <w:lsdException w:name="toc 3" w:semiHidden="1" w:uiPriority="39" w:unhideWhenUsed="1"/>
+    <w:lsdException w:name="toc 4" w:semiHidden="1" w:uiPriority="39" w:unhideWhenUsed="1"/>
+    <w:lsdException w:name="toc 5" w:semiHidden="1" w:uiPriority="39" w:unhideWhenUsed="1"/>
+    <w:lsdException w:name="toc 6" w:semiHidden="1" w:uiPriority="39" w:unhideWhenUsed="1"/>
+    <w:lsdException w:name="toc 7" w:semiHidden="1" w:uiPriority="39" w:unhideWhenUsed="1"/>
+    <w:lsdException w:name="toc 8" w:semiHidden="1" w:uiPriority="39" w:unhideWhenUsed="1"/>
+    <w:lsdException w:name="toc 9" w:semiHidden="1" w:uiPriority="39" w:unhideWhenUsed="1"/>
     <w:lsdException w:name="Normal Indent" w:semiHidden="1" w:unhideWhenUsed="1"/>
     <w:lsdException w:name="footnote text" w:semiHidden="1" w:unhideWhenUsed="1"/>
     <w:lsdException w:name="annotation text" w:semiHidden="1" w:unhideWhenUsed="1"/>
     <w:lsdException w:name="header" w:semiHidden="1" w:unhideWhenUsed="1"/>
     <w:lsdException w:name="footer" w:semiHidden="1" w:unhideWhenUsed="1"/>
     <w:lsdException w:name="index heading" w:semiHidden="1" w:unhideWhenUsed="1"/>
-    <w:lsdException w:name="caption" w:uiPriority="35" w:semiHidden="1" w:unhideWhenUsed="1" w:qFormat="1"/>
+    <w:lsdException w:name="caption" w:semiHidden="1" w:uiPriority="35" w:unhideWhenUsed="1" w:qFormat="1"/>
     <w:lsdException w:name="table of figures" w:semiHidden="1" w:unhideWhenUsed="1"/>
     <w:lsdException w:name="envelope address" w:semiHidden="1" w:unhideWhenUsed="1"/>
     <w:lsdException w:name="envelope return" w:semiHidden="1" w:unhideWhenUsed="1"/>
@@ -1139,7 +2265,7 @@
     <w:lsdException w:name="Title" w:uiPriority="10" w:qFormat="1"/>
     <w:lsdException w:name="Closing" w:semiHidden="1" w:unhideWhenUsed="1"/>
     <w:lsdException w:name="Signature" w:semiHidden="1" w:unhideWhenUsed="1"/>
-    <w:lsdException w:name="Default Paragraph Font" w:uiPriority="1" w:semiHidden="1" w:unhideWhenUsed="1"/>
+    <w:lsdException w:name="Default Paragraph Font" w:semiHidden="1" w:uiPriority="1" w:unhideWhenUsed="1"/>
     <w:lsdException w:name="Body Text" w:semiHidden="1" w:unhideWhenUsed="1"/>
     <w:lsdException w:name="Body Text Indent" w:semiHidden="1" w:unhideWhenUsed="1"/>
     <w:lsdException w:name="List Continue" w:semiHidden="1" w:unhideWhenUsed="1"/>
@@ -1339,8 +2465,8 @@
     <w:lsdException w:name="Subtle Reference" w:uiPriority="31" w:qFormat="1"/>
     <w:lsdException w:name="Intense Reference" w:uiPriority="32" w:qFormat="1"/>
     <w:lsdException w:name="Book Title" w:uiPriority="33" w:qFormat="1"/>
-    <w:lsdException w:name="Bibliography" w:uiPriority="37" w:semiHidden="1" w:unhideWhenUsed="1"/>
-    <w:lsdException w:name="TOC Heading" w:uiPriority="39" w:semiHidden="1" w:unhideWhenUsed="1" w:qFormat="1"/>
+    <w:lsdException w:name="Bibliography" w:semiHidden="1" w:uiPriority="37" w:unhideWhenUsed="1"/>
+    <w:lsdException w:name="TOC Heading" w:semiHidden="1" w:uiPriority="39" w:unhideWhenUsed="1" w:qFormat="1"/>
     <w:lsdException w:name="Plain Table 1" w:uiPriority="41"/>
     <w:lsdException w:name="Plain Table 2" w:uiPriority="42"/>
     <w:lsdException w:name="Plain Table 3" w:uiPriority="43"/>
@@ -1451,39 +2577,26 @@
     <w:lsdException w:name="Unresolved Mention" w:semiHidden="1" w:unhideWhenUsed="1"/>
     <w:lsdException w:name="Smart Link" w:semiHidden="1" w:unhideWhenUsed="1"/>
   </w:latentStyles>
-  <w:style w:type="paragraph" w:styleId="Normal" w:default="1">
+  <w:style w:type="paragraph" w:default="1" w:styleId="Normal">
     <w:name w:val="Normal"/>
     <w:qFormat/>
     <w:pPr>
-      <w:widowControl/>
-      <w:suppressAutoHyphens w:val="true"/>
-      <w:bidi w:val="0"/>
-      <w:spacing w:lineRule="auto" w:line="259" w:before="0" w:after="160"/>
-      <w:jc w:val="start"/>
+      <w:spacing w:after="160" w:line="259" w:lineRule="auto"/>
     </w:pPr>
-    <w:rPr>
-      <w:rFonts w:ascii="Calibri" w:hAnsi="Calibri" w:eastAsia="Calibri" w:cs="" w:asciiTheme="minorHAnsi" w:cstheme="minorBidi" w:eastAsiaTheme="minorHAnsi" w:hAnsiTheme="minorHAnsi"/>
-      <w:color w:val="auto"/>
-      <w:kern w:val="2"/>
-      <w:sz w:val="22"/>
-      <w:szCs w:val="22"/>
-      <w:lang w:val="es-CO" w:eastAsia="en-US" w:bidi="ar-SA"/>
-      <w14:ligatures w14:val="standardContextual"/>
-    </w:rPr>
   </w:style>
-  <w:style w:type="paragraph" w:styleId="Heading1">
+  <w:style w:type="paragraph" w:styleId="Ttulo1">
     <w:name w:val="heading 1"/>
     <w:basedOn w:val="Normal"/>
-    <w:link w:val="Heading1Char"/>
+    <w:link w:val="Ttulo1Car"/>
     <w:uiPriority w:val="9"/>
     <w:qFormat/>
-    <w:rsid w:val="007d07a7"/>
+    <w:rsid w:val="007D07A7"/>
     <w:pPr>
-      <w:spacing w:lineRule="auto" w:line="240" w:beforeAutospacing="1" w:afterAutospacing="1"/>
+      <w:spacing w:beforeAutospacing="1" w:afterAutospacing="1" w:line="240" w:lineRule="auto"/>
       <w:outlineLvl w:val="0"/>
     </w:pPr>
     <w:rPr>
-      <w:rFonts w:ascii="Times New Roman" w:hAnsi="Times New Roman" w:eastAsia="Times New Roman" w:cs="Times New Roman"/>
+      <w:rFonts w:ascii="Times New Roman" w:eastAsia="Times New Roman" w:hAnsi="Times New Roman" w:cs="Times New Roman"/>
       <w:b/>
       <w:bCs/>
       <w:sz w:val="48"/>
@@ -1492,19 +2605,19 @@
       <w14:ligatures w14:val="none"/>
     </w:rPr>
   </w:style>
-  <w:style w:type="paragraph" w:styleId="Heading2">
+  <w:style w:type="paragraph" w:styleId="Ttulo2">
     <w:name w:val="heading 2"/>
     <w:basedOn w:val="Normal"/>
-    <w:link w:val="Heading2Char"/>
+    <w:link w:val="Ttulo2Car"/>
     <w:uiPriority w:val="9"/>
     <w:qFormat/>
-    <w:rsid w:val="007d07a7"/>
+    <w:rsid w:val="007D07A7"/>
     <w:pPr>
-      <w:spacing w:lineRule="auto" w:line="240" w:beforeAutospacing="1" w:afterAutospacing="1"/>
+      <w:spacing w:beforeAutospacing="1" w:afterAutospacing="1" w:line="240" w:lineRule="auto"/>
       <w:outlineLvl w:val="1"/>
     </w:pPr>
     <w:rPr>
-      <w:rFonts w:ascii="Times New Roman" w:hAnsi="Times New Roman" w:eastAsia="Times New Roman" w:cs="Times New Roman"/>
+      <w:rFonts w:ascii="Times New Roman" w:eastAsia="Times New Roman" w:hAnsi="Times New Roman" w:cs="Times New Roman"/>
       <w:b/>
       <w:bCs/>
       <w:kern w:val="0"/>
@@ -1514,45 +2627,64 @@
       <w14:ligatures w14:val="none"/>
     </w:rPr>
   </w:style>
-  <w:style w:type="paragraph" w:styleId="Heading3">
+  <w:style w:type="paragraph" w:styleId="Ttulo3">
     <w:name w:val="heading 3"/>
     <w:basedOn w:val="Normal"/>
     <w:next w:val="Normal"/>
-    <w:link w:val="Heading3Char"/>
+    <w:link w:val="Ttulo3Car"/>
     <w:uiPriority w:val="9"/>
     <w:unhideWhenUsed/>
     <w:qFormat/>
-    <w:rsid w:val="006e176a"/>
+    <w:rsid w:val="006E176A"/>
     <w:pPr>
-      <w:keepNext w:val="true"/>
+      <w:keepNext/>
       <w:keepLines/>
       <w:spacing w:before="40" w:after="0"/>
       <w:outlineLvl w:val="2"/>
     </w:pPr>
     <w:rPr>
-      <w:rFonts w:ascii="Calibri Light" w:hAnsi="Calibri Light" w:eastAsia="" w:cs="" w:asciiTheme="majorHAnsi" w:cstheme="majorBidi" w:eastAsiaTheme="majorEastAsia" w:hAnsiTheme="majorHAnsi"/>
-      <w:color w:themeColor="accent1" w:themeShade="7f" w:val="1F3763"/>
+      <w:rFonts w:asciiTheme="majorHAnsi" w:eastAsiaTheme="majorEastAsia" w:hAnsiTheme="majorHAnsi" w:cstheme="majorBidi"/>
+      <w:color w:val="1F3763" w:themeColor="accent1" w:themeShade="7F"/>
       <w:sz w:val="24"/>
       <w:szCs w:val="24"/>
     </w:rPr>
   </w:style>
-  <w:style w:type="character" w:styleId="DefaultParagraphFont" w:default="1">
+  <w:style w:type="character" w:default="1" w:styleId="Fuentedeprrafopredeter">
     <w:name w:val="Default Paragraph Font"/>
     <w:uiPriority w:val="1"/>
     <w:semiHidden/>
     <w:unhideWhenUsed/>
-    <w:qFormat/>
-    <w:rPr/>
   </w:style>
-  <w:style w:type="character" w:styleId="Heading1Char" w:customStyle="1">
-    <w:name w:val="Heading 1 Char"/>
-    <w:basedOn w:val="DefaultParagraphFont"/>
-    <w:link w:val="Heading1"/>
+  <w:style w:type="table" w:default="1" w:styleId="Tablanormal">
+    <w:name w:val="Normal Table"/>
+    <w:uiPriority w:val="99"/>
+    <w:semiHidden/>
+    <w:unhideWhenUsed/>
+    <w:tblPr>
+      <w:tblInd w:w="0" w:type="dxa"/>
+      <w:tblCellMar>
+        <w:top w:w="0" w:type="dxa"/>
+        <w:left w:w="108" w:type="dxa"/>
+        <w:bottom w:w="0" w:type="dxa"/>
+        <w:right w:w="108" w:type="dxa"/>
+      </w:tblCellMar>
+    </w:tblPr>
+  </w:style>
+  <w:style w:type="numbering" w:default="1" w:styleId="Sinlista">
+    <w:name w:val="No List"/>
+    <w:uiPriority w:val="99"/>
+    <w:semiHidden/>
+    <w:unhideWhenUsed/>
+  </w:style>
+  <w:style w:type="character" w:customStyle="1" w:styleId="Ttulo1Car">
+    <w:name w:val="Título 1 Car"/>
+    <w:basedOn w:val="Fuentedeprrafopredeter"/>
+    <w:link w:val="Ttulo1"/>
     <w:uiPriority w:val="9"/>
     <w:qFormat/>
-    <w:rsid w:val="007d07a7"/>
+    <w:rsid w:val="007D07A7"/>
     <w:rPr>
-      <w:rFonts w:ascii="Times New Roman" w:hAnsi="Times New Roman" w:eastAsia="Times New Roman" w:cs="Times New Roman"/>
+      <w:rFonts w:ascii="Times New Roman" w:eastAsia="Times New Roman" w:hAnsi="Times New Roman" w:cs="Times New Roman"/>
       <w:b/>
       <w:bCs/>
       <w:kern w:val="2"/>
@@ -1562,15 +2694,15 @@
       <w14:ligatures w14:val="none"/>
     </w:rPr>
   </w:style>
-  <w:style w:type="character" w:styleId="Heading2Char" w:customStyle="1">
-    <w:name w:val="Heading 2 Char"/>
-    <w:basedOn w:val="DefaultParagraphFont"/>
-    <w:link w:val="Heading2"/>
+  <w:style w:type="character" w:customStyle="1" w:styleId="Ttulo2Car">
+    <w:name w:val="Título 2 Car"/>
+    <w:basedOn w:val="Fuentedeprrafopredeter"/>
+    <w:link w:val="Ttulo2"/>
     <w:uiPriority w:val="9"/>
     <w:qFormat/>
-    <w:rsid w:val="007d07a7"/>
+    <w:rsid w:val="007D07A7"/>
     <w:rPr>
-      <w:rFonts w:ascii="Times New Roman" w:hAnsi="Times New Roman" w:eastAsia="Times New Roman" w:cs="Times New Roman"/>
+      <w:rFonts w:ascii="Times New Roman" w:eastAsia="Times New Roman" w:hAnsi="Times New Roman" w:cs="Times New Roman"/>
       <w:b/>
       <w:bCs/>
       <w:kern w:val="0"/>
@@ -1580,67 +2712,65 @@
       <w14:ligatures w14:val="none"/>
     </w:rPr>
   </w:style>
-  <w:style w:type="character" w:styleId="TitleChar" w:customStyle="1">
-    <w:name w:val="Title Char"/>
-    <w:basedOn w:val="DefaultParagraphFont"/>
-    <w:link w:val="Title"/>
+  <w:style w:type="character" w:customStyle="1" w:styleId="TtuloCar">
+    <w:name w:val="Título Car"/>
+    <w:basedOn w:val="Fuentedeprrafopredeter"/>
+    <w:link w:val="Ttulo"/>
     <w:uiPriority w:val="10"/>
     <w:qFormat/>
-    <w:rsid w:val="007d07a7"/>
+    <w:rsid w:val="007D07A7"/>
     <w:rPr>
-      <w:rFonts w:ascii="Calibri Light" w:hAnsi="Calibri Light" w:eastAsia="" w:cs="" w:asciiTheme="majorHAnsi" w:cstheme="majorBidi" w:eastAsiaTheme="majorEastAsia" w:hAnsiTheme="majorHAnsi"/>
+      <w:rFonts w:asciiTheme="majorHAnsi" w:eastAsiaTheme="majorEastAsia" w:hAnsiTheme="majorHAnsi" w:cstheme="majorBidi"/>
       <w:spacing w:val="-10"/>
       <w:kern w:val="2"/>
       <w:sz w:val="56"/>
       <w:szCs w:val="56"/>
     </w:rPr>
   </w:style>
-  <w:style w:type="character" w:styleId="Heading3Char" w:customStyle="1">
-    <w:name w:val="Heading 3 Char"/>
-    <w:basedOn w:val="DefaultParagraphFont"/>
-    <w:link w:val="Heading3"/>
+  <w:style w:type="character" w:customStyle="1" w:styleId="Ttulo3Car">
+    <w:name w:val="Título 3 Car"/>
+    <w:basedOn w:val="Fuentedeprrafopredeter"/>
+    <w:link w:val="Ttulo3"/>
     <w:uiPriority w:val="9"/>
     <w:qFormat/>
-    <w:rsid w:val="006e176a"/>
+    <w:rsid w:val="006E176A"/>
     <w:rPr>
-      <w:rFonts w:ascii="Calibri Light" w:hAnsi="Calibri Light" w:eastAsia="" w:cs="" w:asciiTheme="majorHAnsi" w:cstheme="majorBidi" w:eastAsiaTheme="majorEastAsia" w:hAnsiTheme="majorHAnsi"/>
-      <w:color w:themeColor="accent1" w:themeShade="7f" w:val="1F3763"/>
+      <w:rFonts w:asciiTheme="majorHAnsi" w:eastAsiaTheme="majorEastAsia" w:hAnsiTheme="majorHAnsi" w:cstheme="majorBidi"/>
+      <w:color w:val="1F3763" w:themeColor="accent1" w:themeShade="7F"/>
       <w:sz w:val="24"/>
       <w:szCs w:val="24"/>
     </w:rPr>
   </w:style>
-  <w:style w:type="paragraph" w:styleId="Heading" w:customStyle="1">
+  <w:style w:type="paragraph" w:customStyle="1" w:styleId="Heading">
     <w:name w:val="Heading"/>
     <w:basedOn w:val="Normal"/>
-    <w:next w:val="BodyText"/>
+    <w:next w:val="Textoindependiente"/>
     <w:qFormat/>
     <w:pPr>
-      <w:keepNext w:val="true"/>
+      <w:keepNext/>
       <w:spacing w:before="240" w:after="120"/>
     </w:pPr>
     <w:rPr>
-      <w:rFonts w:ascii="Liberation Sans" w:hAnsi="Liberation Sans" w:eastAsia="Noto Sans CJK SC" w:cs="Noto Sans Devanagari"/>
+      <w:rFonts w:ascii="Liberation Sans" w:eastAsia="Noto Sans CJK SC" w:hAnsi="Liberation Sans" w:cs="Noto Sans Devanagari"/>
       <w:sz w:val="28"/>
       <w:szCs w:val="28"/>
     </w:rPr>
   </w:style>
-  <w:style w:type="paragraph" w:styleId="BodyText">
+  <w:style w:type="paragraph" w:styleId="Textoindependiente">
     <w:name w:val="Body Text"/>
     <w:basedOn w:val="Normal"/>
     <w:pPr>
-      <w:spacing w:lineRule="auto" w:line="276" w:before="0" w:after="140"/>
+      <w:spacing w:after="140" w:line="276" w:lineRule="auto"/>
     </w:pPr>
-    <w:rPr/>
   </w:style>
-  <w:style w:type="paragraph" w:styleId="List">
+  <w:style w:type="paragraph" w:styleId="Lista">
     <w:name w:val="List"/>
-    <w:basedOn w:val="BodyText"/>
-    <w:pPr/>
+    <w:basedOn w:val="Textoindependiente"/>
     <w:rPr>
       <w:rFonts w:cs="Noto Sans Devanagari"/>
     </w:rPr>
   </w:style>
-  <w:style w:type="paragraph" w:styleId="Caption">
+  <w:style w:type="paragraph" w:styleId="Descripcin">
     <w:name w:val="caption"/>
     <w:basedOn w:val="Normal"/>
     <w:qFormat/>
@@ -1656,7 +2786,7 @@
       <w:szCs w:val="24"/>
     </w:rPr>
   </w:style>
-  <w:style w:type="paragraph" w:styleId="Index" w:customStyle="1">
+  <w:style w:type="paragraph" w:customStyle="1" w:styleId="Index">
     <w:name w:val="Index"/>
     <w:basedOn w:val="Normal"/>
     <w:qFormat/>
@@ -1674,12 +2804,12 @@
     <w:semiHidden/>
     <w:unhideWhenUsed/>
     <w:qFormat/>
-    <w:rsid w:val="007d07a7"/>
+    <w:rsid w:val="007D07A7"/>
     <w:pPr>
-      <w:spacing w:lineRule="auto" w:line="240" w:beforeAutospacing="1" w:afterAutospacing="1"/>
+      <w:spacing w:beforeAutospacing="1" w:afterAutospacing="1" w:line="240" w:lineRule="auto"/>
     </w:pPr>
     <w:rPr>
-      <w:rFonts w:ascii="Times New Roman" w:hAnsi="Times New Roman" w:eastAsia="Times New Roman" w:cs="Times New Roman"/>
+      <w:rFonts w:ascii="Times New Roman" w:eastAsia="Times New Roman" w:hAnsi="Times New Roman" w:cs="Times New Roman"/>
       <w:kern w:val="0"/>
       <w:sz w:val="24"/>
       <w:szCs w:val="24"/>
@@ -1687,111 +2817,88 @@
       <w14:ligatures w14:val="none"/>
     </w:rPr>
   </w:style>
-  <w:style w:type="paragraph" w:styleId="Title">
+  <w:style w:type="paragraph" w:styleId="Ttulo">
     <w:name w:val="Title"/>
     <w:basedOn w:val="Normal"/>
     <w:next w:val="Normal"/>
-    <w:link w:val="TitleChar"/>
+    <w:link w:val="TtuloCar"/>
     <w:uiPriority w:val="10"/>
     <w:qFormat/>
-    <w:rsid w:val="007d07a7"/>
+    <w:rsid w:val="007D07A7"/>
     <w:pPr>
-      <w:spacing w:lineRule="auto" w:line="240" w:before="0" w:after="0"/>
+      <w:spacing w:after="0" w:line="240" w:lineRule="auto"/>
       <w:contextualSpacing/>
     </w:pPr>
     <w:rPr>
-      <w:rFonts w:ascii="Calibri Light" w:hAnsi="Calibri Light" w:eastAsia="" w:cs="" w:asciiTheme="majorHAnsi" w:cstheme="majorBidi" w:eastAsiaTheme="majorEastAsia" w:hAnsiTheme="majorHAnsi"/>
+      <w:rFonts w:asciiTheme="majorHAnsi" w:eastAsiaTheme="majorEastAsia" w:hAnsiTheme="majorHAnsi" w:cstheme="majorBidi"/>
       <w:spacing w:val="-10"/>
       <w:sz w:val="56"/>
       <w:szCs w:val="56"/>
     </w:rPr>
   </w:style>
-  <w:style w:type="paragraph" w:styleId="ListParagraph">
+  <w:style w:type="paragraph" w:styleId="Prrafodelista">
     <w:name w:val="List Paragraph"/>
     <w:basedOn w:val="Normal"/>
     <w:uiPriority w:val="34"/>
     <w:qFormat/>
-    <w:rsid w:val="00350bb4"/>
+    <w:rsid w:val="00350BB4"/>
     <w:pPr>
-      <w:spacing w:before="0" w:after="160"/>
-      <w:ind w:start="720"/>
+      <w:ind w:left="720"/>
       <w:contextualSpacing/>
     </w:pPr>
-    <w:rPr/>
-  </w:style>
-  <w:style w:type="numbering" w:styleId="NoList" w:default="1">
-    <w:name w:val="No List"/>
-    <w:uiPriority w:val="99"/>
-    <w:semiHidden/>
-    <w:unhideWhenUsed/>
-    <w:qFormat/>
-  </w:style>
-  <w:style w:type="table" w:default="1" w:styleId="TableNormal">
-    <w:name w:val="Normal Table"/>
-    <w:uiPriority w:val="99"/>
-    <w:semiHidden/>
-    <w:unhideWhenUsed/>
-    <w:tblPr>
-      <w:tblCellMar>
-        <w:top w:w="0" w:type="dxa"/>
-        <w:left w:w="108" w:type="dxa"/>
-        <w:bottom w:w="0" w:type="dxa"/>
-        <w:right w:w="108" w:type="dxa"/>
-      </w:tblCellMar>
-    </w:tblPr>
   </w:style>
 </w:styles>
 </file>
 
 <file path=word/theme/theme1.xml><?xml version="1.0" encoding="utf-8"?>
-<a:theme xmlns:a="http://schemas.openxmlformats.org/drawingml/2006/main" xmlns:r="http://schemas.openxmlformats.org/officeDocument/2006/relationships" name="Tema de Office">
+<a:theme xmlns:a="http://schemas.openxmlformats.org/drawingml/2006/main" name="Tema de Office">
   <a:themeElements>
     <a:clrScheme name="Office">
       <a:dk1>
         <a:srgbClr val="000000"/>
       </a:dk1>
       <a:lt1>
-        <a:srgbClr val="ffffff"/>
+        <a:srgbClr val="FFFFFF"/>
       </a:lt1>
       <a:dk2>
-        <a:srgbClr val="44546a"/>
+        <a:srgbClr val="44546A"/>
       </a:dk2>
       <a:lt2>
-        <a:srgbClr val="e7e6e6"/>
+        <a:srgbClr val="E7E6E6"/>
       </a:lt2>
       <a:accent1>
-        <a:srgbClr val="4472c4"/>
+        <a:srgbClr val="4472C4"/>
       </a:accent1>
       <a:accent2>
-        <a:srgbClr val="ed7d31"/>
+        <a:srgbClr val="ED7D31"/>
       </a:accent2>
       <a:accent3>
-        <a:srgbClr val="a5a5a5"/>
+        <a:srgbClr val="A5A5A5"/>
       </a:accent3>
       <a:accent4>
-        <a:srgbClr val="ffc000"/>
+        <a:srgbClr val="FFC000"/>
       </a:accent4>
       <a:accent5>
-        <a:srgbClr val="5b9bd5"/>
+        <a:srgbClr val="5B9BD5"/>
       </a:accent5>
       <a:accent6>
-        <a:srgbClr val="70ad47"/>
+        <a:srgbClr val="70AD47"/>
       </a:accent6>
       <a:hlink>
-        <a:srgbClr val="0563c1"/>
+        <a:srgbClr val="0563C1"/>
       </a:hlink>
       <a:folHlink>
-        <a:srgbClr val="954f72"/>
+        <a:srgbClr val="954F72"/>
       </a:folHlink>
     </a:clrScheme>
     <a:fontScheme name="Office">
       <a:majorFont>
-        <a:latin typeface="Calibri Light" panose="020F0302020204030204" pitchFamily="0" charset="1"/>
+        <a:latin typeface="Calibri Light" panose="020F0302020204030204"/>
         <a:ea typeface=""/>
         <a:cs typeface=""/>
       </a:majorFont>
       <a:minorFont>
-        <a:latin typeface="Calibri" panose="020F0502020204030204" pitchFamily="0" charset="1"/>
+        <a:latin typeface="Calibri" panose="020F0502020204030204"/>
         <a:ea typeface=""/>
         <a:cs typeface=""/>
       </a:minorFont>
@@ -1823,7 +2930,7 @@
             </a:gs>
           </a:gsLst>
           <a:lin ang="5400000" scaled="0"/>
-          <a:tileRect l="0" t="0" r="0" b="0"/>
+          <a:tileRect/>
         </a:gradFill>
         <a:gradFill>
           <a:gsLst>
@@ -1847,7 +2954,7 @@
             </a:gs>
           </a:gsLst>
           <a:lin ang="5400000" scaled="0"/>
-          <a:tileRect l="0" t="0" r="0" b="0"/>
+          <a:tileRect/>
         </a:gradFill>
       </a:fillStyleLst>
       <a:lnStyleLst>
@@ -1907,10 +3014,12 @@
             </a:gs>
           </a:gsLst>
           <a:lin ang="5400000" scaled="0"/>
-          <a:tileRect l="0" t="0" r="0" b="0"/>
+          <a:tileRect/>
         </a:gradFill>
       </a:bgFillStyleLst>
     </a:fmtScheme>
   </a:themeElements>
+  <a:objectDefaults/>
+  <a:extraClrSchemeLst/>
 </a:theme>
 </file>
</xml_diff>

<commit_message>
Working on Ch 3 collaborative draft
</commit_message>
<xml_diff>
--- a/Draft/3 Methodology.docx
+++ b/Draft/3 Methodology.docx
@@ -153,7 +153,23 @@
           <w:rFonts w:cstheme="minorHAnsi"/>
           <w:lang w:val="en-NZ"/>
         </w:rPr>
-        <w:t xml:space="preserve"> give the research validity using a very positivistic framework of analysis, while neglecting or obscuring the human and social core of education. CR offers a midpoint between positivism and social constructivism, by acknowledging the social dynamics used to build knowledge and learning processes, the ontological framework used to model and interpret qualitative data as well as linking </w:t>
+        <w:t xml:space="preserve"> give the research validity using a very positivistic framework of analysis, while neglecting or obscuring the human and social core of education. CR offers a midpoint between positivism and social </w:t>
+      </w:r>
+      <w:proofErr w:type="gramStart"/>
+      <w:r>
+        <w:rPr>
+          <w:rFonts w:cstheme="minorHAnsi"/>
+          <w:lang w:val="en-NZ"/>
+        </w:rPr>
+        <w:t>constructivism,</w:t>
+      </w:r>
+      <w:proofErr w:type="gramEnd"/>
+      <w:r>
+        <w:rPr>
+          <w:rFonts w:cstheme="minorHAnsi"/>
+          <w:lang w:val="en-NZ"/>
+        </w:rPr>
+        <w:t xml:space="preserve"> by acknowledging the social dynamics used to build knowledge and learning processes, the ontological framework used to model and interpret qualitative data as well as linking </w:t>
       </w:r>
       <w:r>
         <w:rPr>
@@ -337,7 +353,23 @@
           <w:rFonts w:cstheme="minorHAnsi"/>
           <w:lang w:val="en-NZ"/>
         </w:rPr>
-        <w:t xml:space="preserve"> best research type that fits the methodology so far described is an inductive approach. Section 1.x described the research questions formulated to guide this research. The main question (MQ) is aimed at understanding how AR promotes observed behaviours, while question SQ1 to SQ6 help to identify elements of the what, describing the data in hope to link the empirical data with the actual mechanisms in play throughout the educational scenario. The assumption here is that those mechanisms in fact exists, and that they are being build or promoted </w:t>
+        <w:t xml:space="preserve"> best research type that fits the methodology so far described is an inductive approach. Section 1.x described the research questions formulated to guide this research. The main question (MQ) is aimed at understanding how AR promotes observed behaviours, while question SQ1 to SQ6 help to identify elements of </w:t>
+      </w:r>
+      <w:proofErr w:type="gramStart"/>
+      <w:r>
+        <w:rPr>
+          <w:rFonts w:cstheme="minorHAnsi"/>
+          <w:lang w:val="en-NZ"/>
+        </w:rPr>
+        <w:t>the what</w:t>
+      </w:r>
+      <w:proofErr w:type="gramEnd"/>
+      <w:r>
+        <w:rPr>
+          <w:rFonts w:cstheme="minorHAnsi"/>
+          <w:lang w:val="en-NZ"/>
+        </w:rPr>
+        <w:t xml:space="preserve">, describing the data in hope to link the empirical data with the actual mechanisms in play throughout the educational scenario. The assumption here is that those mechanisms in fact exists, and that they are being build or promoted </w:t>
       </w:r>
       <w:r>
         <w:rPr>
@@ -866,7 +898,21 @@
           <w:rFonts w:cstheme="minorHAnsi"/>
           <w:lang w:val="en-NZ"/>
         </w:rPr>
-        <w:t>Although these themes are the focus of analysis, it will be very important to track and identify any other relevant content that emerges during the observation phase, specially if it is related to the collaboration process of the use of technology in the classroom.</w:t>
+        <w:t xml:space="preserve">Although these themes are the focus of analysis, it will be very important to track and identify any other relevant content that emerges during the observation phase, </w:t>
+      </w:r>
+      <w:r>
+        <w:rPr>
+          <w:rFonts w:cstheme="minorHAnsi"/>
+          <w:lang w:val="en-NZ"/>
+        </w:rPr>
+        <w:t>especially</w:t>
+      </w:r>
+      <w:r>
+        <w:rPr>
+          <w:rFonts w:cstheme="minorHAnsi"/>
+          <w:lang w:val="en-NZ"/>
+        </w:rPr>
+        <w:t xml:space="preserve"> if it is related to the collaboration process of the use of technology in the classroom.</w:t>
       </w:r>
       <w:r>
         <w:rPr>
@@ -930,7 +976,21 @@
           <w:rFonts w:cstheme="minorHAnsi"/>
           <w:lang w:val="en-NZ"/>
         </w:rPr>
-        <w:t>An important effort is also proposed to offer some triangulation to the data obtained from the case study. In one hand, the software development process in itself requires a substantial data analysis coming from the reported results of similar past projects and from the exercise in user-driven design that will be followed to serve as a framework for the interaction design of the tool, base on data obtained from the users and the analysis of the information obtained from them. The software development process is also iterative in nature, and the feedback collected and analysed during the testing stages of the development will not only inform the development of the tool, but also the observation process.</w:t>
+        <w:t xml:space="preserve">An important effort is also proposed to offer some triangulation to the data obtained from the case study. In one hand, the software development process in itself requires a substantial data analysis coming from the reported results of similar past projects and from the exercise in user-driven design that will be followed to serve as a framework for the interaction design of the tool, </w:t>
+      </w:r>
+      <w:r>
+        <w:rPr>
+          <w:rFonts w:cstheme="minorHAnsi"/>
+          <w:lang w:val="en-NZ"/>
+        </w:rPr>
+        <w:t>based</w:t>
+      </w:r>
+      <w:r>
+        <w:rPr>
+          <w:rFonts w:cstheme="minorHAnsi"/>
+          <w:lang w:val="en-NZ"/>
+        </w:rPr>
+        <w:t xml:space="preserve"> on data obtained from the users and the analysis of the information obtained from them. The software development process is also iterative in nature, and the feedback collected and analysed during the testing stages of the development will not only inform the development of the tool, but also the observation process.</w:t>
       </w:r>
     </w:p>
     <w:p>
@@ -981,7 +1041,21 @@
           <w:rFonts w:cstheme="minorHAnsi"/>
           <w:lang w:val="en-NZ"/>
         </w:rPr>
-        <w:t>The biggest constraints in the time horizon proposed for the development of this research are the access to the Industry Project course. Any cohort of the course runs trough two semesters, and it was important to follow the development of the project from the initial first contact the students have with their time to the final presentation, creating a window of one academical year for data gathering, which can be translated to 24 weeks in which observation of the development of the course is possible. Due to similar time constraints in the degree that this research project is related to, it was possible to gather data of one cohort of the course through 20 weeks and divided in two academical semesters of work.</w:t>
+        <w:t xml:space="preserve">The biggest constraints in the time horizon proposed for the development of this research are the access to the Industry Project course. Any cohort of the course runs </w:t>
+      </w:r>
+      <w:r>
+        <w:rPr>
+          <w:rFonts w:cstheme="minorHAnsi"/>
+          <w:lang w:val="en-NZ"/>
+        </w:rPr>
+        <w:t>through</w:t>
+      </w:r>
+      <w:r>
+        <w:rPr>
+          <w:rFonts w:cstheme="minorHAnsi"/>
+          <w:lang w:val="en-NZ"/>
+        </w:rPr>
+        <w:t xml:space="preserve"> two semesters, and it was important to follow the development of the project from the initial first contact the students have with their time to the final presentation, creating a window of one academical year for data gathering, which can be translated to 24 weeks in which observation of the development of the course is possible. Due to similar time constraints in the degree that this research project is related to, it was possible to gather data of one cohort of the course through 20 weeks and divided in two academical semesters of work.</w:t>
       </w:r>
     </w:p>
     <w:p>
@@ -1346,6 +1420,21 @@
     </w:p>
     <w:p>
       <w:pPr>
+        <w:rPr>
+          <w:rFonts w:cstheme="minorHAnsi"/>
+          <w:lang w:val="en-NZ"/>
+        </w:rPr>
+      </w:pPr>
+      <w:r>
+        <w:rPr>
+          <w:rFonts w:cstheme="minorHAnsi"/>
+          <w:lang w:val="en-NZ"/>
+        </w:rPr>
+        <w:t>In light of these constraints, it is important to follow the documentation of this project as an exercise in experimenting with the application of a unique technology In the classroom, basing the evaluation method of proposal on its observed effects in the learning process rather than in the assessment and end results, in hope of identifying good and bad influences to workout in further developments of the ideas here presented.</w:t>
+      </w:r>
+    </w:p>
+    <w:p>
+      <w:pPr>
         <w:pStyle w:val="Ttulo1"/>
         <w:spacing w:before="280" w:after="280"/>
         <w:rPr>
@@ -1367,6 +1456,93 @@
     </w:p>
     <w:p>
       <w:pPr>
+        <w:rPr>
+          <w:lang w:val="en-NZ"/>
+        </w:rPr>
+      </w:pPr>
+      <w:r>
+        <w:rPr>
+          <w:lang w:val="en-NZ"/>
+        </w:rPr>
+        <w:t xml:space="preserve">So far it has been explained that the approach to this research is </w:t>
+      </w:r>
+      <w:r>
+        <w:rPr>
+          <w:lang w:val="en-NZ"/>
+        </w:rPr>
+        <w:t>through</w:t>
+      </w:r>
+      <w:r>
+        <w:rPr>
+          <w:lang w:val="en-NZ"/>
+        </w:rPr>
+        <w:t xml:space="preserve"> the themes and situation shown in the classroom using two complementary fronts. This is first and foremost and exercise in TEL, with the firm idea in mind that it is impossible and neglectful to ignore the use of technology in the classroom. </w:t>
+      </w:r>
+      <w:r>
+        <w:rPr>
+          <w:lang w:val="en-NZ"/>
+        </w:rPr>
+        <w:t>The first premise that supports the proposal is that mobile technologies can be used in a positive and constructive way to promote learning and good behaviours, when used correctly and with the proper guidance.</w:t>
+      </w:r>
+    </w:p>
+    <w:p>
+      <w:pPr>
+        <w:rPr>
+          <w:lang w:val="en-NZ"/>
+        </w:rPr>
+      </w:pPr>
+      <w:r>
+        <w:rPr>
+          <w:lang w:val="en-NZ"/>
+        </w:rPr>
+        <w:t>To support this statement is that the educational approach that guides the project focuses on the tools and theories</w:t>
+      </w:r>
+      <w:r>
+        <w:rPr>
+          <w:lang w:val="en-NZ"/>
+        </w:rPr>
+        <w:t xml:space="preserve"> that view education mainly as a social phenomenon and as </w:t>
+      </w:r>
+      <w:r>
+        <w:rPr>
+          <w:lang w:val="en-NZ"/>
+        </w:rPr>
+        <w:t>an</w:t>
+      </w:r>
+      <w:r>
+        <w:rPr>
+          <w:lang w:val="en-NZ"/>
+        </w:rPr>
+        <w:t xml:space="preserve"> ongoing construction based on our environment and experiences, as it will be explained in the following sections.</w:t>
+      </w:r>
+    </w:p>
+    <w:p>
+      <w:pPr>
+        <w:rPr>
+          <w:lang w:val="en-NZ"/>
+        </w:rPr>
+      </w:pPr>
+      <w:r>
+        <w:rPr>
+          <w:lang w:val="en-NZ"/>
+        </w:rPr>
+        <w:t xml:space="preserve">Finally, the technological development followed for this project also acknowledges the challenges found in the implementation of educational technology. The </w:t>
+      </w:r>
+      <w:r>
+        <w:rPr>
+          <w:lang w:val="en-NZ"/>
+        </w:rPr>
+        <w:t>focus</w:t>
+      </w:r>
+      <w:r>
+        <w:rPr>
+          <w:lang w:val="en-NZ"/>
+        </w:rPr>
+        <w:t>, beside a successful implementation, is on executing and documenting the design process followed to create ideas and promote discussion about how to integrate the learning and the software design, how to align functional and learning goals and how to incorporate the students and the teaching staff into the process.</w:t>
+      </w:r>
+    </w:p>
+    <w:p>
+      <w:pPr>
         <w:pStyle w:val="Ttulo2"/>
         <w:spacing w:before="280" w:after="280"/>
         <w:rPr>
@@ -1388,6 +1564,63 @@
     </w:p>
     <w:p>
       <w:pPr>
+        <w:rPr>
+          <w:lang w:val="en-NZ"/>
+        </w:rPr>
+      </w:pPr>
+      <w:r>
+        <w:rPr>
+          <w:lang w:val="en-NZ"/>
+        </w:rPr>
+        <w:t xml:space="preserve">The main </w:t>
+      </w:r>
+      <w:r>
+        <w:rPr>
+          <w:lang w:val="en-NZ"/>
+        </w:rPr>
+        <w:t>underlying</w:t>
+      </w:r>
+      <w:r>
+        <w:rPr>
+          <w:lang w:val="en-NZ"/>
+        </w:rPr>
+        <w:t xml:space="preserve"> theoretical framework behind the educational proposal is in collaborative learning</w:t>
+      </w:r>
+      <w:r>
+        <w:rPr>
+          <w:lang w:val="en-NZ"/>
+        </w:rPr>
+        <w:t xml:space="preserve"> used as a teaching tool to promote the communal construction of knowledge in the </w:t>
+      </w:r>
+      <w:r>
+        <w:rPr>
+          <w:lang w:val="en-NZ"/>
+        </w:rPr>
+        <w:lastRenderedPageBreak/>
+        <w:t>classroom, to play with the strengths and flaws of both students and educators as well as facilitating the development of transversal skills such as teamwork and communication.</w:t>
+      </w:r>
+    </w:p>
+    <w:p>
+      <w:pPr>
+        <w:rPr>
+          <w:lang w:val="en-NZ"/>
+        </w:rPr>
+      </w:pPr>
+      <w:r>
+        <w:rPr>
+          <w:lang w:val="en-NZ"/>
+        </w:rPr>
+        <w:t xml:space="preserve">Collaborative learning itself is heavily influenced by a social constructivism view of learning, trying to build environments where the students can discover and construct knowledge they need based primarily on the interactions held with their peers and educators. Therefore, this research uses social constructivism as the main basis for the educational design proposed, trying to cover learning goals that emphasises </w:t>
+      </w:r>
+      <w:r>
+        <w:rPr>
+          <w:lang w:val="en-NZ"/>
+        </w:rPr>
+        <w:t>the process of obtained certain results and instances of self-reflection to as an important part of the assessment process.</w:t>
+      </w:r>
+    </w:p>
+    <w:p>
+      <w:pPr>
         <w:pStyle w:val="Ttulo3"/>
         <w:rPr>
           <w:rFonts w:asciiTheme="minorHAnsi" w:hAnsiTheme="minorHAnsi" w:cstheme="minorHAnsi"/>
@@ -1403,8 +1636,339 @@
           <w:szCs w:val="22"/>
           <w:lang w:val="en-NZ"/>
         </w:rPr>
-        <w:t>3.3.1.1 Cooperative learning structure</w:t>
-      </w:r>
+        <w:t>3.3.1.1 Co</w:t>
+      </w:r>
+      <w:r>
+        <w:rPr>
+          <w:rFonts w:asciiTheme="minorHAnsi" w:hAnsiTheme="minorHAnsi" w:cstheme="minorHAnsi"/>
+          <w:sz w:val="22"/>
+          <w:szCs w:val="22"/>
+          <w:lang w:val="en-NZ"/>
+        </w:rPr>
+        <w:t>llaborative</w:t>
+      </w:r>
+      <w:r>
+        <w:rPr>
+          <w:rFonts w:asciiTheme="minorHAnsi" w:hAnsiTheme="minorHAnsi" w:cstheme="minorHAnsi"/>
+          <w:sz w:val="22"/>
+          <w:szCs w:val="22"/>
+          <w:lang w:val="en-NZ"/>
+        </w:rPr>
+        <w:t xml:space="preserve"> </w:t>
+      </w:r>
+      <w:r>
+        <w:rPr>
+          <w:rFonts w:asciiTheme="minorHAnsi" w:hAnsiTheme="minorHAnsi" w:cstheme="minorHAnsi"/>
+          <w:sz w:val="22"/>
+          <w:szCs w:val="22"/>
+          <w:lang w:val="en-NZ"/>
+        </w:rPr>
+        <w:t>L</w:t>
+      </w:r>
+      <w:r>
+        <w:rPr>
+          <w:rFonts w:asciiTheme="minorHAnsi" w:hAnsiTheme="minorHAnsi" w:cstheme="minorHAnsi"/>
+          <w:sz w:val="22"/>
+          <w:szCs w:val="22"/>
+          <w:lang w:val="en-NZ"/>
+        </w:rPr>
+        <w:t xml:space="preserve">earning </w:t>
+      </w:r>
+      <w:r>
+        <w:rPr>
+          <w:rFonts w:asciiTheme="minorHAnsi" w:hAnsiTheme="minorHAnsi" w:cstheme="minorHAnsi"/>
+          <w:sz w:val="22"/>
+          <w:szCs w:val="22"/>
+          <w:lang w:val="en-NZ"/>
+        </w:rPr>
+        <w:t>S</w:t>
+      </w:r>
+      <w:r>
+        <w:rPr>
+          <w:rFonts w:asciiTheme="minorHAnsi" w:hAnsiTheme="minorHAnsi" w:cstheme="minorHAnsi"/>
+          <w:sz w:val="22"/>
+          <w:szCs w:val="22"/>
+          <w:lang w:val="en-NZ"/>
+        </w:rPr>
+        <w:t>tructure</w:t>
+      </w:r>
+    </w:p>
+    <w:p>
+      <w:pPr>
+        <w:rPr>
+          <w:lang w:val="en-NZ"/>
+        </w:rPr>
+      </w:pPr>
+      <w:r>
+        <w:rPr>
+          <w:lang w:val="en-NZ"/>
+        </w:rPr>
+        <w:t>Collaborative learning is seen as a philosophy of education that prioritizes communal exploration over uniformity</w:t>
+      </w:r>
+      <w:r>
+        <w:rPr>
+          <w:lang w:val="en-NZ"/>
+        </w:rPr>
+        <w:t xml:space="preserve"> </w:t>
+      </w:r>
+      <w:r>
+        <w:rPr>
+          <w:lang w:val="en-NZ"/>
+        </w:rPr>
+        <w:t>(</w:t>
+      </w:r>
+      <w:proofErr w:type="spellStart"/>
+      <w:r>
+        <w:rPr>
+          <w:lang w:val="en-NZ"/>
+        </w:rPr>
+        <w:t>Eskiyurt</w:t>
+      </w:r>
+      <w:proofErr w:type="spellEnd"/>
+      <w:r>
+        <w:rPr>
+          <w:lang w:val="en-NZ"/>
+        </w:rPr>
+        <w:t xml:space="preserve"> &amp; Özkan, 2024)</w:t>
+      </w:r>
+      <w:r>
+        <w:rPr>
+          <w:lang w:val="en-NZ"/>
+        </w:rPr>
+        <w:t>. It assumes that learning is an active process that depends on rich context, diversity and is inherently social</w:t>
+      </w:r>
+      <w:r>
+        <w:rPr>
+          <w:lang w:val="en-NZ"/>
+        </w:rPr>
+        <w:t xml:space="preserve"> </w:t>
+      </w:r>
+      <w:r>
+        <w:rPr>
+          <w:lang w:val="en-NZ"/>
+        </w:rPr>
+        <w:t>(Smith &amp; MacGregor, 1993)</w:t>
+      </w:r>
+      <w:r>
+        <w:rPr>
+          <w:lang w:val="en-NZ"/>
+        </w:rPr>
+        <w:t>.</w:t>
+      </w:r>
+      <w:r>
+        <w:rPr>
+          <w:lang w:val="en-NZ"/>
+        </w:rPr>
+        <w:t xml:space="preserve"> When collaborating students benefits </w:t>
+      </w:r>
+      <w:r>
+        <w:rPr>
+          <w:lang w:val="en-NZ"/>
+        </w:rPr>
+        <w:t xml:space="preserve">from a joint effort to solve problems, a diversity of skills put together for a common purpose and a transmission, active and passive, of knowledge and skills between members of the group </w:t>
+      </w:r>
+      <w:r>
+        <w:rPr>
+          <w:lang w:val="en-NZ"/>
+        </w:rPr>
+        <w:t>(Laal et al., 2013</w:t>
+      </w:r>
+      <w:r>
+        <w:rPr>
+          <w:lang w:val="en-NZ"/>
+        </w:rPr>
+        <w:t xml:space="preserve">, </w:t>
+      </w:r>
+      <w:r>
+        <w:rPr>
+          <w:lang w:val="en-NZ"/>
+        </w:rPr>
+        <w:t>Buchs &amp; Butera, 2015)</w:t>
+      </w:r>
+      <w:r>
+        <w:rPr>
+          <w:lang w:val="en-NZ"/>
+        </w:rPr>
+        <w:t>.</w:t>
+      </w:r>
+    </w:p>
+    <w:p>
+      <w:pPr>
+        <w:rPr>
+          <w:lang w:val="en-NZ"/>
+        </w:rPr>
+      </w:pPr>
+      <w:r>
+        <w:rPr>
+          <w:lang w:val="en-NZ"/>
+        </w:rPr>
+        <w:t>Collaborative learning also goes beyond grouping students for an activity</w:t>
+      </w:r>
+      <w:r>
+        <w:rPr>
+          <w:lang w:val="en-NZ"/>
+        </w:rPr>
+        <w:t xml:space="preserve">, it is an active educational design that seeks to integrate the learning goals of an activity into the dynamics created in the group. </w:t>
+      </w:r>
+      <w:r>
+        <w:rPr>
+          <w:lang w:val="en-NZ"/>
+        </w:rPr>
+        <w:t>Laal</w:t>
+      </w:r>
+      <w:r>
+        <w:rPr>
+          <w:lang w:val="en-NZ"/>
+        </w:rPr>
+        <w:t xml:space="preserve"> (</w:t>
+      </w:r>
+      <w:r>
+        <w:rPr>
+          <w:lang w:val="en-NZ"/>
+        </w:rPr>
+        <w:t>2013)</w:t>
+      </w:r>
+      <w:r>
+        <w:rPr>
+          <w:lang w:val="en-NZ"/>
+        </w:rPr>
+        <w:t xml:space="preserve"> remarks the importance of creating p</w:t>
+      </w:r>
+      <w:r>
+        <w:rPr>
+          <w:lang w:val="en-NZ"/>
+        </w:rPr>
+        <w:t>ositive interdependence</w:t>
+      </w:r>
+      <w:r>
+        <w:rPr>
+          <w:lang w:val="en-NZ"/>
+        </w:rPr>
+        <w:t xml:space="preserve"> between the members of a group, where the success of one individual is linked to the success of all the other. This can only be achieved if the learning design allows for the group activity to create c</w:t>
+      </w:r>
+      <w:r>
+        <w:rPr>
+          <w:lang w:val="en-NZ"/>
+        </w:rPr>
+        <w:t xml:space="preserve">onsiderable </w:t>
+      </w:r>
+      <w:r>
+        <w:rPr>
+          <w:lang w:val="en-NZ"/>
+        </w:rPr>
+        <w:t>and meaningful interactions</w:t>
+      </w:r>
+      <w:r>
+        <w:rPr>
+          <w:lang w:val="en-NZ"/>
+        </w:rPr>
+        <w:t>,</w:t>
+      </w:r>
+      <w:r>
+        <w:rPr>
+          <w:lang w:val="en-NZ"/>
+        </w:rPr>
+        <w:t xml:space="preserve"> mechanisms for </w:t>
+      </w:r>
+      <w:r>
+        <w:rPr>
+          <w:lang w:val="en-NZ"/>
+        </w:rPr>
+        <w:t>personal responsibility,</w:t>
+      </w:r>
+      <w:r>
+        <w:rPr>
+          <w:lang w:val="en-NZ"/>
+        </w:rPr>
+        <w:t xml:space="preserve"> development</w:t>
+      </w:r>
+      <w:r>
+        <w:rPr>
+          <w:lang w:val="en-NZ"/>
+        </w:rPr>
+        <w:t xml:space="preserve"> </w:t>
+      </w:r>
+      <w:r>
+        <w:rPr>
+          <w:lang w:val="en-NZ"/>
+        </w:rPr>
+        <w:t>of s</w:t>
+      </w:r>
+      <w:r>
+        <w:rPr>
+          <w:lang w:val="en-NZ"/>
+        </w:rPr>
+        <w:t>ocial skills,</w:t>
+      </w:r>
+      <w:r>
+        <w:rPr>
+          <w:lang w:val="en-NZ"/>
+        </w:rPr>
+        <w:t xml:space="preserve"> and spaces for the group to </w:t>
+      </w:r>
+      <w:r>
+        <w:rPr>
+          <w:lang w:val="en-NZ"/>
+        </w:rPr>
+        <w:t>self-evaluat</w:t>
+      </w:r>
+      <w:r>
+        <w:rPr>
+          <w:lang w:val="en-NZ"/>
+        </w:rPr>
+        <w:t xml:space="preserve">e </w:t>
+      </w:r>
+      <w:r>
+        <w:rPr>
+          <w:lang w:val="en-NZ"/>
+        </w:rPr>
+        <w:t>(Johnson &amp; Johnson, 1990).</w:t>
+      </w:r>
+      <w:r>
+        <w:rPr>
+          <w:lang w:val="en-NZ"/>
+        </w:rPr>
+        <w:t xml:space="preserve"> Additionally, collaborative learning can be distinguished from other forms of similar activities like peer learning, tutoring and cooperative learning by offering the spaces to work with peer in an equal relationship and with high levels of mutuality, that is, with interactions that have to be executed in both ways of the relationship</w:t>
+      </w:r>
+      <w:r>
+        <w:rPr>
+          <w:lang w:val="en-NZ"/>
+        </w:rPr>
+        <w:t xml:space="preserve"> </w:t>
+      </w:r>
+      <w:r>
+        <w:rPr>
+          <w:lang w:val="en-NZ"/>
+        </w:rPr>
+        <w:t xml:space="preserve">(O’Donnell &amp; </w:t>
+      </w:r>
+      <w:proofErr w:type="spellStart"/>
+      <w:r>
+        <w:rPr>
+          <w:lang w:val="en-NZ"/>
+        </w:rPr>
+        <w:t>Hmelo</w:t>
+      </w:r>
+      <w:proofErr w:type="spellEnd"/>
+      <w:r>
+        <w:rPr>
+          <w:lang w:val="en-NZ"/>
+        </w:rPr>
+        <w:t>-Silver, 2013)</w:t>
+      </w:r>
+      <w:r>
+        <w:rPr>
+          <w:lang w:val="en-NZ"/>
+        </w:rPr>
+        <w:t>.</w:t>
+      </w:r>
+    </w:p>
+    <w:p>
+      <w:pPr>
+        <w:rPr>
+          <w:lang w:val="en-NZ"/>
+        </w:rPr>
+      </w:pPr>
     </w:p>
     <w:p>
       <w:pPr>

</xml_diff>

<commit_message>
Ch3 user-centred design draft
</commit_message>
<xml_diff>
--- a/Draft/3 Methodology.docx
+++ b/Draft/3 Methodology.docx
@@ -234,6 +234,7 @@
       <w:r>
         <w:rPr>
           <w:noProof/>
+          <w:lang w:val="en-NZ"/>
         </w:rPr>
         <w:drawing>
           <wp:inline distT="0" distB="0" distL="0" distR="0" wp14:anchorId="4088167D" wp14:editId="3FD3A096">
@@ -310,6 +311,7 @@
       </w:r>
       <w:r>
         <w:rPr>
+          <w:noProof/>
           <w:lang w:val="en-NZ"/>
         </w:rPr>
         <w:t>1</w:t>
@@ -976,7 +978,21 @@
           <w:rFonts w:cstheme="minorHAnsi"/>
           <w:lang w:val="en-NZ"/>
         </w:rPr>
-        <w:t xml:space="preserve">An important effort is also proposed to offer some triangulation to the data obtained from the case study. In one hand, the software development process in itself requires a substantial data analysis coming from the reported results of similar past projects and from the exercise in user-driven design that will be followed to serve as a framework for the interaction design of the tool, </w:t>
+        <w:t>An important effort is also proposed to offer some triangulation to the data obtained from the case study. In one hand, the software development process in itself requires a substantial data analysis coming from the reported results of similar past projects and from the exercise in user-</w:t>
+      </w:r>
+      <w:r>
+        <w:rPr>
+          <w:rFonts w:cstheme="minorHAnsi"/>
+          <w:lang w:val="en-NZ"/>
+        </w:rPr>
+        <w:t>centred</w:t>
+      </w:r>
+      <w:r>
+        <w:rPr>
+          <w:rFonts w:cstheme="minorHAnsi"/>
+          <w:lang w:val="en-NZ"/>
+        </w:rPr>
+        <w:t xml:space="preserve"> design that will be followed to serve as a framework for the interaction design of the tool, </w:t>
       </w:r>
       <w:r>
         <w:rPr>
@@ -1106,21 +1122,7 @@
           <w:rFonts w:cstheme="minorHAnsi"/>
           <w:lang w:val="en-NZ"/>
         </w:rPr>
-        <w:t xml:space="preserve">As with most cross sectional studies, this approach offers a quick way of gathering data and the observations will be able to cover multiple variables of interest that can be analysed later, at the cost of creating the situation that the data will be biased to the particularities of this sample, making hard to propose any generalization or causality </w:t>
-      </w:r>
-      <w:r>
-        <w:rPr>
-          <w:rFonts w:cstheme="minorHAnsi"/>
-          <w:lang w:val="en-NZ"/>
-        </w:rPr>
-        <w:t>(Wang &amp; Cheng, 2020)</w:t>
-      </w:r>
-      <w:r>
-        <w:rPr>
-          <w:rFonts w:cstheme="minorHAnsi"/>
-          <w:lang w:val="en-NZ"/>
-        </w:rPr>
-        <w:t>.</w:t>
+        <w:t>As with most cross sectional studies, this approach offers a quick way of gathering data and the observations will be able to cover multiple variables of interest that can be analysed later, at the cost of creating the situation that the data will be biased to the particularities of this sample, making hard to propose any generalization or causality (Wang &amp; Cheng, 2020).</w:t>
       </w:r>
       <w:r>
         <w:rPr>
@@ -1709,33 +1711,411 @@
         <w:rPr>
           <w:lang w:val="en-NZ"/>
         </w:rPr>
+        <w:t xml:space="preserve"> (</w:t>
+      </w:r>
+      <w:proofErr w:type="spellStart"/>
+      <w:r>
+        <w:rPr>
+          <w:lang w:val="en-NZ"/>
+        </w:rPr>
+        <w:t>Eskiyurt</w:t>
+      </w:r>
+      <w:proofErr w:type="spellEnd"/>
+      <w:r>
+        <w:rPr>
+          <w:lang w:val="en-NZ"/>
+        </w:rPr>
+        <w:t xml:space="preserve"> &amp; Özkan, 2024). It assumes that learning is an active process that depends on rich context, diversity and is inherently social</w:t>
+      </w:r>
+      <w:r>
+        <w:rPr>
+          <w:lang w:val="en-NZ"/>
+        </w:rPr>
+        <w:t xml:space="preserve"> (Smith &amp; MacGregor, 1993)</w:t>
+      </w:r>
+      <w:r>
+        <w:rPr>
+          <w:lang w:val="en-NZ"/>
+        </w:rPr>
+        <w:t>.</w:t>
+      </w:r>
+      <w:r>
+        <w:rPr>
+          <w:lang w:val="en-NZ"/>
+        </w:rPr>
+        <w:t xml:space="preserve"> When collaborating students benefits </w:t>
+      </w:r>
+      <w:r>
+        <w:rPr>
+          <w:lang w:val="en-NZ"/>
+        </w:rPr>
+        <w:t>from a joint effort to solve problems, a diversity of skills put together for a common purpose and a transmission, active and passive, of knowledge and skills between members of the group (Laal et al., 2013, Buchs &amp; Butera, 2015).</w:t>
+      </w:r>
+    </w:p>
+    <w:p>
+      <w:pPr>
+        <w:rPr>
+          <w:lang w:val="en-NZ"/>
+        </w:rPr>
+      </w:pPr>
+      <w:r>
+        <w:rPr>
+          <w:lang w:val="en-NZ"/>
+        </w:rPr>
+        <w:t>Collaborative learning also goes beyond grouping students for an activity</w:t>
+      </w:r>
+      <w:r>
+        <w:rPr>
+          <w:lang w:val="en-NZ"/>
+        </w:rPr>
+        <w:t>, it is an active educational design that seeks to integrate the learning goals of an activity into the dynamics created in the group. Laal (2013) remarks the importance of creating positive interdependence between the members of a group, where the success of one individual is linked to the success of all the other. This can only be achieved if the learning design allows for the group activity to create considerable and meaningful interactions, mechanisms for personal responsibility, development of social skills, and spaces for the group to self-evaluate (Johnson &amp; Johnson, 1990).</w:t>
+      </w:r>
+      <w:r>
+        <w:rPr>
+          <w:lang w:val="en-NZ"/>
+        </w:rPr>
+        <w:t xml:space="preserve"> Additionally, collaborative learning can be distinguished from other forms of similar activities like peer learning, tutoring and cooperative learning by offering the spaces to work with peer in an equal relationship and with high levels of mutuality, that is, with interactions that have to be executed in both ways of the relationship</w:t>
+      </w:r>
+      <w:r>
+        <w:rPr>
+          <w:lang w:val="en-NZ"/>
+        </w:rPr>
+        <w:t xml:space="preserve"> (O’Donnell &amp; </w:t>
+      </w:r>
+      <w:proofErr w:type="spellStart"/>
+      <w:r>
+        <w:rPr>
+          <w:lang w:val="en-NZ"/>
+        </w:rPr>
+        <w:t>Hmelo</w:t>
+      </w:r>
+      <w:proofErr w:type="spellEnd"/>
+      <w:r>
+        <w:rPr>
+          <w:lang w:val="en-NZ"/>
+        </w:rPr>
+        <w:t>-Silver, 2013)</w:t>
+      </w:r>
+      <w:r>
+        <w:rPr>
+          <w:lang w:val="en-NZ"/>
+        </w:rPr>
+        <w:t>.</w:t>
+      </w:r>
+    </w:p>
+    <w:p>
+      <w:pPr>
+        <w:rPr>
+          <w:lang w:val="en-NZ"/>
+        </w:rPr>
+      </w:pPr>
+      <w:r>
+        <w:rPr>
+          <w:lang w:val="en-NZ"/>
+        </w:rPr>
+        <w:t>Upon these fundamental characteristics of collaborative reading is that the educational proposal of the intervention using WorkshopAR is founded. Given the theoretical background described, is possible to summarize the goals of the TEL intervention with three objectives:</w:t>
+      </w:r>
+    </w:p>
+    <w:p>
+      <w:pPr>
+        <w:pStyle w:val="Prrafodelista"/>
+        <w:numPr>
+          <w:ilvl w:val="0"/>
+          <w:numId w:val="6"/>
+        </w:numPr>
+        <w:rPr>
+          <w:lang w:val="en-NZ"/>
+        </w:rPr>
+      </w:pPr>
+      <w:r>
+        <w:rPr>
+          <w:lang w:val="en-NZ"/>
+        </w:rPr>
+        <w:t>Use the visual tools provided by AR to reinforce the ideas of interdependence and mutuality by highlighting important structures of the collaborative work like roles, tasks and communal evaluation of progress.</w:t>
+      </w:r>
+    </w:p>
+    <w:p>
+      <w:pPr>
+        <w:pStyle w:val="Prrafodelista"/>
+        <w:numPr>
+          <w:ilvl w:val="0"/>
+          <w:numId w:val="6"/>
+        </w:numPr>
+        <w:rPr>
+          <w:lang w:val="en-NZ"/>
+        </w:rPr>
+      </w:pPr>
+      <w:r>
+        <w:rPr>
+          <w:lang w:val="en-NZ"/>
+        </w:rPr>
+        <w:t>Leverage the communication features of a mobile deployment to provide extra channels for meaningful socialization.</w:t>
+      </w:r>
+    </w:p>
+    <w:p>
+      <w:pPr>
+        <w:pStyle w:val="Prrafodelista"/>
+        <w:numPr>
+          <w:ilvl w:val="0"/>
+          <w:numId w:val="6"/>
+        </w:numPr>
+        <w:rPr>
+          <w:lang w:val="en-NZ"/>
+        </w:rPr>
+      </w:pPr>
+      <w:r>
+        <w:rPr>
+          <w:lang w:val="en-NZ"/>
+        </w:rPr>
+        <w:t>Explore the concept of “augmented collaboration” using visuals and interaction to give students a different way to approach elements of teamwork, team management and resource management.</w:t>
+      </w:r>
+    </w:p>
+    <w:p>
+      <w:pPr>
+        <w:rPr>
+          <w:lang w:val="en-NZ"/>
+        </w:rPr>
+      </w:pPr>
+      <w:r>
+        <w:rPr>
+          <w:lang w:val="en-NZ"/>
+        </w:rPr>
+        <w:t>Paired with the requirements of the course, the learning activities that WorkshopAR is meant to support are</w:t>
+      </w:r>
+      <w:r>
+        <w:rPr>
+          <w:lang w:val="en-NZ"/>
+        </w:rPr>
         <w:t xml:space="preserve"> </w:t>
       </w:r>
       <w:r>
         <w:rPr>
           <w:lang w:val="en-NZ"/>
         </w:rPr>
-        <w:t>(</w:t>
+        <w:t xml:space="preserve">analytical and creative in nature, aimed at evaluating the collaborative work of the students at a high cognitive level. </w:t>
+      </w:r>
+      <w:r>
+        <w:rPr>
+          <w:lang w:val="en-NZ"/>
+        </w:rPr>
+        <w:t xml:space="preserve">If the design purpose of the tool is to provide a technological approach to develop the skills needed for an effective collaboration, the observation stage of the </w:t>
+      </w:r>
+      <w:r>
+        <w:rPr>
+          <w:lang w:val="en-NZ"/>
+        </w:rPr>
+        <w:lastRenderedPageBreak/>
+        <w:t>project will try to evaluate if the students that are engaging with the tool are using it in a way that helped them with these learning objectives, either:</w:t>
+      </w:r>
+    </w:p>
+    <w:p>
+      <w:pPr>
+        <w:pStyle w:val="Prrafodelista"/>
+        <w:numPr>
+          <w:ilvl w:val="0"/>
+          <w:numId w:val="7"/>
+        </w:numPr>
+        <w:rPr>
+          <w:lang w:val="en-NZ"/>
+        </w:rPr>
+      </w:pPr>
+      <w:r>
+        <w:rPr>
+          <w:lang w:val="en-NZ"/>
+        </w:rPr>
+        <w:t>To better organize or show the analysis done to the project through an understanding of the context of the problem, use of their previous knowledge to propose a solution, communicate their analysis to their peers or the clients</w:t>
+      </w:r>
+    </w:p>
+    <w:p>
+      <w:pPr>
+        <w:pStyle w:val="Prrafodelista"/>
+        <w:numPr>
+          <w:ilvl w:val="0"/>
+          <w:numId w:val="7"/>
+        </w:numPr>
+        <w:rPr>
+          <w:lang w:val="en-NZ"/>
+        </w:rPr>
+      </w:pPr>
+      <w:r>
+        <w:rPr>
+          <w:lang w:val="en-NZ"/>
+        </w:rPr>
+        <w:t>As a tool that helped in the creative activities needed for the proposed solution by pooling resources to create a proposal, discuss ideas and approaches, organize tasks or keep track of progress.</w:t>
+      </w:r>
+    </w:p>
+    <w:p>
+      <w:pPr>
+        <w:rPr>
+          <w:lang w:val="en-NZ"/>
+        </w:rPr>
+      </w:pPr>
+      <w:r>
+        <w:rPr>
+          <w:lang w:val="en-NZ"/>
+        </w:rPr>
+        <w:t>Observations of this types of activities, positive or negative, will constituted valuable data to construct a satisfactory answer for the research questions, and will show that the tool is indeed highlighting the aspects of collaborative work that are meant to be reinforced: organized and meaningful interactions plus an structured way to manage the interdependent activities taking place in the group.</w:t>
+      </w:r>
+    </w:p>
+    <w:p>
+      <w:pPr>
+        <w:rPr>
+          <w:lang w:val="en-NZ"/>
+        </w:rPr>
+      </w:pPr>
+      <w:r>
+        <w:rPr>
+          <w:lang w:val="en-NZ"/>
+        </w:rPr>
+        <w:t xml:space="preserve">Available literature has also identified the major obstacles that have to be acknowledged when proposing a collaborative learning design. Section 2.1.4 highlight the most relevant literature found around this discussion. </w:t>
+      </w:r>
+      <w:r>
+        <w:rPr>
+          <w:lang w:val="en-NZ"/>
+        </w:rPr>
+        <w:t>Other relevant discussions like the ones present in Hansen (2006)</w:t>
+      </w:r>
+      <w:r>
+        <w:rPr>
+          <w:lang w:val="en-NZ"/>
+        </w:rPr>
+        <w:t xml:space="preserve"> </w:t>
+      </w:r>
+      <w:r>
+        <w:rPr>
+          <w:lang w:val="en-NZ"/>
+        </w:rPr>
+        <w:t xml:space="preserve">and Pfaff &amp; Huddleston (2003) </w:t>
+      </w:r>
+      <w:r>
+        <w:rPr>
+          <w:lang w:val="en-NZ"/>
+        </w:rPr>
+        <w:t>also offer an important analysis of the challenges found in collaborative settings that where critical in the design of WorkshopAR. Of the ideas mentioned, it was considered important an interesting to emphasis</w:t>
+      </w:r>
+      <w:r>
+        <w:rPr>
+          <w:lang w:val="en-NZ"/>
+        </w:rPr>
+        <w:t>e</w:t>
+      </w:r>
+      <w:r>
+        <w:rPr>
+          <w:lang w:val="en-NZ"/>
+        </w:rPr>
+        <w:t>:</w:t>
+      </w:r>
+    </w:p>
+    <w:p>
+      <w:pPr>
+        <w:pStyle w:val="Prrafodelista"/>
+        <w:numPr>
+          <w:ilvl w:val="0"/>
+          <w:numId w:val="8"/>
+        </w:numPr>
+        <w:rPr>
+          <w:lang w:val="en-NZ"/>
+        </w:rPr>
+      </w:pPr>
+      <w:r>
+        <w:rPr>
+          <w:lang w:val="en-NZ"/>
+        </w:rPr>
+        <w:t>The imbalances</w:t>
+      </w:r>
+      <w:r>
+        <w:rPr>
+          <w:lang w:val="en-NZ"/>
+        </w:rPr>
+        <w:t xml:space="preserve"> in dynamics, power and assessment that are</w:t>
+      </w:r>
+      <w:r>
+        <w:rPr>
+          <w:lang w:val="en-NZ"/>
+        </w:rPr>
+        <w:t xml:space="preserve"> often found in teamwork and how the students negotiate and work with them.</w:t>
+      </w:r>
+    </w:p>
+    <w:p>
+      <w:pPr>
+        <w:pStyle w:val="Prrafodelista"/>
+        <w:numPr>
+          <w:ilvl w:val="0"/>
+          <w:numId w:val="8"/>
+        </w:numPr>
+        <w:rPr>
+          <w:lang w:val="en-NZ"/>
+        </w:rPr>
+      </w:pPr>
+      <w:r>
+        <w:rPr>
+          <w:lang w:val="en-NZ"/>
+        </w:rPr>
+        <w:t>The hurdles in communication that often are the focus of friction and failure in a team</w:t>
+      </w:r>
+      <w:r>
+        <w:rPr>
+          <w:lang w:val="en-NZ"/>
+        </w:rPr>
+        <w:t>.</w:t>
+      </w:r>
+    </w:p>
+    <w:p>
+      <w:pPr>
+        <w:rPr>
+          <w:lang w:val="en-NZ"/>
+        </w:rPr>
+      </w:pPr>
+      <w:r>
+        <w:rPr>
+          <w:lang w:val="en-NZ"/>
+        </w:rPr>
+        <w:t>The proposal of WorkshopAR is to offer an interactive space the moves the spotlight from the issues and makes the students acknowledge the problems and discuss solutions.</w:t>
+      </w:r>
+    </w:p>
+    <w:p>
+      <w:pPr>
+        <w:rPr>
+          <w:lang w:val="en-NZ"/>
+        </w:rPr>
+      </w:pPr>
+      <w:r>
+        <w:rPr>
+          <w:lang w:val="en-NZ"/>
+        </w:rPr>
+        <w:t xml:space="preserve">Finally, this is also an exercise in collaboration mediated by technology. There is ample discussion on the phenomena of online collaboration </w:t>
+      </w:r>
+      <w:r>
+        <w:rPr>
+          <w:lang w:val="en-NZ"/>
+        </w:rPr>
+        <w:t xml:space="preserve">(Hathorn &amp; Ingram, 2002, </w:t>
       </w:r>
       <w:proofErr w:type="spellStart"/>
       <w:r>
         <w:rPr>
           <w:lang w:val="en-NZ"/>
         </w:rPr>
-        <w:t>Eskiyurt</w:t>
+        <w:t>Rodchua</w:t>
       </w:r>
       <w:proofErr w:type="spellEnd"/>
       <w:r>
         <w:rPr>
           <w:lang w:val="en-NZ"/>
         </w:rPr>
-        <w:t xml:space="preserve"> &amp; Özkan, 2024)</w:t>
-      </w:r>
-      <w:r>
-        <w:rPr>
-          <w:lang w:val="en-NZ"/>
-        </w:rPr>
-        <w:t>. It assumes that learning is an active process that depends on rich context, diversity and is inherently social</w:t>
+        <w:t>, 2017)</w:t>
+      </w:r>
+      <w:r>
+        <w:rPr>
+          <w:lang w:val="en-NZ"/>
+        </w:rPr>
+        <w:t xml:space="preserve">, but the proposal of WorkshopAR is to identify how this trend of asynchronous and discontinued communication is used outside the web and in the physical classroom, with the main intention of identifying, if possible, positive or interesting behaviours that can be nourished to create a more positive relationship with technology in the classroom, akin to the proposals made by authors like </w:t>
+      </w:r>
+      <w:r>
+        <w:rPr>
+          <w:lang w:val="en-NZ"/>
+        </w:rPr>
+        <w:t>Dyer et al. (2015)</w:t>
       </w:r>
       <w:r>
         <w:rPr>
@@ -1747,228 +2127,8 @@
         <w:rPr>
           <w:lang w:val="en-NZ"/>
         </w:rPr>
-        <w:t>(Smith &amp; MacGregor, 1993)</w:t>
-      </w:r>
-      <w:r>
-        <w:rPr>
-          <w:lang w:val="en-NZ"/>
-        </w:rPr>
-        <w:t>.</w:t>
-      </w:r>
-      <w:r>
-        <w:rPr>
-          <w:lang w:val="en-NZ"/>
-        </w:rPr>
-        <w:t xml:space="preserve"> When collaborating students benefits </w:t>
-      </w:r>
-      <w:r>
-        <w:rPr>
-          <w:lang w:val="en-NZ"/>
-        </w:rPr>
-        <w:t xml:space="preserve">from a joint effort to solve problems, a diversity of skills put together for a common purpose and a transmission, active and passive, of knowledge and skills between members of the group </w:t>
-      </w:r>
-      <w:r>
-        <w:rPr>
-          <w:lang w:val="en-NZ"/>
-        </w:rPr>
-        <w:t>(Laal et al., 2013</w:t>
-      </w:r>
-      <w:r>
-        <w:rPr>
-          <w:lang w:val="en-NZ"/>
-        </w:rPr>
-        <w:t xml:space="preserve">, </w:t>
-      </w:r>
-      <w:r>
-        <w:rPr>
-          <w:lang w:val="en-NZ"/>
-        </w:rPr>
-        <w:t>Buchs &amp; Butera, 2015)</w:t>
-      </w:r>
-      <w:r>
-        <w:rPr>
-          <w:lang w:val="en-NZ"/>
-        </w:rPr>
-        <w:t>.</w:t>
-      </w:r>
-    </w:p>
-    <w:p>
-      <w:pPr>
-        <w:rPr>
-          <w:lang w:val="en-NZ"/>
-        </w:rPr>
-      </w:pPr>
-      <w:r>
-        <w:rPr>
-          <w:lang w:val="en-NZ"/>
-        </w:rPr>
-        <w:t>Collaborative learning also goes beyond grouping students for an activity</w:t>
-      </w:r>
-      <w:r>
-        <w:rPr>
-          <w:lang w:val="en-NZ"/>
-        </w:rPr>
-        <w:t xml:space="preserve">, it is an active educational design that seeks to integrate the learning goals of an activity into the dynamics created in the group. </w:t>
-      </w:r>
-      <w:r>
-        <w:rPr>
-          <w:lang w:val="en-NZ"/>
-        </w:rPr>
-        <w:t>Laal</w:t>
-      </w:r>
-      <w:r>
-        <w:rPr>
-          <w:lang w:val="en-NZ"/>
-        </w:rPr>
-        <w:t xml:space="preserve"> (</w:t>
-      </w:r>
-      <w:r>
-        <w:rPr>
-          <w:lang w:val="en-NZ"/>
-        </w:rPr>
-        <w:t>2013)</w:t>
-      </w:r>
-      <w:r>
-        <w:rPr>
-          <w:lang w:val="en-NZ"/>
-        </w:rPr>
-        <w:t xml:space="preserve"> remarks the importance of creating p</w:t>
-      </w:r>
-      <w:r>
-        <w:rPr>
-          <w:lang w:val="en-NZ"/>
-        </w:rPr>
-        <w:t>ositive interdependence</w:t>
-      </w:r>
-      <w:r>
-        <w:rPr>
-          <w:lang w:val="en-NZ"/>
-        </w:rPr>
-        <w:t xml:space="preserve"> between the members of a group, where the success of one individual is linked to the success of all the other. This can only be achieved if the learning design allows for the group activity to create c</w:t>
-      </w:r>
-      <w:r>
-        <w:rPr>
-          <w:lang w:val="en-NZ"/>
-        </w:rPr>
-        <w:t xml:space="preserve">onsiderable </w:t>
-      </w:r>
-      <w:r>
-        <w:rPr>
-          <w:lang w:val="en-NZ"/>
-        </w:rPr>
-        <w:t>and meaningful interactions</w:t>
-      </w:r>
-      <w:r>
-        <w:rPr>
-          <w:lang w:val="en-NZ"/>
-        </w:rPr>
-        <w:t>,</w:t>
-      </w:r>
-      <w:r>
-        <w:rPr>
-          <w:lang w:val="en-NZ"/>
-        </w:rPr>
-        <w:t xml:space="preserve"> mechanisms for </w:t>
-      </w:r>
-      <w:r>
-        <w:rPr>
-          <w:lang w:val="en-NZ"/>
-        </w:rPr>
-        <w:t>personal responsibility,</w:t>
-      </w:r>
-      <w:r>
-        <w:rPr>
-          <w:lang w:val="en-NZ"/>
-        </w:rPr>
-        <w:t xml:space="preserve"> development</w:t>
-      </w:r>
-      <w:r>
-        <w:rPr>
-          <w:lang w:val="en-NZ"/>
-        </w:rPr>
-        <w:t xml:space="preserve"> </w:t>
-      </w:r>
-      <w:r>
-        <w:rPr>
-          <w:lang w:val="en-NZ"/>
-        </w:rPr>
-        <w:t>of s</w:t>
-      </w:r>
-      <w:r>
-        <w:rPr>
-          <w:lang w:val="en-NZ"/>
-        </w:rPr>
-        <w:t>ocial skills,</w:t>
-      </w:r>
-      <w:r>
-        <w:rPr>
-          <w:lang w:val="en-NZ"/>
-        </w:rPr>
-        <w:t xml:space="preserve"> and spaces for the group to </w:t>
-      </w:r>
-      <w:r>
-        <w:rPr>
-          <w:lang w:val="en-NZ"/>
-        </w:rPr>
-        <w:t>self-evaluat</w:t>
-      </w:r>
-      <w:r>
-        <w:rPr>
-          <w:lang w:val="en-NZ"/>
-        </w:rPr>
-        <w:t xml:space="preserve">e </w:t>
-      </w:r>
-      <w:r>
-        <w:rPr>
-          <w:lang w:val="en-NZ"/>
-        </w:rPr>
-        <w:t>(Johnson &amp; Johnson, 1990).</w:t>
-      </w:r>
-      <w:r>
-        <w:rPr>
-          <w:lang w:val="en-NZ"/>
-        </w:rPr>
-        <w:t xml:space="preserve"> Additionally, collaborative learning can be distinguished from other forms of similar activities like peer learning, tutoring and cooperative learning by offering the spaces to work with peer in an equal relationship and with high levels of mutuality, that is, with interactions that have to be executed in both ways of the relationship</w:t>
-      </w:r>
-      <w:r>
-        <w:rPr>
-          <w:lang w:val="en-NZ"/>
-        </w:rPr>
-        <w:t xml:space="preserve"> </w:t>
-      </w:r>
-      <w:r>
-        <w:rPr>
-          <w:lang w:val="en-NZ"/>
-        </w:rPr>
-        <w:t xml:space="preserve">(O’Donnell &amp; </w:t>
-      </w:r>
-      <w:proofErr w:type="spellStart"/>
-      <w:r>
-        <w:rPr>
-          <w:lang w:val="en-NZ"/>
-        </w:rPr>
-        <w:t>Hmelo</w:t>
-      </w:r>
-      <w:proofErr w:type="spellEnd"/>
-      <w:r>
-        <w:rPr>
-          <w:lang w:val="en-NZ"/>
-        </w:rPr>
-        <w:t>-Silver, 2013)</w:t>
-      </w:r>
-      <w:r>
-        <w:rPr>
-          <w:lang w:val="en-NZ"/>
-        </w:rPr>
-        <w:t>.</w:t>
-      </w:r>
-    </w:p>
-    <w:p>
-      <w:pPr>
-        <w:rPr>
-          <w:lang w:val="en-NZ"/>
-        </w:rPr>
-      </w:pPr>
+        <w:t>or the analysis of available options and approaches from Olson &amp; Olson (2012).</w:t>
+      </w:r>
     </w:p>
     <w:p>
       <w:pPr>
@@ -2033,6 +2193,209 @@
     </w:p>
     <w:p>
       <w:pPr>
+        <w:rPr>
+          <w:lang w:val="en-NZ"/>
+        </w:rPr>
+      </w:pPr>
+      <w:r>
+        <w:rPr>
+          <w:lang w:val="en-NZ"/>
+        </w:rPr>
+        <w:t>Yadav et al. (2015)</w:t>
+      </w:r>
+      <w:r>
+        <w:rPr>
+          <w:lang w:val="en-NZ"/>
+        </w:rPr>
+        <w:t xml:space="preserve"> stablishes that an</w:t>
+      </w:r>
+      <w:r>
+        <w:rPr>
+          <w:lang w:val="en-NZ"/>
+        </w:rPr>
+        <w:t xml:space="preserve"> agile development </w:t>
+      </w:r>
+      <w:r>
+        <w:rPr>
+          <w:lang w:val="en-NZ"/>
+        </w:rPr>
+        <w:t>process with</w:t>
+      </w:r>
+      <w:r>
+        <w:rPr>
+          <w:lang w:val="en-NZ"/>
+        </w:rPr>
+        <w:t xml:space="preserve"> an</w:t>
+      </w:r>
+      <w:r>
+        <w:rPr>
+          <w:lang w:val="en-NZ"/>
+        </w:rPr>
+        <w:t xml:space="preserve"> iterative or cyclical </w:t>
+      </w:r>
+      <w:r>
+        <w:rPr>
+          <w:lang w:val="en-NZ"/>
+        </w:rPr>
+        <w:t>approach</w:t>
+      </w:r>
+      <w:r>
+        <w:rPr>
+          <w:lang w:val="en-NZ"/>
+        </w:rPr>
+        <w:t xml:space="preserve"> is better suited for rapidly changing environments and for the exploration of ideas. The nature of WorkshopAR required a development process that could quickly be adapted and </w:t>
+      </w:r>
+      <w:r>
+        <w:rPr>
+          <w:lang w:val="en-NZ"/>
+        </w:rPr>
+        <w:lastRenderedPageBreak/>
+        <w:t>refocused as the testing and observation process go on, when the context of the course is better understood and when feedback from the students is gathered and analysed.</w:t>
+      </w:r>
+    </w:p>
+    <w:p>
+      <w:pPr>
+        <w:rPr>
+          <w:lang w:val="en-NZ"/>
+        </w:rPr>
+      </w:pPr>
+      <w:r>
+        <w:rPr>
+          <w:lang w:val="en-NZ"/>
+        </w:rPr>
+        <w:t>The development did not advance completely blind or lacked a guided focus. First, and derived for the goals stated in the research questions, the development needed to focus on visual and interaction design, multiuser interaction and support communication features. Additionally, despite the initial open nature of the case study, a set of common functionalities where stablished that represented the core ideas of collaborative learning that could be enhanced through AR as explained in previous sections.</w:t>
+      </w:r>
+    </w:p>
+    <w:p>
+      <w:pPr>
+        <w:rPr>
+          <w:lang w:val="en-NZ"/>
+        </w:rPr>
+      </w:pPr>
+      <w:r>
+        <w:rPr>
+          <w:lang w:val="en-NZ"/>
+        </w:rPr>
+        <w:t>Independent of the particularities of the case study, WorkshopAR was conceived and designed to provide solutions for:</w:t>
+      </w:r>
+    </w:p>
+    <w:p>
+      <w:pPr>
+        <w:pStyle w:val="Prrafodelista"/>
+        <w:numPr>
+          <w:ilvl w:val="0"/>
+          <w:numId w:val="9"/>
+        </w:numPr>
+        <w:rPr>
+          <w:lang w:val="en-NZ"/>
+        </w:rPr>
+      </w:pPr>
+      <w:r>
+        <w:rPr>
+          <w:lang w:val="en-NZ"/>
+        </w:rPr>
+        <w:t xml:space="preserve">Visualizing the interdependence of the group </w:t>
+      </w:r>
+      <w:r>
+        <w:rPr>
+          <w:lang w:val="en-NZ"/>
+        </w:rPr>
+        <w:t>b</w:t>
+      </w:r>
+      <w:r>
+        <w:rPr>
+          <w:lang w:val="en-NZ"/>
+        </w:rPr>
+        <w:t>y making clear the composition of the team, the structure implemented and the work being done at a given time.</w:t>
+      </w:r>
+      <w:r>
+        <w:rPr>
+          <w:lang w:val="en-NZ"/>
+        </w:rPr>
+        <w:t xml:space="preserve"> This to offer guidance and promote discussion as suggested by Salas et al. (2015).</w:t>
+      </w:r>
+    </w:p>
+    <w:p>
+      <w:pPr>
+        <w:pStyle w:val="Prrafodelista"/>
+        <w:numPr>
+          <w:ilvl w:val="0"/>
+          <w:numId w:val="9"/>
+        </w:numPr>
+        <w:rPr>
+          <w:lang w:val="en-NZ"/>
+        </w:rPr>
+      </w:pPr>
+      <w:r>
+        <w:rPr>
+          <w:lang w:val="en-NZ"/>
+        </w:rPr>
+        <w:t>Keeping track of the visual resources used in the work session (ideas, models, discussions, experiments).</w:t>
+      </w:r>
+    </w:p>
+    <w:p>
+      <w:pPr>
+        <w:pStyle w:val="Prrafodelista"/>
+        <w:numPr>
+          <w:ilvl w:val="0"/>
+          <w:numId w:val="9"/>
+        </w:numPr>
+        <w:rPr>
+          <w:lang w:val="en-NZ"/>
+        </w:rPr>
+      </w:pPr>
+      <w:r>
+        <w:rPr>
+          <w:lang w:val="en-NZ"/>
+        </w:rPr>
+        <w:t>Create a shared experience for visualization, interaction and communication.</w:t>
+      </w:r>
+    </w:p>
+    <w:p>
+      <w:pPr>
+        <w:rPr>
+          <w:lang w:val="en-NZ"/>
+        </w:rPr>
+      </w:pPr>
+      <w:r>
+        <w:rPr>
+          <w:lang w:val="en-NZ"/>
+        </w:rPr>
+        <w:t xml:space="preserve">In a similar way, </w:t>
+      </w:r>
+      <w:r>
+        <w:rPr>
+          <w:lang w:val="en-NZ"/>
+        </w:rPr>
+        <w:t>in preparation for the</w:t>
+      </w:r>
+      <w:r>
+        <w:rPr>
+          <w:lang w:val="en-NZ"/>
+        </w:rPr>
+        <w:t xml:space="preserve"> development process followed, the conceptualization of the tool was first tackled through a focused design process with the aim of understanding interactions in 3D and using the inputs and tools often available in AR technologies. The purpose of this focused design process was to offer </w:t>
+      </w:r>
+      <w:r>
+        <w:rPr>
+          <w:lang w:val="en-NZ"/>
+        </w:rPr>
+        <w:t xml:space="preserve">an interaction experience that highlighted the advantages of AR and that offered an easier experience for the users that in general terms </w:t>
+      </w:r>
+      <w:r>
+        <w:rPr>
+          <w:lang w:val="en-NZ"/>
+        </w:rPr>
+        <w:t>were</w:t>
+      </w:r>
+      <w:r>
+        <w:rPr>
+          <w:lang w:val="en-NZ"/>
+        </w:rPr>
+        <w:t xml:space="preserve"> not familiar with the technology used. </w:t>
+      </w:r>
+    </w:p>
+    <w:p>
+      <w:pPr>
         <w:pStyle w:val="Ttulo3"/>
         <w:rPr>
           <w:rFonts w:asciiTheme="minorHAnsi" w:hAnsiTheme="minorHAnsi" w:cstheme="minorHAnsi"/>
@@ -2050,7 +2413,6 @@
         </w:rPr>
         <w:t>3.3.2.1 User-</w:t>
       </w:r>
-      <w:proofErr w:type="spellStart"/>
       <w:r>
         <w:rPr>
           <w:rFonts w:asciiTheme="minorHAnsi" w:hAnsiTheme="minorHAnsi" w:cstheme="minorHAnsi"/>
@@ -2058,9 +2420,8 @@
           <w:szCs w:val="22"/>
           <w:lang w:val="en-NZ"/>
         </w:rPr>
-        <w:t>centered</w:t>
-      </w:r>
-      <w:proofErr w:type="spellEnd"/>
+        <w:t>centred</w:t>
+      </w:r>
       <w:r>
         <w:rPr>
           <w:rFonts w:asciiTheme="minorHAnsi" w:hAnsiTheme="minorHAnsi" w:cstheme="minorHAnsi"/>
@@ -2073,6 +2434,690 @@
     </w:p>
     <w:p>
       <w:pPr>
+        <w:rPr>
+          <w:lang w:val="en-NZ"/>
+        </w:rPr>
+      </w:pPr>
+      <w:r>
+        <w:rPr>
+          <w:lang w:val="en-NZ"/>
+        </w:rPr>
+        <w:t>The first step in the development of WorkshopAR was a user-</w:t>
+      </w:r>
+      <w:r>
+        <w:rPr>
+          <w:lang w:val="en-NZ"/>
+        </w:rPr>
+        <w:t>centred</w:t>
+      </w:r>
+      <w:r>
+        <w:rPr>
+          <w:lang w:val="en-NZ"/>
+        </w:rPr>
+        <w:t xml:space="preserve"> design aimed at the interaction aspects of the experience with the hardware and with the AR tools build to accomplish the learning goals established. The main objective was to identify expected interactions with AR technologies and formulate a proposal for the overall user experience based on the aggregated feedback gathered from the users.</w:t>
+      </w:r>
+    </w:p>
+    <w:p>
+      <w:pPr>
+        <w:rPr>
+          <w:lang w:val="en-NZ"/>
+        </w:rPr>
+      </w:pPr>
+      <w:r>
+        <w:rPr>
+          <w:lang w:val="en-NZ"/>
+        </w:rPr>
+        <w:t>Chammas et al.</w:t>
+      </w:r>
+      <w:r>
+        <w:rPr>
+          <w:lang w:val="en-NZ"/>
+        </w:rPr>
+        <w:t xml:space="preserve"> (</w:t>
+      </w:r>
+      <w:r>
+        <w:rPr>
+          <w:lang w:val="en-NZ"/>
+        </w:rPr>
+        <w:t>2015)</w:t>
+      </w:r>
+      <w:r>
+        <w:rPr>
+          <w:lang w:val="en-NZ"/>
+        </w:rPr>
+        <w:t xml:space="preserve"> stablishes that a user-</w:t>
+      </w:r>
+      <w:r>
+        <w:rPr>
+          <w:lang w:val="en-NZ"/>
+        </w:rPr>
+        <w:t>centred</w:t>
+      </w:r>
+      <w:r>
+        <w:rPr>
+          <w:lang w:val="en-NZ"/>
+        </w:rPr>
+        <w:t xml:space="preserve"> design is characterized</w:t>
+      </w:r>
+      <w:r>
+        <w:rPr>
+          <w:lang w:val="en-NZ"/>
+        </w:rPr>
+        <w:t>, among several other things,</w:t>
+      </w:r>
+      <w:r>
+        <w:rPr>
+          <w:lang w:val="en-NZ"/>
+        </w:rPr>
+        <w:t xml:space="preserve"> by:</w:t>
+      </w:r>
+    </w:p>
+    <w:p>
+      <w:pPr>
+        <w:pStyle w:val="Prrafodelista"/>
+        <w:numPr>
+          <w:ilvl w:val="0"/>
+          <w:numId w:val="10"/>
+        </w:numPr>
+        <w:rPr>
+          <w:lang w:val="en-NZ"/>
+        </w:rPr>
+      </w:pPr>
+      <w:r>
+        <w:rPr>
+          <w:lang w:val="en-NZ"/>
+        </w:rPr>
+        <w:t>Being project-oriented, tailored to specifics needs and driven by data.</w:t>
+      </w:r>
+    </w:p>
+    <w:p>
+      <w:pPr>
+        <w:pStyle w:val="Prrafodelista"/>
+        <w:numPr>
+          <w:ilvl w:val="0"/>
+          <w:numId w:val="10"/>
+        </w:numPr>
+        <w:rPr>
+          <w:lang w:val="en-NZ"/>
+        </w:rPr>
+      </w:pPr>
+      <w:r>
+        <w:rPr>
+          <w:lang w:val="en-NZ"/>
+        </w:rPr>
+        <w:t>Interacting and engaging with the user. It is an exercise in communication.</w:t>
+      </w:r>
+    </w:p>
+    <w:p>
+      <w:pPr>
+        <w:pStyle w:val="Prrafodelista"/>
+        <w:numPr>
+          <w:ilvl w:val="0"/>
+          <w:numId w:val="10"/>
+        </w:numPr>
+        <w:rPr>
+          <w:lang w:val="en-NZ"/>
+        </w:rPr>
+      </w:pPr>
+      <w:r>
+        <w:rPr>
+          <w:lang w:val="en-NZ"/>
+        </w:rPr>
+        <w:t>A constant process of analysis and refinement.</w:t>
+      </w:r>
+    </w:p>
+    <w:p>
+      <w:pPr>
+        <w:rPr>
+          <w:lang w:val="en-NZ"/>
+        </w:rPr>
+      </w:pPr>
+      <w:r>
+        <w:rPr>
+          <w:lang w:val="en-NZ"/>
+        </w:rPr>
+        <w:t xml:space="preserve">User-driven design can move in a wide spectrum depending on the level of involvement of the user and the steps in which input has been gathered and implemented. </w:t>
+      </w:r>
+      <w:r>
+        <w:rPr>
+          <w:lang w:val="en-NZ"/>
+        </w:rPr>
+        <w:t>Marti &amp; Bannon</w:t>
+      </w:r>
+      <w:r>
+        <w:rPr>
+          <w:lang w:val="en-NZ"/>
+        </w:rPr>
+        <w:t xml:space="preserve"> (</w:t>
+      </w:r>
+      <w:r>
+        <w:rPr>
+          <w:lang w:val="en-NZ"/>
+        </w:rPr>
+        <w:t>2009)</w:t>
+      </w:r>
+      <w:r>
+        <w:rPr>
+          <w:lang w:val="en-NZ"/>
+        </w:rPr>
+        <w:t xml:space="preserve"> advise the need of considering the context of the project to determine how much access the user can and should have in the development process, the points in the project life-cycle in which the </w:t>
+      </w:r>
+      <w:r>
+        <w:rPr>
+          <w:lang w:val="en-NZ"/>
+        </w:rPr>
+        <w:t>input</w:t>
+      </w:r>
+      <w:r>
+        <w:rPr>
+          <w:lang w:val="en-NZ"/>
+        </w:rPr>
+        <w:t xml:space="preserve"> </w:t>
+      </w:r>
+      <w:proofErr w:type="spellStart"/>
+      <w:r>
+        <w:rPr>
+          <w:lang w:val="en-NZ"/>
+        </w:rPr>
+        <w:t>f</w:t>
+      </w:r>
+      <w:proofErr w:type="spellEnd"/>
+      <w:r>
+        <w:rPr>
+          <w:lang w:val="en-NZ"/>
+        </w:rPr>
+        <w:t xml:space="preserve"> the user is more </w:t>
+      </w:r>
+      <w:r>
+        <w:rPr>
+          <w:lang w:val="en-NZ"/>
+        </w:rPr>
+        <w:t>valuable</w:t>
+      </w:r>
+      <w:r>
+        <w:rPr>
+          <w:lang w:val="en-NZ"/>
+        </w:rPr>
+        <w:t xml:space="preserve"> and </w:t>
+      </w:r>
+      <w:r>
+        <w:rPr>
+          <w:lang w:val="en-NZ"/>
+        </w:rPr>
+        <w:t>developing</w:t>
+      </w:r>
+      <w:r>
+        <w:rPr>
+          <w:lang w:val="en-NZ"/>
+        </w:rPr>
+        <w:t xml:space="preserve"> a correct characterization of all the different users that a </w:t>
+      </w:r>
+      <w:r>
+        <w:rPr>
+          <w:lang w:val="en-NZ"/>
+        </w:rPr>
+        <w:t>product</w:t>
+      </w:r>
+      <w:r>
+        <w:rPr>
+          <w:lang w:val="en-NZ"/>
+        </w:rPr>
+        <w:t xml:space="preserve"> may target.</w:t>
+      </w:r>
+    </w:p>
+    <w:p>
+      <w:pPr>
+        <w:rPr>
+          <w:lang w:val="en-NZ"/>
+        </w:rPr>
+      </w:pPr>
+      <w:r>
+        <w:rPr>
+          <w:lang w:val="en-NZ"/>
+        </w:rPr>
+        <w:lastRenderedPageBreak/>
+        <w:t>The development of this project benefits from a user-centred approach because it is an exploratory context. User-driven design is better suited for scenarios in which the user has a personal or strong connection to the product o</w:t>
+      </w:r>
+      <w:r>
+        <w:rPr>
+          <w:lang w:val="en-NZ"/>
+        </w:rPr>
+        <w:t>r</w:t>
+      </w:r>
+      <w:r>
+        <w:rPr>
+          <w:lang w:val="en-NZ"/>
+        </w:rPr>
+        <w:t xml:space="preserve"> when tailoring a solution to a particular population. User input is also more valuable when used to guide research, explore design pathways or identifying issues with an idea or a prototype </w:t>
+      </w:r>
+      <w:r>
+        <w:rPr>
+          <w:lang w:val="en-NZ"/>
+        </w:rPr>
+        <w:t>(Goodman-Deane et al., 2010</w:t>
+      </w:r>
+      <w:r>
+        <w:rPr>
+          <w:lang w:val="en-NZ"/>
+        </w:rPr>
+        <w:t xml:space="preserve">, </w:t>
+      </w:r>
+      <w:r>
+        <w:rPr>
+          <w:lang w:val="en-NZ"/>
+        </w:rPr>
+        <w:t>Tosi, 2020</w:t>
+      </w:r>
+      <w:r>
+        <w:rPr>
+          <w:lang w:val="en-NZ"/>
+        </w:rPr>
+        <w:t>)</w:t>
+      </w:r>
+      <w:r>
+        <w:rPr>
+          <w:lang w:val="en-NZ"/>
+        </w:rPr>
+        <w:t>.</w:t>
+      </w:r>
+      <w:r>
+        <w:rPr>
+          <w:lang w:val="en-NZ"/>
+        </w:rPr>
+        <w:t xml:space="preserve"> Figure 2 shows the involvement of the users incorporated through the different stages of the research, but more significantly in the software development process, using as a bases the stages proposed by </w:t>
+      </w:r>
+      <w:r>
+        <w:rPr>
+          <w:lang w:val="en-NZ"/>
+        </w:rPr>
+        <w:t xml:space="preserve">Pelegrin, </w:t>
+      </w:r>
+      <w:r>
+        <w:rPr>
+          <w:lang w:val="en-NZ"/>
+        </w:rPr>
+        <w:t>(</w:t>
+      </w:r>
+      <w:r>
+        <w:rPr>
+          <w:lang w:val="en-NZ"/>
+        </w:rPr>
+        <w:t>2024</w:t>
+      </w:r>
+      <w:r>
+        <w:rPr>
+          <w:lang w:val="en-NZ"/>
+        </w:rPr>
+        <w:t>)</w:t>
+      </w:r>
+      <w:r>
+        <w:rPr>
+          <w:lang w:val="en-NZ"/>
+        </w:rPr>
+        <w:t>.</w:t>
+      </w:r>
+    </w:p>
+    <w:p>
+      <w:pPr>
+        <w:keepNext/>
+        <w:jc w:val="center"/>
+        <w:rPr>
+          <w:lang w:val="en-NZ"/>
+        </w:rPr>
+      </w:pPr>
+      <w:r>
+        <w:rPr>
+          <w:noProof/>
+          <w:lang w:val="en-NZ"/>
+        </w:rPr>
+        <w:drawing>
+          <wp:inline distT="0" distB="0" distL="0" distR="0" wp14:anchorId="2A2EC62D" wp14:editId="387C8EE6">
+            <wp:extent cx="5612130" cy="3741420"/>
+            <wp:effectExtent l="0" t="0" r="7620" b="0"/>
+            <wp:docPr id="272358819" name="Imagen 1"/>
+            <wp:cNvGraphicFramePr>
+              <a:graphicFrameLocks xmlns:a="http://schemas.openxmlformats.org/drawingml/2006/main" noChangeAspect="1"/>
+            </wp:cNvGraphicFramePr>
+            <a:graphic xmlns:a="http://schemas.openxmlformats.org/drawingml/2006/main">
+              <a:graphicData uri="http://schemas.openxmlformats.org/drawingml/2006/picture">
+                <pic:pic xmlns:pic="http://schemas.openxmlformats.org/drawingml/2006/picture">
+                  <pic:nvPicPr>
+                    <pic:cNvPr id="0" name="Picture 1"/>
+                    <pic:cNvPicPr>
+                      <a:picLocks noChangeAspect="1" noChangeArrowheads="1"/>
+                    </pic:cNvPicPr>
+                  </pic:nvPicPr>
+                  <pic:blipFill>
+                    <a:blip r:embed="rId6">
+                      <a:extLst>
+                        <a:ext uri="{28A0092B-C50C-407E-A947-70E740481C1C}">
+                          <a14:useLocalDpi xmlns:a14="http://schemas.microsoft.com/office/drawing/2010/main" val="0"/>
+                        </a:ext>
+                      </a:extLst>
+                    </a:blip>
+                    <a:srcRect/>
+                    <a:stretch>
+                      <a:fillRect/>
+                    </a:stretch>
+                  </pic:blipFill>
+                  <pic:spPr bwMode="auto">
+                    <a:xfrm>
+                      <a:off x="0" y="0"/>
+                      <a:ext cx="5612130" cy="3741420"/>
+                    </a:xfrm>
+                    <a:prstGeom prst="rect">
+                      <a:avLst/>
+                    </a:prstGeom>
+                    <a:noFill/>
+                    <a:ln>
+                      <a:noFill/>
+                    </a:ln>
+                  </pic:spPr>
+                </pic:pic>
+              </a:graphicData>
+            </a:graphic>
+          </wp:inline>
+        </w:drawing>
+      </w:r>
+    </w:p>
+    <w:p>
+      <w:pPr>
+        <w:pStyle w:val="Descripcin"/>
+        <w:jc w:val="center"/>
+        <w:rPr>
+          <w:lang w:val="en-NZ"/>
+        </w:rPr>
+      </w:pPr>
+      <w:r>
+        <w:rPr>
+          <w:lang w:val="en-NZ"/>
+        </w:rPr>
+        <w:t xml:space="preserve">Figure </w:t>
+      </w:r>
+      <w:r>
+        <w:rPr>
+          <w:lang w:val="en-NZ"/>
+        </w:rPr>
+        <w:fldChar w:fldCharType="begin"/>
+      </w:r>
+      <w:r>
+        <w:rPr>
+          <w:lang w:val="en-NZ"/>
+        </w:rPr>
+        <w:instrText xml:space="preserve"> SEQ Figure \* ARABIC </w:instrText>
+      </w:r>
+      <w:r>
+        <w:rPr>
+          <w:lang w:val="en-NZ"/>
+        </w:rPr>
+        <w:fldChar w:fldCharType="separate"/>
+      </w:r>
+      <w:r>
+        <w:rPr>
+          <w:noProof/>
+          <w:lang w:val="en-NZ"/>
+        </w:rPr>
+        <w:t>2</w:t>
+      </w:r>
+      <w:r>
+        <w:rPr>
+          <w:lang w:val="en-NZ"/>
+        </w:rPr>
+        <w:fldChar w:fldCharType="end"/>
+      </w:r>
+      <w:r>
+        <w:rPr>
+          <w:lang w:val="en-NZ"/>
+        </w:rPr>
+        <w:t xml:space="preserve"> User Input in the user-centred design process</w:t>
+      </w:r>
+    </w:p>
+    <w:p>
+      <w:pPr>
+        <w:rPr>
+          <w:lang w:val="en-NZ"/>
+        </w:rPr>
+      </w:pPr>
+      <w:r>
+        <w:rPr>
+          <w:lang w:val="en-NZ"/>
+        </w:rPr>
+        <w:t xml:space="preserve">The biggest risk that needs to be acknowledged when implementing </w:t>
+      </w:r>
+      <w:proofErr w:type="gramStart"/>
+      <w:r>
+        <w:rPr>
+          <w:lang w:val="en-NZ"/>
+        </w:rPr>
+        <w:t>an</w:t>
+      </w:r>
+      <w:proofErr w:type="gramEnd"/>
+      <w:r>
+        <w:rPr>
+          <w:lang w:val="en-NZ"/>
+        </w:rPr>
+        <w:t xml:space="preserve"> user-centred design is to mismanage the involvement of the user in the process, as </w:t>
+      </w:r>
+      <w:r>
+        <w:rPr>
+          <w:lang w:val="en-NZ"/>
+        </w:rPr>
+        <w:t>Wilson</w:t>
+      </w:r>
+      <w:r>
+        <w:rPr>
+          <w:lang w:val="en-NZ"/>
+        </w:rPr>
+        <w:t xml:space="preserve"> (</w:t>
+      </w:r>
+      <w:r>
+        <w:rPr>
+          <w:lang w:val="en-NZ"/>
+        </w:rPr>
+        <w:t>2014)</w:t>
+      </w:r>
+      <w:r>
+        <w:rPr>
+          <w:lang w:val="en-NZ"/>
+        </w:rPr>
+        <w:t xml:space="preserve"> exemplifies. This situation can take the form of:</w:t>
+      </w:r>
+    </w:p>
+    <w:p>
+      <w:pPr>
+        <w:pStyle w:val="Prrafodelista"/>
+        <w:numPr>
+          <w:ilvl w:val="0"/>
+          <w:numId w:val="11"/>
+        </w:numPr>
+        <w:rPr>
+          <w:lang w:val="en-NZ"/>
+        </w:rPr>
+      </w:pPr>
+      <w:r>
+        <w:rPr>
+          <w:lang w:val="en-NZ"/>
+        </w:rPr>
+        <w:t>A lack of expertise guiding the project, which results in only community-driven ideas than can turn out amateurish in nature or not take into consideration the whole extent and context of the project.</w:t>
+      </w:r>
+    </w:p>
+    <w:p>
+      <w:pPr>
+        <w:pStyle w:val="Prrafodelista"/>
+        <w:numPr>
+          <w:ilvl w:val="0"/>
+          <w:numId w:val="11"/>
+        </w:numPr>
+        <w:rPr>
+          <w:lang w:val="en-NZ"/>
+        </w:rPr>
+      </w:pPr>
+      <w:r>
+        <w:rPr>
+          <w:lang w:val="en-NZ"/>
+        </w:rPr>
+        <w:t>A disorganized input that lacks cohesion and a clear goal.</w:t>
+      </w:r>
+    </w:p>
+    <w:p>
+      <w:pPr>
+        <w:pStyle w:val="Prrafodelista"/>
+        <w:numPr>
+          <w:ilvl w:val="0"/>
+          <w:numId w:val="11"/>
+        </w:numPr>
+        <w:rPr>
+          <w:lang w:val="en-NZ"/>
+        </w:rPr>
+      </w:pPr>
+      <w:r>
+        <w:rPr>
+          <w:lang w:val="en-NZ"/>
+        </w:rPr>
+        <w:t>Stumbled progress, usually due to late decision making or relaying on the necessity to please many disjointed voices.</w:t>
+      </w:r>
+    </w:p>
+    <w:p>
+      <w:pPr>
+        <w:rPr>
+          <w:lang w:val="en-NZ"/>
+        </w:rPr>
+      </w:pPr>
+      <w:r>
+        <w:rPr>
+          <w:lang w:val="en-NZ"/>
+        </w:rPr>
+        <w:t xml:space="preserve">To deal with these issues is necessary to have a clear guideline of the objectives and purpose of the development (citation). The clear goal of creating a shared space for collaborative work and the learning goals for the general software development and the industry project course check these requirements or the development of this design process. Nonetheless, some other guidelines have </w:t>
+      </w:r>
+      <w:r>
+        <w:rPr>
+          <w:lang w:val="en-NZ"/>
+        </w:rPr>
+        <w:lastRenderedPageBreak/>
+        <w:t>been established to keep the interaction design focused and to help the analysis and incorporation of feedback in the different stages of the user-centred design:</w:t>
+      </w:r>
+    </w:p>
+    <w:p>
+      <w:pPr>
+        <w:pStyle w:val="Prrafodelista"/>
+        <w:numPr>
+          <w:ilvl w:val="0"/>
+          <w:numId w:val="12"/>
+        </w:numPr>
+        <w:rPr>
+          <w:lang w:val="en-NZ"/>
+        </w:rPr>
+      </w:pPr>
+      <w:r>
+        <w:rPr>
+          <w:lang w:val="en-NZ"/>
+        </w:rPr>
+        <w:t>The development of WorkshopAR is mobile-first. Several aspects of multiplatform interaction will be discussed and tested, but the priority in design will be given to the technology and input methods found primarily in mobile environments, leveraging the handholds and methods present and expected in the medium.</w:t>
+      </w:r>
+    </w:p>
+    <w:p>
+      <w:pPr>
+        <w:pStyle w:val="Prrafodelista"/>
+        <w:numPr>
+          <w:ilvl w:val="0"/>
+          <w:numId w:val="12"/>
+        </w:numPr>
+        <w:rPr>
+          <w:lang w:val="en-NZ"/>
+        </w:rPr>
+      </w:pPr>
+      <w:r>
+        <w:rPr>
+          <w:lang w:val="en-NZ"/>
+        </w:rPr>
+        <w:t>The main design space will be in 3D interactions and the use of AR to solve problems like the selection of objects, positioning and image identification. Aesthetical decisions and design are important but not the focus of the research.</w:t>
+      </w:r>
+    </w:p>
+    <w:p>
+      <w:pPr>
+        <w:pStyle w:val="Prrafodelista"/>
+        <w:numPr>
+          <w:ilvl w:val="0"/>
+          <w:numId w:val="12"/>
+        </w:numPr>
+        <w:rPr>
+          <w:lang w:val="en-NZ"/>
+        </w:rPr>
+      </w:pPr>
+      <w:r>
+        <w:rPr>
+          <w:lang w:val="en-NZ"/>
+        </w:rPr>
+        <w:t xml:space="preserve">AR is a new interaction space for many users, but plenty of sources have shown and tested different designs with positive results. The design guidelines for AR interactions developed by Google </w:t>
+      </w:r>
+      <w:proofErr w:type="spellStart"/>
+      <w:r>
+        <w:rPr>
+          <w:lang w:val="en-NZ"/>
+        </w:rPr>
+        <w:t>DevWorks</w:t>
+      </w:r>
+      <w:proofErr w:type="spellEnd"/>
+      <w:r>
+        <w:rPr>
+          <w:lang w:val="en-NZ"/>
+        </w:rPr>
+        <w:t xml:space="preserve"> </w:t>
+      </w:r>
+      <w:r>
+        <w:rPr>
+          <w:lang w:val="en-NZ"/>
+        </w:rPr>
+        <w:t>(</w:t>
+      </w:r>
+      <w:proofErr w:type="spellStart"/>
+      <w:r>
+        <w:rPr>
+          <w:lang w:val="en-NZ"/>
+        </w:rPr>
+        <w:t>ARCore</w:t>
+      </w:r>
+      <w:proofErr w:type="spellEnd"/>
+      <w:r>
+        <w:rPr>
+          <w:lang w:val="en-NZ"/>
+        </w:rPr>
+        <w:t>, 2025)</w:t>
+      </w:r>
+      <w:r>
+        <w:rPr>
+          <w:lang w:val="en-NZ"/>
+        </w:rPr>
+        <w:t xml:space="preserve"> </w:t>
+      </w:r>
+      <w:r>
+        <w:rPr>
+          <w:lang w:val="en-NZ"/>
+        </w:rPr>
+        <w:t>are</w:t>
+      </w:r>
+      <w:r>
+        <w:rPr>
+          <w:lang w:val="en-NZ"/>
+        </w:rPr>
+        <w:t xml:space="preserve"> a good example of the available solutions in the current market than can be leveraged and expanded upon without the necessity of reinventing the wheel.</w:t>
+      </w:r>
+    </w:p>
+    <w:p>
+      <w:pPr>
+        <w:rPr>
+          <w:lang w:val="en-NZ"/>
+        </w:rPr>
+      </w:pPr>
+      <w:r>
+        <w:rPr>
+          <w:lang w:val="en-NZ"/>
+        </w:rPr>
+        <w:t>This philosophy behind the user-centred design was also used as part of the iterative process for the software development specially in support of the analysis and testing steps, as will be described in the next section.</w:t>
+      </w:r>
+    </w:p>
+    <w:p>
+      <w:pPr>
         <w:pStyle w:val="Ttulo3"/>
         <w:rPr>
           <w:rFonts w:asciiTheme="minorHAnsi" w:hAnsiTheme="minorHAnsi" w:cstheme="minorHAnsi"/>
@@ -2089,6 +3134,19 @@
           <w:lang w:val="en-NZ"/>
         </w:rPr>
         <w:t>3.3.2.2 Software engineering process</w:t>
+      </w:r>
+    </w:p>
+    <w:p>
+      <w:pPr>
+        <w:rPr>
+          <w:lang w:val="en-NZ"/>
+        </w:rPr>
+      </w:pPr>
+      <w:r>
+        <w:rPr>
+          <w:lang w:val="en-NZ"/>
+        </w:rPr>
+        <w:t>Most of the process proposed is based on the stages and activities recommended by Salo &amp; Abrahamsson (2007) to conduct and agile development process that tis constantly checking for improvement and for effective use of resources.</w:t>
       </w:r>
     </w:p>
     <w:p>
@@ -2126,6 +3184,345 @@
 <file path=word/numbering.xml><?xml version="1.0" encoding="utf-8"?>
 <w:numbering xmlns:wpc="http://schemas.microsoft.com/office/word/2010/wordprocessingCanvas" xmlns:cx="http://schemas.microsoft.com/office/drawing/2014/chartex" xmlns:cx1="http://schemas.microsoft.com/office/drawing/2015/9/8/chartex" xmlns:cx2="http://schemas.microsoft.com/office/drawing/2015/10/21/chartex" xmlns:cx3="http://schemas.microsoft.com/office/drawing/2016/5/9/chartex" xmlns:cx4="http://schemas.microsoft.com/office/drawing/2016/5/10/chartex" xmlns:cx5="http://schemas.microsoft.com/office/drawing/2016/5/11/chartex" xmlns:cx6="http://schemas.microsoft.com/office/drawing/2016/5/12/chartex" xmlns:cx7="http://schemas.microsoft.com/office/drawing/2016/5/13/chartex" xmlns:cx8="http://schemas.microsoft.com/office/drawing/2016/5/14/chartex" xmlns:mc="http://schemas.openxmlformats.org/markup-compatibility/2006" xmlns:aink="http://schemas.microsoft.com/office/drawing/2016/ink" xmlns:am3d="http://schemas.microsoft.com/office/drawing/2017/model3d" xmlns:o="urn:schemas-microsoft-com:office:office" xmlns:oel="http://schemas.microsoft.com/office/2019/extlst" xmlns:r="http://schemas.openxmlformats.org/officeDocument/2006/relationships" xmlns:m="http://schemas.openxmlformats.org/officeDocument/2006/math" xmlns:v="urn:schemas-microsoft-com:vml" xmlns:wp14="http://schemas.microsoft.com/office/word/2010/wordprocessingDrawing" xmlns:wp="http://schemas.openxmlformats.org/drawingml/2006/wordprocessingDrawing" xmlns:w10="urn:schemas-microsoft-com:office:word" xmlns:w="http://schemas.openxmlformats.org/wordprocessingml/2006/main" xmlns:w14="http://schemas.microsoft.com/office/word/2010/wordml" xmlns:w15="http://schemas.microsoft.com/office/word/2012/wordml" xmlns:w16cex="http://schemas.microsoft.com/office/word/2018/wordml/cex" xmlns:w16cid="http://schemas.microsoft.com/office/word/2016/wordml/cid" xmlns:w16="http://schemas.microsoft.com/office/word/2018/wordml" xmlns:w16du="http://schemas.microsoft.com/office/word/2023/wordml/word16du" xmlns:w16sdtdh="http://schemas.microsoft.com/office/word/2020/wordml/sdtdatahash" xmlns:w16sdtfl="http://schemas.microsoft.com/office/word/2024/wordml/sdtformatlock" xmlns:w16se="http://schemas.microsoft.com/office/word/2015/wordml/symex" xmlns:wpg="http://schemas.microsoft.com/office/word/2010/wordprocessingGroup" xmlns:wpi="http://schemas.microsoft.com/office/word/2010/wordprocessingInk" xmlns:wne="http://schemas.microsoft.com/office/word/2006/wordml" xmlns:wps="http://schemas.microsoft.com/office/word/2010/wordprocessingShape" mc:Ignorable="w14 w15 w16se w16cid w16 w16cex w16sdtdh w16sdtfl w16du wp14">
   <w:abstractNum w:abstractNumId="0" w15:restartNumberingAfterBreak="0">
+    <w:nsid w:val="37422F48"/>
+    <w:multiLevelType w:val="hybridMultilevel"/>
+    <w:tmpl w:val="418C146E"/>
+    <w:lvl w:ilvl="0" w:tplc="240A0001">
+      <w:start w:val="1"/>
+      <w:numFmt w:val="bullet"/>
+      <w:lvlText w:val=""/>
+      <w:lvlJc w:val="left"/>
+      <w:pPr>
+        <w:ind w:left="720" w:hanging="360"/>
+      </w:pPr>
+      <w:rPr>
+        <w:rFonts w:ascii="Symbol" w:hAnsi="Symbol" w:hint="default"/>
+      </w:rPr>
+    </w:lvl>
+    <w:lvl w:ilvl="1" w:tplc="240A0003" w:tentative="1">
+      <w:start w:val="1"/>
+      <w:numFmt w:val="bullet"/>
+      <w:lvlText w:val="o"/>
+      <w:lvlJc w:val="left"/>
+      <w:pPr>
+        <w:ind w:left="1440" w:hanging="360"/>
+      </w:pPr>
+      <w:rPr>
+        <w:rFonts w:ascii="Courier New" w:hAnsi="Courier New" w:cs="Courier New" w:hint="default"/>
+      </w:rPr>
+    </w:lvl>
+    <w:lvl w:ilvl="2" w:tplc="240A0005" w:tentative="1">
+      <w:start w:val="1"/>
+      <w:numFmt w:val="bullet"/>
+      <w:lvlText w:val=""/>
+      <w:lvlJc w:val="left"/>
+      <w:pPr>
+        <w:ind w:left="2160" w:hanging="360"/>
+      </w:pPr>
+      <w:rPr>
+        <w:rFonts w:ascii="Wingdings" w:hAnsi="Wingdings" w:hint="default"/>
+      </w:rPr>
+    </w:lvl>
+    <w:lvl w:ilvl="3" w:tplc="240A0001" w:tentative="1">
+      <w:start w:val="1"/>
+      <w:numFmt w:val="bullet"/>
+      <w:lvlText w:val=""/>
+      <w:lvlJc w:val="left"/>
+      <w:pPr>
+        <w:ind w:left="2880" w:hanging="360"/>
+      </w:pPr>
+      <w:rPr>
+        <w:rFonts w:ascii="Symbol" w:hAnsi="Symbol" w:hint="default"/>
+      </w:rPr>
+    </w:lvl>
+    <w:lvl w:ilvl="4" w:tplc="240A0003" w:tentative="1">
+      <w:start w:val="1"/>
+      <w:numFmt w:val="bullet"/>
+      <w:lvlText w:val="o"/>
+      <w:lvlJc w:val="left"/>
+      <w:pPr>
+        <w:ind w:left="3600" w:hanging="360"/>
+      </w:pPr>
+      <w:rPr>
+        <w:rFonts w:ascii="Courier New" w:hAnsi="Courier New" w:cs="Courier New" w:hint="default"/>
+      </w:rPr>
+    </w:lvl>
+    <w:lvl w:ilvl="5" w:tplc="240A0005" w:tentative="1">
+      <w:start w:val="1"/>
+      <w:numFmt w:val="bullet"/>
+      <w:lvlText w:val=""/>
+      <w:lvlJc w:val="left"/>
+      <w:pPr>
+        <w:ind w:left="4320" w:hanging="360"/>
+      </w:pPr>
+      <w:rPr>
+        <w:rFonts w:ascii="Wingdings" w:hAnsi="Wingdings" w:hint="default"/>
+      </w:rPr>
+    </w:lvl>
+    <w:lvl w:ilvl="6" w:tplc="240A0001" w:tentative="1">
+      <w:start w:val="1"/>
+      <w:numFmt w:val="bullet"/>
+      <w:lvlText w:val=""/>
+      <w:lvlJc w:val="left"/>
+      <w:pPr>
+        <w:ind w:left="5040" w:hanging="360"/>
+      </w:pPr>
+      <w:rPr>
+        <w:rFonts w:ascii="Symbol" w:hAnsi="Symbol" w:hint="default"/>
+      </w:rPr>
+    </w:lvl>
+    <w:lvl w:ilvl="7" w:tplc="240A0003" w:tentative="1">
+      <w:start w:val="1"/>
+      <w:numFmt w:val="bullet"/>
+      <w:lvlText w:val="o"/>
+      <w:lvlJc w:val="left"/>
+      <w:pPr>
+        <w:ind w:left="5760" w:hanging="360"/>
+      </w:pPr>
+      <w:rPr>
+        <w:rFonts w:ascii="Courier New" w:hAnsi="Courier New" w:cs="Courier New" w:hint="default"/>
+      </w:rPr>
+    </w:lvl>
+    <w:lvl w:ilvl="8" w:tplc="240A0005" w:tentative="1">
+      <w:start w:val="1"/>
+      <w:numFmt w:val="bullet"/>
+      <w:lvlText w:val=""/>
+      <w:lvlJc w:val="left"/>
+      <w:pPr>
+        <w:ind w:left="6480" w:hanging="360"/>
+      </w:pPr>
+      <w:rPr>
+        <w:rFonts w:ascii="Wingdings" w:hAnsi="Wingdings" w:hint="default"/>
+      </w:rPr>
+    </w:lvl>
+  </w:abstractNum>
+  <w:abstractNum w:abstractNumId="1" w15:restartNumberingAfterBreak="0">
+    <w:nsid w:val="3B9C0E49"/>
+    <w:multiLevelType w:val="hybridMultilevel"/>
+    <w:tmpl w:val="983A57BE"/>
+    <w:lvl w:ilvl="0" w:tplc="240A0001">
+      <w:start w:val="1"/>
+      <w:numFmt w:val="bullet"/>
+      <w:lvlText w:val=""/>
+      <w:lvlJc w:val="left"/>
+      <w:pPr>
+        <w:ind w:left="720" w:hanging="360"/>
+      </w:pPr>
+      <w:rPr>
+        <w:rFonts w:ascii="Symbol" w:hAnsi="Symbol" w:hint="default"/>
+      </w:rPr>
+    </w:lvl>
+    <w:lvl w:ilvl="1" w:tplc="240A0003" w:tentative="1">
+      <w:start w:val="1"/>
+      <w:numFmt w:val="bullet"/>
+      <w:lvlText w:val="o"/>
+      <w:lvlJc w:val="left"/>
+      <w:pPr>
+        <w:ind w:left="1440" w:hanging="360"/>
+      </w:pPr>
+      <w:rPr>
+        <w:rFonts w:ascii="Courier New" w:hAnsi="Courier New" w:cs="Courier New" w:hint="default"/>
+      </w:rPr>
+    </w:lvl>
+    <w:lvl w:ilvl="2" w:tplc="240A0005" w:tentative="1">
+      <w:start w:val="1"/>
+      <w:numFmt w:val="bullet"/>
+      <w:lvlText w:val=""/>
+      <w:lvlJc w:val="left"/>
+      <w:pPr>
+        <w:ind w:left="2160" w:hanging="360"/>
+      </w:pPr>
+      <w:rPr>
+        <w:rFonts w:ascii="Wingdings" w:hAnsi="Wingdings" w:hint="default"/>
+      </w:rPr>
+    </w:lvl>
+    <w:lvl w:ilvl="3" w:tplc="240A0001" w:tentative="1">
+      <w:start w:val="1"/>
+      <w:numFmt w:val="bullet"/>
+      <w:lvlText w:val=""/>
+      <w:lvlJc w:val="left"/>
+      <w:pPr>
+        <w:ind w:left="2880" w:hanging="360"/>
+      </w:pPr>
+      <w:rPr>
+        <w:rFonts w:ascii="Symbol" w:hAnsi="Symbol" w:hint="default"/>
+      </w:rPr>
+    </w:lvl>
+    <w:lvl w:ilvl="4" w:tplc="240A0003" w:tentative="1">
+      <w:start w:val="1"/>
+      <w:numFmt w:val="bullet"/>
+      <w:lvlText w:val="o"/>
+      <w:lvlJc w:val="left"/>
+      <w:pPr>
+        <w:ind w:left="3600" w:hanging="360"/>
+      </w:pPr>
+      <w:rPr>
+        <w:rFonts w:ascii="Courier New" w:hAnsi="Courier New" w:cs="Courier New" w:hint="default"/>
+      </w:rPr>
+    </w:lvl>
+    <w:lvl w:ilvl="5" w:tplc="240A0005" w:tentative="1">
+      <w:start w:val="1"/>
+      <w:numFmt w:val="bullet"/>
+      <w:lvlText w:val=""/>
+      <w:lvlJc w:val="left"/>
+      <w:pPr>
+        <w:ind w:left="4320" w:hanging="360"/>
+      </w:pPr>
+      <w:rPr>
+        <w:rFonts w:ascii="Wingdings" w:hAnsi="Wingdings" w:hint="default"/>
+      </w:rPr>
+    </w:lvl>
+    <w:lvl w:ilvl="6" w:tplc="240A0001" w:tentative="1">
+      <w:start w:val="1"/>
+      <w:numFmt w:val="bullet"/>
+      <w:lvlText w:val=""/>
+      <w:lvlJc w:val="left"/>
+      <w:pPr>
+        <w:ind w:left="5040" w:hanging="360"/>
+      </w:pPr>
+      <w:rPr>
+        <w:rFonts w:ascii="Symbol" w:hAnsi="Symbol" w:hint="default"/>
+      </w:rPr>
+    </w:lvl>
+    <w:lvl w:ilvl="7" w:tplc="240A0003" w:tentative="1">
+      <w:start w:val="1"/>
+      <w:numFmt w:val="bullet"/>
+      <w:lvlText w:val="o"/>
+      <w:lvlJc w:val="left"/>
+      <w:pPr>
+        <w:ind w:left="5760" w:hanging="360"/>
+      </w:pPr>
+      <w:rPr>
+        <w:rFonts w:ascii="Courier New" w:hAnsi="Courier New" w:cs="Courier New" w:hint="default"/>
+      </w:rPr>
+    </w:lvl>
+    <w:lvl w:ilvl="8" w:tplc="240A0005" w:tentative="1">
+      <w:start w:val="1"/>
+      <w:numFmt w:val="bullet"/>
+      <w:lvlText w:val=""/>
+      <w:lvlJc w:val="left"/>
+      <w:pPr>
+        <w:ind w:left="6480" w:hanging="360"/>
+      </w:pPr>
+      <w:rPr>
+        <w:rFonts w:ascii="Wingdings" w:hAnsi="Wingdings" w:hint="default"/>
+      </w:rPr>
+    </w:lvl>
+  </w:abstractNum>
+  <w:abstractNum w:abstractNumId="2" w15:restartNumberingAfterBreak="0">
+    <w:nsid w:val="3E9F2DAB"/>
+    <w:multiLevelType w:val="hybridMultilevel"/>
+    <w:tmpl w:val="5716492A"/>
+    <w:lvl w:ilvl="0" w:tplc="240A0001">
+      <w:start w:val="1"/>
+      <w:numFmt w:val="bullet"/>
+      <w:lvlText w:val=""/>
+      <w:lvlJc w:val="left"/>
+      <w:pPr>
+        <w:ind w:left="720" w:hanging="360"/>
+      </w:pPr>
+      <w:rPr>
+        <w:rFonts w:ascii="Symbol" w:hAnsi="Symbol" w:hint="default"/>
+      </w:rPr>
+    </w:lvl>
+    <w:lvl w:ilvl="1" w:tplc="240A0003" w:tentative="1">
+      <w:start w:val="1"/>
+      <w:numFmt w:val="bullet"/>
+      <w:lvlText w:val="o"/>
+      <w:lvlJc w:val="left"/>
+      <w:pPr>
+        <w:ind w:left="1440" w:hanging="360"/>
+      </w:pPr>
+      <w:rPr>
+        <w:rFonts w:ascii="Courier New" w:hAnsi="Courier New" w:cs="Courier New" w:hint="default"/>
+      </w:rPr>
+    </w:lvl>
+    <w:lvl w:ilvl="2" w:tplc="240A0005" w:tentative="1">
+      <w:start w:val="1"/>
+      <w:numFmt w:val="bullet"/>
+      <w:lvlText w:val=""/>
+      <w:lvlJc w:val="left"/>
+      <w:pPr>
+        <w:ind w:left="2160" w:hanging="360"/>
+      </w:pPr>
+      <w:rPr>
+        <w:rFonts w:ascii="Wingdings" w:hAnsi="Wingdings" w:hint="default"/>
+      </w:rPr>
+    </w:lvl>
+    <w:lvl w:ilvl="3" w:tplc="240A0001" w:tentative="1">
+      <w:start w:val="1"/>
+      <w:numFmt w:val="bullet"/>
+      <w:lvlText w:val=""/>
+      <w:lvlJc w:val="left"/>
+      <w:pPr>
+        <w:ind w:left="2880" w:hanging="360"/>
+      </w:pPr>
+      <w:rPr>
+        <w:rFonts w:ascii="Symbol" w:hAnsi="Symbol" w:hint="default"/>
+      </w:rPr>
+    </w:lvl>
+    <w:lvl w:ilvl="4" w:tplc="240A0003" w:tentative="1">
+      <w:start w:val="1"/>
+      <w:numFmt w:val="bullet"/>
+      <w:lvlText w:val="o"/>
+      <w:lvlJc w:val="left"/>
+      <w:pPr>
+        <w:ind w:left="3600" w:hanging="360"/>
+      </w:pPr>
+      <w:rPr>
+        <w:rFonts w:ascii="Courier New" w:hAnsi="Courier New" w:cs="Courier New" w:hint="default"/>
+      </w:rPr>
+    </w:lvl>
+    <w:lvl w:ilvl="5" w:tplc="240A0005" w:tentative="1">
+      <w:start w:val="1"/>
+      <w:numFmt w:val="bullet"/>
+      <w:lvlText w:val=""/>
+      <w:lvlJc w:val="left"/>
+      <w:pPr>
+        <w:ind w:left="4320" w:hanging="360"/>
+      </w:pPr>
+      <w:rPr>
+        <w:rFonts w:ascii="Wingdings" w:hAnsi="Wingdings" w:hint="default"/>
+      </w:rPr>
+    </w:lvl>
+    <w:lvl w:ilvl="6" w:tplc="240A0001" w:tentative="1">
+      <w:start w:val="1"/>
+      <w:numFmt w:val="bullet"/>
+      <w:lvlText w:val=""/>
+      <w:lvlJc w:val="left"/>
+      <w:pPr>
+        <w:ind w:left="5040" w:hanging="360"/>
+      </w:pPr>
+      <w:rPr>
+        <w:rFonts w:ascii="Symbol" w:hAnsi="Symbol" w:hint="default"/>
+      </w:rPr>
+    </w:lvl>
+    <w:lvl w:ilvl="7" w:tplc="240A0003" w:tentative="1">
+      <w:start w:val="1"/>
+      <w:numFmt w:val="bullet"/>
+      <w:lvlText w:val="o"/>
+      <w:lvlJc w:val="left"/>
+      <w:pPr>
+        <w:ind w:left="5760" w:hanging="360"/>
+      </w:pPr>
+      <w:rPr>
+        <w:rFonts w:ascii="Courier New" w:hAnsi="Courier New" w:cs="Courier New" w:hint="default"/>
+      </w:rPr>
+    </w:lvl>
+    <w:lvl w:ilvl="8" w:tplc="240A0005" w:tentative="1">
+      <w:start w:val="1"/>
+      <w:numFmt w:val="bullet"/>
+      <w:lvlText w:val=""/>
+      <w:lvlJc w:val="left"/>
+      <w:pPr>
+        <w:ind w:left="6480" w:hanging="360"/>
+      </w:pPr>
+      <w:rPr>
+        <w:rFonts w:ascii="Wingdings" w:hAnsi="Wingdings" w:hint="default"/>
+      </w:rPr>
+    </w:lvl>
+  </w:abstractNum>
+  <w:abstractNum w:abstractNumId="3" w15:restartNumberingAfterBreak="0">
     <w:nsid w:val="4A0275F9"/>
     <w:multiLevelType w:val="hybridMultilevel"/>
     <w:tmpl w:val="2D36C7EA"/>
@@ -2238,7 +3635,120 @@
       </w:rPr>
     </w:lvl>
   </w:abstractNum>
-  <w:abstractNum w:abstractNumId="1" w15:restartNumberingAfterBreak="0">
+  <w:abstractNum w:abstractNumId="4" w15:restartNumberingAfterBreak="0">
+    <w:nsid w:val="4A9D379F"/>
+    <w:multiLevelType w:val="hybridMultilevel"/>
+    <w:tmpl w:val="12E4FEC0"/>
+    <w:lvl w:ilvl="0" w:tplc="240A0001">
+      <w:start w:val="1"/>
+      <w:numFmt w:val="bullet"/>
+      <w:lvlText w:val=""/>
+      <w:lvlJc w:val="left"/>
+      <w:pPr>
+        <w:ind w:left="720" w:hanging="360"/>
+      </w:pPr>
+      <w:rPr>
+        <w:rFonts w:ascii="Symbol" w:hAnsi="Symbol" w:hint="default"/>
+      </w:rPr>
+    </w:lvl>
+    <w:lvl w:ilvl="1" w:tplc="240A0003" w:tentative="1">
+      <w:start w:val="1"/>
+      <w:numFmt w:val="bullet"/>
+      <w:lvlText w:val="o"/>
+      <w:lvlJc w:val="left"/>
+      <w:pPr>
+        <w:ind w:left="1440" w:hanging="360"/>
+      </w:pPr>
+      <w:rPr>
+        <w:rFonts w:ascii="Courier New" w:hAnsi="Courier New" w:cs="Courier New" w:hint="default"/>
+      </w:rPr>
+    </w:lvl>
+    <w:lvl w:ilvl="2" w:tplc="240A0005" w:tentative="1">
+      <w:start w:val="1"/>
+      <w:numFmt w:val="bullet"/>
+      <w:lvlText w:val=""/>
+      <w:lvlJc w:val="left"/>
+      <w:pPr>
+        <w:ind w:left="2160" w:hanging="360"/>
+      </w:pPr>
+      <w:rPr>
+        <w:rFonts w:ascii="Wingdings" w:hAnsi="Wingdings" w:hint="default"/>
+      </w:rPr>
+    </w:lvl>
+    <w:lvl w:ilvl="3" w:tplc="240A0001" w:tentative="1">
+      <w:start w:val="1"/>
+      <w:numFmt w:val="bullet"/>
+      <w:lvlText w:val=""/>
+      <w:lvlJc w:val="left"/>
+      <w:pPr>
+        <w:ind w:left="2880" w:hanging="360"/>
+      </w:pPr>
+      <w:rPr>
+        <w:rFonts w:ascii="Symbol" w:hAnsi="Symbol" w:hint="default"/>
+      </w:rPr>
+    </w:lvl>
+    <w:lvl w:ilvl="4" w:tplc="240A0003" w:tentative="1">
+      <w:start w:val="1"/>
+      <w:numFmt w:val="bullet"/>
+      <w:lvlText w:val="o"/>
+      <w:lvlJc w:val="left"/>
+      <w:pPr>
+        <w:ind w:left="3600" w:hanging="360"/>
+      </w:pPr>
+      <w:rPr>
+        <w:rFonts w:ascii="Courier New" w:hAnsi="Courier New" w:cs="Courier New" w:hint="default"/>
+      </w:rPr>
+    </w:lvl>
+    <w:lvl w:ilvl="5" w:tplc="240A0005" w:tentative="1">
+      <w:start w:val="1"/>
+      <w:numFmt w:val="bullet"/>
+      <w:lvlText w:val=""/>
+      <w:lvlJc w:val="left"/>
+      <w:pPr>
+        <w:ind w:left="4320" w:hanging="360"/>
+      </w:pPr>
+      <w:rPr>
+        <w:rFonts w:ascii="Wingdings" w:hAnsi="Wingdings" w:hint="default"/>
+      </w:rPr>
+    </w:lvl>
+    <w:lvl w:ilvl="6" w:tplc="240A0001" w:tentative="1">
+      <w:start w:val="1"/>
+      <w:numFmt w:val="bullet"/>
+      <w:lvlText w:val=""/>
+      <w:lvlJc w:val="left"/>
+      <w:pPr>
+        <w:ind w:left="5040" w:hanging="360"/>
+      </w:pPr>
+      <w:rPr>
+        <w:rFonts w:ascii="Symbol" w:hAnsi="Symbol" w:hint="default"/>
+      </w:rPr>
+    </w:lvl>
+    <w:lvl w:ilvl="7" w:tplc="240A0003" w:tentative="1">
+      <w:start w:val="1"/>
+      <w:numFmt w:val="bullet"/>
+      <w:lvlText w:val="o"/>
+      <w:lvlJc w:val="left"/>
+      <w:pPr>
+        <w:ind w:left="5760" w:hanging="360"/>
+      </w:pPr>
+      <w:rPr>
+        <w:rFonts w:ascii="Courier New" w:hAnsi="Courier New" w:cs="Courier New" w:hint="default"/>
+      </w:rPr>
+    </w:lvl>
+    <w:lvl w:ilvl="8" w:tplc="240A0005" w:tentative="1">
+      <w:start w:val="1"/>
+      <w:numFmt w:val="bullet"/>
+      <w:lvlText w:val=""/>
+      <w:lvlJc w:val="left"/>
+      <w:pPr>
+        <w:ind w:left="6480" w:hanging="360"/>
+      </w:pPr>
+      <w:rPr>
+        <w:rFonts w:ascii="Wingdings" w:hAnsi="Wingdings" w:hint="default"/>
+      </w:rPr>
+    </w:lvl>
+  </w:abstractNum>
+  <w:abstractNum w:abstractNumId="5" w15:restartNumberingAfterBreak="0">
     <w:nsid w:val="50AE5D78"/>
     <w:multiLevelType w:val="hybridMultilevel"/>
     <w:tmpl w:val="2D1617CC"/>
@@ -2351,7 +3861,206 @@
       </w:rPr>
     </w:lvl>
   </w:abstractNum>
-  <w:abstractNum w:abstractNumId="2" w15:restartNumberingAfterBreak="0">
+  <w:abstractNum w:abstractNumId="6" w15:restartNumberingAfterBreak="0">
+    <w:nsid w:val="599A21A2"/>
+    <w:multiLevelType w:val="hybridMultilevel"/>
+    <w:tmpl w:val="F4AC26FE"/>
+    <w:lvl w:ilvl="0" w:tplc="240A000F">
+      <w:start w:val="1"/>
+      <w:numFmt w:val="decimal"/>
+      <w:lvlText w:val="%1."/>
+      <w:lvlJc w:val="left"/>
+      <w:pPr>
+        <w:ind w:left="720" w:hanging="360"/>
+      </w:pPr>
+    </w:lvl>
+    <w:lvl w:ilvl="1" w:tplc="240A0019" w:tentative="1">
+      <w:start w:val="1"/>
+      <w:numFmt w:val="lowerLetter"/>
+      <w:lvlText w:val="%2."/>
+      <w:lvlJc w:val="left"/>
+      <w:pPr>
+        <w:ind w:left="1440" w:hanging="360"/>
+      </w:pPr>
+    </w:lvl>
+    <w:lvl w:ilvl="2" w:tplc="240A001B" w:tentative="1">
+      <w:start w:val="1"/>
+      <w:numFmt w:val="lowerRoman"/>
+      <w:lvlText w:val="%3."/>
+      <w:lvlJc w:val="right"/>
+      <w:pPr>
+        <w:ind w:left="2160" w:hanging="180"/>
+      </w:pPr>
+    </w:lvl>
+    <w:lvl w:ilvl="3" w:tplc="240A000F" w:tentative="1">
+      <w:start w:val="1"/>
+      <w:numFmt w:val="decimal"/>
+      <w:lvlText w:val="%4."/>
+      <w:lvlJc w:val="left"/>
+      <w:pPr>
+        <w:ind w:left="2880" w:hanging="360"/>
+      </w:pPr>
+    </w:lvl>
+    <w:lvl w:ilvl="4" w:tplc="240A0019" w:tentative="1">
+      <w:start w:val="1"/>
+      <w:numFmt w:val="lowerLetter"/>
+      <w:lvlText w:val="%5."/>
+      <w:lvlJc w:val="left"/>
+      <w:pPr>
+        <w:ind w:left="3600" w:hanging="360"/>
+      </w:pPr>
+    </w:lvl>
+    <w:lvl w:ilvl="5" w:tplc="240A001B" w:tentative="1">
+      <w:start w:val="1"/>
+      <w:numFmt w:val="lowerRoman"/>
+      <w:lvlText w:val="%6."/>
+      <w:lvlJc w:val="right"/>
+      <w:pPr>
+        <w:ind w:left="4320" w:hanging="180"/>
+      </w:pPr>
+    </w:lvl>
+    <w:lvl w:ilvl="6" w:tplc="240A000F" w:tentative="1">
+      <w:start w:val="1"/>
+      <w:numFmt w:val="decimal"/>
+      <w:lvlText w:val="%7."/>
+      <w:lvlJc w:val="left"/>
+      <w:pPr>
+        <w:ind w:left="5040" w:hanging="360"/>
+      </w:pPr>
+    </w:lvl>
+    <w:lvl w:ilvl="7" w:tplc="240A0019" w:tentative="1">
+      <w:start w:val="1"/>
+      <w:numFmt w:val="lowerLetter"/>
+      <w:lvlText w:val="%8."/>
+      <w:lvlJc w:val="left"/>
+      <w:pPr>
+        <w:ind w:left="5760" w:hanging="360"/>
+      </w:pPr>
+    </w:lvl>
+    <w:lvl w:ilvl="8" w:tplc="240A001B" w:tentative="1">
+      <w:start w:val="1"/>
+      <w:numFmt w:val="lowerRoman"/>
+      <w:lvlText w:val="%9."/>
+      <w:lvlJc w:val="right"/>
+      <w:pPr>
+        <w:ind w:left="6480" w:hanging="180"/>
+      </w:pPr>
+    </w:lvl>
+  </w:abstractNum>
+  <w:abstractNum w:abstractNumId="7" w15:restartNumberingAfterBreak="0">
+    <w:nsid w:val="5DCE67E2"/>
+    <w:multiLevelType w:val="hybridMultilevel"/>
+    <w:tmpl w:val="33025884"/>
+    <w:lvl w:ilvl="0" w:tplc="240A0001">
+      <w:start w:val="1"/>
+      <w:numFmt w:val="bullet"/>
+      <w:lvlText w:val=""/>
+      <w:lvlJc w:val="left"/>
+      <w:pPr>
+        <w:ind w:left="720" w:hanging="360"/>
+      </w:pPr>
+      <w:rPr>
+        <w:rFonts w:ascii="Symbol" w:hAnsi="Symbol" w:hint="default"/>
+      </w:rPr>
+    </w:lvl>
+    <w:lvl w:ilvl="1" w:tplc="240A0003" w:tentative="1">
+      <w:start w:val="1"/>
+      <w:numFmt w:val="bullet"/>
+      <w:lvlText w:val="o"/>
+      <w:lvlJc w:val="left"/>
+      <w:pPr>
+        <w:ind w:left="1440" w:hanging="360"/>
+      </w:pPr>
+      <w:rPr>
+        <w:rFonts w:ascii="Courier New" w:hAnsi="Courier New" w:cs="Courier New" w:hint="default"/>
+      </w:rPr>
+    </w:lvl>
+    <w:lvl w:ilvl="2" w:tplc="240A0005" w:tentative="1">
+      <w:start w:val="1"/>
+      <w:numFmt w:val="bullet"/>
+      <w:lvlText w:val=""/>
+      <w:lvlJc w:val="left"/>
+      <w:pPr>
+        <w:ind w:left="2160" w:hanging="360"/>
+      </w:pPr>
+      <w:rPr>
+        <w:rFonts w:ascii="Wingdings" w:hAnsi="Wingdings" w:hint="default"/>
+      </w:rPr>
+    </w:lvl>
+    <w:lvl w:ilvl="3" w:tplc="240A0001" w:tentative="1">
+      <w:start w:val="1"/>
+      <w:numFmt w:val="bullet"/>
+      <w:lvlText w:val=""/>
+      <w:lvlJc w:val="left"/>
+      <w:pPr>
+        <w:ind w:left="2880" w:hanging="360"/>
+      </w:pPr>
+      <w:rPr>
+        <w:rFonts w:ascii="Symbol" w:hAnsi="Symbol" w:hint="default"/>
+      </w:rPr>
+    </w:lvl>
+    <w:lvl w:ilvl="4" w:tplc="240A0003" w:tentative="1">
+      <w:start w:val="1"/>
+      <w:numFmt w:val="bullet"/>
+      <w:lvlText w:val="o"/>
+      <w:lvlJc w:val="left"/>
+      <w:pPr>
+        <w:ind w:left="3600" w:hanging="360"/>
+      </w:pPr>
+      <w:rPr>
+        <w:rFonts w:ascii="Courier New" w:hAnsi="Courier New" w:cs="Courier New" w:hint="default"/>
+      </w:rPr>
+    </w:lvl>
+    <w:lvl w:ilvl="5" w:tplc="240A0005" w:tentative="1">
+      <w:start w:val="1"/>
+      <w:numFmt w:val="bullet"/>
+      <w:lvlText w:val=""/>
+      <w:lvlJc w:val="left"/>
+      <w:pPr>
+        <w:ind w:left="4320" w:hanging="360"/>
+      </w:pPr>
+      <w:rPr>
+        <w:rFonts w:ascii="Wingdings" w:hAnsi="Wingdings" w:hint="default"/>
+      </w:rPr>
+    </w:lvl>
+    <w:lvl w:ilvl="6" w:tplc="240A0001" w:tentative="1">
+      <w:start w:val="1"/>
+      <w:numFmt w:val="bullet"/>
+      <w:lvlText w:val=""/>
+      <w:lvlJc w:val="left"/>
+      <w:pPr>
+        <w:ind w:left="5040" w:hanging="360"/>
+      </w:pPr>
+      <w:rPr>
+        <w:rFonts w:ascii="Symbol" w:hAnsi="Symbol" w:hint="default"/>
+      </w:rPr>
+    </w:lvl>
+    <w:lvl w:ilvl="7" w:tplc="240A0003" w:tentative="1">
+      <w:start w:val="1"/>
+      <w:numFmt w:val="bullet"/>
+      <w:lvlText w:val="o"/>
+      <w:lvlJc w:val="left"/>
+      <w:pPr>
+        <w:ind w:left="5760" w:hanging="360"/>
+      </w:pPr>
+      <w:rPr>
+        <w:rFonts w:ascii="Courier New" w:hAnsi="Courier New" w:cs="Courier New" w:hint="default"/>
+      </w:rPr>
+    </w:lvl>
+    <w:lvl w:ilvl="8" w:tplc="240A0005" w:tentative="1">
+      <w:start w:val="1"/>
+      <w:numFmt w:val="bullet"/>
+      <w:lvlText w:val=""/>
+      <w:lvlJc w:val="left"/>
+      <w:pPr>
+        <w:ind w:left="6480" w:hanging="360"/>
+      </w:pPr>
+      <w:rPr>
+        <w:rFonts w:ascii="Wingdings" w:hAnsi="Wingdings" w:hint="default"/>
+      </w:rPr>
+    </w:lvl>
+  </w:abstractNum>
+  <w:abstractNum w:abstractNumId="8" w15:restartNumberingAfterBreak="0">
     <w:nsid w:val="60B2553B"/>
     <w:multiLevelType w:val="hybridMultilevel"/>
     <w:tmpl w:val="256E472A"/>
@@ -2464,7 +4173,120 @@
       </w:rPr>
     </w:lvl>
   </w:abstractNum>
-  <w:abstractNum w:abstractNumId="3" w15:restartNumberingAfterBreak="0">
+  <w:abstractNum w:abstractNumId="9" w15:restartNumberingAfterBreak="0">
+    <w:nsid w:val="6F991BC1"/>
+    <w:multiLevelType w:val="hybridMultilevel"/>
+    <w:tmpl w:val="D0226264"/>
+    <w:lvl w:ilvl="0" w:tplc="240A0001">
+      <w:start w:val="1"/>
+      <w:numFmt w:val="bullet"/>
+      <w:lvlText w:val=""/>
+      <w:lvlJc w:val="left"/>
+      <w:pPr>
+        <w:ind w:left="720" w:hanging="360"/>
+      </w:pPr>
+      <w:rPr>
+        <w:rFonts w:ascii="Symbol" w:hAnsi="Symbol" w:hint="default"/>
+      </w:rPr>
+    </w:lvl>
+    <w:lvl w:ilvl="1" w:tplc="240A0003" w:tentative="1">
+      <w:start w:val="1"/>
+      <w:numFmt w:val="bullet"/>
+      <w:lvlText w:val="o"/>
+      <w:lvlJc w:val="left"/>
+      <w:pPr>
+        <w:ind w:left="1440" w:hanging="360"/>
+      </w:pPr>
+      <w:rPr>
+        <w:rFonts w:ascii="Courier New" w:hAnsi="Courier New" w:cs="Courier New" w:hint="default"/>
+      </w:rPr>
+    </w:lvl>
+    <w:lvl w:ilvl="2" w:tplc="240A0005" w:tentative="1">
+      <w:start w:val="1"/>
+      <w:numFmt w:val="bullet"/>
+      <w:lvlText w:val=""/>
+      <w:lvlJc w:val="left"/>
+      <w:pPr>
+        <w:ind w:left="2160" w:hanging="360"/>
+      </w:pPr>
+      <w:rPr>
+        <w:rFonts w:ascii="Wingdings" w:hAnsi="Wingdings" w:hint="default"/>
+      </w:rPr>
+    </w:lvl>
+    <w:lvl w:ilvl="3" w:tplc="240A0001" w:tentative="1">
+      <w:start w:val="1"/>
+      <w:numFmt w:val="bullet"/>
+      <w:lvlText w:val=""/>
+      <w:lvlJc w:val="left"/>
+      <w:pPr>
+        <w:ind w:left="2880" w:hanging="360"/>
+      </w:pPr>
+      <w:rPr>
+        <w:rFonts w:ascii="Symbol" w:hAnsi="Symbol" w:hint="default"/>
+      </w:rPr>
+    </w:lvl>
+    <w:lvl w:ilvl="4" w:tplc="240A0003" w:tentative="1">
+      <w:start w:val="1"/>
+      <w:numFmt w:val="bullet"/>
+      <w:lvlText w:val="o"/>
+      <w:lvlJc w:val="left"/>
+      <w:pPr>
+        <w:ind w:left="3600" w:hanging="360"/>
+      </w:pPr>
+      <w:rPr>
+        <w:rFonts w:ascii="Courier New" w:hAnsi="Courier New" w:cs="Courier New" w:hint="default"/>
+      </w:rPr>
+    </w:lvl>
+    <w:lvl w:ilvl="5" w:tplc="240A0005" w:tentative="1">
+      <w:start w:val="1"/>
+      <w:numFmt w:val="bullet"/>
+      <w:lvlText w:val=""/>
+      <w:lvlJc w:val="left"/>
+      <w:pPr>
+        <w:ind w:left="4320" w:hanging="360"/>
+      </w:pPr>
+      <w:rPr>
+        <w:rFonts w:ascii="Wingdings" w:hAnsi="Wingdings" w:hint="default"/>
+      </w:rPr>
+    </w:lvl>
+    <w:lvl w:ilvl="6" w:tplc="240A0001" w:tentative="1">
+      <w:start w:val="1"/>
+      <w:numFmt w:val="bullet"/>
+      <w:lvlText w:val=""/>
+      <w:lvlJc w:val="left"/>
+      <w:pPr>
+        <w:ind w:left="5040" w:hanging="360"/>
+      </w:pPr>
+      <w:rPr>
+        <w:rFonts w:ascii="Symbol" w:hAnsi="Symbol" w:hint="default"/>
+      </w:rPr>
+    </w:lvl>
+    <w:lvl w:ilvl="7" w:tplc="240A0003" w:tentative="1">
+      <w:start w:val="1"/>
+      <w:numFmt w:val="bullet"/>
+      <w:lvlText w:val="o"/>
+      <w:lvlJc w:val="left"/>
+      <w:pPr>
+        <w:ind w:left="5760" w:hanging="360"/>
+      </w:pPr>
+      <w:rPr>
+        <w:rFonts w:ascii="Courier New" w:hAnsi="Courier New" w:cs="Courier New" w:hint="default"/>
+      </w:rPr>
+    </w:lvl>
+    <w:lvl w:ilvl="8" w:tplc="240A0005" w:tentative="1">
+      <w:start w:val="1"/>
+      <w:numFmt w:val="bullet"/>
+      <w:lvlText w:val=""/>
+      <w:lvlJc w:val="left"/>
+      <w:pPr>
+        <w:ind w:left="6480" w:hanging="360"/>
+      </w:pPr>
+      <w:rPr>
+        <w:rFonts w:ascii="Wingdings" w:hAnsi="Wingdings" w:hint="default"/>
+      </w:rPr>
+    </w:lvl>
+  </w:abstractNum>
+  <w:abstractNum w:abstractNumId="10" w15:restartNumberingAfterBreak="0">
     <w:nsid w:val="7AA678B3"/>
     <w:multiLevelType w:val="multilevel"/>
     <w:tmpl w:val="9F4A76D2"/>
@@ -2604,7 +4426,7 @@
       </w:rPr>
     </w:lvl>
   </w:abstractNum>
-  <w:abstractNum w:abstractNumId="4" w15:restartNumberingAfterBreak="0">
+  <w:abstractNum w:abstractNumId="11" w15:restartNumberingAfterBreak="0">
     <w:nsid w:val="7BAF304B"/>
     <w:multiLevelType w:val="multilevel"/>
     <w:tmpl w:val="C22A476C"/>
@@ -2727,19 +4549,40 @@
     </w:lvl>
   </w:abstractNum>
   <w:num w:numId="1" w16cid:durableId="439112252">
+    <w:abstractNumId w:val="10"/>
+  </w:num>
+  <w:num w:numId="2" w16cid:durableId="127675219">
+    <w:abstractNumId w:val="11"/>
+  </w:num>
+  <w:num w:numId="3" w16cid:durableId="1951622312">
     <w:abstractNumId w:val="3"/>
   </w:num>
-  <w:num w:numId="2" w16cid:durableId="127675219">
+  <w:num w:numId="4" w16cid:durableId="1930582924">
+    <w:abstractNumId w:val="5"/>
+  </w:num>
+  <w:num w:numId="5" w16cid:durableId="1064987166">
+    <w:abstractNumId w:val="8"/>
+  </w:num>
+  <w:num w:numId="6" w16cid:durableId="221795635">
+    <w:abstractNumId w:val="6"/>
+  </w:num>
+  <w:num w:numId="7" w16cid:durableId="553011239">
+    <w:abstractNumId w:val="2"/>
+  </w:num>
+  <w:num w:numId="8" w16cid:durableId="28651207">
+    <w:abstractNumId w:val="0"/>
+  </w:num>
+  <w:num w:numId="9" w16cid:durableId="605815526">
+    <w:abstractNumId w:val="7"/>
+  </w:num>
+  <w:num w:numId="10" w16cid:durableId="2040278667">
     <w:abstractNumId w:val="4"/>
   </w:num>
-  <w:num w:numId="3" w16cid:durableId="1951622312">
-    <w:abstractNumId w:val="0"/>
-  </w:num>
-  <w:num w:numId="4" w16cid:durableId="1930582924">
+  <w:num w:numId="11" w16cid:durableId="1767069666">
     <w:abstractNumId w:val="1"/>
   </w:num>
-  <w:num w:numId="5" w16cid:durableId="1064987166">
-    <w:abstractNumId w:val="2"/>
+  <w:num w:numId="12" w16cid:durableId="1964071851">
+    <w:abstractNumId w:val="9"/>
   </w:num>
 </w:numbering>
 </file>

</xml_diff>

<commit_message>
Working on Ch 2 Skills second revision
</commit_message>
<xml_diff>
--- a/Draft/3 Methodology.docx
+++ b/Draft/3 Methodology.docx
@@ -5888,84 +5888,7 @@
           <w:rFonts w:ascii="Arial" w:hAnsi="Arial" w:cs="Arial"/>
           <w:lang w:val="en-NZ"/>
         </w:rPr>
-        <w:t>A us</w:t>
-      </w:r>
-      <w:r>
-        <w:rPr>
-          <w:rFonts w:ascii="Arial" w:hAnsi="Arial" w:cs="Arial"/>
-          <w:lang w:val="en-NZ"/>
-        </w:rPr>
-        <w:t>er-</w:t>
-      </w:r>
-      <w:r>
-        <w:rPr>
-          <w:rFonts w:ascii="Arial" w:hAnsi="Arial" w:cs="Arial"/>
-          <w:lang w:val="en-NZ"/>
-        </w:rPr>
-        <w:t>centred</w:t>
-      </w:r>
-      <w:r>
-        <w:rPr>
-          <w:rFonts w:ascii="Arial" w:hAnsi="Arial" w:cs="Arial"/>
-          <w:lang w:val="en-NZ"/>
-        </w:rPr>
-        <w:t xml:space="preserve"> design can move in a wide spectrum </w:t>
-      </w:r>
-      <w:r>
-        <w:rPr>
-          <w:rFonts w:ascii="Arial" w:hAnsi="Arial" w:cs="Arial"/>
-          <w:lang w:val="en-NZ"/>
-        </w:rPr>
-        <w:t xml:space="preserve">of implementations </w:t>
-      </w:r>
-      <w:r>
-        <w:rPr>
-          <w:rFonts w:ascii="Arial" w:hAnsi="Arial" w:cs="Arial"/>
-          <w:lang w:val="en-NZ"/>
-        </w:rPr>
-        <w:t xml:space="preserve">depending on </w:t>
-      </w:r>
-      <w:r>
-        <w:rPr>
-          <w:rFonts w:ascii="Arial" w:hAnsi="Arial" w:cs="Arial"/>
-          <w:lang w:val="en-NZ"/>
-        </w:rPr>
-        <w:t>how much</w:t>
-      </w:r>
-      <w:r>
-        <w:rPr>
-          <w:rFonts w:ascii="Arial" w:hAnsi="Arial" w:cs="Arial"/>
-          <w:lang w:val="en-NZ"/>
-        </w:rPr>
-        <w:t xml:space="preserve"> involvement</w:t>
-      </w:r>
-      <w:r>
-        <w:rPr>
-          <w:rFonts w:ascii="Arial" w:hAnsi="Arial" w:cs="Arial"/>
-          <w:lang w:val="en-NZ"/>
-        </w:rPr>
-        <w:t xml:space="preserve"> </w:t>
-      </w:r>
-      <w:r>
-        <w:rPr>
-          <w:rFonts w:ascii="Arial" w:hAnsi="Arial" w:cs="Arial"/>
-          <w:lang w:val="en-NZ"/>
-        </w:rPr>
-        <w:t>the user</w:t>
-      </w:r>
-      <w:r>
-        <w:rPr>
-          <w:rFonts w:ascii="Arial" w:hAnsi="Arial" w:cs="Arial"/>
-          <w:lang w:val="en-NZ"/>
-        </w:rPr>
-        <w:t xml:space="preserve"> has in the process</w:t>
-      </w:r>
-      <w:r>
-        <w:rPr>
-          <w:rFonts w:ascii="Arial" w:hAnsi="Arial" w:cs="Arial"/>
-          <w:lang w:val="en-NZ"/>
-        </w:rPr>
-        <w:t xml:space="preserve"> and the steps in which input has been gathered and implemented. </w:t>
+        <w:t xml:space="preserve">A user-centred design can move in a wide spectrum of implementations depending on how much involvement the user has in the process and the steps in which input has been gathered and implemented. </w:t>
       </w:r>
       <w:r>
         <w:rPr>
@@ -5979,35 +5902,7 @@
           <w:rFonts w:ascii="Arial" w:hAnsi="Arial" w:cs="Arial"/>
           <w:lang w:val="en-NZ"/>
         </w:rPr>
-        <w:t xml:space="preserve"> advise the need of considering the context of the project to determine how much access the user can and should have in the development process, the points in the project life-cycle in which the input </w:t>
-      </w:r>
-      <w:r>
-        <w:rPr>
-          <w:rFonts w:ascii="Arial" w:hAnsi="Arial" w:cs="Arial"/>
-          <w:lang w:val="en-NZ"/>
-        </w:rPr>
-        <w:t>o</w:t>
-      </w:r>
-      <w:r>
-        <w:rPr>
-          <w:rFonts w:ascii="Arial" w:hAnsi="Arial" w:cs="Arial"/>
-          <w:lang w:val="en-NZ"/>
-        </w:rPr>
-        <w:t xml:space="preserve">f the user is more valuable and </w:t>
-      </w:r>
-      <w:r>
-        <w:rPr>
-          <w:rFonts w:ascii="Arial" w:hAnsi="Arial" w:cs="Arial"/>
-          <w:lang w:val="en-NZ"/>
-        </w:rPr>
-        <w:t xml:space="preserve">the importance of identifying and working with </w:t>
-      </w:r>
-      <w:r>
-        <w:rPr>
-          <w:rFonts w:ascii="Arial" w:hAnsi="Arial" w:cs="Arial"/>
-          <w:lang w:val="en-NZ"/>
-        </w:rPr>
-        <w:t>all the different users that a product may target.</w:t>
+        <w:t xml:space="preserve"> advise the need of considering the context of the project to determine how much access the user can and should have in the development process, the points in the project life-cycle in which the input of the user is more valuable and the importance of identifying and working with all the different users that a product may target.</w:t>
       </w:r>
     </w:p>
     <w:p>
@@ -6572,28 +6467,7 @@
           <w:rFonts w:ascii="Arial" w:hAnsi="Arial" w:cs="Arial"/>
           <w:lang w:val="en-NZ"/>
         </w:rPr>
-        <w:t>T</w:t>
-      </w:r>
-      <w:r>
-        <w:rPr>
-          <w:rFonts w:ascii="Arial" w:hAnsi="Arial" w:cs="Arial"/>
-          <w:lang w:val="en-NZ"/>
-        </w:rPr>
-        <w:t xml:space="preserve">he process proposed </w:t>
-      </w:r>
-      <w:r>
-        <w:rPr>
-          <w:rFonts w:ascii="Arial" w:hAnsi="Arial" w:cs="Arial"/>
-          <w:lang w:val="en-NZ"/>
-        </w:rPr>
-        <w:t xml:space="preserve">for this development </w:t>
-      </w:r>
-      <w:r>
-        <w:rPr>
-          <w:rFonts w:ascii="Arial" w:hAnsi="Arial" w:cs="Arial"/>
-          <w:lang w:val="en-NZ"/>
-        </w:rPr>
-        <w:t>is based on the stages and activities recommended by Salo &amp; Abrahamsson (2007) to conduct and agile development process that is constantly checking for improvement and for effective use of resources. The research context in which WorkshopAR is developed, and the exploratory nature of the objectives behind the software proposal require for the approach of the development process to be flexible and agile.</w:t>
+        <w:t>The process proposed for this development is based on the stages and activities recommended by Salo &amp; Abrahamsson (2007) to conduct and agile development process that is constantly checking for improvement and for effective use of resources. The research context in which WorkshopAR is developed, and the exploratory nature of the objectives behind the software proposal require for the approach of the development process to be flexible and agile.</w:t>
       </w:r>
     </w:p>
     <w:p>
@@ -7196,7 +7070,7 @@
                                     </pic:cNvPicPr>
                                   </pic:nvPicPr>
                                   <pic:blipFill>
-                                    <a:blip r:embed="rId7"/>
+                                    <a:blip r:embed="rId8"/>
                                     <a:stretch>
                                       <a:fillRect/>
                                     </a:stretch>
@@ -7408,7 +7282,7 @@
                     </pic:cNvPicPr>
                   </pic:nvPicPr>
                   <pic:blipFill>
-                    <a:blip r:embed="rId8">
+                    <a:blip r:embed="rId9">
                       <a:extLst>
                         <a:ext uri="{28A0092B-C50C-407E-A947-70E740481C1C}">
                           <a14:useLocalDpi xmlns:a14="http://schemas.microsoft.com/office/drawing/2010/main" val="0"/>
@@ -7769,21 +7643,7 @@
           <w:rFonts w:ascii="Arial" w:hAnsi="Arial" w:cs="Arial"/>
           <w:lang w:val="en-NZ"/>
         </w:rPr>
-        <w:t xml:space="preserve">The next step is to </w:t>
-      </w:r>
-      <w:r>
-        <w:rPr>
-          <w:rFonts w:ascii="Arial" w:hAnsi="Arial" w:cs="Arial"/>
-          <w:lang w:val="en-NZ"/>
-        </w:rPr>
-        <w:t>describe the results of applying</w:t>
-      </w:r>
-      <w:r>
-        <w:rPr>
-          <w:rFonts w:ascii="Arial" w:hAnsi="Arial" w:cs="Arial"/>
-          <w:lang w:val="en-NZ"/>
-        </w:rPr>
-        <w:t xml:space="preserve"> </w:t>
+        <w:t xml:space="preserve">The next step is to describe the results of applying </w:t>
       </w:r>
       <w:r>
         <w:rPr>

</xml_diff>

<commit_message>
Working on the rewrite of ch3. Added paragraph related to issues with IP and observations
</commit_message>
<xml_diff>
--- a/Draft/3 Methodology.docx
+++ b/Draft/3 Methodology.docx
@@ -94,13 +94,7 @@
         <w:rPr>
           <w:rFonts w:ascii="Arial" w:hAnsi="Arial" w:cs="Arial"/>
         </w:rPr>
-        <w:t>This project</w:t>
-      </w:r>
-      <w:r>
-        <w:rPr>
-          <w:rFonts w:ascii="Arial" w:hAnsi="Arial" w:cs="Arial"/>
-        </w:rPr>
-        <w:t xml:space="preserve"> is qualitative and exploratory in nature. Qualitative because at the core of the research questions, there is the idea of description. The goal is to describe behaviours and characterise the technology selected as it is used in the classroom. It is exploratory because, rather than trying to corroborate or to formulate a theory, the goal is to gather enough data to understand the characteristics of the scenario being studied. This will allow a deeper analysis of the issues and questions that stood out through the review of relevant literature and previous experiences in the field.</w:t>
+        <w:t>This project is qualitative and exploratory in nature. Qualitative because at the core of the research questions, there is the idea of description. The goal is to describe behaviours and characterise the technology selected as it is used in the classroom. It is exploratory because, rather than trying to corroborate or to formulate a theory, the goal is to gather enough data to understand the characteristics of the scenario being studied. This will allow a deeper analysis of the issues and questions that stood out through the review of relevant literature and previous experiences in the field.</w:t>
       </w:r>
     </w:p>
     <w:p>
@@ -691,11 +685,13 @@
         <w:jc w:val="both"/>
         <w:rPr>
           <w:rFonts w:ascii="Arial" w:hAnsi="Arial" w:cs="Arial"/>
-        </w:rPr>
-      </w:pPr>
-      <w:r>
-        <w:rPr>
-          <w:rFonts w:ascii="Arial" w:hAnsi="Arial" w:cs="Arial"/>
+          <w:highlight w:val="cyan"/>
+        </w:rPr>
+      </w:pPr>
+      <w:r>
+        <w:rPr>
+          <w:rFonts w:ascii="Arial" w:hAnsi="Arial" w:cs="Arial"/>
+          <w:highlight w:val="cyan"/>
         </w:rPr>
         <w:lastRenderedPageBreak/>
         <w:t xml:space="preserve">The biggest constraint on the timeline proposed for the development of this research is access to the Industry Project course. </w:t>
@@ -703,132 +699,154 @@
       <w:r>
         <w:rPr>
           <w:rFonts w:ascii="Arial" w:hAnsi="Arial" w:cs="Arial"/>
+          <w:highlight w:val="cyan"/>
         </w:rPr>
         <w:t>The observation window to</w:t>
       </w:r>
       <w:r>
         <w:rPr>
           <w:rFonts w:ascii="Arial" w:hAnsi="Arial" w:cs="Arial"/>
+          <w:highlight w:val="cyan"/>
         </w:rPr>
         <w:t xml:space="preserve"> gather data for the case study </w:t>
       </w:r>
       <w:r>
         <w:rPr>
           <w:rFonts w:ascii="Arial" w:hAnsi="Arial" w:cs="Arial"/>
+          <w:highlight w:val="cyan"/>
         </w:rPr>
         <w:t>is one academic year, which can be translated to 24 academic weeks along two semesters of 12 weeks</w:t>
       </w:r>
       <w:r>
         <w:rPr>
           <w:rFonts w:ascii="Arial" w:hAnsi="Arial" w:cs="Arial"/>
+          <w:highlight w:val="cyan"/>
         </w:rPr>
         <w:t xml:space="preserve">. </w:t>
       </w:r>
       <w:r>
         <w:rPr>
           <w:rFonts w:ascii="Arial" w:hAnsi="Arial" w:cs="Arial"/>
+          <w:highlight w:val="cyan"/>
         </w:rPr>
         <w:t>This situation forces the project to adapt a cross-sectional approach,</w:t>
       </w:r>
       <w:r>
         <w:rPr>
           <w:rFonts w:ascii="Arial" w:hAnsi="Arial" w:cs="Arial"/>
+          <w:highlight w:val="cyan"/>
         </w:rPr>
         <w:t xml:space="preserve"> </w:t>
       </w:r>
       <w:r>
         <w:rPr>
           <w:rFonts w:ascii="Arial" w:hAnsi="Arial" w:cs="Arial"/>
+          <w:highlight w:val="cyan"/>
         </w:rPr>
         <w:t>detail</w:t>
       </w:r>
       <w:r>
         <w:rPr>
           <w:rFonts w:ascii="Arial" w:hAnsi="Arial" w:cs="Arial"/>
+          <w:highlight w:val="cyan"/>
         </w:rPr>
         <w:t xml:space="preserve">ing </w:t>
       </w:r>
       <w:r>
         <w:rPr>
           <w:rFonts w:ascii="Arial" w:hAnsi="Arial" w:cs="Arial"/>
+          <w:highlight w:val="cyan"/>
         </w:rPr>
         <w:t xml:space="preserve">as </w:t>
       </w:r>
       <w:r>
         <w:rPr>
           <w:rFonts w:ascii="Arial" w:hAnsi="Arial" w:cs="Arial"/>
+          <w:highlight w:val="cyan"/>
         </w:rPr>
         <w:t xml:space="preserve">much as </w:t>
       </w:r>
       <w:r>
         <w:rPr>
           <w:rFonts w:ascii="Arial" w:hAnsi="Arial" w:cs="Arial"/>
+          <w:highlight w:val="cyan"/>
         </w:rPr>
         <w:t xml:space="preserve">possible the technological intervention </w:t>
       </w:r>
       <w:r>
         <w:rPr>
           <w:rFonts w:ascii="Arial" w:hAnsi="Arial" w:cs="Arial"/>
+          <w:highlight w:val="cyan"/>
         </w:rPr>
         <w:t>through</w:t>
       </w:r>
       <w:r>
         <w:rPr>
           <w:rFonts w:ascii="Arial" w:hAnsi="Arial" w:cs="Arial"/>
+          <w:highlight w:val="cyan"/>
         </w:rPr>
         <w:t xml:space="preserve"> one cohort of the</w:t>
       </w:r>
       <w:r>
         <w:rPr>
           <w:rFonts w:ascii="Arial" w:hAnsi="Arial" w:cs="Arial"/>
+          <w:highlight w:val="cyan"/>
         </w:rPr>
         <w:t xml:space="preserve"> </w:t>
       </w:r>
       <w:r>
         <w:rPr>
           <w:rFonts w:ascii="Arial" w:hAnsi="Arial" w:cs="Arial"/>
+          <w:highlight w:val="cyan"/>
         </w:rPr>
         <w:t>course.</w:t>
       </w:r>
       <w:r>
         <w:rPr>
           <w:rFonts w:ascii="Arial" w:hAnsi="Arial" w:cs="Arial"/>
+          <w:highlight w:val="cyan"/>
         </w:rPr>
         <w:t xml:space="preserve"> </w:t>
       </w:r>
       <w:r>
         <w:rPr>
           <w:rFonts w:ascii="Arial" w:hAnsi="Arial" w:cs="Arial"/>
+          <w:highlight w:val="cyan"/>
         </w:rPr>
         <w:t xml:space="preserve">The main objective is to create an internal comparison between those groups participating in the course as they would normally do versus those using the AR tool. As with most </w:t>
       </w:r>
       <w:r>
         <w:rPr>
           <w:rFonts w:ascii="Arial" w:hAnsi="Arial" w:cs="Arial"/>
+          <w:highlight w:val="cyan"/>
         </w:rPr>
         <w:t>cross-sectional</w:t>
       </w:r>
       <w:r>
         <w:rPr>
           <w:rFonts w:ascii="Arial" w:hAnsi="Arial" w:cs="Arial"/>
+          <w:highlight w:val="cyan"/>
         </w:rPr>
         <w:t xml:space="preserve"> studies, this approach offers a quick way of gathering data and </w:t>
       </w:r>
       <w:r>
         <w:rPr>
           <w:rFonts w:ascii="Arial" w:hAnsi="Arial" w:cs="Arial"/>
+          <w:highlight w:val="cyan"/>
         </w:rPr>
         <w:t>to</w:t>
       </w:r>
       <w:r>
         <w:rPr>
           <w:rFonts w:ascii="Arial" w:hAnsi="Arial" w:cs="Arial"/>
+          <w:highlight w:val="cyan"/>
         </w:rPr>
         <w:t xml:space="preserve"> cover multiple variables of interest that can be analysed later, at the cost of creating a situation in which the data will be biased to the particularities of this sample, making it harder to propose any generalisation or causality </w:t>
       </w:r>
       <w:r>
         <w:rPr>
           <w:rStyle w:val="CitaCar"/>
+          <w:highlight w:val="cyan"/>
         </w:rPr>
         <w:t>(Wang &amp; Cheng, 2020).</w:t>
       </w:r>
@@ -838,23 +856,27 @@
         <w:jc w:val="both"/>
         <w:rPr>
           <w:rFonts w:ascii="Arial" w:hAnsi="Arial" w:cs="Arial"/>
-        </w:rPr>
-      </w:pPr>
-      <w:r>
-        <w:rPr>
-          <w:rFonts w:ascii="Arial" w:hAnsi="Arial" w:cs="Arial"/>
+          <w:highlight w:val="cyan"/>
+        </w:rPr>
+      </w:pPr>
+      <w:r>
+        <w:rPr>
+          <w:rFonts w:ascii="Arial" w:hAnsi="Arial" w:cs="Arial"/>
+          <w:highlight w:val="cyan"/>
         </w:rPr>
         <w:t>Sampling inside the cohort of the course will be guided by convenience and the disposition of the students to participate in the research, since it is important to prioritise their academical work and minimise any disruptions to the classroom. Observations will be organised in singular work sessions that the students will be asked to participate in. Each work session will be guided by the students, setting the goals of the session based on any requirements they have during that instance of development of their project. The observation will try to focus on different aspects of the course that had not be observed previously. The researcher will also try to show the students a different aspect of the AR tool</w:t>
       </w:r>
       <w:r>
         <w:rPr>
           <w:rFonts w:ascii="Arial" w:hAnsi="Arial" w:cs="Arial"/>
+          <w:highlight w:val="cyan"/>
         </w:rPr>
         <w:t xml:space="preserve">, </w:t>
       </w:r>
       <w:r>
         <w:rPr>
           <w:rFonts w:ascii="Arial" w:hAnsi="Arial" w:cs="Arial"/>
+          <w:highlight w:val="cyan"/>
         </w:rPr>
         <w:t>one functionality at a time, facilitating their involvement in the observation and helping with the iterative development of the software. If possible, the observation will try to gather different work sessions focused on:</w:t>
       </w:r>
@@ -869,11 +891,13 @@
         <w:jc w:val="both"/>
         <w:rPr>
           <w:rFonts w:ascii="Arial" w:hAnsi="Arial" w:cs="Arial"/>
-        </w:rPr>
-      </w:pPr>
-      <w:r>
-        <w:rPr>
-          <w:rFonts w:ascii="Arial" w:hAnsi="Arial" w:cs="Arial"/>
+          <w:highlight w:val="cyan"/>
+        </w:rPr>
+      </w:pPr>
+      <w:r>
+        <w:rPr>
+          <w:rFonts w:ascii="Arial" w:hAnsi="Arial" w:cs="Arial"/>
+          <w:highlight w:val="cyan"/>
         </w:rPr>
         <w:t>The initial contact and formation of the group.</w:t>
       </w:r>
@@ -888,11 +912,13 @@
         <w:jc w:val="both"/>
         <w:rPr>
           <w:rFonts w:ascii="Arial" w:hAnsi="Arial" w:cs="Arial"/>
-        </w:rPr>
-      </w:pPr>
-      <w:r>
-        <w:rPr>
-          <w:rFonts w:ascii="Arial" w:hAnsi="Arial" w:cs="Arial"/>
+          <w:highlight w:val="cyan"/>
+        </w:rPr>
+      </w:pPr>
+      <w:r>
+        <w:rPr>
+          <w:rFonts w:ascii="Arial" w:hAnsi="Arial" w:cs="Arial"/>
+          <w:highlight w:val="cyan"/>
         </w:rPr>
         <w:t>Understanding the project and gathering information about it.</w:t>
       </w:r>
@@ -907,11 +933,13 @@
         <w:jc w:val="both"/>
         <w:rPr>
           <w:rFonts w:ascii="Arial" w:hAnsi="Arial" w:cs="Arial"/>
-        </w:rPr>
-      </w:pPr>
-      <w:r>
-        <w:rPr>
-          <w:rFonts w:ascii="Arial" w:hAnsi="Arial" w:cs="Arial"/>
+          <w:highlight w:val="cyan"/>
+        </w:rPr>
+      </w:pPr>
+      <w:r>
+        <w:rPr>
+          <w:rFonts w:ascii="Arial" w:hAnsi="Arial" w:cs="Arial"/>
+          <w:highlight w:val="cyan"/>
         </w:rPr>
         <w:t>The initial design proposal and the flow of information between the different roles in the group.</w:t>
       </w:r>
@@ -926,11 +954,13 @@
         <w:jc w:val="both"/>
         <w:rPr>
           <w:rFonts w:ascii="Arial" w:hAnsi="Arial" w:cs="Arial"/>
-        </w:rPr>
-      </w:pPr>
-      <w:r>
-        <w:rPr>
-          <w:rFonts w:ascii="Arial" w:hAnsi="Arial" w:cs="Arial"/>
+          <w:highlight w:val="cyan"/>
+        </w:rPr>
+      </w:pPr>
+      <w:r>
+        <w:rPr>
+          <w:rFonts w:ascii="Arial" w:hAnsi="Arial" w:cs="Arial"/>
+          <w:highlight w:val="cyan"/>
         </w:rPr>
         <w:t>The creation of material for the project.</w:t>
       </w:r>
@@ -945,11 +975,13 @@
         <w:jc w:val="both"/>
         <w:rPr>
           <w:rFonts w:ascii="Arial" w:hAnsi="Arial" w:cs="Arial"/>
-        </w:rPr>
-      </w:pPr>
-      <w:r>
-        <w:rPr>
-          <w:rFonts w:ascii="Arial" w:hAnsi="Arial" w:cs="Arial"/>
+          <w:highlight w:val="cyan"/>
+        </w:rPr>
+      </w:pPr>
+      <w:r>
+        <w:rPr>
+          <w:rFonts w:ascii="Arial" w:hAnsi="Arial" w:cs="Arial"/>
+          <w:highlight w:val="cyan"/>
         </w:rPr>
         <w:t>Evaluation and correction of the material created based on the feedback of the teaching staff and their peers.</w:t>
       </w:r>
@@ -964,11 +996,13 @@
         <w:jc w:val="both"/>
         <w:rPr>
           <w:rFonts w:ascii="Arial" w:hAnsi="Arial" w:cs="Arial"/>
-        </w:rPr>
-      </w:pPr>
-      <w:r>
-        <w:rPr>
-          <w:rFonts w:ascii="Arial" w:hAnsi="Arial" w:cs="Arial"/>
+          <w:highlight w:val="cyan"/>
+        </w:rPr>
+      </w:pPr>
+      <w:r>
+        <w:rPr>
+          <w:rFonts w:ascii="Arial" w:hAnsi="Arial" w:cs="Arial"/>
+          <w:highlight w:val="cyan"/>
         </w:rPr>
         <w:t>A final evaluation of the work done by the group at the end of the project.</w:t>
       </w:r>
@@ -978,11 +1012,13 @@
         <w:jc w:val="both"/>
         <w:rPr>
           <w:rFonts w:ascii="Arial" w:hAnsi="Arial" w:cs="Arial"/>
-        </w:rPr>
-      </w:pPr>
-      <w:r>
-        <w:rPr>
-          <w:rFonts w:ascii="Arial" w:hAnsi="Arial" w:cs="Arial"/>
+          <w:highlight w:val="cyan"/>
+        </w:rPr>
+      </w:pPr>
+      <w:r>
+        <w:rPr>
+          <w:rFonts w:ascii="Arial" w:hAnsi="Arial" w:cs="Arial"/>
+          <w:highlight w:val="cyan"/>
         </w:rPr>
         <w:t>The observations themselves will gather data of the student’s work using mainly audio and video recordings, as well as the personal notes of the researcher. Data will be initially organised based on the week it was taken (to determine the overall development stage of the course’s project), the composition of the group observed and the functionality of the AR tool that was prioritised.</w:t>
       </w:r>
@@ -992,41 +1028,34 @@
         <w:jc w:val="both"/>
         <w:rPr>
           <w:rFonts w:ascii="Arial" w:hAnsi="Arial" w:cs="Arial"/>
-        </w:rPr>
-      </w:pPr>
-      <w:r>
-        <w:rPr>
-          <w:rFonts w:ascii="Arial" w:hAnsi="Arial" w:cs="Arial"/>
-        </w:rPr>
-        <w:t>This methodological approach using a cross-sectional analysis of one single case study has</w:t>
-      </w:r>
-      <w:r>
-        <w:rPr>
-          <w:rFonts w:ascii="Arial" w:hAnsi="Arial" w:cs="Arial"/>
-        </w:rPr>
-        <w:t xml:space="preserve"> clear limits and constraints </w:t>
-      </w:r>
-      <w:r>
-        <w:rPr>
-          <w:rFonts w:ascii="Arial" w:hAnsi="Arial" w:cs="Arial"/>
-        </w:rPr>
-        <w:t>on the type of data that can be gathered and the overall analysis and conclusion</w:t>
-      </w:r>
-      <w:r>
-        <w:rPr>
-          <w:rFonts w:ascii="Arial" w:hAnsi="Arial" w:cs="Arial"/>
+          <w:highlight w:val="cyan"/>
+        </w:rPr>
+      </w:pPr>
+      <w:r>
+        <w:rPr>
+          <w:rFonts w:ascii="Arial" w:hAnsi="Arial" w:cs="Arial"/>
+          <w:highlight w:val="cyan"/>
+        </w:rPr>
+        <w:t>This methodological approach using a cross-sectional analysis of one single case study has clear limits and constraints on the type of data that can be gathered and the overall analysis and conclusion</w:t>
+      </w:r>
+      <w:r>
+        <w:rPr>
+          <w:rFonts w:ascii="Arial" w:hAnsi="Arial" w:cs="Arial"/>
+          <w:highlight w:val="cyan"/>
         </w:rPr>
         <w:t>s</w:t>
       </w:r>
       <w:r>
         <w:rPr>
           <w:rFonts w:ascii="Arial" w:hAnsi="Arial" w:cs="Arial"/>
+          <w:highlight w:val="cyan"/>
         </w:rPr>
         <w:t xml:space="preserve"> that can be extracted</w:t>
       </w:r>
       <w:r>
         <w:rPr>
           <w:rFonts w:ascii="Arial" w:hAnsi="Arial" w:cs="Arial"/>
+          <w:highlight w:val="cyan"/>
         </w:rPr>
         <w:t>.</w:t>
       </w:r>
@@ -1036,41 +1065,27 @@
         <w:jc w:val="both"/>
         <w:rPr>
           <w:rFonts w:ascii="Arial" w:hAnsi="Arial" w:cs="Arial"/>
-        </w:rPr>
-      </w:pPr>
-      <w:r>
-        <w:rPr>
-          <w:rFonts w:ascii="Arial" w:hAnsi="Arial" w:cs="Arial"/>
-        </w:rPr>
-        <w:t>First, c</w:t>
-      </w:r>
-      <w:r>
-        <w:rPr>
-          <w:rFonts w:ascii="Arial" w:hAnsi="Arial" w:cs="Arial"/>
-        </w:rPr>
-        <w:t xml:space="preserve">ase studies </w:t>
-      </w:r>
-      <w:r>
-        <w:rPr>
-          <w:rFonts w:ascii="Arial" w:hAnsi="Arial" w:cs="Arial"/>
-        </w:rPr>
-        <w:t xml:space="preserve">in general </w:t>
-      </w:r>
-      <w:r>
-        <w:rPr>
-          <w:rFonts w:ascii="Arial" w:hAnsi="Arial" w:cs="Arial"/>
-        </w:rPr>
-        <w:t>are not well suited for generalisation and extrapolation. The results obtained through this project will be linked mainly to the case study selected and its unique characteristics</w:t>
-      </w:r>
-      <w:r>
-        <w:rPr>
-          <w:rFonts w:ascii="Arial" w:hAnsi="Arial" w:cs="Arial"/>
+          <w:highlight w:val="cyan"/>
+        </w:rPr>
+      </w:pPr>
+      <w:r>
+        <w:rPr>
+          <w:rFonts w:ascii="Arial" w:hAnsi="Arial" w:cs="Arial"/>
+          <w:highlight w:val="cyan"/>
+        </w:rPr>
+        <w:t>First, case studies in general are not well suited for generalisation and extrapolation. The results obtained through this project will be linked mainly to the case study selected and its unique characteristics</w:t>
+      </w:r>
+      <w:r>
+        <w:rPr>
+          <w:rFonts w:ascii="Arial" w:hAnsi="Arial" w:cs="Arial"/>
+          <w:highlight w:val="cyan"/>
         </w:rPr>
         <w:t xml:space="preserve"> and may not be relevant to the situations found in other courses with different learning objectives or teaching approaches</w:t>
       </w:r>
       <w:r>
         <w:rPr>
           <w:rFonts w:ascii="Arial" w:hAnsi="Arial" w:cs="Arial"/>
+          <w:highlight w:val="cyan"/>
         </w:rPr>
         <w:t>.</w:t>
       </w:r>
@@ -1080,36 +1095,21 @@
         <w:jc w:val="both"/>
         <w:rPr>
           <w:rFonts w:ascii="Arial" w:hAnsi="Arial" w:cs="Arial"/>
-        </w:rPr>
-      </w:pPr>
-      <w:r>
-        <w:rPr>
-          <w:rFonts w:ascii="Arial" w:hAnsi="Arial" w:cs="Arial"/>
+          <w:highlight w:val="cyan"/>
+        </w:rPr>
+      </w:pPr>
+      <w:r>
+        <w:rPr>
+          <w:rFonts w:ascii="Arial" w:hAnsi="Arial" w:cs="Arial"/>
+          <w:highlight w:val="cyan"/>
         </w:rPr>
         <w:lastRenderedPageBreak/>
-        <w:t>To mitigate this situation, a</w:t>
-      </w:r>
-      <w:r>
-        <w:rPr>
-          <w:rFonts w:ascii="Arial" w:hAnsi="Arial" w:cs="Arial"/>
-        </w:rPr>
-        <w:t>n important effort was done to select a case study that uses all the elements of collaborative learning needed for this research, as well as presenting a unique an interesting scenario</w:t>
-      </w:r>
-      <w:r>
-        <w:rPr>
-          <w:rFonts w:ascii="Arial" w:hAnsi="Arial" w:cs="Arial"/>
-        </w:rPr>
-        <w:t xml:space="preserve"> that could</w:t>
-      </w:r>
-      <w:r>
-        <w:rPr>
-          <w:rFonts w:ascii="Arial" w:hAnsi="Arial" w:cs="Arial"/>
-        </w:rPr>
-        <w:t xml:space="preserve"> provide insights usable in future research.</w:t>
-      </w:r>
-      <w:r>
-        <w:rPr>
-          <w:rFonts w:ascii="Arial" w:hAnsi="Arial" w:cs="Arial"/>
+        <w:t>To mitigate this situation, an important effort was done to select a case study that uses all the elements of collaborative learning needed for this research, as well as presenting a unique an interesting scenario that could provide insights usable in future research.</w:t>
+      </w:r>
+      <w:r>
+        <w:rPr>
+          <w:rFonts w:ascii="Arial" w:hAnsi="Arial" w:cs="Arial"/>
+          <w:highlight w:val="cyan"/>
         </w:rPr>
         <w:t xml:space="preserve"> The Industry Project course offers an interesting view on how students organise themselves around intensive teamwork activities and showcased a variety of approaches to solve problems and to the use of diverse technological tools that can be appliable to many other situations.</w:t>
       </w:r>
@@ -1119,11 +1119,13 @@
         <w:jc w:val="both"/>
         <w:rPr>
           <w:rFonts w:ascii="Arial" w:hAnsi="Arial" w:cs="Arial"/>
-        </w:rPr>
-      </w:pPr>
-      <w:r>
-        <w:rPr>
-          <w:rFonts w:ascii="Arial" w:hAnsi="Arial" w:cs="Arial"/>
+          <w:highlight w:val="cyan"/>
+        </w:rPr>
+      </w:pPr>
+      <w:r>
+        <w:rPr>
+          <w:rFonts w:ascii="Arial" w:hAnsi="Arial" w:cs="Arial"/>
+          <w:highlight w:val="cyan"/>
         </w:rPr>
         <w:t>Nonetheless, it is important to acknowledge that the conclusions extracted form the data analysis will be strongly linked to the activities and learning objectives present in the Industry Project course and to the situations emerging in the cohort observed. For a better triangulation of the data obtained and to be able to draw more general conclusions, it would have been ideal to observe more cohorts or to apply the tool in different types of courses and activities.</w:t>
       </w:r>
@@ -1133,125 +1135,139 @@
         <w:jc w:val="both"/>
         <w:rPr>
           <w:rFonts w:ascii="Arial" w:hAnsi="Arial" w:cs="Arial"/>
-        </w:rPr>
-      </w:pPr>
-      <w:r>
-        <w:rPr>
-          <w:rFonts w:ascii="Arial" w:hAnsi="Arial" w:cs="Arial"/>
-        </w:rPr>
-        <w:t>The second methodological limitation is related to t</w:t>
-      </w:r>
-      <w:r>
-        <w:rPr>
-          <w:rFonts w:ascii="Arial" w:hAnsi="Arial" w:cs="Arial"/>
-        </w:rPr>
-        <w:t xml:space="preserve">he prototyping nature of the </w:t>
-      </w:r>
-      <w:r>
-        <w:rPr>
-          <w:rFonts w:ascii="Arial" w:hAnsi="Arial" w:cs="Arial"/>
+          <w:highlight w:val="cyan"/>
+        </w:rPr>
+      </w:pPr>
+      <w:r>
+        <w:rPr>
+          <w:rFonts w:ascii="Arial" w:hAnsi="Arial" w:cs="Arial"/>
+          <w:highlight w:val="cyan"/>
+        </w:rPr>
+        <w:t xml:space="preserve">The second methodological limitation is related to the prototyping nature of the </w:t>
+      </w:r>
+      <w:r>
+        <w:rPr>
+          <w:rFonts w:ascii="Arial" w:hAnsi="Arial" w:cs="Arial"/>
+          <w:highlight w:val="cyan"/>
         </w:rPr>
         <w:t xml:space="preserve">software development, which can generate </w:t>
       </w:r>
       <w:r>
         <w:rPr>
           <w:rFonts w:ascii="Arial" w:hAnsi="Arial" w:cs="Arial"/>
+          <w:highlight w:val="cyan"/>
         </w:rPr>
         <w:t>a lot of noise</w:t>
       </w:r>
       <w:r>
         <w:rPr>
           <w:rFonts w:ascii="Arial" w:hAnsi="Arial" w:cs="Arial"/>
+          <w:highlight w:val="cyan"/>
         </w:rPr>
         <w:t xml:space="preserve"> </w:t>
       </w:r>
       <w:r>
         <w:rPr>
           <w:rFonts w:ascii="Arial" w:hAnsi="Arial" w:cs="Arial"/>
+          <w:highlight w:val="cyan"/>
         </w:rPr>
         <w:t xml:space="preserve">from the friction </w:t>
       </w:r>
       <w:r>
         <w:rPr>
           <w:rFonts w:ascii="Arial" w:hAnsi="Arial" w:cs="Arial"/>
+          <w:highlight w:val="cyan"/>
         </w:rPr>
         <w:t>between</w:t>
       </w:r>
       <w:r>
         <w:rPr>
           <w:rFonts w:ascii="Arial" w:hAnsi="Arial" w:cs="Arial"/>
+          <w:highlight w:val="cyan"/>
         </w:rPr>
         <w:t xml:space="preserve"> learn</w:t>
       </w:r>
       <w:r>
         <w:rPr>
           <w:rFonts w:ascii="Arial" w:hAnsi="Arial" w:cs="Arial"/>
+          <w:highlight w:val="cyan"/>
         </w:rPr>
         <w:t>ing to</w:t>
       </w:r>
       <w:r>
         <w:rPr>
           <w:rFonts w:ascii="Arial" w:hAnsi="Arial" w:cs="Arial"/>
+          <w:highlight w:val="cyan"/>
         </w:rPr>
         <w:t xml:space="preserve"> us</w:t>
       </w:r>
       <w:r>
         <w:rPr>
           <w:rFonts w:ascii="Arial" w:hAnsi="Arial" w:cs="Arial"/>
+          <w:highlight w:val="cyan"/>
         </w:rPr>
         <w:t>e</w:t>
       </w:r>
       <w:r>
         <w:rPr>
           <w:rFonts w:ascii="Arial" w:hAnsi="Arial" w:cs="Arial"/>
+          <w:highlight w:val="cyan"/>
         </w:rPr>
         <w:t xml:space="preserve"> the tool</w:t>
       </w:r>
       <w:r>
         <w:rPr>
           <w:rFonts w:ascii="Arial" w:hAnsi="Arial" w:cs="Arial"/>
+          <w:highlight w:val="cyan"/>
         </w:rPr>
         <w:t xml:space="preserve"> and working towards the work session’s goals</w:t>
       </w:r>
       <w:r>
         <w:rPr>
           <w:rFonts w:ascii="Arial" w:hAnsi="Arial" w:cs="Arial"/>
+          <w:highlight w:val="cyan"/>
         </w:rPr>
         <w:t>. This often is evidenced by observations that highlight</w:t>
       </w:r>
       <w:r>
         <w:rPr>
           <w:rFonts w:ascii="Arial" w:hAnsi="Arial" w:cs="Arial"/>
+          <w:highlight w:val="cyan"/>
         </w:rPr>
         <w:t xml:space="preserve"> </w:t>
       </w:r>
       <w:r>
         <w:rPr>
           <w:rFonts w:ascii="Arial" w:hAnsi="Arial" w:cs="Arial"/>
+          <w:highlight w:val="cyan"/>
         </w:rPr>
         <w:t xml:space="preserve">comments and opinions of the tool around disruptions and </w:t>
       </w:r>
       <w:r>
         <w:rPr>
           <w:rFonts w:ascii="Arial" w:hAnsi="Arial" w:cs="Arial"/>
+          <w:highlight w:val="cyan"/>
         </w:rPr>
         <w:t>issues with the learning curve, which are interesting in themselves and useful for the continuous improvement of the tool, but that can also distract from</w:t>
       </w:r>
       <w:r>
         <w:rPr>
           <w:rFonts w:ascii="Arial" w:hAnsi="Arial" w:cs="Arial"/>
+          <w:highlight w:val="cyan"/>
         </w:rPr>
         <w:t xml:space="preserve"> </w:t>
       </w:r>
       <w:r>
         <w:rPr>
           <w:rFonts w:ascii="Arial" w:hAnsi="Arial" w:cs="Arial"/>
+          <w:highlight w:val="cyan"/>
         </w:rPr>
         <w:t>issues more related to the</w:t>
       </w:r>
       <w:r>
         <w:rPr>
           <w:rFonts w:ascii="Arial" w:hAnsi="Arial" w:cs="Arial"/>
+          <w:highlight w:val="cyan"/>
         </w:rPr>
         <w:t xml:space="preserve"> educational design.</w:t>
       </w:r>
@@ -1261,43 +1277,42 @@
         <w:jc w:val="both"/>
         <w:rPr>
           <w:rFonts w:ascii="Arial" w:hAnsi="Arial" w:cs="Arial"/>
-        </w:rPr>
-      </w:pPr>
-      <w:r>
-        <w:rPr>
-          <w:rFonts w:ascii="Arial" w:hAnsi="Arial" w:cs="Arial"/>
-        </w:rPr>
-        <w:t>Finally, t</w:t>
-      </w:r>
-      <w:r>
-        <w:rPr>
-          <w:rFonts w:ascii="Arial" w:hAnsi="Arial" w:cs="Arial"/>
-        </w:rPr>
-        <w:t>he predominance of qualitative data generated from this study needs to be interpreted and contextualised. In the same way, the focus on behaviour and underlying mechanism of social activities makes it impossible to create answers and observations that are not subjective in nature and marked by the biases of the researcher. An important effort is done to separate the observations from the analysis. The interpretation of the researcher will be well documented, but hopefully this research will also offer the opportunity for future work to recontextualise and propose different views to the data obtained and documented here.</w:t>
-      </w:r>
-    </w:p>
-    <w:p>
-      <w:pPr>
-        <w:jc w:val="both"/>
-        <w:rPr>
-          <w:rFonts w:ascii="Arial" w:hAnsi="Arial" w:cs="Arial"/>
-        </w:rPr>
-      </w:pPr>
-      <w:r>
-        <w:rPr>
-          <w:rFonts w:ascii="Arial" w:hAnsi="Arial" w:cs="Arial"/>
+          <w:highlight w:val="cyan"/>
+        </w:rPr>
+      </w:pPr>
+      <w:r>
+        <w:rPr>
+          <w:rFonts w:ascii="Arial" w:hAnsi="Arial" w:cs="Arial"/>
+          <w:highlight w:val="cyan"/>
+        </w:rPr>
+        <w:t>Finally, the predominance of qualitative data generated from this study needs to be interpreted and contextualised. In the same way, the focus on behaviour and underlying mechanism of social activities makes it impossible to create answers and observations that are not subjective in nature and marked by the biases of the researcher. An important effort is done to separate the observations from the analysis. The interpretation of the researcher will be well documented, but hopefully this research will also offer the opportunity for future work to recontextualise and propose different views to the data obtained and documented here.</w:t>
+      </w:r>
+    </w:p>
+    <w:p>
+      <w:pPr>
+        <w:jc w:val="both"/>
+        <w:rPr>
+          <w:rFonts w:ascii="Arial" w:hAnsi="Arial" w:cs="Arial"/>
+        </w:rPr>
+      </w:pPr>
+      <w:r>
+        <w:rPr>
+          <w:rFonts w:ascii="Arial" w:hAnsi="Arial" w:cs="Arial"/>
+          <w:highlight w:val="cyan"/>
         </w:rPr>
         <w:t xml:space="preserve">Considering these constraints, it is important to follow the documentation of this project as an exercise in experimenting with the application of a unique technology in the classroom, </w:t>
       </w:r>
       <w:r>
         <w:rPr>
           <w:rFonts w:ascii="Arial" w:hAnsi="Arial" w:cs="Arial"/>
+          <w:highlight w:val="cyan"/>
         </w:rPr>
         <w:t>with the end goal</w:t>
       </w:r>
       <w:r>
         <w:rPr>
           <w:rFonts w:ascii="Arial" w:hAnsi="Arial" w:cs="Arial"/>
+          <w:highlight w:val="cyan"/>
         </w:rPr>
         <w:t xml:space="preserve"> of identifying good and bad influences that could be linked to the use of the technology proposed. In the end, the analysis of the results documented in this thesis can be used as a starting point to develop similar experiences in the future in different contexts, either trying to emulate the same positive results or working on the negative ones, inciting more discussions and pushing forward the understanding we have about the use of AR technologies in the classroom.</w:t>
       </w:r>
@@ -1322,28 +1337,13 @@
         <w:rPr>
           <w:rFonts w:ascii="Arial" w:hAnsi="Arial" w:cs="Arial"/>
         </w:rPr>
-        <w:t xml:space="preserve">So far it has been explained that the approach to this research is through the themes and situations found in the classroom using two complementary fronts. This is first and foremost an exercise in TEL, with the firm idea in mind that it is impossible and neglectful to ignore the use of technology in the classroom. The first premise that supports the proposal is that mobile technologies can be used in a positive and constructive way to </w:t>
-      </w:r>
-      <w:r>
-        <w:rPr>
-          <w:rFonts w:ascii="Arial" w:hAnsi="Arial" w:cs="Arial"/>
-        </w:rPr>
-        <w:lastRenderedPageBreak/>
-        <w:t>promote learning and good behaviours, when used correctly and with the proper guidance. The educational approach that guides the project focuses on the tools and theories that view education mainly as a social phenomenon and as an ongoing construction based on our environment and experiences, as it will be explained in the following sections.</w:t>
-      </w:r>
-    </w:p>
-    <w:p>
-      <w:pPr>
-        <w:jc w:val="both"/>
-        <w:rPr>
-          <w:rFonts w:ascii="Arial" w:hAnsi="Arial" w:cs="Arial"/>
-        </w:rPr>
-      </w:pPr>
-      <w:r>
-        <w:rPr>
-          <w:rFonts w:ascii="Arial" w:hAnsi="Arial" w:cs="Arial"/>
-        </w:rPr>
-        <w:t>The technological development followed for this project also acknowledges the challenges found in the implementation of educational technology. The focus, besides a successful implementation, is on executing and documenting the design process followed to create ideas and promote discussion about how to integrate the educational and software design processes, how to align functional and learning goals and how to incorporate the students and the teaching staff into the process.</w:t>
+        <w:t xml:space="preserve">The following section will discuss the main theoretical frameworks that support the two focal points of this project: The educational design around collaborative learning and the software development process </w:t>
+      </w:r>
+      <w:r>
+        <w:rPr>
+          <w:rFonts w:ascii="Arial" w:hAnsi="Arial" w:cs="Arial"/>
+        </w:rPr>
+        <w:t>of an AR tool to support collocated collaboration.</w:t>
       </w:r>
     </w:p>
     <w:p>
@@ -1352,6 +1352,7 @@
         <w:spacing w:before="280" w:after="280"/>
       </w:pPr>
       <w:r>
+        <w:lastRenderedPageBreak/>
         <w:t>3.3.1 Educational Approach</w:t>
       </w:r>
     </w:p>
@@ -1452,7 +1453,19 @@
         <w:rPr>
           <w:rFonts w:ascii="Arial" w:hAnsi="Arial" w:cs="Arial"/>
         </w:rPr>
-        <w:t xml:space="preserve">Collaborative learning also goes beyond grouping students for an activity, it is an active educational design that seeks to integrate the learning goals of an activity into the dynamics created in the group. </w:t>
+        <w:t xml:space="preserve">Collaborative learning also goes beyond grouping students for </w:t>
+      </w:r>
+      <w:r>
+        <w:rPr>
+          <w:rFonts w:ascii="Arial" w:hAnsi="Arial" w:cs="Arial"/>
+        </w:rPr>
+        <w:t>work</w:t>
+      </w:r>
+      <w:r>
+        <w:rPr>
+          <w:rFonts w:ascii="Arial" w:hAnsi="Arial" w:cs="Arial"/>
+        </w:rPr>
+        <w:t xml:space="preserve">, it is an active educational design that seeks to integrate the learning goals of an activity into the dynamics created in the group. </w:t>
       </w:r>
       <w:r>
         <w:rPr>
@@ -1464,7 +1477,19 @@
         <w:rPr>
           <w:rFonts w:ascii="Arial" w:hAnsi="Arial" w:cs="Arial"/>
         </w:rPr>
-        <w:t xml:space="preserve"> remarks the importance of creating positive interdependence between the members of a group, where the success of one individual is linked to the success of all the others. This can only be achieved if the learning design allows for the group activity to create considerable and meaningful interactions, mechanisms for personal responsibility, development of social skills, and spaces for the group to self-evaluate </w:t>
+        <w:t xml:space="preserve"> remarks the importance of creating positive interdependence, where the success of one individual </w:t>
+      </w:r>
+      <w:r>
+        <w:rPr>
+          <w:rFonts w:ascii="Arial" w:hAnsi="Arial" w:cs="Arial"/>
+        </w:rPr>
+        <w:t xml:space="preserve">in a group </w:t>
+      </w:r>
+      <w:r>
+        <w:rPr>
+          <w:rFonts w:ascii="Arial" w:hAnsi="Arial" w:cs="Arial"/>
+        </w:rPr>
+        <w:t xml:space="preserve">is linked to the success of all the others. This can only be achieved if the learning design allows for the group activity to create considerable and meaningful interactions, mechanisms for personal responsibility, development of social skills, and spaces for the group to self-evaluate </w:t>
       </w:r>
       <w:r>
         <w:rPr>
@@ -1510,7 +1535,19 @@
         <w:rPr>
           <w:rFonts w:ascii="Arial" w:hAnsi="Arial" w:cs="Arial"/>
         </w:rPr>
-        <w:t>The education proposal of this research is founded on these characteristics. It is possible to summarise the goals of the TEL intervention with three objectives:</w:t>
+        <w:t xml:space="preserve">It is possible to summarise the goals of the TEL intervention </w:t>
+      </w:r>
+      <w:r>
+        <w:rPr>
+          <w:rFonts w:ascii="Arial" w:hAnsi="Arial" w:cs="Arial"/>
+        </w:rPr>
+        <w:t xml:space="preserve">in this project </w:t>
+      </w:r>
+      <w:r>
+        <w:rPr>
+          <w:rFonts w:ascii="Arial" w:hAnsi="Arial" w:cs="Arial"/>
+        </w:rPr>
+        <w:t>with three objectives:</w:t>
       </w:r>
     </w:p>
     <w:p>
@@ -1548,7 +1585,6 @@
         <w:rPr>
           <w:rFonts w:ascii="Arial" w:hAnsi="Arial" w:cs="Arial"/>
         </w:rPr>
-        <w:lastRenderedPageBreak/>
         <w:t>Leverage the communication features of a mobile deployment to provide extra channels for meaningful socialisation.</w:t>
       </w:r>
     </w:p>
@@ -1601,6 +1637,7 @@
         <w:rPr>
           <w:rFonts w:ascii="Arial" w:hAnsi="Arial" w:cs="Arial"/>
         </w:rPr>
+        <w:lastRenderedPageBreak/>
         <w:t>To better organise or show the analysis done to the project through an understanding of the context of the problem, the use of their previous knowledge to propose a solution and communicating their analysis to their peers or the clients.</w:t>
       </w:r>
     </w:p>
@@ -1776,7 +1813,6 @@
         <w:pStyle w:val="Ttulo3"/>
       </w:pPr>
       <w:r>
-        <w:lastRenderedPageBreak/>
         <w:t>3.3.1.2 Social constructionism</w:t>
       </w:r>
     </w:p>
@@ -1850,6 +1886,7 @@
         <w:rPr>
           <w:rFonts w:ascii="Arial" w:hAnsi="Arial" w:cs="Arial"/>
         </w:rPr>
+        <w:lastRenderedPageBreak/>
         <w:t>Focus on learning and working in small groups to facilitate the creation of meaningful relationships.</w:t>
       </w:r>
     </w:p>
@@ -1947,7 +1984,99 @@
         <w:rPr>
           <w:rFonts w:ascii="Arial" w:hAnsi="Arial" w:cs="Arial"/>
         </w:rPr>
-        <w:t xml:space="preserve">. In its core, the distinctions are not fundamental for the proposal of this thesis, but a strong constructionist view aligns better with the analytical methods proposed in the methodological design, since all observations are of social behaviours, and need to be filtered and understood through the social context, cultural and linguistic frameworks of the case study. This also supports the view that any observation and analysis done in the case study cannot be objective or completely unbiased. The context around the classroom and the background of the participants and the researcher, among many other factors, are important determinants of the results of this research. </w:t>
+        <w:t>. In its core, the distinctions are not fundamental for the proposal of this thesis, but a strong constructionist view aligns better with the analytical methods proposed in the methodological design, since all observations are of social behaviours, and need to be filtered and understood through the social context, cultural and linguistic frameworks of the case study. This also supports the view that any observation and analysis done in the case study cannot be objective or completely unbiased. The context around the classroom and the background of the participants and the researcher, among many other factors, are important determinants of the results of this research.</w:t>
+      </w:r>
+    </w:p>
+    <w:p>
+      <w:pPr>
+        <w:jc w:val="both"/>
+        <w:rPr>
+          <w:rFonts w:ascii="Arial" w:hAnsi="Arial" w:cs="Arial"/>
+          <w:highlight w:val="cyan"/>
+        </w:rPr>
+      </w:pPr>
+      <w:r>
+        <w:rPr>
+          <w:rFonts w:ascii="Arial" w:hAnsi="Arial" w:cs="Arial"/>
+          <w:highlight w:val="cyan"/>
+        </w:rPr>
+        <w:t>In the case of the Industry Project course, it was considered that the following social factors presented and strong influence on the behaviours observed and the analysis performed by the researcher:</w:t>
+      </w:r>
+    </w:p>
+    <w:p>
+      <w:pPr>
+        <w:pStyle w:val="Prrafodelista"/>
+        <w:numPr>
+          <w:ilvl w:val="0"/>
+          <w:numId w:val="19"/>
+        </w:numPr>
+        <w:jc w:val="both"/>
+        <w:rPr>
+          <w:rFonts w:ascii="Arial" w:hAnsi="Arial" w:cs="Arial"/>
+          <w:highlight w:val="cyan"/>
+        </w:rPr>
+      </w:pPr>
+      <w:r>
+        <w:rPr>
+          <w:rFonts w:ascii="Arial" w:hAnsi="Arial" w:cs="Arial"/>
+          <w:highlight w:val="cyan"/>
+        </w:rPr>
+        <w:t>The course represented the last academical requirement of the program, and all students were close to graduation. This is relevant since all the students already had a lot of experience with academical and collaborative work, and the observation could change substantially if the observed group is younger or in an earlier state of their studies.</w:t>
+      </w:r>
+    </w:p>
+    <w:p>
+      <w:pPr>
+        <w:pStyle w:val="Prrafodelista"/>
+        <w:numPr>
+          <w:ilvl w:val="0"/>
+          <w:numId w:val="19"/>
+        </w:numPr>
+        <w:jc w:val="both"/>
+        <w:rPr>
+          <w:rFonts w:ascii="Arial" w:hAnsi="Arial" w:cs="Arial"/>
+          <w:highlight w:val="cyan"/>
+        </w:rPr>
+      </w:pPr>
+      <w:r>
+        <w:rPr>
+          <w:rFonts w:ascii="Arial" w:hAnsi="Arial" w:cs="Arial"/>
+          <w:highlight w:val="cyan"/>
+        </w:rPr>
+        <w:t>The research</w:t>
+      </w:r>
+      <w:r>
+        <w:rPr>
+          <w:rFonts w:ascii="Arial" w:hAnsi="Arial" w:cs="Arial"/>
+          <w:highlight w:val="cyan"/>
+        </w:rPr>
+        <w:t>er</w:t>
+      </w:r>
+      <w:r>
+        <w:rPr>
+          <w:rFonts w:ascii="Arial" w:hAnsi="Arial" w:cs="Arial"/>
+          <w:highlight w:val="cyan"/>
+        </w:rPr>
+        <w:t xml:space="preserve"> also fulfilled other minor roles as part of the teaching staff, which could affect the way the students approached the intervention, the responses given and their overall disposition to their work while the researcher observed.</w:t>
+      </w:r>
+    </w:p>
+    <w:p>
+      <w:pPr>
+        <w:pStyle w:val="Prrafodelista"/>
+        <w:numPr>
+          <w:ilvl w:val="0"/>
+          <w:numId w:val="19"/>
+        </w:numPr>
+        <w:jc w:val="both"/>
+        <w:rPr>
+          <w:rFonts w:ascii="Arial" w:hAnsi="Arial" w:cs="Arial"/>
+        </w:rPr>
+      </w:pPr>
+      <w:r>
+        <w:rPr>
+          <w:rFonts w:ascii="Arial" w:hAnsi="Arial" w:cs="Arial"/>
+          <w:highlight w:val="cyan"/>
+        </w:rPr>
+        <w:t>The students did not have any real obligation to attend the work sessions, and the number of absentees was considerable. The students consistently attending, which in the end represented the observed population, shared common characteristics associated with their compromise to the course and dedication. This situation could skew the observational data to certain attitudes towards teamwork and classwork in general.</w:t>
       </w:r>
     </w:p>
     <w:p>
@@ -1955,6 +2084,7 @@
         <w:pStyle w:val="Ttulo3"/>
       </w:pPr>
       <w:r>
+        <w:lastRenderedPageBreak/>
         <w:t>3.1.1.3 Andragogy and educational design</w:t>
       </w:r>
     </w:p>
@@ -1981,14 +2111,7 @@
         <w:rPr>
           <w:rFonts w:ascii="Arial" w:hAnsi="Arial" w:cs="Arial"/>
         </w:rPr>
-        <w:t xml:space="preserve">. </w:t>
-      </w:r>
-      <w:r>
-        <w:rPr>
-          <w:rFonts w:ascii="Arial" w:hAnsi="Arial" w:cs="Arial"/>
-        </w:rPr>
-        <w:lastRenderedPageBreak/>
-        <w:t>This document has purposely tried to avoid the term pedagogy because it recognises critical elements that characterise an adult learner and that are integral to the educational design proposed for the project:</w:t>
+        <w:t>. This document has purposely tried to avoid the term pedagogy because it recognises critical elements that characterise an adult learner and that are integral to the educational design proposed for the project:</w:t>
       </w:r>
     </w:p>
     <w:p>
@@ -2260,6 +2383,7 @@
           <w:b/>
           <w:bCs/>
         </w:rPr>
+        <w:lastRenderedPageBreak/>
         <w:t>LO1:</w:t>
       </w:r>
       <w:r>
@@ -2275,7 +2399,6 @@
           <w:b/>
           <w:bCs/>
         </w:rPr>
-        <w:lastRenderedPageBreak/>
         <w:t>LO2:</w:t>
       </w:r>
       <w:r>
@@ -2419,21 +2542,27 @@
         <w:rPr>
           <w:rFonts w:ascii="Arial" w:hAnsi="Arial" w:cs="Arial"/>
         </w:rPr>
-        <w:t xml:space="preserve">The assessment process of this educational design is minimal, and it is concerned mostly on comparing the assessment done for the course between the different observations throughout the case study. Hopefully, it is possible to observe that there is a positive change in results in the groups using WorkshopAR, but this research is more concerned in identifying changes and differences during the development process. Nonetheless, some criteria can be established to guide what can be considered a positive or negative impact. </w:t>
-      </w:r>
-    </w:p>
-    <w:p>
-      <w:pPr>
-        <w:jc w:val="both"/>
-        <w:rPr>
-          <w:rFonts w:ascii="Arial" w:hAnsi="Arial" w:cs="Arial"/>
-        </w:rPr>
-      </w:pPr>
+        <w:t xml:space="preserve">The assessment process of this educational design is minimal, and it is concerned mostly on comparing the assessment done for the course between the different observations throughout the case study. Hopefully, it is possible to observe that there is a positive </w:t>
+      </w:r>
       <w:r>
         <w:rPr>
           <w:rFonts w:ascii="Arial" w:hAnsi="Arial" w:cs="Arial"/>
         </w:rPr>
         <w:lastRenderedPageBreak/>
+        <w:t xml:space="preserve">change in results in the groups using WorkshopAR, but this research is more concerned in identifying changes and differences during the development process. Nonetheless, some criteria can be established to guide what can be considered a positive or negative impact. </w:t>
+      </w:r>
+    </w:p>
+    <w:p>
+      <w:pPr>
+        <w:jc w:val="both"/>
+        <w:rPr>
+          <w:rFonts w:ascii="Arial" w:hAnsi="Arial" w:cs="Arial"/>
+        </w:rPr>
+      </w:pPr>
+      <w:r>
+        <w:rPr>
+          <w:rFonts w:ascii="Arial" w:hAnsi="Arial" w:cs="Arial"/>
+        </w:rPr>
         <w:t>Positive observations can be characterised by constant communication between the team members, coherency between the different aspects of the proposal and a clear visualisation of the decisions taken for the project and the reasoning behind them. In contrast, poor performance can be characterised by a disjointed work without a common or clear objective, noticeable lack of communication between the group and a failure in meeting deadlines or show consistent progress in their work.</w:t>
       </w:r>
     </w:p>
@@ -2576,7 +2705,14 @@
         <w:rPr>
           <w:rFonts w:ascii="Arial" w:hAnsi="Arial" w:cs="Arial"/>
         </w:rPr>
-        <w:t>The first step in the development of WorkshopAR is a user-centred design aimed at the interaction aspects of the experience with the hardware and with the AR tools build to accomplish the learning goals established. The main objective is to identify expected interactions with AR technologies and formulate a proposal for the overall user experience based on the aggregated feedback gathered from the users.</w:t>
+        <w:t xml:space="preserve">The first step in the development of WorkshopAR is a user-centred design aimed at the interaction aspects of the experience with the hardware and with the AR tools build to accomplish the learning goals established. The main objective is to identify expected </w:t>
+      </w:r>
+      <w:r>
+        <w:rPr>
+          <w:rFonts w:ascii="Arial" w:hAnsi="Arial" w:cs="Arial"/>
+        </w:rPr>
+        <w:lastRenderedPageBreak/>
+        <w:t>interactions with AR technologies and formulate a proposal for the overall user experience based on the aggregated feedback gathered from the users.</w:t>
       </w:r>
     </w:p>
     <w:p>
@@ -2615,7 +2751,6 @@
         <w:rPr>
           <w:rFonts w:ascii="Arial" w:hAnsi="Arial" w:cs="Arial"/>
         </w:rPr>
-        <w:lastRenderedPageBreak/>
         <w:t>Being project-oriented, tailored to specifics needs and driven by data.</w:t>
       </w:r>
     </w:p>
@@ -2797,6 +2932,7 @@
         <w:rPr>
           <w:rFonts w:ascii="Arial" w:hAnsi="Arial" w:cs="Arial"/>
         </w:rPr>
+        <w:lastRenderedPageBreak/>
         <w:t xml:space="preserve">The biggest risk that needs to be acknowledged when implementing a user-centred design is to mismanage the involvement of the user in the process. As </w:t>
       </w:r>
       <w:r>
@@ -2847,7 +2983,6 @@
         <w:rPr>
           <w:rFonts w:ascii="Arial" w:hAnsi="Arial" w:cs="Arial"/>
         </w:rPr>
-        <w:lastRenderedPageBreak/>
         <w:t>A disorganised input that lacks cohesion and a clear goal.</w:t>
       </w:r>
     </w:p>
@@ -3054,7 +3189,14 @@
         <w:rPr>
           <w:rFonts w:ascii="Arial" w:hAnsi="Arial" w:cs="Arial"/>
         </w:rPr>
-        <w:t xml:space="preserve"> explains, agile developments are useful for getting unrestrictive progress in rapidly changing environments, but they run the risk of aimlessly keep producing bloated functionalities and lack a clear direction. For the prototyping nature of WorkshopAR, this is an acceptable use scenario, and the same guidelines established to focus the user-centred design process can be used to guide the software development. Additional milestones can also be proposed to evaluate progress and to set a baseline of what can be considered a finished version of WorkshopAR within the context of the project.</w:t>
+        <w:t xml:space="preserve"> explains, agile developments are useful for getting unrestrictive progress in rapidly changing environments, but they run the risk of aimlessly keep </w:t>
+      </w:r>
+      <w:r>
+        <w:rPr>
+          <w:rFonts w:ascii="Arial" w:hAnsi="Arial" w:cs="Arial"/>
+        </w:rPr>
+        <w:lastRenderedPageBreak/>
+        <w:t>producing bloated functionalities and lack a clear direction. For the prototyping nature of WorkshopAR, this is an acceptable use scenario, and the same guidelines established to focus the user-centred design process can be used to guide the software development. Additional milestones can also be proposed to evaluate progress and to set a baseline of what can be considered a finished version of WorkshopAR within the context of the project.</w:t>
       </w:r>
     </w:p>
     <w:p>
@@ -3074,7 +3216,6 @@
           <w:b/>
           <w:bCs/>
         </w:rPr>
-        <w:lastRenderedPageBreak/>
         <w:t>Milestone 1:</w:t>
       </w:r>
       <w:r>
@@ -5663,6 +5804,119 @@
     </w:lvl>
   </w:abstractNum>
   <w:abstractNum w:abstractNumId="16" w15:restartNumberingAfterBreak="0">
+    <w:nsid w:val="7B413148"/>
+    <w:multiLevelType w:val="hybridMultilevel"/>
+    <w:tmpl w:val="A072C27E"/>
+    <w:lvl w:ilvl="0" w:tplc="240A0001">
+      <w:start w:val="1"/>
+      <w:numFmt w:val="bullet"/>
+      <w:lvlText w:val=""/>
+      <w:lvlJc w:val="left"/>
+      <w:pPr>
+        <w:ind w:left="720" w:hanging="360"/>
+      </w:pPr>
+      <w:rPr>
+        <w:rFonts w:ascii="Symbol" w:hAnsi="Symbol" w:hint="default"/>
+      </w:rPr>
+    </w:lvl>
+    <w:lvl w:ilvl="1" w:tplc="240A0003" w:tentative="1">
+      <w:start w:val="1"/>
+      <w:numFmt w:val="bullet"/>
+      <w:lvlText w:val="o"/>
+      <w:lvlJc w:val="left"/>
+      <w:pPr>
+        <w:ind w:left="1440" w:hanging="360"/>
+      </w:pPr>
+      <w:rPr>
+        <w:rFonts w:ascii="Courier New" w:hAnsi="Courier New" w:cs="Courier New" w:hint="default"/>
+      </w:rPr>
+    </w:lvl>
+    <w:lvl w:ilvl="2" w:tplc="240A0005" w:tentative="1">
+      <w:start w:val="1"/>
+      <w:numFmt w:val="bullet"/>
+      <w:lvlText w:val=""/>
+      <w:lvlJc w:val="left"/>
+      <w:pPr>
+        <w:ind w:left="2160" w:hanging="360"/>
+      </w:pPr>
+      <w:rPr>
+        <w:rFonts w:ascii="Wingdings" w:hAnsi="Wingdings" w:hint="default"/>
+      </w:rPr>
+    </w:lvl>
+    <w:lvl w:ilvl="3" w:tplc="240A0001" w:tentative="1">
+      <w:start w:val="1"/>
+      <w:numFmt w:val="bullet"/>
+      <w:lvlText w:val=""/>
+      <w:lvlJc w:val="left"/>
+      <w:pPr>
+        <w:ind w:left="2880" w:hanging="360"/>
+      </w:pPr>
+      <w:rPr>
+        <w:rFonts w:ascii="Symbol" w:hAnsi="Symbol" w:hint="default"/>
+      </w:rPr>
+    </w:lvl>
+    <w:lvl w:ilvl="4" w:tplc="240A0003" w:tentative="1">
+      <w:start w:val="1"/>
+      <w:numFmt w:val="bullet"/>
+      <w:lvlText w:val="o"/>
+      <w:lvlJc w:val="left"/>
+      <w:pPr>
+        <w:ind w:left="3600" w:hanging="360"/>
+      </w:pPr>
+      <w:rPr>
+        <w:rFonts w:ascii="Courier New" w:hAnsi="Courier New" w:cs="Courier New" w:hint="default"/>
+      </w:rPr>
+    </w:lvl>
+    <w:lvl w:ilvl="5" w:tplc="240A0005" w:tentative="1">
+      <w:start w:val="1"/>
+      <w:numFmt w:val="bullet"/>
+      <w:lvlText w:val=""/>
+      <w:lvlJc w:val="left"/>
+      <w:pPr>
+        <w:ind w:left="4320" w:hanging="360"/>
+      </w:pPr>
+      <w:rPr>
+        <w:rFonts w:ascii="Wingdings" w:hAnsi="Wingdings" w:hint="default"/>
+      </w:rPr>
+    </w:lvl>
+    <w:lvl w:ilvl="6" w:tplc="240A0001" w:tentative="1">
+      <w:start w:val="1"/>
+      <w:numFmt w:val="bullet"/>
+      <w:lvlText w:val=""/>
+      <w:lvlJc w:val="left"/>
+      <w:pPr>
+        <w:ind w:left="5040" w:hanging="360"/>
+      </w:pPr>
+      <w:rPr>
+        <w:rFonts w:ascii="Symbol" w:hAnsi="Symbol" w:hint="default"/>
+      </w:rPr>
+    </w:lvl>
+    <w:lvl w:ilvl="7" w:tplc="240A0003" w:tentative="1">
+      <w:start w:val="1"/>
+      <w:numFmt w:val="bullet"/>
+      <w:lvlText w:val="o"/>
+      <w:lvlJc w:val="left"/>
+      <w:pPr>
+        <w:ind w:left="5760" w:hanging="360"/>
+      </w:pPr>
+      <w:rPr>
+        <w:rFonts w:ascii="Courier New" w:hAnsi="Courier New" w:cs="Courier New" w:hint="default"/>
+      </w:rPr>
+    </w:lvl>
+    <w:lvl w:ilvl="8" w:tplc="240A0005" w:tentative="1">
+      <w:start w:val="1"/>
+      <w:numFmt w:val="bullet"/>
+      <w:lvlText w:val=""/>
+      <w:lvlJc w:val="left"/>
+      <w:pPr>
+        <w:ind w:left="6480" w:hanging="360"/>
+      </w:pPr>
+      <w:rPr>
+        <w:rFonts w:ascii="Wingdings" w:hAnsi="Wingdings" w:hint="default"/>
+      </w:rPr>
+    </w:lvl>
+  </w:abstractNum>
+  <w:abstractNum w:abstractNumId="17" w15:restartNumberingAfterBreak="0">
     <w:nsid w:val="7CE47E31"/>
     <w:multiLevelType w:val="multilevel"/>
     <w:tmpl w:val="C4928922"/>
@@ -5802,7 +6056,7 @@
       </w:rPr>
     </w:lvl>
   </w:abstractNum>
-  <w:abstractNum w:abstractNumId="17" w15:restartNumberingAfterBreak="0">
+  <w:abstractNum w:abstractNumId="18" w15:restartNumberingAfterBreak="0">
     <w:nsid w:val="7D562F59"/>
     <w:multiLevelType w:val="multilevel"/>
     <w:tmpl w:val="4F56F7C2"/>
@@ -5967,7 +6221,7 @@
     <w:abstractNumId w:val="13"/>
   </w:num>
   <w:num w:numId="9" w16cid:durableId="1339964584">
-    <w:abstractNumId w:val="16"/>
+    <w:abstractNumId w:val="17"/>
   </w:num>
   <w:num w:numId="10" w16cid:durableId="1114666598">
     <w:abstractNumId w:val="12"/>
@@ -5988,13 +6242,16 @@
     <w:abstractNumId w:val="10"/>
   </w:num>
   <w:num w:numId="16" w16cid:durableId="2078824581">
-    <w:abstractNumId w:val="17"/>
+    <w:abstractNumId w:val="18"/>
   </w:num>
   <w:num w:numId="17" w16cid:durableId="821510757">
     <w:abstractNumId w:val="2"/>
   </w:num>
   <w:num w:numId="18" w16cid:durableId="1182283143">
     <w:abstractNumId w:val="14"/>
+  </w:num>
+  <w:num w:numId="19" w16cid:durableId="232013147">
+    <w:abstractNumId w:val="16"/>
   </w:num>
 </w:numbering>
 </file>

</xml_diff>

<commit_message>
Working on expanding ch1 Case study introduction
</commit_message>
<xml_diff>
--- a/Draft/3 Methodology.docx
+++ b/Draft/3 Methodology.docx
@@ -512,39 +512,17 @@
           <w:rFonts w:ascii="Arial" w:hAnsi="Arial" w:cs="Arial"/>
         </w:rPr>
       </w:pPr>
-      <w:proofErr w:type="gramStart"/>
-      <w:r>
-        <w:rPr>
-          <w:rFonts w:ascii="Arial" w:hAnsi="Arial" w:cs="Arial"/>
-        </w:rPr>
-        <w:t>Finally</w:t>
-      </w:r>
-      <w:proofErr w:type="gramEnd"/>
-      <w:r>
-        <w:rPr>
-          <w:rFonts w:ascii="Arial" w:hAnsi="Arial" w:cs="Arial"/>
-        </w:rPr>
-        <w:t xml:space="preserve"> the analysis technique chosen for the project will focus on content and thematic analysis. These approaches offer good flexibility to analyse the data obtained from different points of view that are subjective and anecdotal in nature. They help in synthesising large quantities of textual data, organise them and extract relevant points of interest to start building results and conclusions </w:t>
+      <w:r>
+        <w:rPr>
+          <w:rFonts w:ascii="Arial" w:hAnsi="Arial" w:cs="Arial"/>
+        </w:rPr>
+        <w:t xml:space="preserve">Finally the analysis technique chosen for the project will focus on content and thematic analysis. These approaches offer good flexibility to analyse the data obtained from different points of view that are subjective and anecdotal in nature. They help in synthesising large quantities of textual data, organise them and extract relevant points of interest to start building results and conclusions </w:t>
       </w:r>
       <w:r>
         <w:rPr>
           <w:rStyle w:val="CitaCar"/>
         </w:rPr>
-        <w:t xml:space="preserve">(Kiger &amp; </w:t>
-      </w:r>
-      <w:proofErr w:type="spellStart"/>
-      <w:r>
-        <w:rPr>
-          <w:rStyle w:val="CitaCar"/>
-        </w:rPr>
-        <w:t>Varpio</w:t>
-      </w:r>
-      <w:proofErr w:type="spellEnd"/>
-      <w:r>
-        <w:rPr>
-          <w:rStyle w:val="CitaCar"/>
-        </w:rPr>
-        <w:t>, 2020, Neuendorf, 2018).</w:t>
+        <w:t>(Kiger &amp; Varpio, 2020, Neuendorf, 2018).</w:t>
       </w:r>
       <w:r>
         <w:rPr>
@@ -1395,133 +1373,105 @@
         <w:rPr>
           <w:rStyle w:val="CitaCar"/>
         </w:rPr>
-        <w:t>(</w:t>
-      </w:r>
-      <w:proofErr w:type="spellStart"/>
+        <w:t>(Eskiyurt &amp; Özkan, 2024)</w:t>
+      </w:r>
+      <w:r>
+        <w:rPr>
+          <w:rFonts w:ascii="Arial" w:hAnsi="Arial" w:cs="Arial"/>
+        </w:rPr>
+        <w:t xml:space="preserve">. It assumes that learning is an active process that depends on rich context, diversity and is inherently social </w:t>
+      </w:r>
       <w:r>
         <w:rPr>
           <w:rStyle w:val="CitaCar"/>
         </w:rPr>
-        <w:t>Eskiyurt</w:t>
-      </w:r>
-      <w:proofErr w:type="spellEnd"/>
+        <w:t>(Smith &amp; MacGregor, 1993)</w:t>
+      </w:r>
+      <w:r>
+        <w:rPr>
+          <w:rFonts w:ascii="Arial" w:hAnsi="Arial" w:cs="Arial"/>
+        </w:rPr>
+        <w:t xml:space="preserve">. In a collaborative design students benefit from a joint effort to solve problems, a diversity of skills put together for a common purpose and a transmission, active and passive, of knowledge and skills between members of the group </w:t>
+      </w:r>
       <w:r>
         <w:rPr>
           <w:rStyle w:val="CitaCar"/>
         </w:rPr>
-        <w:t xml:space="preserve"> &amp; Özkan, 2024)</w:t>
-      </w:r>
-      <w:r>
-        <w:rPr>
-          <w:rFonts w:ascii="Arial" w:hAnsi="Arial" w:cs="Arial"/>
-        </w:rPr>
-        <w:t xml:space="preserve">. It assumes that learning is an active process that depends on rich context, diversity and is inherently social </w:t>
+        <w:t>(Laal et al., 2013, Buchs &amp; Butera, 2015)</w:t>
+      </w:r>
+      <w:r>
+        <w:rPr>
+          <w:rFonts w:ascii="Arial" w:hAnsi="Arial" w:cs="Arial"/>
+        </w:rPr>
+        <w:t>.</w:t>
+      </w:r>
+    </w:p>
+    <w:p>
+      <w:pPr>
+        <w:jc w:val="both"/>
+        <w:rPr>
+          <w:rFonts w:ascii="Arial" w:hAnsi="Arial" w:cs="Arial"/>
+        </w:rPr>
+      </w:pPr>
+      <w:r>
+        <w:rPr>
+          <w:rFonts w:ascii="Arial" w:hAnsi="Arial" w:cs="Arial"/>
+        </w:rPr>
+        <w:t xml:space="preserve">Collaborative learning also goes beyond grouping students for </w:t>
+      </w:r>
+      <w:r>
+        <w:rPr>
+          <w:rFonts w:ascii="Arial" w:hAnsi="Arial" w:cs="Arial"/>
+        </w:rPr>
+        <w:t>work</w:t>
+      </w:r>
+      <w:r>
+        <w:rPr>
+          <w:rFonts w:ascii="Arial" w:hAnsi="Arial" w:cs="Arial"/>
+        </w:rPr>
+        <w:t xml:space="preserve">, it is an active educational design that seeks to integrate the learning goals of an activity into the dynamics created in the group. </w:t>
       </w:r>
       <w:r>
         <w:rPr>
           <w:rStyle w:val="CitaCar"/>
         </w:rPr>
-        <w:t>(Smith &amp; MacGregor, 1993)</w:t>
-      </w:r>
-      <w:r>
-        <w:rPr>
-          <w:rFonts w:ascii="Arial" w:hAnsi="Arial" w:cs="Arial"/>
-        </w:rPr>
-        <w:t xml:space="preserve">. In a collaborative design students benefit from a joint effort to solve problems, a diversity of skills put together for a common purpose and a transmission, active and passive, of knowledge and skills between members of the group </w:t>
+        <w:t>Laal (2013)</w:t>
+      </w:r>
+      <w:r>
+        <w:rPr>
+          <w:rFonts w:ascii="Arial" w:hAnsi="Arial" w:cs="Arial"/>
+        </w:rPr>
+        <w:t xml:space="preserve"> remarks the importance of creating positive interdependence, where the success of one individual </w:t>
+      </w:r>
+      <w:r>
+        <w:rPr>
+          <w:rFonts w:ascii="Arial" w:hAnsi="Arial" w:cs="Arial"/>
+        </w:rPr>
+        <w:t xml:space="preserve">in a group </w:t>
+      </w:r>
+      <w:r>
+        <w:rPr>
+          <w:rFonts w:ascii="Arial" w:hAnsi="Arial" w:cs="Arial"/>
+        </w:rPr>
+        <w:t xml:space="preserve">is linked to the success of all the others. This can only be achieved if the learning design allows for the group activity to create considerable and meaningful interactions, mechanisms for personal responsibility, development of social skills, and spaces for the group to self-evaluate </w:t>
       </w:r>
       <w:r>
         <w:rPr>
           <w:rStyle w:val="CitaCar"/>
         </w:rPr>
-        <w:t>(Laal et al., 2013, Buchs &amp; Butera, 2015)</w:t>
-      </w:r>
-      <w:r>
-        <w:rPr>
-          <w:rFonts w:ascii="Arial" w:hAnsi="Arial" w:cs="Arial"/>
-        </w:rPr>
-        <w:t>.</w:t>
-      </w:r>
-    </w:p>
-    <w:p>
-      <w:pPr>
-        <w:jc w:val="both"/>
-        <w:rPr>
-          <w:rFonts w:ascii="Arial" w:hAnsi="Arial" w:cs="Arial"/>
-        </w:rPr>
-      </w:pPr>
-      <w:r>
-        <w:rPr>
-          <w:rFonts w:ascii="Arial" w:hAnsi="Arial" w:cs="Arial"/>
-        </w:rPr>
-        <w:t xml:space="preserve">Collaborative learning also goes beyond grouping students for </w:t>
-      </w:r>
-      <w:r>
-        <w:rPr>
-          <w:rFonts w:ascii="Arial" w:hAnsi="Arial" w:cs="Arial"/>
-        </w:rPr>
-        <w:t>work</w:t>
-      </w:r>
-      <w:r>
-        <w:rPr>
-          <w:rFonts w:ascii="Arial" w:hAnsi="Arial" w:cs="Arial"/>
-        </w:rPr>
-        <w:t xml:space="preserve">, it is an active educational design that seeks to integrate the learning goals of an activity into the dynamics created in the group. </w:t>
+        <w:t>(Johnson &amp; Johnson, 1990).</w:t>
+      </w:r>
+      <w:r>
+        <w:rPr>
+          <w:rFonts w:ascii="Arial" w:hAnsi="Arial" w:cs="Arial"/>
+        </w:rPr>
+        <w:t xml:space="preserve"> Collaborative learning can be distinguished from similar concepts like peer learning, tutoring and cooperative learning by the way it frames the relationship between students. It proposes an equal relationship between peers that develops high levels of mutuality, that is, interactions that must be executed in both ways of the relationship </w:t>
       </w:r>
       <w:r>
         <w:rPr>
           <w:rStyle w:val="CitaCar"/>
         </w:rPr>
-        <w:t>Laal (2013)</w:t>
-      </w:r>
-      <w:r>
-        <w:rPr>
-          <w:rFonts w:ascii="Arial" w:hAnsi="Arial" w:cs="Arial"/>
-        </w:rPr>
-        <w:t xml:space="preserve"> remarks the importance of creating positive interdependence, where the success of one individual </w:t>
-      </w:r>
-      <w:r>
-        <w:rPr>
-          <w:rFonts w:ascii="Arial" w:hAnsi="Arial" w:cs="Arial"/>
-        </w:rPr>
-        <w:t xml:space="preserve">in a group </w:t>
-      </w:r>
-      <w:r>
-        <w:rPr>
-          <w:rFonts w:ascii="Arial" w:hAnsi="Arial" w:cs="Arial"/>
-        </w:rPr>
-        <w:t xml:space="preserve">is linked to the success of all the others. This can only be achieved if the learning design allows for the group activity to create considerable and meaningful interactions, mechanisms for personal responsibility, development of social skills, and spaces for the group to self-evaluate </w:t>
-      </w:r>
-      <w:r>
-        <w:rPr>
-          <w:rStyle w:val="CitaCar"/>
-        </w:rPr>
-        <w:t>(Johnson &amp; Johnson, 1990).</w:t>
-      </w:r>
-      <w:r>
-        <w:rPr>
-          <w:rFonts w:ascii="Arial" w:hAnsi="Arial" w:cs="Arial"/>
-        </w:rPr>
-        <w:t xml:space="preserve"> Collaborative learning can be distinguished from similar concepts like peer learning, tutoring and cooperative learning by the way it frames the relationship between students. It proposes an equal relationship between peers that develops high levels of mutuality, that is, interactions that must be executed in both ways of the relationship </w:t>
-      </w:r>
-      <w:r>
-        <w:rPr>
-          <w:rStyle w:val="CitaCar"/>
-        </w:rPr>
-        <w:t xml:space="preserve">(O’Donnell &amp; </w:t>
-      </w:r>
-      <w:proofErr w:type="spellStart"/>
-      <w:r>
-        <w:rPr>
-          <w:rStyle w:val="CitaCar"/>
-        </w:rPr>
-        <w:t>Hmelo</w:t>
-      </w:r>
-      <w:proofErr w:type="spellEnd"/>
-      <w:r>
-        <w:rPr>
-          <w:rStyle w:val="CitaCar"/>
-        </w:rPr>
-        <w:t>-Silver, 2013).</w:t>
+        <w:t>(O’Donnell &amp; Hmelo-Silver, 2013).</w:t>
       </w:r>
     </w:p>
     <w:p>
@@ -1767,72 +1717,58 @@
         <w:rPr>
           <w:rStyle w:val="CitaCar"/>
         </w:rPr>
-        <w:t xml:space="preserve">(Hathorn &amp; Ingram, 2002, </w:t>
-      </w:r>
-      <w:proofErr w:type="spellStart"/>
+        <w:t>(Hathorn &amp; Ingram, 2002, Rodchua, 2017)</w:t>
+      </w:r>
+      <w:r>
+        <w:rPr>
+          <w:rFonts w:ascii="Arial" w:hAnsi="Arial" w:cs="Arial"/>
+        </w:rPr>
+        <w:t xml:space="preserve">, but the proposal of WorkshopAR is to identify how this trend of asynchronous and discontinued communication is used outside the web and in the physical classroom, with the main intention of identifying, if possible, positive or interesting behaviours that can be nourished to create a more positive relationship with technology inside the classroom, akin to the proposals made by authors like </w:t>
+      </w:r>
       <w:r>
         <w:rPr>
           <w:rStyle w:val="CitaCar"/>
         </w:rPr>
-        <w:t>Rodchua</w:t>
-      </w:r>
-      <w:proofErr w:type="spellEnd"/>
+        <w:t>Dyer et al. (2015)</w:t>
+      </w:r>
+      <w:r>
+        <w:rPr>
+          <w:rFonts w:ascii="Arial" w:hAnsi="Arial" w:cs="Arial"/>
+        </w:rPr>
+        <w:t xml:space="preserve"> or the analysis of available options and approaches from </w:t>
+      </w:r>
       <w:r>
         <w:rPr>
           <w:rStyle w:val="CitaCar"/>
         </w:rPr>
-        <w:t>, 2017)</w:t>
-      </w:r>
-      <w:r>
-        <w:rPr>
-          <w:rFonts w:ascii="Arial" w:hAnsi="Arial" w:cs="Arial"/>
-        </w:rPr>
-        <w:t xml:space="preserve">, but the proposal of WorkshopAR is to identify how this trend of asynchronous and discontinued communication is used outside the web and in the physical classroom, with the main intention of identifying, if possible, positive or interesting behaviours that can be nourished to create a more positive relationship with technology inside the classroom, akin to the proposals made by authors like </w:t>
+        <w:t>Olson &amp; Olson (2012).</w:t>
+      </w:r>
+    </w:p>
+    <w:p>
+      <w:pPr>
+        <w:pStyle w:val="Ttulo3"/>
+      </w:pPr>
+      <w:r>
+        <w:t>3.3.1.2 Social constructionism</w:t>
+      </w:r>
+    </w:p>
+    <w:p>
+      <w:pPr>
+        <w:jc w:val="both"/>
+        <w:rPr>
+          <w:rFonts w:ascii="Arial" w:hAnsi="Arial" w:cs="Arial"/>
+        </w:rPr>
+      </w:pPr>
+      <w:r>
+        <w:rPr>
+          <w:rFonts w:ascii="Arial" w:hAnsi="Arial" w:cs="Arial"/>
+        </w:rPr>
+        <w:t xml:space="preserve">If collaborative learning is the central pillar of the educational proposal of this project, then social constructionism is at the core of the educational philosophy found in collaborative learning. One of the main premises of social constructionism is that the cognitive development of people matures thanks to the guidance and collaboration with others </w:t>
       </w:r>
       <w:r>
         <w:rPr>
           <w:rStyle w:val="CitaCar"/>
         </w:rPr>
-        <w:t>Dyer et al. (2015)</w:t>
-      </w:r>
-      <w:r>
-        <w:rPr>
-          <w:rFonts w:ascii="Arial" w:hAnsi="Arial" w:cs="Arial"/>
-        </w:rPr>
-        <w:t xml:space="preserve"> or the analysis of available options and approaches from </w:t>
-      </w:r>
-      <w:r>
-        <w:rPr>
-          <w:rStyle w:val="CitaCar"/>
-        </w:rPr>
-        <w:t>Olson &amp; Olson (2012).</w:t>
-      </w:r>
-    </w:p>
-    <w:p>
-      <w:pPr>
-        <w:pStyle w:val="Ttulo3"/>
-      </w:pPr>
-      <w:r>
-        <w:t>3.3.1.2 Social constructionism</w:t>
-      </w:r>
-    </w:p>
-    <w:p>
-      <w:pPr>
-        <w:jc w:val="both"/>
-        <w:rPr>
-          <w:rFonts w:ascii="Arial" w:hAnsi="Arial" w:cs="Arial"/>
-        </w:rPr>
-      </w:pPr>
-      <w:r>
-        <w:rPr>
-          <w:rFonts w:ascii="Arial" w:hAnsi="Arial" w:cs="Arial"/>
-        </w:rPr>
-        <w:t xml:space="preserve">If collaborative learning is the central pillar of the educational proposal of this project, then social constructionism is at the core of the educational philosophy found in collaborative learning. One of the main premises of social constructionism is that the cognitive development of people matures thanks to the guidance and collaboration with others </w:t>
-      </w:r>
-      <w:r>
-        <w:rPr>
-          <w:rStyle w:val="CitaCar"/>
-        </w:rPr>
         <w:t>(Rogoff, 1990)</w:t>
       </w:r>
       <w:r>
@@ -1853,21 +1789,7 @@
         <w:rPr>
           <w:rFonts w:ascii="Arial" w:hAnsi="Arial" w:cs="Arial"/>
         </w:rPr>
-        <w:t>In this model of learning, communication is a key ingredient since language itself is the main driver for the construction of knowledge and the core medium for its transmission (</w:t>
-      </w:r>
-      <w:proofErr w:type="spellStart"/>
-      <w:r>
-        <w:rPr>
-          <w:rFonts w:ascii="Arial" w:hAnsi="Arial" w:cs="Arial"/>
-        </w:rPr>
-        <w:t>Renzl</w:t>
-      </w:r>
-      <w:proofErr w:type="spellEnd"/>
-      <w:r>
-        <w:rPr>
-          <w:rFonts w:ascii="Arial" w:hAnsi="Arial" w:cs="Arial"/>
-        </w:rPr>
-        <w:t>, 2007). The immediate context, the cultural background, cultural artifacts, the relationships that had been build and the sense (or lack of) pertinence to a group are all fundamental factors in the process of creating knowledge, and they are all inherently social (Edley, 2001, Burr &amp; Dick, 2017). It is no surprise then that collaborative learning echoes all these elements and bases most of its methodological approaches in social constructionism premises:</w:t>
+        <w:t>In this model of learning, communication is a key ingredient since language itself is the main driver for the construction of knowledge and the core medium for its transmission (Renzl, 2007). The immediate context, the cultural background, cultural artifacts, the relationships that had been build and the sense (or lack of) pertinence to a group are all fundamental factors in the process of creating knowledge, and they are all inherently social (Edley, 2001, Burr &amp; Dick, 2017). It is no surprise then that collaborative learning echoes all these elements and bases most of its methodological approaches in social constructionism premises:</w:t>
       </w:r>
     </w:p>
     <w:p>
@@ -2099,7 +2021,7 @@
         <w:rPr>
           <w:rFonts w:ascii="Arial" w:hAnsi="Arial" w:cs="Arial"/>
         </w:rPr>
-        <w:t xml:space="preserve">The last fundamental guideline in the educational approach of this project is andragogy and the design principles in education for adults and life-long learners </w:t>
+        <w:t xml:space="preserve">The last fundamental guideline is andragogy and the design principles in education for adults and life-long learners </w:t>
       </w:r>
       <w:r>
         <w:rPr>
@@ -2206,67 +2128,103 @@
         <w:rPr>
           <w:rFonts w:ascii="Arial" w:hAnsi="Arial" w:cs="Arial"/>
         </w:rPr>
-        <w:t xml:space="preserve">An additional consideration is the approach to technology proposed by this project, which makes more sense, is safer and offers more value in a context with adult learners </w:t>
+        <w:t>T</w:t>
+      </w:r>
+      <w:r>
+        <w:rPr>
+          <w:rFonts w:ascii="Arial" w:hAnsi="Arial" w:cs="Arial"/>
+        </w:rPr>
+        <w:t>he approach to technology proposed by this project</w:t>
+      </w:r>
+      <w:r>
+        <w:rPr>
+          <w:rFonts w:ascii="Arial" w:hAnsi="Arial" w:cs="Arial"/>
+        </w:rPr>
+        <w:t xml:space="preserve"> also </w:t>
+      </w:r>
+      <w:r>
+        <w:rPr>
+          <w:rFonts w:ascii="Arial" w:hAnsi="Arial" w:cs="Arial"/>
+        </w:rPr>
+        <w:t xml:space="preserve">makes more sense, is safer and offers more value in a context with adult learners </w:t>
       </w:r>
       <w:r>
         <w:rPr>
           <w:rStyle w:val="CitaCar"/>
         </w:rPr>
-        <w:t xml:space="preserve">(Shopova, 2014, </w:t>
-      </w:r>
-      <w:proofErr w:type="spellStart"/>
+        <w:t>(Shopova, 2014, Jimoyiannis &amp; Gravani, 2011)</w:t>
+      </w:r>
+      <w:r>
+        <w:rPr>
+          <w:rFonts w:ascii="Arial" w:hAnsi="Arial" w:cs="Arial"/>
+        </w:rPr>
+        <w:t>. Since the proposal focuses on identifying the benefits of communication and collaboration mediated by technology, it is important to balance th</w:t>
+      </w:r>
+      <w:r>
+        <w:rPr>
+          <w:rFonts w:ascii="Arial" w:hAnsi="Arial" w:cs="Arial"/>
+        </w:rPr>
+        <w:t>is</w:t>
+      </w:r>
+      <w:r>
+        <w:rPr>
+          <w:rFonts w:ascii="Arial" w:hAnsi="Arial" w:cs="Arial"/>
+        </w:rPr>
+        <w:t xml:space="preserve"> approach with the evidence that</w:t>
+      </w:r>
+      <w:r>
+        <w:rPr>
+          <w:rFonts w:ascii="Arial" w:hAnsi="Arial" w:cs="Arial"/>
+        </w:rPr>
+        <w:t xml:space="preserve"> </w:t>
+      </w:r>
+      <w:r>
+        <w:rPr>
+          <w:rFonts w:ascii="Arial" w:hAnsi="Arial" w:cs="Arial"/>
+        </w:rPr>
+        <w:t xml:space="preserve">shows </w:t>
+      </w:r>
+      <w:r>
+        <w:rPr>
+          <w:rFonts w:ascii="Arial" w:hAnsi="Arial" w:cs="Arial"/>
+        </w:rPr>
+        <w:t xml:space="preserve">the </w:t>
+      </w:r>
+      <w:r>
+        <w:rPr>
+          <w:rFonts w:ascii="Arial" w:hAnsi="Arial" w:cs="Arial"/>
+        </w:rPr>
+        <w:t xml:space="preserve">benefits </w:t>
+      </w:r>
+      <w:r>
+        <w:rPr>
+          <w:rFonts w:ascii="Arial" w:hAnsi="Arial" w:cs="Arial"/>
+        </w:rPr>
+        <w:t>of</w:t>
+      </w:r>
+      <w:r>
+        <w:rPr>
+          <w:rFonts w:ascii="Arial" w:hAnsi="Arial" w:cs="Arial"/>
+        </w:rPr>
+        <w:t xml:space="preserve"> </w:t>
+      </w:r>
+      <w:r>
+        <w:rPr>
+          <w:rFonts w:ascii="Arial" w:hAnsi="Arial" w:cs="Arial"/>
+        </w:rPr>
+        <w:t>limiting</w:t>
+      </w:r>
+      <w:r>
+        <w:rPr>
+          <w:rFonts w:ascii="Arial" w:hAnsi="Arial" w:cs="Arial"/>
+        </w:rPr>
+        <w:t xml:space="preserve"> access to mobile and smart technologies in young learners </w:t>
+      </w:r>
       <w:r>
         <w:rPr>
           <w:rStyle w:val="CitaCar"/>
         </w:rPr>
-        <w:t>Jimoyiannis</w:t>
-      </w:r>
-      <w:proofErr w:type="spellEnd"/>
-      <w:r>
-        <w:rPr>
-          <w:rStyle w:val="CitaCar"/>
-        </w:rPr>
-        <w:t xml:space="preserve"> &amp; </w:t>
-      </w:r>
-      <w:proofErr w:type="spellStart"/>
-      <w:r>
-        <w:rPr>
-          <w:rStyle w:val="CitaCar"/>
-        </w:rPr>
-        <w:t>Gravani</w:t>
-      </w:r>
-      <w:proofErr w:type="spellEnd"/>
-      <w:r>
-        <w:rPr>
-          <w:rStyle w:val="CitaCar"/>
-        </w:rPr>
-        <w:t>, 2011)</w:t>
-      </w:r>
-      <w:r>
-        <w:rPr>
-          <w:rFonts w:ascii="Arial" w:hAnsi="Arial" w:cs="Arial"/>
-        </w:rPr>
-        <w:t xml:space="preserve">. Since the proposal focuses on identifying the benefits of communication and collaboration mediated by technology, it is important to balance the approach with the evidence that also shows benefits by withdrawing access to mobile and smart technologies in young learners </w:t>
-      </w:r>
-      <w:r>
-        <w:rPr>
-          <w:rStyle w:val="CitaCar"/>
-        </w:rPr>
-        <w:t>(</w:t>
-      </w:r>
-      <w:proofErr w:type="spellStart"/>
-      <w:r>
-        <w:rPr>
-          <w:rStyle w:val="CitaCar"/>
-        </w:rPr>
-        <w:t>Cheriti</w:t>
-      </w:r>
-      <w:proofErr w:type="spellEnd"/>
-      <w:r>
-        <w:rPr>
-          <w:rStyle w:val="CitaCar"/>
-        </w:rPr>
-        <w:t>, 2025)</w:t>
+        <w:t>(Cheriti, 2025)</w:t>
       </w:r>
       <w:r>
         <w:rPr>
@@ -2274,33 +2232,55 @@
         </w:rPr>
         <w:t xml:space="preserve">. There </w:t>
       </w:r>
-      <w:proofErr w:type="gramStart"/>
-      <w:r>
-        <w:rPr>
-          <w:rFonts w:ascii="Arial" w:hAnsi="Arial" w:cs="Arial"/>
-        </w:rPr>
-        <w:t>is</w:t>
-      </w:r>
-      <w:proofErr w:type="gramEnd"/>
-      <w:r>
-        <w:rPr>
-          <w:rFonts w:ascii="Arial" w:hAnsi="Arial" w:cs="Arial"/>
-        </w:rPr>
-        <w:t xml:space="preserve"> value and a necessity to create sufficient and actionable digital literacy, but not at the cost of other aspects of development.</w:t>
-      </w:r>
-    </w:p>
-    <w:p>
-      <w:pPr>
-        <w:jc w:val="both"/>
-        <w:rPr>
-          <w:rFonts w:ascii="Arial" w:hAnsi="Arial" w:cs="Arial"/>
-        </w:rPr>
-      </w:pPr>
-      <w:r>
-        <w:rPr>
-          <w:rFonts w:ascii="Arial" w:hAnsi="Arial" w:cs="Arial"/>
-        </w:rPr>
-        <w:t>Within this framework, as well as based on the ideas mentioned in previous sections, it is possible to summarise the educational design behind the development of in three main ideas:</w:t>
+      <w:r>
+        <w:rPr>
+          <w:rFonts w:ascii="Arial" w:hAnsi="Arial" w:cs="Arial"/>
+        </w:rPr>
+        <w:t>are</w:t>
+      </w:r>
+      <w:r>
+        <w:rPr>
+          <w:rFonts w:ascii="Arial" w:hAnsi="Arial" w:cs="Arial"/>
+        </w:rPr>
+        <w:t xml:space="preserve"> </w:t>
+      </w:r>
+      <w:r>
+        <w:rPr>
+          <w:rFonts w:ascii="Arial" w:hAnsi="Arial" w:cs="Arial"/>
+        </w:rPr>
+        <w:t xml:space="preserve">both </w:t>
+      </w:r>
+      <w:r>
+        <w:rPr>
+          <w:rFonts w:ascii="Arial" w:hAnsi="Arial" w:cs="Arial"/>
+        </w:rPr>
+        <w:t>value and a necessity to create sufficient and actionable digital literacy, but not at the cost of other aspects of development.</w:t>
+      </w:r>
+    </w:p>
+    <w:p>
+      <w:pPr>
+        <w:jc w:val="both"/>
+        <w:rPr>
+          <w:rFonts w:ascii="Arial" w:hAnsi="Arial" w:cs="Arial"/>
+        </w:rPr>
+      </w:pPr>
+      <w:r>
+        <w:rPr>
+          <w:rFonts w:ascii="Arial" w:hAnsi="Arial" w:cs="Arial"/>
+        </w:rPr>
+        <w:t>Within this framework</w:t>
+      </w:r>
+      <w:r>
+        <w:rPr>
+          <w:rFonts w:ascii="Arial" w:hAnsi="Arial" w:cs="Arial"/>
+        </w:rPr>
+        <w:t xml:space="preserve"> </w:t>
+      </w:r>
+      <w:r>
+        <w:rPr>
+          <w:rFonts w:ascii="Arial" w:hAnsi="Arial" w:cs="Arial"/>
+        </w:rPr>
+        <w:t>it is possible to summarise the educational design behind the development of in three main ideas:</w:t>
       </w:r>
     </w:p>
     <w:p>
@@ -2383,7 +2363,6 @@
           <w:b/>
           <w:bCs/>
         </w:rPr>
-        <w:lastRenderedPageBreak/>
         <w:t>LO1:</w:t>
       </w:r>
       <w:r>
@@ -2399,6 +2378,7 @@
           <w:b/>
           <w:bCs/>
         </w:rPr>
+        <w:lastRenderedPageBreak/>
         <w:t>LO2:</w:t>
       </w:r>
       <w:r>
@@ -2460,7 +2440,31 @@
         <w:rPr>
           <w:rFonts w:ascii="Arial" w:hAnsi="Arial" w:cs="Arial"/>
         </w:rPr>
-        <w:t>The main learning activity associated to the educational proposal of WorkshopAR are the work sessions of the students. Within a work session, it is expected that a group focuses on a set of tasks to fulfil during the session and uses the tool to organise their work and support any discussion or debate. This is a very open approach to the activity, meant mostly to facilitate the observation process during the execution of the case study, and to disrupt the work of the students as little as possible. Some structure can be given to the students to guide their work and emphasise better one or more of the learning objectives. Three types of activities can be suggested that are in line with the learning goals and can be useful, especially if the group finds itself a little directionless or without a clear goal in mind for the session:</w:t>
+        <w:t xml:space="preserve">The main learning activity associated to the educational proposal of WorkshopAR are the work sessions of the students. Within a work session, it is expected that a group focuses on a set of tasks </w:t>
+      </w:r>
+      <w:r>
+        <w:rPr>
+          <w:rFonts w:ascii="Arial" w:hAnsi="Arial" w:cs="Arial"/>
+        </w:rPr>
+        <w:t>and to use</w:t>
+      </w:r>
+      <w:r>
+        <w:rPr>
+          <w:rFonts w:ascii="Arial" w:hAnsi="Arial" w:cs="Arial"/>
+        </w:rPr>
+        <w:t xml:space="preserve"> the tool to organise their work and support any discussion or debate. This is </w:t>
+      </w:r>
+      <w:r>
+        <w:rPr>
+          <w:rFonts w:ascii="Arial" w:hAnsi="Arial" w:cs="Arial"/>
+        </w:rPr>
+        <w:t xml:space="preserve">an </w:t>
+      </w:r>
+      <w:r>
+        <w:rPr>
+          <w:rFonts w:ascii="Arial" w:hAnsi="Arial" w:cs="Arial"/>
+        </w:rPr>
+        <w:t>open approach to the activity, meant mostly to facilitate the observation process during the execution of the case study, and to disrupt the work of the students as little as possible. Some structure can be given to the students to guide their work and emphasise better one or more of the learning objectives. Three types of activities can be suggested that are in line with the learning goals and can be useful, especially if the group finds itself a little directionless or without a clear goal in mind for the session:</w:t>
       </w:r>
     </w:p>
     <w:p>
@@ -2542,27 +2546,21 @@
         <w:rPr>
           <w:rFonts w:ascii="Arial" w:hAnsi="Arial" w:cs="Arial"/>
         </w:rPr>
-        <w:t xml:space="preserve">The assessment process of this educational design is minimal, and it is concerned mostly on comparing the assessment done for the course between the different observations throughout the case study. Hopefully, it is possible to observe that there is a positive </w:t>
-      </w:r>
+        <w:t xml:space="preserve">The assessment process of this educational design is minimal, and it is concerned mostly on comparing the assessment done for the course between the different observations throughout the case study. Hopefully, it is possible to observe that there is a positive change in results in the groups using WorkshopAR, but this research is more concerned in identifying changes and differences during the development process. Nonetheless, some criteria can be established to guide what can be considered a positive or negative impact. </w:t>
+      </w:r>
+    </w:p>
+    <w:p>
+      <w:pPr>
+        <w:jc w:val="both"/>
+        <w:rPr>
+          <w:rFonts w:ascii="Arial" w:hAnsi="Arial" w:cs="Arial"/>
+        </w:rPr>
+      </w:pPr>
       <w:r>
         <w:rPr>
           <w:rFonts w:ascii="Arial" w:hAnsi="Arial" w:cs="Arial"/>
         </w:rPr>
         <w:lastRenderedPageBreak/>
-        <w:t xml:space="preserve">change in results in the groups using WorkshopAR, but this research is more concerned in identifying changes and differences during the development process. Nonetheless, some criteria can be established to guide what can be considered a positive or negative impact. </w:t>
-      </w:r>
-    </w:p>
-    <w:p>
-      <w:pPr>
-        <w:jc w:val="both"/>
-        <w:rPr>
-          <w:rFonts w:ascii="Arial" w:hAnsi="Arial" w:cs="Arial"/>
-        </w:rPr>
-      </w:pPr>
-      <w:r>
-        <w:rPr>
-          <w:rFonts w:ascii="Arial" w:hAnsi="Arial" w:cs="Arial"/>
-        </w:rPr>
         <w:t>Positive observations can be characterised by constant communication between the team members, coherency between the different aspects of the proposal and a clear visualisation of the decisions taken for the project and the reasoning behind them. In contrast, poor performance can be characterised by a disjointed work without a common or clear objective, noticeable lack of communication between the group and a failure in meeting deadlines or show consistent progress in their work.</w:t>
       </w:r>
     </w:p>
@@ -2705,14 +2703,7 @@
         <w:rPr>
           <w:rFonts w:ascii="Arial" w:hAnsi="Arial" w:cs="Arial"/>
         </w:rPr>
-        <w:t xml:space="preserve">The first step in the development of WorkshopAR is a user-centred design aimed at the interaction aspects of the experience with the hardware and with the AR tools build to accomplish the learning goals established. The main objective is to identify expected </w:t>
-      </w:r>
-      <w:r>
-        <w:rPr>
-          <w:rFonts w:ascii="Arial" w:hAnsi="Arial" w:cs="Arial"/>
-        </w:rPr>
-        <w:lastRenderedPageBreak/>
-        <w:t>interactions with AR technologies and formulate a proposal for the overall user experience based on the aggregated feedback gathered from the users.</w:t>
+        <w:t>The first step in the development of WorkshopAR is a user-centred design aimed at the interaction aspects of the experience with the hardware and with the AR tools build to accomplish the learning goals established. The main objective is to identify expected interactions with AR technologies and formulate a proposal for the overall user experience based on the aggregated feedback gathered from the users.</w:t>
       </w:r>
     </w:p>
     <w:p>
@@ -2751,6 +2742,7 @@
         <w:rPr>
           <w:rFonts w:ascii="Arial" w:hAnsi="Arial" w:cs="Arial"/>
         </w:rPr>
+        <w:lastRenderedPageBreak/>
         <w:t>Being project-oriented, tailored to specifics needs and driven by data.</w:t>
       </w:r>
     </w:p>
@@ -2815,21 +2807,7 @@
         <w:rPr>
           <w:rFonts w:ascii="Arial" w:hAnsi="Arial" w:cs="Arial"/>
         </w:rPr>
-        <w:t xml:space="preserve"> highlight the need of considering the context of the project to determine how much access the user can and should have in the development process, the points in the project </w:t>
-      </w:r>
-      <w:proofErr w:type="gramStart"/>
-      <w:r>
-        <w:rPr>
-          <w:rFonts w:ascii="Arial" w:hAnsi="Arial" w:cs="Arial"/>
-        </w:rPr>
-        <w:t>life-cycle</w:t>
-      </w:r>
-      <w:proofErr w:type="gramEnd"/>
-      <w:r>
-        <w:rPr>
-          <w:rFonts w:ascii="Arial" w:hAnsi="Arial" w:cs="Arial"/>
-        </w:rPr>
-        <w:t xml:space="preserve"> in which the input of the user is more valuable and the importance of identifying and working with all the different users that a product may target.</w:t>
+        <w:t xml:space="preserve"> highlight the need of considering the context of the project to determine how much access the user can and should have in the development process, the points in the project life-cycle in which the input of the user is more valuable and the importance of identifying and working with all the different users that a product may target.</w:t>
       </w:r>
     </w:p>
     <w:p>
@@ -2932,7 +2910,6 @@
         <w:rPr>
           <w:rFonts w:ascii="Arial" w:hAnsi="Arial" w:cs="Arial"/>
         </w:rPr>
-        <w:lastRenderedPageBreak/>
         <w:t xml:space="preserve">The biggest risk that needs to be acknowledged when implementing a user-centred design is to mismanage the involvement of the user in the process. As </w:t>
       </w:r>
       <w:r>
@@ -2983,6 +2960,7 @@
         <w:rPr>
           <w:rFonts w:ascii="Arial" w:hAnsi="Arial" w:cs="Arial"/>
         </w:rPr>
+        <w:lastRenderedPageBreak/>
         <w:t>A disorganised input that lacks cohesion and a clear goal.</w:t>
       </w:r>
     </w:p>
@@ -3035,7 +3013,25 @@
         <w:rPr>
           <w:rFonts w:ascii="Arial" w:hAnsi="Arial" w:cs="Arial"/>
         </w:rPr>
-        <w:t>The development of WorkshopAR is mobile-first. Several aspects of multiplatform interactions will be discussed and tested, but the priority in design will be given to the technology and input methods found primarily in mobile environments, leveraging the handholds and methods present and expected in the medium.</w:t>
+        <w:t>M</w:t>
+      </w:r>
+      <w:r>
+        <w:rPr>
+          <w:rFonts w:ascii="Arial" w:hAnsi="Arial" w:cs="Arial"/>
+        </w:rPr>
+        <w:t>obile-first</w:t>
+      </w:r>
+      <w:r>
+        <w:rPr>
+          <w:rFonts w:ascii="Arial" w:hAnsi="Arial" w:cs="Arial"/>
+        </w:rPr>
+        <w:t xml:space="preserve"> development</w:t>
+      </w:r>
+      <w:r>
+        <w:rPr>
+          <w:rFonts w:ascii="Arial" w:hAnsi="Arial" w:cs="Arial"/>
+        </w:rPr>
+        <w:t>. Several aspects of multiplatform interactions will be discussed and tested, but the priority in design will be given to the technology and input methods found primarily in mobile environments, leveraging the handholds and methods present and expected in the medium.</w:t>
       </w:r>
     </w:p>
     <w:p>
@@ -3073,130 +3069,95 @@
         <w:rPr>
           <w:rFonts w:ascii="Arial" w:hAnsi="Arial" w:cs="Arial"/>
         </w:rPr>
-        <w:t xml:space="preserve">AR is a new interaction space for many users, but plenty of sources have shown and tested different designs with positive results. The design guidelines for AR interactions developed by Google </w:t>
-      </w:r>
-      <w:proofErr w:type="spellStart"/>
-      <w:r>
-        <w:rPr>
-          <w:rFonts w:ascii="Arial" w:hAnsi="Arial" w:cs="Arial"/>
-        </w:rPr>
-        <w:t>DevWorks</w:t>
-      </w:r>
-      <w:proofErr w:type="spellEnd"/>
-      <w:r>
-        <w:rPr>
-          <w:rFonts w:ascii="Arial" w:hAnsi="Arial" w:cs="Arial"/>
-        </w:rPr>
-        <w:t xml:space="preserve"> </w:t>
+        <w:t xml:space="preserve">AR is a new interaction space for many users, but plenty of sources have shown and tested different designs with positive results. The design guidelines for AR interactions developed by Google DevWorks </w:t>
       </w:r>
       <w:r>
         <w:rPr>
           <w:rStyle w:val="CitaCar"/>
         </w:rPr>
-        <w:t>(</w:t>
-      </w:r>
-      <w:proofErr w:type="spellStart"/>
+        <w:t>(ARCore, 2025)</w:t>
+      </w:r>
+      <w:r>
+        <w:rPr>
+          <w:rFonts w:ascii="Arial" w:hAnsi="Arial" w:cs="Arial"/>
+        </w:rPr>
+        <w:t xml:space="preserve"> are a good example of the available solutions in the current market than can be leveraged and expanded upon without the necessity of reinventing the wheel.</w:t>
+      </w:r>
+    </w:p>
+    <w:p>
+      <w:pPr>
+        <w:jc w:val="both"/>
+        <w:rPr>
+          <w:rFonts w:ascii="Arial" w:hAnsi="Arial" w:cs="Arial"/>
+        </w:rPr>
+      </w:pPr>
+      <w:r>
+        <w:rPr>
+          <w:rFonts w:ascii="Arial" w:hAnsi="Arial" w:cs="Arial"/>
+        </w:rPr>
+        <w:t>This philosophy behind the user-centred design was also used as part of the iterative process for the software development, especially in support of the analysis and testing steps, as will be described in the next section.</w:t>
+      </w:r>
+    </w:p>
+    <w:p>
+      <w:pPr>
+        <w:pStyle w:val="Ttulo3"/>
+      </w:pPr>
+      <w:r>
+        <w:t>3.3.2.2 Software engineering process</w:t>
+      </w:r>
+    </w:p>
+    <w:p>
+      <w:pPr>
+        <w:jc w:val="both"/>
+        <w:rPr>
+          <w:rFonts w:ascii="Arial" w:hAnsi="Arial" w:cs="Arial"/>
+        </w:rPr>
+      </w:pPr>
+      <w:r>
+        <w:rPr>
+          <w:rFonts w:ascii="Arial" w:hAnsi="Arial" w:cs="Arial"/>
+        </w:rPr>
+        <w:t>The process proposed for this development is based on the stages and activities recommended by Salo &amp; Abrahamsson (2007) to conduct and agile development process that is constantly checking for improvement and for effective use of resources. The research context in which WorkshopAR is developed, and the exploratory nature of the objectives behind the software proposal require for the approach of the development process to be flexible and agile.</w:t>
+      </w:r>
+    </w:p>
+    <w:p>
+      <w:pPr>
+        <w:jc w:val="both"/>
+        <w:rPr>
+          <w:rFonts w:ascii="Arial" w:hAnsi="Arial" w:cs="Arial"/>
+        </w:rPr>
+      </w:pPr>
+      <w:r>
+        <w:rPr>
+          <w:rFonts w:ascii="Arial" w:hAnsi="Arial" w:cs="Arial"/>
+        </w:rPr>
+        <w:t>The agile process will be used in the context of a development that tries to deliver functionality fast and in increasing complexity. This behaviour is a response to the necessity of tentatively explore solutions for the educational and technological challenges of the project, to change course, pivot a proposal and be able to incorporate the input of the user participation as explored in the previous section.</w:t>
+      </w:r>
+    </w:p>
+    <w:p>
+      <w:pPr>
+        <w:jc w:val="both"/>
+        <w:rPr>
+          <w:rFonts w:ascii="Arial" w:hAnsi="Arial" w:cs="Arial"/>
+        </w:rPr>
+      </w:pPr>
+      <w:r>
+        <w:rPr>
+          <w:rFonts w:ascii="Arial" w:hAnsi="Arial" w:cs="Arial"/>
+        </w:rPr>
+        <w:t xml:space="preserve">As </w:t>
+      </w:r>
       <w:r>
         <w:rPr>
           <w:rStyle w:val="CitaCar"/>
         </w:rPr>
-        <w:t>ARCore</w:t>
-      </w:r>
-      <w:proofErr w:type="spellEnd"/>
-      <w:r>
-        <w:rPr>
-          <w:rStyle w:val="CitaCar"/>
-        </w:rPr>
-        <w:t>, 2025)</w:t>
-      </w:r>
-      <w:r>
-        <w:rPr>
-          <w:rFonts w:ascii="Arial" w:hAnsi="Arial" w:cs="Arial"/>
-        </w:rPr>
-        <w:t xml:space="preserve"> are a good example of the available solutions in the current market than can be leveraged and expanded upon without the necessity of reinventing the wheel.</w:t>
-      </w:r>
-    </w:p>
-    <w:p>
-      <w:pPr>
-        <w:jc w:val="both"/>
-        <w:rPr>
-          <w:rFonts w:ascii="Arial" w:hAnsi="Arial" w:cs="Arial"/>
-        </w:rPr>
-      </w:pPr>
-      <w:r>
-        <w:rPr>
-          <w:rFonts w:ascii="Arial" w:hAnsi="Arial" w:cs="Arial"/>
-        </w:rPr>
-        <w:t>This philosophy behind the user-centred design was also used as part of the iterative process for the software development, especially in support of the analysis and testing steps, as will be described in the next section.</w:t>
-      </w:r>
-    </w:p>
-    <w:p>
-      <w:pPr>
-        <w:pStyle w:val="Ttulo3"/>
-      </w:pPr>
-      <w:r>
-        <w:t>3.3.2.2 Software engineering process</w:t>
-      </w:r>
-    </w:p>
-    <w:p>
-      <w:pPr>
-        <w:jc w:val="both"/>
-        <w:rPr>
-          <w:rFonts w:ascii="Arial" w:hAnsi="Arial" w:cs="Arial"/>
-        </w:rPr>
-      </w:pPr>
-      <w:r>
-        <w:rPr>
-          <w:rFonts w:ascii="Arial" w:hAnsi="Arial" w:cs="Arial"/>
-        </w:rPr>
-        <w:t>The process proposed for this development is based on the stages and activities recommended by Salo &amp; Abrahamsson (2007) to conduct and agile development process that is constantly checking for improvement and for effective use of resources. The research context in which WorkshopAR is developed, and the exploratory nature of the objectives behind the software proposal require for the approach of the development process to be flexible and agile.</w:t>
-      </w:r>
-    </w:p>
-    <w:p>
-      <w:pPr>
-        <w:jc w:val="both"/>
-        <w:rPr>
-          <w:rFonts w:ascii="Arial" w:hAnsi="Arial" w:cs="Arial"/>
-        </w:rPr>
-      </w:pPr>
-      <w:r>
-        <w:rPr>
-          <w:rFonts w:ascii="Arial" w:hAnsi="Arial" w:cs="Arial"/>
-        </w:rPr>
-        <w:t>The agile process will be used in the context of a development that tries to deliver functionality fast and in increasing complexity. This behaviour is a response to the necessity of tentatively explore solutions for the educational and technological challenges of the project, to change course, pivot a proposal and be able to incorporate the input of the user participation as explored in the previous section.</w:t>
-      </w:r>
-    </w:p>
-    <w:p>
-      <w:pPr>
-        <w:jc w:val="both"/>
-        <w:rPr>
-          <w:rFonts w:ascii="Arial" w:hAnsi="Arial" w:cs="Arial"/>
-        </w:rPr>
-      </w:pPr>
-      <w:r>
-        <w:rPr>
-          <w:rFonts w:ascii="Arial" w:hAnsi="Arial" w:cs="Arial"/>
-        </w:rPr>
-        <w:t xml:space="preserve">As </w:t>
-      </w:r>
-      <w:r>
-        <w:rPr>
-          <w:rStyle w:val="CitaCar"/>
-        </w:rPr>
         <w:t>Elbanna &amp; Sarker (2016)</w:t>
       </w:r>
       <w:r>
         <w:rPr>
           <w:rFonts w:ascii="Arial" w:hAnsi="Arial" w:cs="Arial"/>
         </w:rPr>
-        <w:t xml:space="preserve"> explains, agile developments are useful for getting unrestrictive progress in rapidly changing environments, but they run the risk of aimlessly keep </w:t>
-      </w:r>
-      <w:r>
-        <w:rPr>
-          <w:rFonts w:ascii="Arial" w:hAnsi="Arial" w:cs="Arial"/>
-        </w:rPr>
-        <w:lastRenderedPageBreak/>
-        <w:t>producing bloated functionalities and lack a clear direction. For the prototyping nature of WorkshopAR, this is an acceptable use scenario, and the same guidelines established to focus the user-centred design process can be used to guide the software development. Additional milestones can also be proposed to evaluate progress and to set a baseline of what can be considered a finished version of WorkshopAR within the context of the project.</w:t>
+        <w:t xml:space="preserve"> explains, agile developments are useful for getting unrestrictive progress in rapidly changing environments, but they run the risk of aimlessly keep producing bloated functionalities and lack a clear direction. For the prototyping nature of WorkshopAR, this is an acceptable use scenario, and the same guidelines established to focus the user-centred design process can be used to guide the software development. Additional milestones can also be proposed to evaluate progress and to set a baseline of what can be considered a finished version of WorkshopAR within the context of the project.</w:t>
       </w:r>
     </w:p>
     <w:p>
@@ -3216,6 +3177,7 @@
           <w:b/>
           <w:bCs/>
         </w:rPr>
+        <w:lastRenderedPageBreak/>
         <w:t>Milestone 1:</w:t>
       </w:r>
       <w:r>

</xml_diff>